<commit_message>
Add Filament notes and implement Category and Post CRUD features
</commit_message>
<xml_diff>
--- a/Filament/filament notes.docx
+++ b/Filament/filament notes.docx
@@ -257,11 +257,2189 @@
       <w:pPr>
         <w:rPr>
           <w:rFonts w:cstheme="minorHAnsi"/>
+          <w:b/>
+          <w:bCs/>
+          <w:color w:val="FF0000"/>
+          <w:sz w:val="28"/>
+          <w:szCs w:val="28"/>
+        </w:rPr>
+      </w:pPr>
+    </w:p>
+    <w:p>
+      <w:pPr>
+        <w:rPr>
+          <w:rFonts w:cstheme="minorHAnsi"/>
+          <w:b/>
+          <w:bCs/>
+          <w:color w:val="FF0000"/>
+          <w:sz w:val="28"/>
+          <w:szCs w:val="28"/>
+          <w:u w:val="single"/>
+        </w:rPr>
+      </w:pPr>
+      <w:r>
+        <w:rPr>
+          <w:rFonts w:cstheme="minorHAnsi"/>
+          <w:b/>
+          <w:bCs/>
+          <w:color w:val="FF0000"/>
+          <w:sz w:val="28"/>
+          <w:szCs w:val="28"/>
+          <w:u w:val="single"/>
+        </w:rPr>
+        <w:t>The "Published" Switch Concept:</w:t>
+      </w:r>
+    </w:p>
+    <w:p>
+      <w:pPr>
+        <w:rPr>
+          <w:rFonts w:cstheme="minorHAnsi"/>
+          <w:szCs w:val="22"/>
+        </w:rPr>
+      </w:pPr>
+    </w:p>
+    <w:p>
+      <w:pPr>
+        <w:rPr>
+          <w:rFonts w:cstheme="minorHAnsi"/>
+          <w:szCs w:val="22"/>
+        </w:rPr>
+      </w:pPr>
+      <w:r>
+        <w:rPr>
+          <w:rFonts w:cstheme="minorHAnsi"/>
+          <w:szCs w:val="22"/>
+        </w:rPr>
+        <w:drawing>
+          <wp:inline distT="0" distB="0" distL="0" distR="0" wp14:anchorId="5EA18D44" wp14:editId="70DF698A">
+            <wp:extent cx="2913068" cy="1574800"/>
+            <wp:effectExtent l="0" t="0" r="1905" b="6350"/>
+            <wp:docPr id="1" name="Picture 1"/>
+            <wp:cNvGraphicFramePr>
+              <a:graphicFrameLocks xmlns:a="http://schemas.openxmlformats.org/drawingml/2006/main" noChangeAspect="1"/>
+            </wp:cNvGraphicFramePr>
+            <a:graphic xmlns:a="http://schemas.openxmlformats.org/drawingml/2006/main">
+              <a:graphicData uri="http://schemas.openxmlformats.org/drawingml/2006/picture">
+                <pic:pic xmlns:pic="http://schemas.openxmlformats.org/drawingml/2006/picture">
+                  <pic:nvPicPr>
+                    <pic:cNvPr id="0" name=""/>
+                    <pic:cNvPicPr/>
+                  </pic:nvPicPr>
+                  <pic:blipFill>
+                    <a:blip r:embed="rId6"/>
+                    <a:stretch>
+                      <a:fillRect/>
+                    </a:stretch>
+                  </pic:blipFill>
+                  <pic:spPr>
+                    <a:xfrm>
+                      <a:off x="0" y="0"/>
+                      <a:ext cx="2912853" cy="1574684"/>
+                    </a:xfrm>
+                    <a:prstGeom prst="rect">
+                      <a:avLst/>
+                    </a:prstGeom>
+                  </pic:spPr>
+                </pic:pic>
+              </a:graphicData>
+            </a:graphic>
+          </wp:inline>
+        </w:drawing>
+      </w:r>
+    </w:p>
+    <w:p>
+      <w:pPr>
+        <w:shd w:val="clear" w:color="auto" w:fill="121314"/>
+        <w:spacing w:after="0" w:line="285" w:lineRule="atLeast"/>
+        <w:rPr>
+          <w:rFonts w:ascii="Consolas" w:eastAsia="Times New Roman" w:hAnsi="Consolas" w:cs="Times New Roman"/>
+          <w:color w:val="BBBEBF"/>
+          <w:sz w:val="21"/>
+          <w:szCs w:val="21"/>
+          <w:lang w:eastAsia="en-IN"/>
+        </w:rPr>
+      </w:pPr>
+      <w:r>
+        <w:rPr>
+          <w:rFonts w:ascii="Consolas" w:eastAsia="Times New Roman" w:hAnsi="Consolas" w:cs="Times New Roman"/>
+          <w:color w:val="C9D1D9"/>
+          <w:sz w:val="21"/>
+          <w:szCs w:val="21"/>
+          <w:lang w:eastAsia="en-IN"/>
+        </w:rPr>
+        <w:t>$table</w:t>
+      </w:r>
+      <w:r>
+        <w:rPr>
+          <w:rFonts w:ascii="Consolas" w:eastAsia="Times New Roman" w:hAnsi="Consolas" w:cs="Times New Roman"/>
+          <w:color w:val="D4D4D4"/>
+          <w:sz w:val="21"/>
+          <w:szCs w:val="21"/>
+          <w:lang w:eastAsia="en-IN"/>
+        </w:rPr>
+        <w:t>-&gt;</w:t>
+      </w:r>
+      <w:proofErr w:type="spellStart"/>
+      <w:proofErr w:type="gramStart"/>
+      <w:r>
+        <w:rPr>
+          <w:rFonts w:ascii="Consolas" w:eastAsia="Times New Roman" w:hAnsi="Consolas" w:cs="Times New Roman"/>
+          <w:color w:val="D2A8FF"/>
+          <w:sz w:val="21"/>
+          <w:szCs w:val="21"/>
+          <w:lang w:eastAsia="en-IN"/>
+        </w:rPr>
+        <w:t>boolean</w:t>
+      </w:r>
+      <w:proofErr w:type="spellEnd"/>
+      <w:r>
+        <w:rPr>
+          <w:rFonts w:ascii="Consolas" w:eastAsia="Times New Roman" w:hAnsi="Consolas" w:cs="Times New Roman"/>
+          <w:color w:val="D4D4D4"/>
+          <w:sz w:val="21"/>
+          <w:szCs w:val="21"/>
+          <w:lang w:eastAsia="en-IN"/>
+        </w:rPr>
+        <w:t>(</w:t>
+      </w:r>
+      <w:proofErr w:type="gramEnd"/>
+      <w:r>
+        <w:rPr>
+          <w:rFonts w:ascii="Consolas" w:eastAsia="Times New Roman" w:hAnsi="Consolas" w:cs="Times New Roman"/>
+          <w:color w:val="A5D6FF"/>
+          <w:sz w:val="21"/>
+          <w:szCs w:val="21"/>
+          <w:lang w:eastAsia="en-IN"/>
+        </w:rPr>
+        <w:t>"published"</w:t>
+      </w:r>
+      <w:r>
+        <w:rPr>
+          <w:rFonts w:ascii="Consolas" w:eastAsia="Times New Roman" w:hAnsi="Consolas" w:cs="Times New Roman"/>
+          <w:color w:val="D4D4D4"/>
+          <w:sz w:val="21"/>
+          <w:szCs w:val="21"/>
+          <w:lang w:eastAsia="en-IN"/>
+        </w:rPr>
+        <w:t>)-&gt;</w:t>
+      </w:r>
+      <w:r>
+        <w:rPr>
+          <w:rFonts w:ascii="Consolas" w:eastAsia="Times New Roman" w:hAnsi="Consolas" w:cs="Times New Roman"/>
+          <w:color w:val="D2A8FF"/>
+          <w:sz w:val="21"/>
+          <w:szCs w:val="21"/>
+          <w:lang w:eastAsia="en-IN"/>
+        </w:rPr>
+        <w:t>default</w:t>
+      </w:r>
+      <w:r>
+        <w:rPr>
+          <w:rFonts w:ascii="Consolas" w:eastAsia="Times New Roman" w:hAnsi="Consolas" w:cs="Times New Roman"/>
+          <w:color w:val="D4D4D4"/>
+          <w:sz w:val="21"/>
+          <w:szCs w:val="21"/>
+          <w:lang w:eastAsia="en-IN"/>
+        </w:rPr>
+        <w:t>(</w:t>
+      </w:r>
+      <w:r>
+        <w:rPr>
+          <w:rFonts w:ascii="Consolas" w:eastAsia="Times New Roman" w:hAnsi="Consolas" w:cs="Times New Roman"/>
+          <w:color w:val="569CD6"/>
+          <w:sz w:val="21"/>
+          <w:szCs w:val="21"/>
+          <w:lang w:eastAsia="en-IN"/>
+        </w:rPr>
+        <w:t>false</w:t>
+      </w:r>
+      <w:r>
+        <w:rPr>
+          <w:rFonts w:ascii="Consolas" w:eastAsia="Times New Roman" w:hAnsi="Consolas" w:cs="Times New Roman"/>
+          <w:color w:val="D4D4D4"/>
+          <w:sz w:val="21"/>
+          <w:szCs w:val="21"/>
+          <w:lang w:eastAsia="en-IN"/>
+        </w:rPr>
+        <w:t>);</w:t>
+      </w:r>
+    </w:p>
+    <w:p>
+      <w:pPr>
+        <w:rPr>
+          <w:rFonts w:cstheme="minorHAnsi"/>
+          <w:szCs w:val="22"/>
+        </w:rPr>
+      </w:pPr>
+    </w:p>
+    <w:p>
+      <w:pPr>
+        <w:rPr>
+          <w:rFonts w:cstheme="minorHAnsi"/>
+          <w:szCs w:val="22"/>
+        </w:rPr>
+      </w:pPr>
+      <w:r>
+        <w:rPr>
+          <w:rFonts w:cstheme="minorHAnsi"/>
+          <w:szCs w:val="22"/>
+        </w:rPr>
+        <w:t>In web development, adding a published column with a default false value is a standard way to create a Draft vs. Live system for content.</w:t>
+      </w:r>
+    </w:p>
+    <w:p>
+      <w:pPr>
+        <w:pStyle w:val="ListParagraph"/>
+        <w:numPr>
+          <w:ilvl w:val="0"/>
+          <w:numId w:val="1"/>
+        </w:numPr>
+        <w:rPr>
+          <w:rFonts w:cstheme="minorHAnsi"/>
+          <w:szCs w:val="22"/>
+        </w:rPr>
+      </w:pPr>
+      <w:r>
+        <w:rPr>
+          <w:rFonts w:cstheme="minorHAnsi"/>
+          <w:b/>
+          <w:bCs/>
+          <w:szCs w:val="22"/>
+        </w:rPr>
+        <w:t>The Blueprint:</w:t>
+      </w:r>
+      <w:r>
+        <w:rPr>
+          <w:rFonts w:cstheme="minorHAnsi"/>
+          <w:szCs w:val="22"/>
+        </w:rPr>
+        <w:t xml:space="preserve"> It creates a simple "Yes/No" status for every post.</w:t>
+      </w:r>
+    </w:p>
+    <w:p>
+      <w:pPr>
+        <w:pStyle w:val="ListParagraph"/>
+        <w:numPr>
+          <w:ilvl w:val="0"/>
+          <w:numId w:val="1"/>
+        </w:numPr>
+        <w:rPr>
+          <w:rFonts w:cstheme="minorHAnsi"/>
+          <w:szCs w:val="22"/>
+        </w:rPr>
+      </w:pPr>
+      <w:r>
+        <w:rPr>
+          <w:rFonts w:cstheme="minorHAnsi"/>
+          <w:b/>
+          <w:bCs/>
+          <w:szCs w:val="22"/>
+        </w:rPr>
+        <w:t>The Safety Net:</w:t>
+      </w:r>
+      <w:r>
+        <w:rPr>
+          <w:rFonts w:cstheme="minorHAnsi"/>
+          <w:szCs w:val="22"/>
+        </w:rPr>
+        <w:t xml:space="preserve"> By defaulting to false (No), the system guarantees that new content is saved privately as a </w:t>
+      </w:r>
+      <w:r>
+        <w:rPr>
+          <w:rFonts w:cstheme="minorHAnsi"/>
+          <w:szCs w:val="22"/>
+        </w:rPr>
+        <w:t>draft first.</w:t>
+      </w:r>
+    </w:p>
+    <w:p>
+      <w:pPr>
+        <w:pStyle w:val="ListParagraph"/>
+        <w:numPr>
+          <w:ilvl w:val="0"/>
+          <w:numId w:val="1"/>
+        </w:numPr>
+        <w:rPr>
+          <w:rFonts w:cstheme="minorHAnsi"/>
+          <w:szCs w:val="22"/>
+        </w:rPr>
+      </w:pPr>
+      <w:r>
+        <w:rPr>
+          <w:rFonts w:cstheme="minorHAnsi"/>
+          <w:b/>
+          <w:bCs/>
+          <w:szCs w:val="22"/>
+        </w:rPr>
+        <w:t>The Control:</w:t>
+      </w:r>
+      <w:r>
+        <w:rPr>
+          <w:rFonts w:cstheme="minorHAnsi"/>
+          <w:szCs w:val="22"/>
+        </w:rPr>
+        <w:t xml:space="preserve"> Content only goes live when an authorized user explicitly changes the status to true (Yes), usually by clicking a "Publish" button.</w:t>
+      </w:r>
+    </w:p>
+    <w:p>
+      <w:pPr>
+        <w:rPr>
+          <w:rFonts w:cstheme="minorHAnsi"/>
+          <w:szCs w:val="22"/>
+        </w:rPr>
+      </w:pPr>
+      <w:r>
+        <w:rPr>
+          <w:rFonts w:cstheme="minorHAnsi"/>
+          <w:szCs w:val="22"/>
+        </w:rPr>
+        <w:t>Without this concept, a website cannot support drafts, scheduled posting, or the ability to temporarily hide content without deleting it entirely.</w:t>
+      </w:r>
+    </w:p>
+    <w:p>
+      <w:pPr>
+        <w:rPr>
+          <w:rFonts w:cstheme="minorHAnsi"/>
+          <w:szCs w:val="22"/>
+        </w:rPr>
+      </w:pPr>
+    </w:p>
+    <w:p>
+      <w:pPr>
+        <w:rPr>
+          <w:rFonts w:cstheme="minorHAnsi"/>
+          <w:b/>
+          <w:bCs/>
+          <w:color w:val="FF0000"/>
+          <w:sz w:val="28"/>
+          <w:szCs w:val="28"/>
+          <w:u w:val="single"/>
+        </w:rPr>
+      </w:pPr>
+      <w:r>
+        <w:rPr>
+          <w:rFonts w:cstheme="minorHAnsi"/>
+          <w:b/>
+          <w:bCs/>
+          <w:color w:val="FF0000"/>
+          <w:sz w:val="28"/>
+          <w:szCs w:val="28"/>
+          <w:u w:val="single"/>
+        </w:rPr>
+        <w:lastRenderedPageBreak/>
+        <w:t>Protected $fillable vs protected $cast:</w:t>
+      </w:r>
+    </w:p>
+    <w:p>
+      <w:pPr>
+        <w:rPr>
+          <w:rFonts w:cstheme="minorHAnsi"/>
+          <w:b/>
+          <w:bCs/>
+          <w:color w:val="FF0000"/>
+          <w:sz w:val="28"/>
+          <w:szCs w:val="28"/>
+          <w:u w:val="single"/>
+        </w:rPr>
+      </w:pPr>
+      <w:r>
+        <w:rPr>
+          <w:rFonts w:cstheme="minorHAnsi"/>
+          <w:szCs w:val="22"/>
+        </w:rPr>
+        <w:t xml:space="preserve">These are two different tools in </w:t>
+      </w:r>
+      <w:proofErr w:type="spellStart"/>
+      <w:r>
+        <w:rPr>
+          <w:rFonts w:cstheme="minorHAnsi"/>
+          <w:szCs w:val="22"/>
+        </w:rPr>
+        <w:t>Laravel</w:t>
+      </w:r>
+      <w:proofErr w:type="spellEnd"/>
+      <w:r>
+        <w:rPr>
+          <w:rFonts w:cstheme="minorHAnsi"/>
+          <w:szCs w:val="22"/>
+        </w:rPr>
+        <w:t xml:space="preserve"> used to handle your database data.</w:t>
+      </w:r>
+    </w:p>
+    <w:p>
+      <w:pPr>
+        <w:rPr>
+          <w:rFonts w:cstheme="minorHAnsi"/>
+          <w:b/>
+          <w:bCs/>
+          <w:szCs w:val="22"/>
+        </w:rPr>
+      </w:pPr>
+      <w:r>
+        <w:rPr>
+          <w:rFonts w:cstheme="minorHAnsi"/>
+          <w:b/>
+          <w:bCs/>
+          <w:szCs w:val="22"/>
+        </w:rPr>
+        <w:t>$fillable is the Guard (Security)</w:t>
+      </w:r>
+    </w:p>
+    <w:p>
+      <w:pPr>
+        <w:pStyle w:val="ListParagraph"/>
+        <w:numPr>
+          <w:ilvl w:val="0"/>
+          <w:numId w:val="2"/>
+        </w:numPr>
+        <w:rPr>
+          <w:rFonts w:cstheme="minorHAnsi"/>
+          <w:szCs w:val="22"/>
+        </w:rPr>
+      </w:pPr>
+      <w:r>
+        <w:rPr>
+          <w:rFonts w:cstheme="minorHAnsi"/>
+          <w:b/>
+          <w:bCs/>
+          <w:szCs w:val="22"/>
+        </w:rPr>
+        <w:t>What it does:</w:t>
+      </w:r>
+      <w:r>
+        <w:rPr>
+          <w:rFonts w:cstheme="minorHAnsi"/>
+          <w:szCs w:val="22"/>
+        </w:rPr>
+        <w:t xml:space="preserve"> It decides what data can be saved.</w:t>
+      </w:r>
+    </w:p>
+    <w:p>
+      <w:pPr>
+        <w:pStyle w:val="ListParagraph"/>
+        <w:numPr>
+          <w:ilvl w:val="0"/>
+          <w:numId w:val="2"/>
+        </w:numPr>
+        <w:rPr>
+          <w:rFonts w:cstheme="minorHAnsi"/>
+          <w:szCs w:val="22"/>
+        </w:rPr>
+      </w:pPr>
+      <w:r>
+        <w:rPr>
+          <w:rFonts w:cstheme="minorHAnsi"/>
+          <w:b/>
+          <w:bCs/>
+          <w:szCs w:val="22"/>
+        </w:rPr>
+        <w:t xml:space="preserve">How it </w:t>
+      </w:r>
+      <w:proofErr w:type="spellStart"/>
+      <w:r>
+        <w:rPr>
+          <w:rFonts w:cstheme="minorHAnsi"/>
+          <w:b/>
+          <w:bCs/>
+          <w:szCs w:val="22"/>
+        </w:rPr>
+        <w:t>works</w:t>
+      </w:r>
+      <w:proofErr w:type="gramStart"/>
+      <w:r>
+        <w:rPr>
+          <w:rFonts w:cstheme="minorHAnsi"/>
+          <w:b/>
+          <w:bCs/>
+          <w:szCs w:val="22"/>
+        </w:rPr>
+        <w:t>:</w:t>
+      </w:r>
+      <w:r>
+        <w:rPr>
+          <w:rFonts w:cstheme="minorHAnsi"/>
+          <w:szCs w:val="22"/>
+        </w:rPr>
+        <w:t>It</w:t>
+      </w:r>
+      <w:proofErr w:type="spellEnd"/>
+      <w:proofErr w:type="gramEnd"/>
+      <w:r>
+        <w:rPr>
+          <w:rFonts w:cstheme="minorHAnsi"/>
+          <w:szCs w:val="22"/>
+        </w:rPr>
+        <w:t xml:space="preserve"> is a list of approved columns. If a field is not on this list, </w:t>
+      </w:r>
+      <w:proofErr w:type="spellStart"/>
+      <w:r>
+        <w:rPr>
+          <w:rFonts w:cstheme="minorHAnsi"/>
+          <w:szCs w:val="22"/>
+        </w:rPr>
+        <w:t>Laravel</w:t>
+      </w:r>
+      <w:proofErr w:type="spellEnd"/>
+      <w:r>
+        <w:rPr>
+          <w:rFonts w:cstheme="minorHAnsi"/>
+          <w:szCs w:val="22"/>
+        </w:rPr>
+        <w:t xml:space="preserve"> blocks it.</w:t>
+      </w:r>
+    </w:p>
+    <w:p>
+      <w:pPr>
+        <w:pStyle w:val="ListParagraph"/>
+        <w:numPr>
+          <w:ilvl w:val="0"/>
+          <w:numId w:val="2"/>
+        </w:numPr>
+        <w:rPr>
+          <w:rFonts w:cstheme="minorHAnsi"/>
+          <w:szCs w:val="22"/>
+        </w:rPr>
+      </w:pPr>
+      <w:r>
+        <w:rPr>
+          <w:rFonts w:cstheme="minorHAnsi"/>
+          <w:szCs w:val="22"/>
+        </w:rPr>
+        <w:t>Only the items listed inside $fillable can be changed or added all at once (which programmers call "mass assignment").</w:t>
+      </w:r>
+    </w:p>
+    <w:p>
+      <w:pPr>
+        <w:pStyle w:val="ListParagraph"/>
+        <w:numPr>
+          <w:ilvl w:val="0"/>
+          <w:numId w:val="2"/>
+        </w:numPr>
+        <w:rPr>
+          <w:rFonts w:cstheme="minorHAnsi"/>
+          <w:szCs w:val="22"/>
+        </w:rPr>
+      </w:pPr>
+      <w:r>
+        <w:rPr>
+          <w:rFonts w:cstheme="minorHAnsi"/>
+          <w:b/>
+          <w:bCs/>
+          <w:szCs w:val="22"/>
+        </w:rPr>
+        <w:t>Example:</w:t>
+      </w:r>
+      <w:r>
+        <w:rPr>
+          <w:rFonts w:cstheme="minorHAnsi"/>
+          <w:szCs w:val="22"/>
+        </w:rPr>
+        <w:t xml:space="preserve"> It stops users from secretly making </w:t>
+      </w:r>
+      <w:proofErr w:type="gramStart"/>
+      <w:r>
+        <w:rPr>
+          <w:rFonts w:cstheme="minorHAnsi"/>
+          <w:szCs w:val="22"/>
+        </w:rPr>
+        <w:t>themselves</w:t>
+      </w:r>
+      <w:proofErr w:type="gramEnd"/>
+      <w:r>
+        <w:rPr>
+          <w:rFonts w:cstheme="minorHAnsi"/>
+          <w:szCs w:val="22"/>
+        </w:rPr>
+        <w:t xml:space="preserve"> an admin.</w:t>
+      </w:r>
+    </w:p>
+    <w:p>
+      <w:pPr>
+        <w:rPr>
+          <w:rFonts w:cstheme="minorHAnsi"/>
+          <w:b/>
+          <w:bCs/>
+          <w:szCs w:val="22"/>
+        </w:rPr>
+      </w:pPr>
+      <w:r>
+        <w:rPr>
+          <w:rFonts w:cstheme="minorHAnsi"/>
+          <w:b/>
+          <w:bCs/>
+          <w:szCs w:val="22"/>
+        </w:rPr>
+        <w:t>$casts is the Translator (Formatting)</w:t>
+      </w:r>
+    </w:p>
+    <w:p>
+      <w:pPr>
+        <w:pStyle w:val="ListParagraph"/>
+        <w:numPr>
+          <w:ilvl w:val="0"/>
+          <w:numId w:val="3"/>
+        </w:numPr>
+        <w:rPr>
+          <w:rFonts w:cstheme="minorHAnsi"/>
+          <w:szCs w:val="22"/>
+        </w:rPr>
+      </w:pPr>
+      <w:r>
+        <w:rPr>
+          <w:rFonts w:cstheme="minorHAnsi"/>
+          <w:b/>
+          <w:bCs/>
+          <w:szCs w:val="22"/>
+        </w:rPr>
+        <w:t>What it does:</w:t>
+      </w:r>
+      <w:r>
+        <w:rPr>
+          <w:rFonts w:cstheme="minorHAnsi"/>
+          <w:szCs w:val="22"/>
+        </w:rPr>
+        <w:t xml:space="preserve"> It decides how the data looks.</w:t>
+      </w:r>
+    </w:p>
+    <w:p>
+      <w:pPr>
+        <w:pStyle w:val="ListParagraph"/>
+        <w:numPr>
+          <w:ilvl w:val="0"/>
+          <w:numId w:val="3"/>
+        </w:numPr>
+        <w:rPr>
+          <w:rFonts w:cstheme="minorHAnsi"/>
+          <w:szCs w:val="22"/>
+        </w:rPr>
+      </w:pPr>
+      <w:r>
+        <w:rPr>
+          <w:rFonts w:cstheme="minorHAnsi"/>
+          <w:b/>
+          <w:bCs/>
+          <w:szCs w:val="22"/>
+        </w:rPr>
+        <w:t>How it works:</w:t>
+      </w:r>
+      <w:r>
+        <w:rPr>
+          <w:rFonts w:cstheme="minorHAnsi"/>
+          <w:szCs w:val="22"/>
+        </w:rPr>
+        <w:t xml:space="preserve"> It converts database text or numbers into friendly formats for your code.</w:t>
+      </w:r>
+    </w:p>
+    <w:p>
+      <w:pPr>
+        <w:pStyle w:val="ListParagraph"/>
+        <w:numPr>
+          <w:ilvl w:val="0"/>
+          <w:numId w:val="3"/>
+        </w:numPr>
+        <w:rPr>
+          <w:rFonts w:cstheme="minorHAnsi"/>
+          <w:szCs w:val="22"/>
+        </w:rPr>
+      </w:pPr>
+      <w:r>
+        <w:rPr>
+          <w:rFonts w:cstheme="minorHAnsi"/>
+          <w:b/>
+          <w:bCs/>
+          <w:szCs w:val="22"/>
+        </w:rPr>
+        <w:t>Example:</w:t>
+      </w:r>
+      <w:r>
+        <w:rPr>
+          <w:rFonts w:cstheme="minorHAnsi"/>
+          <w:szCs w:val="22"/>
+        </w:rPr>
+        <w:t xml:space="preserve"> It automatically turns a database 1 or 0 into a clean true or false.</w:t>
+      </w:r>
+    </w:p>
+    <w:p>
+      <w:pPr>
+        <w:pStyle w:val="ListParagraph"/>
+        <w:numPr>
+          <w:ilvl w:val="0"/>
+          <w:numId w:val="3"/>
+        </w:numPr>
+        <w:rPr>
+          <w:rFonts w:cstheme="minorHAnsi"/>
+          <w:szCs w:val="22"/>
+        </w:rPr>
+      </w:pPr>
+      <w:r>
+        <w:rPr>
+          <w:rFonts w:cstheme="minorHAnsi"/>
+          <w:szCs w:val="22"/>
+        </w:rPr>
+        <w:t>This property is a utility tool that automatically transforms raw database data into specific PHP data types when you access them, and converts them back when saving</w:t>
+      </w:r>
+    </w:p>
+    <w:p>
+      <w:pPr>
+        <w:pStyle w:val="ListParagraph"/>
+        <w:numPr>
+          <w:ilvl w:val="0"/>
+          <w:numId w:val="3"/>
+        </w:numPr>
+        <w:rPr>
+          <w:rFonts w:cstheme="minorHAnsi"/>
+          <w:szCs w:val="22"/>
+        </w:rPr>
+      </w:pPr>
+      <w:r>
+        <w:rPr>
+          <w:rFonts w:cstheme="minorHAnsi"/>
+          <w:b/>
+          <w:bCs/>
+          <w:szCs w:val="22"/>
+        </w:rPr>
+        <w:t>Why it matters:</w:t>
+      </w:r>
+      <w:r>
+        <w:rPr>
+          <w:rFonts w:cstheme="minorHAnsi"/>
+          <w:szCs w:val="22"/>
+        </w:rPr>
+        <w:t xml:space="preserve"> Databases often store </w:t>
+      </w:r>
+      <w:proofErr w:type="spellStart"/>
+      <w:r>
+        <w:rPr>
+          <w:rFonts w:cstheme="minorHAnsi"/>
+          <w:szCs w:val="22"/>
+        </w:rPr>
+        <w:t>booleans</w:t>
+      </w:r>
+      <w:proofErr w:type="spellEnd"/>
+      <w:r>
+        <w:rPr>
+          <w:rFonts w:cstheme="minorHAnsi"/>
+          <w:szCs w:val="22"/>
+        </w:rPr>
+        <w:t xml:space="preserve"> as integers (0 or 1) or JSON as plain strings. Casting saves you from manually parsing data every time.</w:t>
+      </w:r>
+    </w:p>
+    <w:p>
+      <w:pPr>
+        <w:rPr>
+          <w:rFonts w:cstheme="minorHAnsi"/>
+          <w:szCs w:val="22"/>
+        </w:rPr>
+      </w:pPr>
+      <w:proofErr w:type="gramStart"/>
+      <w:r>
+        <w:rPr>
+          <w:rFonts w:cstheme="minorHAnsi"/>
+          <w:szCs w:val="22"/>
+        </w:rPr>
+        <w:t xml:space="preserve">In </w:t>
+      </w:r>
+      <w:proofErr w:type="spellStart"/>
+      <w:r>
+        <w:rPr>
+          <w:rFonts w:cstheme="minorHAnsi"/>
+          <w:szCs w:val="22"/>
+        </w:rPr>
+        <w:t>ShortUse</w:t>
+      </w:r>
+      <w:proofErr w:type="spellEnd"/>
+      <w:r>
+        <w:rPr>
+          <w:rFonts w:cstheme="minorHAnsi"/>
+          <w:szCs w:val="22"/>
+        </w:rPr>
+        <w:t xml:space="preserve"> $fillable to stop hackers.</w:t>
+      </w:r>
+      <w:proofErr w:type="gramEnd"/>
+    </w:p>
+    <w:p>
+      <w:pPr>
+        <w:rPr>
+          <w:rFonts w:cstheme="minorHAnsi"/>
+          <w:szCs w:val="22"/>
+        </w:rPr>
+      </w:pPr>
+      <w:r>
+        <w:rPr>
+          <w:rFonts w:cstheme="minorHAnsi"/>
+          <w:szCs w:val="22"/>
+        </w:rPr>
+        <w:t>Use $casts to make data easy to read.</w:t>
+      </w:r>
+    </w:p>
+    <w:p>
+      <w:pPr>
+        <w:rPr>
+          <w:rFonts w:cstheme="minorHAnsi"/>
+          <w:szCs w:val="22"/>
+        </w:rPr>
+      </w:pPr>
+    </w:p>
+    <w:p>
+      <w:pPr>
+        <w:rPr>
+          <w:rFonts w:cstheme="minorHAnsi"/>
+          <w:color w:val="FF0000"/>
+          <w:szCs w:val="22"/>
+        </w:rPr>
+      </w:pPr>
+      <w:r>
+        <w:rPr>
+          <w:rFonts w:cstheme="minorHAnsi"/>
+          <w:b/>
+          <w:bCs/>
+          <w:color w:val="FF0000"/>
+          <w:szCs w:val="22"/>
+          <w:u w:val="single"/>
+        </w:rPr>
+        <w:t>Slug:</w:t>
+      </w:r>
+    </w:p>
+    <w:p>
+      <w:pPr>
+        <w:rPr>
+          <w:rFonts w:cstheme="minorHAnsi"/>
+          <w:szCs w:val="22"/>
+        </w:rPr>
+      </w:pPr>
+      <w:r>
+        <w:rPr>
+          <w:rFonts w:cstheme="minorHAnsi"/>
+          <w:szCs w:val="22"/>
+        </w:rPr>
+        <w:t>A slug is the part of a web address (URL) that identifies a specific page in easy-to-read words. It is always lowercase, uses hyphens instead of spaces, and contains no special characters.</w:t>
+      </w:r>
+    </w:p>
+    <w:p>
+      <w:pPr>
+        <w:rPr>
+          <w:rFonts w:cstheme="minorHAnsi"/>
+          <w:b/>
+          <w:bCs/>
+          <w:szCs w:val="22"/>
+        </w:rPr>
+      </w:pPr>
+      <w:r>
+        <w:rPr>
+          <w:rFonts w:cstheme="minorHAnsi"/>
+          <w:b/>
+          <w:bCs/>
+          <w:szCs w:val="22"/>
+        </w:rPr>
+        <w:t>Uses of a Slug</w:t>
+      </w:r>
+      <w:r>
+        <w:rPr>
+          <w:rFonts w:cstheme="minorHAnsi"/>
+          <w:b/>
+          <w:bCs/>
+          <w:szCs w:val="22"/>
+        </w:rPr>
+        <w:t>:</w:t>
+      </w:r>
+    </w:p>
+    <w:p>
+      <w:pPr>
+        <w:pStyle w:val="ListParagraph"/>
+        <w:numPr>
+          <w:ilvl w:val="0"/>
+          <w:numId w:val="4"/>
+        </w:numPr>
+        <w:rPr>
+          <w:rFonts w:cstheme="minorHAnsi"/>
+          <w:b/>
+          <w:bCs/>
+          <w:szCs w:val="22"/>
+        </w:rPr>
+      </w:pPr>
+      <w:r>
+        <w:rPr>
+          <w:rFonts w:cstheme="minorHAnsi"/>
+          <w:b/>
+          <w:bCs/>
+          <w:szCs w:val="22"/>
+        </w:rPr>
+        <w:t xml:space="preserve">Better </w:t>
+      </w:r>
+      <w:proofErr w:type="spellStart"/>
+      <w:r>
+        <w:rPr>
+          <w:rFonts w:cstheme="minorHAnsi"/>
+          <w:b/>
+          <w:bCs/>
+          <w:szCs w:val="22"/>
+        </w:rPr>
+        <w:t>Reading</w:t>
+      </w:r>
+      <w:proofErr w:type="gramStart"/>
+      <w:r>
+        <w:rPr>
+          <w:rFonts w:cstheme="minorHAnsi"/>
+          <w:b/>
+          <w:bCs/>
+          <w:szCs w:val="22"/>
+        </w:rPr>
+        <w:t>:</w:t>
+      </w:r>
+      <w:r>
+        <w:rPr>
+          <w:rFonts w:cstheme="minorHAnsi"/>
+          <w:szCs w:val="22"/>
+        </w:rPr>
+        <w:t>It</w:t>
+      </w:r>
+      <w:proofErr w:type="spellEnd"/>
+      <w:proofErr w:type="gramEnd"/>
+      <w:r>
+        <w:rPr>
+          <w:rFonts w:cstheme="minorHAnsi"/>
+          <w:szCs w:val="22"/>
+        </w:rPr>
+        <w:t xml:space="preserve"> tells human visitors exactly what the page is about before they click it.</w:t>
+      </w:r>
+    </w:p>
+    <w:p>
+      <w:pPr>
+        <w:pStyle w:val="ListParagraph"/>
+        <w:numPr>
+          <w:ilvl w:val="0"/>
+          <w:numId w:val="4"/>
+        </w:numPr>
+        <w:rPr>
+          <w:rFonts w:cstheme="minorHAnsi"/>
+          <w:b/>
+          <w:bCs/>
+          <w:szCs w:val="22"/>
+        </w:rPr>
+      </w:pPr>
+      <w:r>
+        <w:rPr>
+          <w:rFonts w:cstheme="minorHAnsi"/>
+          <w:b/>
+          <w:bCs/>
+          <w:szCs w:val="22"/>
+        </w:rPr>
+        <w:t>SEO Boost:</w:t>
+      </w:r>
+      <w:r>
+        <w:rPr>
+          <w:rFonts w:cstheme="minorHAnsi"/>
+          <w:szCs w:val="22"/>
+        </w:rPr>
+        <w:t xml:space="preserve"> Search engines like Google use the words in the slug to understand and rank your page.</w:t>
+      </w:r>
+    </w:p>
+    <w:p>
+      <w:pPr>
+        <w:pStyle w:val="ListParagraph"/>
+        <w:numPr>
+          <w:ilvl w:val="0"/>
+          <w:numId w:val="4"/>
+        </w:numPr>
+        <w:rPr>
+          <w:rFonts w:cstheme="minorHAnsi"/>
+          <w:b/>
+          <w:bCs/>
+          <w:szCs w:val="22"/>
+        </w:rPr>
+      </w:pPr>
+      <w:r>
+        <w:rPr>
+          <w:rFonts w:cstheme="minorHAnsi"/>
+          <w:b/>
+          <w:bCs/>
+          <w:szCs w:val="22"/>
+        </w:rPr>
+        <w:t>Cleaner Links:</w:t>
+      </w:r>
+      <w:r>
+        <w:rPr>
+          <w:rFonts w:cstheme="minorHAnsi"/>
+          <w:szCs w:val="22"/>
+        </w:rPr>
+        <w:t xml:space="preserve"> It replaces ugly database ID numbers with clear text.</w:t>
+      </w:r>
+    </w:p>
+    <w:p>
+      <w:pPr>
+        <w:pStyle w:val="ListParagraph"/>
+        <w:numPr>
+          <w:ilvl w:val="0"/>
+          <w:numId w:val="4"/>
+        </w:numPr>
+        <w:rPr>
+          <w:rFonts w:cstheme="minorHAnsi"/>
+          <w:b/>
+          <w:bCs/>
+          <w:szCs w:val="22"/>
+        </w:rPr>
+      </w:pPr>
+      <w:r>
+        <w:rPr>
+          <w:rFonts w:cstheme="minorHAnsi"/>
+          <w:b/>
+          <w:bCs/>
+          <w:szCs w:val="22"/>
+        </w:rPr>
+        <w:t>Examples</w:t>
+      </w:r>
+    </w:p>
+    <w:p>
+      <w:pPr>
+        <w:pStyle w:val="ListParagraph"/>
+        <w:rPr>
+          <w:rFonts w:cstheme="minorHAnsi"/>
+          <w:b/>
+          <w:bCs/>
+          <w:szCs w:val="22"/>
+        </w:rPr>
+      </w:pPr>
+      <w:r>
+        <w:rPr>
+          <w:rFonts w:cstheme="minorHAnsi"/>
+          <w:b/>
+          <w:bCs/>
+          <w:szCs w:val="22"/>
+        </w:rPr>
+        <w:t>(Blog Post)</w:t>
+      </w:r>
+    </w:p>
+    <w:p>
+      <w:pPr>
+        <w:pStyle w:val="ListParagraph"/>
+        <w:ind w:firstLine="720"/>
+        <w:rPr>
+          <w:rFonts w:cstheme="minorHAnsi"/>
+          <w:szCs w:val="22"/>
+        </w:rPr>
+      </w:pPr>
+      <w:r>
+        <w:rPr>
+          <w:rFonts w:cstheme="minorHAnsi"/>
+          <w:b/>
+          <w:bCs/>
+          <w:szCs w:val="22"/>
+        </w:rPr>
+        <w:t>Messy URL</w:t>
+      </w:r>
+      <w:proofErr w:type="gramStart"/>
+      <w:r>
+        <w:rPr>
+          <w:rFonts w:cstheme="minorHAnsi"/>
+          <w:szCs w:val="22"/>
+        </w:rPr>
+        <w:t>: :</w:t>
+      </w:r>
+      <w:proofErr w:type="gramEnd"/>
+      <w:r>
+        <w:rPr>
+          <w:rFonts w:cstheme="minorHAnsi"/>
+          <w:szCs w:val="22"/>
+        </w:rPr>
+        <w:t>//mysite.com</w:t>
+      </w:r>
+    </w:p>
+    <w:p>
+      <w:pPr>
+        <w:pStyle w:val="ListParagraph"/>
+        <w:ind w:firstLine="720"/>
+        <w:rPr>
+          <w:rFonts w:cstheme="minorHAnsi"/>
+          <w:szCs w:val="22"/>
+        </w:rPr>
+      </w:pPr>
+      <w:r>
+        <w:rPr>
+          <w:rFonts w:cstheme="minorHAnsi"/>
+          <w:b/>
+          <w:bCs/>
+          <w:szCs w:val="22"/>
+        </w:rPr>
+        <w:t>Slug:</w:t>
+      </w:r>
+      <w:r>
+        <w:rPr>
+          <w:rFonts w:cstheme="minorHAnsi"/>
+          <w:szCs w:val="22"/>
+        </w:rPr>
+        <w:t xml:space="preserve"> how-to-learn-</w:t>
+      </w:r>
+      <w:proofErr w:type="spellStart"/>
+      <w:r>
+        <w:rPr>
+          <w:rFonts w:cstheme="minorHAnsi"/>
+          <w:szCs w:val="22"/>
+        </w:rPr>
+        <w:t>laravel</w:t>
+      </w:r>
+      <w:proofErr w:type="spellEnd"/>
+    </w:p>
+    <w:p>
+      <w:pPr>
+        <w:rPr>
+          <w:rFonts w:cstheme="minorHAnsi"/>
+          <w:b/>
+          <w:bCs/>
+          <w:szCs w:val="22"/>
+        </w:rPr>
+      </w:pPr>
+      <w:r>
+        <w:rPr>
+          <w:rFonts w:cstheme="minorHAnsi"/>
+          <w:b/>
+          <w:bCs/>
+          <w:szCs w:val="22"/>
+        </w:rPr>
+        <w:t xml:space="preserve">Q: How to generate a slug in </w:t>
+      </w:r>
+      <w:proofErr w:type="spellStart"/>
+      <w:r>
+        <w:rPr>
+          <w:rFonts w:cstheme="minorHAnsi"/>
+          <w:b/>
+          <w:bCs/>
+          <w:szCs w:val="22"/>
+        </w:rPr>
+        <w:t>laravel</w:t>
+      </w:r>
+      <w:proofErr w:type="spellEnd"/>
+      <w:r>
+        <w:rPr>
+          <w:rFonts w:cstheme="minorHAnsi"/>
+          <w:b/>
+          <w:bCs/>
+          <w:szCs w:val="22"/>
+        </w:rPr>
+        <w:t xml:space="preserve">, filament and in </w:t>
+      </w:r>
+      <w:proofErr w:type="spellStart"/>
+      <w:r>
+        <w:rPr>
+          <w:rFonts w:cstheme="minorHAnsi"/>
+          <w:b/>
+          <w:bCs/>
+          <w:szCs w:val="22"/>
+        </w:rPr>
+        <w:t>javascript</w:t>
+      </w:r>
+      <w:proofErr w:type="spellEnd"/>
+      <w:r>
+        <w:rPr>
+          <w:rFonts w:cstheme="minorHAnsi"/>
+          <w:b/>
+          <w:bCs/>
+          <w:szCs w:val="22"/>
+        </w:rPr>
+        <w:t>?</w:t>
+      </w:r>
+    </w:p>
+    <w:p>
+      <w:pPr>
+        <w:rPr>
+          <w:rFonts w:cstheme="minorHAnsi"/>
+          <w:b/>
+          <w:bCs/>
+          <w:szCs w:val="22"/>
+        </w:rPr>
+      </w:pPr>
+      <w:proofErr w:type="spellStart"/>
+      <w:r>
+        <w:rPr>
+          <w:rFonts w:cstheme="minorHAnsi"/>
+          <w:b/>
+          <w:bCs/>
+          <w:szCs w:val="22"/>
+        </w:rPr>
+        <w:t>Ans</w:t>
+      </w:r>
+      <w:proofErr w:type="spellEnd"/>
+      <w:r>
+        <w:rPr>
+          <w:rFonts w:cstheme="minorHAnsi"/>
+          <w:b/>
+          <w:bCs/>
+          <w:szCs w:val="22"/>
+        </w:rPr>
+        <w:t xml:space="preserve">: </w:t>
+      </w:r>
+      <w:proofErr w:type="spellStart"/>
+      <w:r>
+        <w:rPr>
+          <w:rFonts w:cstheme="minorHAnsi"/>
+          <w:b/>
+          <w:bCs/>
+          <w:color w:val="FF0000"/>
+          <w:sz w:val="24"/>
+          <w:szCs w:val="24"/>
+          <w:u w:val="single"/>
+        </w:rPr>
+        <w:t>Laravel</w:t>
+      </w:r>
+      <w:proofErr w:type="spellEnd"/>
+      <w:r>
+        <w:rPr>
+          <w:rFonts w:cstheme="minorHAnsi"/>
+          <w:b/>
+          <w:bCs/>
+          <w:color w:val="FF0000"/>
+          <w:sz w:val="24"/>
+          <w:szCs w:val="24"/>
+          <w:u w:val="single"/>
+        </w:rPr>
+        <w:t>:</w:t>
+      </w:r>
+    </w:p>
+    <w:p>
+      <w:pPr>
+        <w:rPr>
+          <w:rFonts w:cstheme="minorHAnsi"/>
+          <w:szCs w:val="22"/>
+        </w:rPr>
+      </w:pPr>
+      <w:proofErr w:type="spellStart"/>
+      <w:r>
+        <w:rPr>
+          <w:rFonts w:cstheme="minorHAnsi"/>
+          <w:szCs w:val="22"/>
+        </w:rPr>
+        <w:t>Laravel</w:t>
+      </w:r>
+      <w:proofErr w:type="spellEnd"/>
+      <w:r>
+        <w:rPr>
+          <w:rFonts w:cstheme="minorHAnsi"/>
+          <w:szCs w:val="22"/>
+        </w:rPr>
+        <w:t xml:space="preserve"> has a built-in function called </w:t>
+      </w:r>
+      <w:proofErr w:type="spellStart"/>
+      <w:r>
+        <w:rPr>
+          <w:rFonts w:cstheme="minorHAnsi"/>
+          <w:szCs w:val="22"/>
+        </w:rPr>
+        <w:t>Str</w:t>
+      </w:r>
+      <w:proofErr w:type="spellEnd"/>
+      <w:r>
+        <w:rPr>
+          <w:rFonts w:cstheme="minorHAnsi"/>
+          <w:szCs w:val="22"/>
+        </w:rPr>
+        <w:t>::</w:t>
+      </w:r>
+      <w:proofErr w:type="gramStart"/>
+      <w:r>
+        <w:rPr>
+          <w:rFonts w:cstheme="minorHAnsi"/>
+          <w:szCs w:val="22"/>
+        </w:rPr>
+        <w:t>slug(</w:t>
+      </w:r>
+      <w:proofErr w:type="gramEnd"/>
+      <w:r>
+        <w:rPr>
+          <w:rFonts w:cstheme="minorHAnsi"/>
+          <w:szCs w:val="22"/>
+        </w:rPr>
+        <w:t>) that does all the work for you.</w:t>
+      </w:r>
+    </w:p>
+    <w:p>
+      <w:pPr>
+        <w:rPr>
+          <w:rFonts w:cstheme="minorHAnsi"/>
+          <w:b/>
+          <w:bCs/>
+          <w:szCs w:val="22"/>
+        </w:rPr>
+      </w:pPr>
+      <w:r>
+        <w:rPr>
+          <w:rFonts w:cstheme="minorHAnsi"/>
+          <w:b/>
+          <w:bCs/>
+          <w:szCs w:val="22"/>
+        </w:rPr>
+        <w:lastRenderedPageBreak/>
+        <w:t>The Code:</w:t>
+      </w:r>
+    </w:p>
+    <w:p>
+      <w:pPr>
+        <w:rPr>
+          <w:rFonts w:cstheme="minorHAnsi"/>
+          <w:b/>
+          <w:bCs/>
+          <w:color w:val="548DD4" w:themeColor="text2" w:themeTint="99"/>
+          <w:szCs w:val="22"/>
+        </w:rPr>
+      </w:pPr>
+      <w:proofErr w:type="gramStart"/>
+      <w:r>
+        <w:rPr>
+          <w:rFonts w:cstheme="minorHAnsi"/>
+          <w:b/>
+          <w:bCs/>
+          <w:color w:val="548DD4" w:themeColor="text2" w:themeTint="99"/>
+          <w:szCs w:val="22"/>
+        </w:rPr>
+        <w:t>use</w:t>
+      </w:r>
+      <w:proofErr w:type="gramEnd"/>
+      <w:r>
+        <w:rPr>
+          <w:rFonts w:cstheme="minorHAnsi"/>
+          <w:b/>
+          <w:bCs/>
+          <w:color w:val="548DD4" w:themeColor="text2" w:themeTint="99"/>
+          <w:szCs w:val="22"/>
+        </w:rPr>
+        <w:t xml:space="preserve"> Illuminate\Support\</w:t>
+      </w:r>
+      <w:proofErr w:type="spellStart"/>
+      <w:r>
+        <w:rPr>
+          <w:rFonts w:cstheme="minorHAnsi"/>
+          <w:b/>
+          <w:bCs/>
+          <w:color w:val="548DD4" w:themeColor="text2" w:themeTint="99"/>
+          <w:szCs w:val="22"/>
+        </w:rPr>
+        <w:t>Str</w:t>
+      </w:r>
+      <w:proofErr w:type="spellEnd"/>
+      <w:r>
+        <w:rPr>
+          <w:rFonts w:cstheme="minorHAnsi"/>
+          <w:b/>
+          <w:bCs/>
+          <w:color w:val="548DD4" w:themeColor="text2" w:themeTint="99"/>
+          <w:szCs w:val="22"/>
+        </w:rPr>
+        <w:t>;</w:t>
+      </w:r>
+    </w:p>
+    <w:p>
+      <w:pPr>
+        <w:rPr>
+          <w:rFonts w:cstheme="minorHAnsi"/>
+          <w:b/>
+          <w:bCs/>
+          <w:color w:val="548DD4" w:themeColor="text2" w:themeTint="99"/>
+          <w:szCs w:val="22"/>
+        </w:rPr>
+      </w:pPr>
+      <w:r>
+        <w:rPr>
+          <w:rFonts w:cstheme="minorHAnsi"/>
+          <w:b/>
+          <w:bCs/>
+          <w:color w:val="548DD4" w:themeColor="text2" w:themeTint="99"/>
+          <w:szCs w:val="22"/>
+        </w:rPr>
+        <w:t>$title = "How to Generate a Slug! 2026";</w:t>
+      </w:r>
+    </w:p>
+    <w:p>
+      <w:pPr>
+        <w:rPr>
+          <w:rFonts w:cstheme="minorHAnsi"/>
+          <w:b/>
+          <w:bCs/>
+          <w:color w:val="548DD4" w:themeColor="text2" w:themeTint="99"/>
+          <w:szCs w:val="22"/>
+        </w:rPr>
+      </w:pPr>
+      <w:r>
+        <w:rPr>
+          <w:rFonts w:cstheme="minorHAnsi"/>
+          <w:b/>
+          <w:bCs/>
+          <w:color w:val="548DD4" w:themeColor="text2" w:themeTint="99"/>
+          <w:szCs w:val="22"/>
+        </w:rPr>
+        <w:t xml:space="preserve">$slug = </w:t>
+      </w:r>
+      <w:proofErr w:type="spellStart"/>
+      <w:r>
+        <w:rPr>
+          <w:rFonts w:cstheme="minorHAnsi"/>
+          <w:b/>
+          <w:bCs/>
+          <w:color w:val="548DD4" w:themeColor="text2" w:themeTint="99"/>
+          <w:szCs w:val="22"/>
+        </w:rPr>
+        <w:t>Str</w:t>
+      </w:r>
+      <w:proofErr w:type="spellEnd"/>
+      <w:r>
+        <w:rPr>
+          <w:rFonts w:cstheme="minorHAnsi"/>
+          <w:b/>
+          <w:bCs/>
+          <w:color w:val="548DD4" w:themeColor="text2" w:themeTint="99"/>
+          <w:szCs w:val="22"/>
+        </w:rPr>
+        <w:t>::</w:t>
+      </w:r>
+      <w:proofErr w:type="gramStart"/>
+      <w:r>
+        <w:rPr>
+          <w:rFonts w:cstheme="minorHAnsi"/>
+          <w:b/>
+          <w:bCs/>
+          <w:color w:val="548DD4" w:themeColor="text2" w:themeTint="99"/>
+          <w:szCs w:val="22"/>
+        </w:rPr>
+        <w:t>slug(</w:t>
+      </w:r>
+      <w:proofErr w:type="gramEnd"/>
+      <w:r>
+        <w:rPr>
+          <w:rFonts w:cstheme="minorHAnsi"/>
+          <w:b/>
+          <w:bCs/>
+          <w:color w:val="548DD4" w:themeColor="text2" w:themeTint="99"/>
+          <w:szCs w:val="22"/>
+        </w:rPr>
+        <w:t>$title, '-');</w:t>
+      </w:r>
+    </w:p>
+    <w:p>
+      <w:pPr>
+        <w:rPr>
+          <w:rFonts w:cstheme="minorHAnsi"/>
+          <w:b/>
+          <w:bCs/>
+          <w:color w:val="548DD4" w:themeColor="text2" w:themeTint="99"/>
+          <w:szCs w:val="22"/>
+        </w:rPr>
+      </w:pPr>
+      <w:proofErr w:type="gramStart"/>
+      <w:r>
+        <w:rPr>
+          <w:rFonts w:cstheme="minorHAnsi"/>
+          <w:b/>
+          <w:bCs/>
+          <w:color w:val="548DD4" w:themeColor="text2" w:themeTint="99"/>
+          <w:szCs w:val="22"/>
+        </w:rPr>
+        <w:t>echo</w:t>
+      </w:r>
+      <w:proofErr w:type="gramEnd"/>
+      <w:r>
+        <w:rPr>
+          <w:rFonts w:cstheme="minorHAnsi"/>
+          <w:b/>
+          <w:bCs/>
+          <w:color w:val="548DD4" w:themeColor="text2" w:themeTint="99"/>
+          <w:szCs w:val="22"/>
+        </w:rPr>
+        <w:t xml:space="preserve"> $slug; </w:t>
+      </w:r>
+    </w:p>
+    <w:p>
+      <w:pPr>
+        <w:rPr>
+          <w:rFonts w:cstheme="minorHAnsi"/>
+          <w:b/>
+          <w:bCs/>
+          <w:szCs w:val="22"/>
+        </w:rPr>
+      </w:pPr>
+      <w:r>
+        <w:rPr>
+          <w:rFonts w:cstheme="minorHAnsi"/>
+          <w:b/>
+          <w:bCs/>
+          <w:szCs w:val="22"/>
+        </w:rPr>
+        <w:t>// Output: how-to-generate-a-slug-2026</w:t>
+      </w:r>
+    </w:p>
+    <w:p>
+      <w:pPr>
+        <w:rPr>
+          <w:rFonts w:cstheme="minorHAnsi"/>
+          <w:b/>
+          <w:bCs/>
+          <w:color w:val="FF0000"/>
+          <w:sz w:val="24"/>
+          <w:szCs w:val="24"/>
+          <w:u w:val="single"/>
+        </w:rPr>
+      </w:pPr>
+      <w:r>
+        <w:rPr>
+          <w:rFonts w:cstheme="minorHAnsi"/>
+          <w:b/>
+          <w:bCs/>
+          <w:color w:val="FF0000"/>
+          <w:sz w:val="24"/>
+          <w:szCs w:val="24"/>
+          <w:u w:val="single"/>
+        </w:rPr>
+        <w:t>In Filament:</w:t>
+      </w:r>
+    </w:p>
+    <w:p>
+      <w:pPr>
+        <w:rPr>
+          <w:rFonts w:cstheme="minorHAnsi"/>
+          <w:szCs w:val="22"/>
+        </w:rPr>
+      </w:pPr>
+      <w:r>
+        <w:rPr>
+          <w:rFonts w:cstheme="minorHAnsi"/>
+          <w:szCs w:val="22"/>
+        </w:rPr>
+        <w:t>If you want the slug to generate automatically in the background while an admin types a title, configure it inside your Filament Resource form schema.</w:t>
+      </w:r>
+    </w:p>
+    <w:p>
+      <w:pPr>
+        <w:rPr>
+          <w:rFonts w:cstheme="minorHAnsi"/>
+          <w:szCs w:val="22"/>
+        </w:rPr>
+      </w:pPr>
+      <w:r>
+        <w:rPr>
+          <w:rFonts w:cstheme="minorHAnsi"/>
+          <w:szCs w:val="22"/>
+        </w:rPr>
+        <w:t>The Code:</w:t>
+      </w:r>
+    </w:p>
+    <w:p>
+      <w:pPr>
+        <w:rPr>
+          <w:rFonts w:cstheme="minorHAnsi"/>
+          <w:color w:val="548DD4" w:themeColor="text2" w:themeTint="99"/>
+          <w:szCs w:val="22"/>
+        </w:rPr>
+      </w:pPr>
+      <w:proofErr w:type="gramStart"/>
+      <w:r>
+        <w:rPr>
+          <w:rFonts w:cstheme="minorHAnsi"/>
+          <w:color w:val="548DD4" w:themeColor="text2" w:themeTint="99"/>
+          <w:szCs w:val="22"/>
+        </w:rPr>
+        <w:t>use</w:t>
+      </w:r>
+      <w:proofErr w:type="gramEnd"/>
+      <w:r>
+        <w:rPr>
+          <w:rFonts w:cstheme="minorHAnsi"/>
+          <w:color w:val="548DD4" w:themeColor="text2" w:themeTint="99"/>
+          <w:szCs w:val="22"/>
+        </w:rPr>
+        <w:t xml:space="preserve"> Filament\Forms\Components\</w:t>
+      </w:r>
+      <w:proofErr w:type="spellStart"/>
+      <w:r>
+        <w:rPr>
+          <w:rFonts w:cstheme="minorHAnsi"/>
+          <w:color w:val="548DD4" w:themeColor="text2" w:themeTint="99"/>
+          <w:szCs w:val="22"/>
+        </w:rPr>
+        <w:t>TextInput;</w:t>
+      </w:r>
+      <w:proofErr w:type="spellEnd"/>
+    </w:p>
+    <w:p>
+      <w:pPr>
+        <w:rPr>
+          <w:rFonts w:cstheme="minorHAnsi"/>
+          <w:color w:val="548DD4" w:themeColor="text2" w:themeTint="99"/>
+          <w:szCs w:val="22"/>
+        </w:rPr>
+      </w:pPr>
+      <w:proofErr w:type="gramStart"/>
+      <w:r>
+        <w:rPr>
+          <w:rFonts w:cstheme="minorHAnsi"/>
+          <w:color w:val="548DD4" w:themeColor="text2" w:themeTint="99"/>
+          <w:szCs w:val="22"/>
+        </w:rPr>
+        <w:t>use</w:t>
+      </w:r>
+      <w:proofErr w:type="gramEnd"/>
+      <w:r>
+        <w:rPr>
+          <w:rFonts w:cstheme="minorHAnsi"/>
+          <w:color w:val="548DD4" w:themeColor="text2" w:themeTint="99"/>
+          <w:szCs w:val="22"/>
+        </w:rPr>
+        <w:t xml:space="preserve"> Illuminate\Support\</w:t>
+      </w:r>
+      <w:proofErr w:type="spellStart"/>
+      <w:r>
+        <w:rPr>
+          <w:rFonts w:cstheme="minorHAnsi"/>
+          <w:color w:val="548DD4" w:themeColor="text2" w:themeTint="99"/>
+          <w:szCs w:val="22"/>
+        </w:rPr>
+        <w:t>Str</w:t>
+      </w:r>
+      <w:proofErr w:type="spellEnd"/>
+      <w:r>
+        <w:rPr>
+          <w:rFonts w:cstheme="minorHAnsi"/>
+          <w:color w:val="548DD4" w:themeColor="text2" w:themeTint="99"/>
+          <w:szCs w:val="22"/>
+        </w:rPr>
+        <w:t>;</w:t>
+      </w:r>
+    </w:p>
+    <w:p>
+      <w:pPr>
+        <w:rPr>
+          <w:rFonts w:cstheme="minorHAnsi"/>
+          <w:color w:val="548DD4" w:themeColor="text2" w:themeTint="99"/>
+          <w:szCs w:val="22"/>
+        </w:rPr>
+      </w:pPr>
+      <w:proofErr w:type="spellStart"/>
+      <w:r>
+        <w:rPr>
+          <w:rFonts w:cstheme="minorHAnsi"/>
+          <w:color w:val="548DD4" w:themeColor="text2" w:themeTint="99"/>
+          <w:szCs w:val="22"/>
+        </w:rPr>
+        <w:t>TextInput</w:t>
+      </w:r>
+      <w:proofErr w:type="spellEnd"/>
+      <w:r>
+        <w:rPr>
+          <w:rFonts w:cstheme="minorHAnsi"/>
+          <w:color w:val="548DD4" w:themeColor="text2" w:themeTint="99"/>
+          <w:szCs w:val="22"/>
+        </w:rPr>
+        <w:t>::</w:t>
+      </w:r>
+      <w:proofErr w:type="gramStart"/>
+      <w:r>
+        <w:rPr>
+          <w:rFonts w:cstheme="minorHAnsi"/>
+          <w:color w:val="548DD4" w:themeColor="text2" w:themeTint="99"/>
+          <w:szCs w:val="22"/>
+        </w:rPr>
+        <w:t>make(</w:t>
+      </w:r>
+      <w:proofErr w:type="gramEnd"/>
+      <w:r>
+        <w:rPr>
+          <w:rFonts w:cstheme="minorHAnsi"/>
+          <w:color w:val="548DD4" w:themeColor="text2" w:themeTint="99"/>
+          <w:szCs w:val="22"/>
+        </w:rPr>
+        <w:t>'title')</w:t>
+      </w:r>
+    </w:p>
+    <w:p>
+      <w:pPr>
+        <w:rPr>
+          <w:rFonts w:cstheme="minorHAnsi"/>
+          <w:color w:val="548DD4" w:themeColor="text2" w:themeTint="99"/>
+          <w:szCs w:val="22"/>
+        </w:rPr>
+      </w:pPr>
+      <w:r>
+        <w:rPr>
+          <w:rFonts w:cstheme="minorHAnsi"/>
+          <w:color w:val="548DD4" w:themeColor="text2" w:themeTint="99"/>
+          <w:szCs w:val="22"/>
+        </w:rPr>
+        <w:t xml:space="preserve">    -&gt;</w:t>
+      </w:r>
+      <w:proofErr w:type="gramStart"/>
+      <w:r>
+        <w:rPr>
+          <w:rFonts w:cstheme="minorHAnsi"/>
+          <w:color w:val="548DD4" w:themeColor="text2" w:themeTint="99"/>
+          <w:szCs w:val="22"/>
+        </w:rPr>
+        <w:t>live(</w:t>
+      </w:r>
+      <w:proofErr w:type="spellStart"/>
+      <w:proofErr w:type="gramEnd"/>
+      <w:r>
+        <w:rPr>
+          <w:rFonts w:cstheme="minorHAnsi"/>
+          <w:color w:val="548DD4" w:themeColor="text2" w:themeTint="99"/>
+          <w:szCs w:val="22"/>
+        </w:rPr>
+        <w:t>onBlur</w:t>
+      </w:r>
+      <w:proofErr w:type="spellEnd"/>
+      <w:r>
+        <w:rPr>
+          <w:rFonts w:cstheme="minorHAnsi"/>
+          <w:color w:val="548DD4" w:themeColor="text2" w:themeTint="99"/>
+          <w:szCs w:val="22"/>
+        </w:rPr>
+        <w:t>: true) // Updates when user clicks away from the input</w:t>
+      </w:r>
+    </w:p>
+    <w:p>
+      <w:pPr>
+        <w:rPr>
+          <w:rFonts w:cstheme="minorHAnsi"/>
+          <w:color w:val="548DD4" w:themeColor="text2" w:themeTint="99"/>
+          <w:szCs w:val="22"/>
+        </w:rPr>
+      </w:pPr>
+      <w:r>
+        <w:rPr>
+          <w:rFonts w:cstheme="minorHAnsi"/>
+          <w:color w:val="548DD4" w:themeColor="text2" w:themeTint="99"/>
+          <w:szCs w:val="22"/>
+        </w:rPr>
+        <w:t xml:space="preserve">    -&gt;</w:t>
+      </w:r>
+      <w:proofErr w:type="spellStart"/>
+      <w:proofErr w:type="gramStart"/>
+      <w:r>
+        <w:rPr>
+          <w:rFonts w:cstheme="minorHAnsi"/>
+          <w:color w:val="548DD4" w:themeColor="text2" w:themeTint="99"/>
+          <w:szCs w:val="22"/>
+        </w:rPr>
+        <w:t>afterStateUpdated</w:t>
+      </w:r>
+      <w:proofErr w:type="spellEnd"/>
+      <w:r>
+        <w:rPr>
+          <w:rFonts w:cstheme="minorHAnsi"/>
+          <w:color w:val="548DD4" w:themeColor="text2" w:themeTint="99"/>
+          <w:szCs w:val="22"/>
+        </w:rPr>
+        <w:t>(</w:t>
+      </w:r>
+      <w:proofErr w:type="spellStart"/>
+      <w:proofErr w:type="gramEnd"/>
+      <w:r>
+        <w:rPr>
+          <w:rFonts w:cstheme="minorHAnsi"/>
+          <w:color w:val="548DD4" w:themeColor="text2" w:themeTint="99"/>
+          <w:szCs w:val="22"/>
+        </w:rPr>
+        <w:t>fn</w:t>
+      </w:r>
+      <w:proofErr w:type="spellEnd"/>
+      <w:r>
+        <w:rPr>
+          <w:rFonts w:cstheme="minorHAnsi"/>
+          <w:color w:val="548DD4" w:themeColor="text2" w:themeTint="99"/>
+          <w:szCs w:val="22"/>
+        </w:rPr>
+        <w:t xml:space="preserve"> (string $operation, $state, callable $set) =&gt; </w:t>
+      </w:r>
+    </w:p>
+    <w:p>
+      <w:pPr>
+        <w:rPr>
+          <w:rFonts w:cstheme="minorHAnsi"/>
+          <w:color w:val="548DD4" w:themeColor="text2" w:themeTint="99"/>
+          <w:szCs w:val="22"/>
+        </w:rPr>
+      </w:pPr>
+      <w:r>
+        <w:rPr>
+          <w:rFonts w:cstheme="minorHAnsi"/>
+          <w:color w:val="548DD4" w:themeColor="text2" w:themeTint="99"/>
+          <w:szCs w:val="22"/>
+        </w:rPr>
+        <w:t xml:space="preserve">        $operation === </w:t>
+      </w:r>
+      <w:proofErr w:type="gramStart"/>
+      <w:r>
+        <w:rPr>
+          <w:rFonts w:cstheme="minorHAnsi"/>
+          <w:color w:val="548DD4" w:themeColor="text2" w:themeTint="99"/>
+          <w:szCs w:val="22"/>
+        </w:rPr>
+        <w:t>'create' ?</w:t>
+      </w:r>
+      <w:proofErr w:type="gramEnd"/>
+      <w:r>
+        <w:rPr>
+          <w:rFonts w:cstheme="minorHAnsi"/>
+          <w:color w:val="548DD4" w:themeColor="text2" w:themeTint="99"/>
+          <w:szCs w:val="22"/>
+        </w:rPr>
+        <w:t xml:space="preserve"> $</w:t>
+      </w:r>
+      <w:proofErr w:type="gramStart"/>
+      <w:r>
+        <w:rPr>
+          <w:rFonts w:cstheme="minorHAnsi"/>
+          <w:color w:val="548DD4" w:themeColor="text2" w:themeTint="99"/>
+          <w:szCs w:val="22"/>
+        </w:rPr>
+        <w:t>set(</w:t>
+      </w:r>
+      <w:proofErr w:type="gramEnd"/>
+      <w:r>
+        <w:rPr>
+          <w:rFonts w:cstheme="minorHAnsi"/>
+          <w:color w:val="548DD4" w:themeColor="text2" w:themeTint="99"/>
+          <w:szCs w:val="22"/>
+        </w:rPr>
+        <w:t xml:space="preserve">'slug', </w:t>
+      </w:r>
+      <w:proofErr w:type="spellStart"/>
+      <w:r>
+        <w:rPr>
+          <w:rFonts w:cstheme="minorHAnsi"/>
+          <w:color w:val="548DD4" w:themeColor="text2" w:themeTint="99"/>
+          <w:szCs w:val="22"/>
+        </w:rPr>
+        <w:t>Str</w:t>
+      </w:r>
+      <w:proofErr w:type="spellEnd"/>
+      <w:r>
+        <w:rPr>
+          <w:rFonts w:cstheme="minorHAnsi"/>
+          <w:color w:val="548DD4" w:themeColor="text2" w:themeTint="99"/>
+          <w:szCs w:val="22"/>
+        </w:rPr>
+        <w:t>::slug($state)) : null</w:t>
+      </w:r>
+    </w:p>
+    <w:p>
+      <w:pPr>
+        <w:rPr>
+          <w:rFonts w:cstheme="minorHAnsi"/>
+          <w:color w:val="548DD4" w:themeColor="text2" w:themeTint="99"/>
+          <w:szCs w:val="22"/>
+        </w:rPr>
+      </w:pPr>
+      <w:r>
+        <w:rPr>
+          <w:rFonts w:cstheme="minorHAnsi"/>
+          <w:color w:val="548DD4" w:themeColor="text2" w:themeTint="99"/>
+          <w:szCs w:val="22"/>
+        </w:rPr>
+        <w:t xml:space="preserve">    ),</w:t>
+      </w:r>
+    </w:p>
+    <w:p>
+      <w:pPr>
+        <w:rPr>
+          <w:rFonts w:cstheme="minorHAnsi"/>
+          <w:color w:val="548DD4" w:themeColor="text2" w:themeTint="99"/>
+          <w:szCs w:val="22"/>
+        </w:rPr>
+      </w:pPr>
+      <w:proofErr w:type="spellStart"/>
+      <w:r>
+        <w:rPr>
+          <w:rFonts w:cstheme="minorHAnsi"/>
+          <w:color w:val="548DD4" w:themeColor="text2" w:themeTint="99"/>
+          <w:szCs w:val="22"/>
+        </w:rPr>
+        <w:t>TextInput</w:t>
+      </w:r>
+      <w:proofErr w:type="spellEnd"/>
+      <w:r>
+        <w:rPr>
+          <w:rFonts w:cstheme="minorHAnsi"/>
+          <w:color w:val="548DD4" w:themeColor="text2" w:themeTint="99"/>
+          <w:szCs w:val="22"/>
+        </w:rPr>
+        <w:t>::</w:t>
+      </w:r>
+      <w:proofErr w:type="gramStart"/>
+      <w:r>
+        <w:rPr>
+          <w:rFonts w:cstheme="minorHAnsi"/>
+          <w:color w:val="548DD4" w:themeColor="text2" w:themeTint="99"/>
+          <w:szCs w:val="22"/>
+        </w:rPr>
+        <w:t>make(</w:t>
+      </w:r>
+      <w:proofErr w:type="gramEnd"/>
+      <w:r>
+        <w:rPr>
+          <w:rFonts w:cstheme="minorHAnsi"/>
+          <w:color w:val="548DD4" w:themeColor="text2" w:themeTint="99"/>
+          <w:szCs w:val="22"/>
+        </w:rPr>
+        <w:t>'slug')-&gt;required()</w:t>
+      </w:r>
+    </w:p>
+    <w:p>
+      <w:pPr>
+        <w:rPr>
+          <w:rFonts w:cstheme="minorHAnsi"/>
+          <w:color w:val="548DD4" w:themeColor="text2" w:themeTint="99"/>
+          <w:szCs w:val="22"/>
+        </w:rPr>
+      </w:pPr>
+    </w:p>
+    <w:p>
+      <w:pPr>
+        <w:rPr>
+          <w:rFonts w:cstheme="minorHAnsi"/>
+          <w:szCs w:val="22"/>
+        </w:rPr>
+      </w:pPr>
+      <w:r>
+        <w:rPr>
+          <w:rFonts w:cstheme="minorHAnsi"/>
+          <w:b/>
+          <w:bCs/>
+          <w:szCs w:val="22"/>
+        </w:rPr>
+        <w:t>In JavaScript (Web Browser)</w:t>
+      </w:r>
+    </w:p>
+    <w:p>
+      <w:pPr>
+        <w:rPr>
+          <w:rFonts w:cstheme="minorHAnsi"/>
+          <w:szCs w:val="22"/>
+        </w:rPr>
+      </w:pPr>
+      <w:r>
+        <w:rPr>
+          <w:rFonts w:cstheme="minorHAnsi"/>
+          <w:szCs w:val="22"/>
+        </w:rPr>
+        <w:t>If you want to do it directly in the browser:</w:t>
+      </w:r>
+    </w:p>
+    <w:p>
+      <w:pPr>
+        <w:rPr>
+          <w:rFonts w:cstheme="minorHAnsi"/>
+          <w:b/>
+          <w:bCs/>
+          <w:color w:val="FF0000"/>
+          <w:szCs w:val="22"/>
+          <w:u w:val="single"/>
+        </w:rPr>
+      </w:pPr>
+      <w:r>
+        <w:rPr>
+          <w:rFonts w:cstheme="minorHAnsi"/>
+          <w:b/>
+          <w:bCs/>
+          <w:color w:val="FF0000"/>
+          <w:szCs w:val="22"/>
+          <w:u w:val="single"/>
+        </w:rPr>
+        <w:t xml:space="preserve">In </w:t>
+      </w:r>
+      <w:proofErr w:type="spellStart"/>
+      <w:r>
+        <w:rPr>
+          <w:rFonts w:cstheme="minorHAnsi"/>
+          <w:b/>
+          <w:bCs/>
+          <w:color w:val="FF0000"/>
+          <w:szCs w:val="22"/>
+          <w:u w:val="single"/>
+        </w:rPr>
+        <w:t>J</w:t>
+      </w:r>
+      <w:r>
+        <w:rPr>
+          <w:rFonts w:cstheme="minorHAnsi"/>
+          <w:b/>
+          <w:bCs/>
+          <w:color w:val="FF0000"/>
+          <w:szCs w:val="22"/>
+          <w:u w:val="single"/>
+        </w:rPr>
+        <w:t>avascript</w:t>
+      </w:r>
+      <w:proofErr w:type="spellEnd"/>
+      <w:r>
+        <w:rPr>
+          <w:rFonts w:cstheme="minorHAnsi"/>
+          <w:b/>
+          <w:bCs/>
+          <w:color w:val="FF0000"/>
+          <w:szCs w:val="22"/>
+          <w:u w:val="single"/>
+        </w:rPr>
+        <w:t>:</w:t>
+      </w:r>
+    </w:p>
+    <w:p>
+      <w:pPr>
+        <w:rPr>
+          <w:rFonts w:cstheme="minorHAnsi"/>
+          <w:b/>
+          <w:bCs/>
+          <w:color w:val="548DD4" w:themeColor="text2" w:themeTint="99"/>
           <w:szCs w:val="22"/>
         </w:rPr>
       </w:pPr>
       <w:bookmarkStart w:id="0" w:name="_GoBack"/>
       <w:bookmarkEnd w:id="0"/>
+      <w:proofErr w:type="gramStart"/>
+      <w:r>
+        <w:rPr>
+          <w:rFonts w:cstheme="minorHAnsi"/>
+          <w:b/>
+          <w:bCs/>
+          <w:color w:val="548DD4" w:themeColor="text2" w:themeTint="99"/>
+          <w:szCs w:val="22"/>
+        </w:rPr>
+        <w:t>let</w:t>
+      </w:r>
+      <w:proofErr w:type="gramEnd"/>
+      <w:r>
+        <w:rPr>
+          <w:rFonts w:cstheme="minorHAnsi"/>
+          <w:b/>
+          <w:bCs/>
+          <w:color w:val="548DD4" w:themeColor="text2" w:themeTint="99"/>
+          <w:szCs w:val="22"/>
+        </w:rPr>
+        <w:t xml:space="preserve"> title = "My First Blog Post!";</w:t>
+      </w:r>
+    </w:p>
+    <w:p>
+      <w:pPr>
+        <w:rPr>
+          <w:rFonts w:cstheme="minorHAnsi"/>
+          <w:b/>
+          <w:bCs/>
+          <w:color w:val="548DD4" w:themeColor="text2" w:themeTint="99"/>
+          <w:szCs w:val="22"/>
+        </w:rPr>
+      </w:pPr>
+      <w:proofErr w:type="gramStart"/>
+      <w:r>
+        <w:rPr>
+          <w:rFonts w:cstheme="minorHAnsi"/>
+          <w:b/>
+          <w:bCs/>
+          <w:color w:val="548DD4" w:themeColor="text2" w:themeTint="99"/>
+          <w:szCs w:val="22"/>
+        </w:rPr>
+        <w:t>let</w:t>
+      </w:r>
+      <w:proofErr w:type="gramEnd"/>
+      <w:r>
+        <w:rPr>
+          <w:rFonts w:cstheme="minorHAnsi"/>
+          <w:b/>
+          <w:bCs/>
+          <w:color w:val="548DD4" w:themeColor="text2" w:themeTint="99"/>
+          <w:szCs w:val="22"/>
+        </w:rPr>
+        <w:t xml:space="preserve"> slug = </w:t>
+      </w:r>
+      <w:proofErr w:type="spellStart"/>
+      <w:r>
+        <w:rPr>
+          <w:rFonts w:cstheme="minorHAnsi"/>
+          <w:b/>
+          <w:bCs/>
+          <w:color w:val="548DD4" w:themeColor="text2" w:themeTint="99"/>
+          <w:szCs w:val="22"/>
+        </w:rPr>
+        <w:t>title.toLowerCase</w:t>
+      </w:r>
+      <w:proofErr w:type="spellEnd"/>
+      <w:r>
+        <w:rPr>
+          <w:rFonts w:cstheme="minorHAnsi"/>
+          <w:b/>
+          <w:bCs/>
+          <w:color w:val="548DD4" w:themeColor="text2" w:themeTint="99"/>
+          <w:szCs w:val="22"/>
+        </w:rPr>
+        <w:t>().replace(/[^a-z0-9]+/g, '-');</w:t>
+      </w:r>
+    </w:p>
+    <w:p>
+      <w:pPr>
+        <w:rPr>
+          <w:rFonts w:cstheme="minorHAnsi"/>
+          <w:b/>
+          <w:bCs/>
+          <w:color w:val="548DD4" w:themeColor="text2" w:themeTint="99"/>
+          <w:szCs w:val="22"/>
+        </w:rPr>
+      </w:pPr>
+      <w:proofErr w:type="gramStart"/>
+      <w:r>
+        <w:rPr>
+          <w:rFonts w:cstheme="minorHAnsi"/>
+          <w:b/>
+          <w:bCs/>
+          <w:color w:val="548DD4" w:themeColor="text2" w:themeTint="99"/>
+          <w:szCs w:val="22"/>
+        </w:rPr>
+        <w:t>console.log(</w:t>
+      </w:r>
+      <w:proofErr w:type="gramEnd"/>
+      <w:r>
+        <w:rPr>
+          <w:rFonts w:cstheme="minorHAnsi"/>
+          <w:b/>
+          <w:bCs/>
+          <w:color w:val="548DD4" w:themeColor="text2" w:themeTint="99"/>
+          <w:szCs w:val="22"/>
+        </w:rPr>
+        <w:t>slug); // Output: my-first-blog-post</w:t>
+      </w:r>
+    </w:p>
+    <w:p>
+      <w:pPr>
+        <w:rPr>
+          <w:rFonts w:cstheme="minorHAnsi"/>
+          <w:color w:val="548DD4" w:themeColor="text2" w:themeTint="99"/>
+          <w:szCs w:val="22"/>
+        </w:rPr>
+      </w:pPr>
+    </w:p>
+    <w:p>
+      <w:pPr>
+        <w:rPr>
+          <w:rFonts w:cstheme="minorHAnsi"/>
+          <w:color w:val="FF0000"/>
+          <w:sz w:val="24"/>
+          <w:szCs w:val="24"/>
+        </w:rPr>
+      </w:pPr>
+    </w:p>
+    <w:p>
+      <w:pPr>
+        <w:rPr>
+          <w:rFonts w:cstheme="minorHAnsi"/>
+          <w:b/>
+          <w:bCs/>
+          <w:szCs w:val="22"/>
+        </w:rPr>
+      </w:pPr>
+    </w:p>
+    <w:p>
+      <w:pPr>
+        <w:rPr>
+          <w:rFonts w:cstheme="minorHAnsi"/>
+          <w:b/>
+          <w:bCs/>
+          <w:color w:val="FF0000"/>
+          <w:szCs w:val="22"/>
+          <w:u w:val="single"/>
+        </w:rPr>
+      </w:pPr>
     </w:p>
     <w:sectPr>
       <w:pgSz w:w="11906" w:h="16838"/>
@@ -271,6 +2449,475 @@
     </w:sectPr>
   </w:body>
 </w:document>
+</file>
+
+<file path=word/numbering.xml><?xml version="1.0" encoding="utf-8"?>
+<w:numbering xmlns:wpc="http://schemas.microsoft.com/office/word/2010/wordprocessingCanvas" xmlns:mc="http://schemas.openxmlformats.org/markup-compatibility/2006" xmlns:o="urn:schemas-microsoft-com:office:office" xmlns:r="http://schemas.openxmlformats.org/officeDocument/2006/relationships" xmlns:m="http://schemas.openxmlformats.org/officeDocument/2006/math" xmlns:v="urn:schemas-microsoft-com:vml" xmlns:wp14="http://schemas.microsoft.com/office/word/2010/wordprocessingDrawing" xmlns:wp="http://schemas.openxmlformats.org/drawingml/2006/wordprocessingDrawing" xmlns:w10="urn:schemas-microsoft-com:office:word" xmlns:w="http://schemas.openxmlformats.org/wordprocessingml/2006/main" xmlns:w14="http://schemas.microsoft.com/office/word/2010/wordml" xmlns:wpg="http://schemas.microsoft.com/office/word/2010/wordprocessingGroup" xmlns:wpi="http://schemas.microsoft.com/office/word/2010/wordprocessingInk" xmlns:wne="http://schemas.microsoft.com/office/word/2006/wordml" xmlns:wps="http://schemas.microsoft.com/office/word/2010/wordprocessingShape" mc:Ignorable="w14 wp14">
+  <w:abstractNum w:abstractNumId="0">
+    <w:nsid w:val="3E824C74"/>
+    <w:multiLevelType w:val="hybridMultilevel"/>
+    <w:tmpl w:val="9A52B122"/>
+    <w:lvl w:ilvl="0" w:tplc="40090001">
+      <w:start w:val="1"/>
+      <w:numFmt w:val="bullet"/>
+      <w:lvlText w:val=""/>
+      <w:lvlJc w:val="left"/>
+      <w:pPr>
+        <w:ind w:left="720" w:hanging="360"/>
+      </w:pPr>
+      <w:rPr>
+        <w:rFonts w:ascii="Symbol" w:hAnsi="Symbol" w:hint="default"/>
+      </w:rPr>
+    </w:lvl>
+    <w:lvl w:ilvl="1" w:tplc="40090003" w:tentative="1">
+      <w:start w:val="1"/>
+      <w:numFmt w:val="bullet"/>
+      <w:lvlText w:val="o"/>
+      <w:lvlJc w:val="left"/>
+      <w:pPr>
+        <w:ind w:left="1440" w:hanging="360"/>
+      </w:pPr>
+      <w:rPr>
+        <w:rFonts w:ascii="Courier New" w:hAnsi="Courier New" w:cs="Courier New" w:hint="default"/>
+      </w:rPr>
+    </w:lvl>
+    <w:lvl w:ilvl="2" w:tplc="40090005" w:tentative="1">
+      <w:start w:val="1"/>
+      <w:numFmt w:val="bullet"/>
+      <w:lvlText w:val=""/>
+      <w:lvlJc w:val="left"/>
+      <w:pPr>
+        <w:ind w:left="2160" w:hanging="360"/>
+      </w:pPr>
+      <w:rPr>
+        <w:rFonts w:ascii="Wingdings" w:hAnsi="Wingdings" w:hint="default"/>
+      </w:rPr>
+    </w:lvl>
+    <w:lvl w:ilvl="3" w:tplc="40090001" w:tentative="1">
+      <w:start w:val="1"/>
+      <w:numFmt w:val="bullet"/>
+      <w:lvlText w:val=""/>
+      <w:lvlJc w:val="left"/>
+      <w:pPr>
+        <w:ind w:left="2880" w:hanging="360"/>
+      </w:pPr>
+      <w:rPr>
+        <w:rFonts w:ascii="Symbol" w:hAnsi="Symbol" w:hint="default"/>
+      </w:rPr>
+    </w:lvl>
+    <w:lvl w:ilvl="4" w:tplc="40090003" w:tentative="1">
+      <w:start w:val="1"/>
+      <w:numFmt w:val="bullet"/>
+      <w:lvlText w:val="o"/>
+      <w:lvlJc w:val="left"/>
+      <w:pPr>
+        <w:ind w:left="3600" w:hanging="360"/>
+      </w:pPr>
+      <w:rPr>
+        <w:rFonts w:ascii="Courier New" w:hAnsi="Courier New" w:cs="Courier New" w:hint="default"/>
+      </w:rPr>
+    </w:lvl>
+    <w:lvl w:ilvl="5" w:tplc="40090005" w:tentative="1">
+      <w:start w:val="1"/>
+      <w:numFmt w:val="bullet"/>
+      <w:lvlText w:val=""/>
+      <w:lvlJc w:val="left"/>
+      <w:pPr>
+        <w:ind w:left="4320" w:hanging="360"/>
+      </w:pPr>
+      <w:rPr>
+        <w:rFonts w:ascii="Wingdings" w:hAnsi="Wingdings" w:hint="default"/>
+      </w:rPr>
+    </w:lvl>
+    <w:lvl w:ilvl="6" w:tplc="40090001" w:tentative="1">
+      <w:start w:val="1"/>
+      <w:numFmt w:val="bullet"/>
+      <w:lvlText w:val=""/>
+      <w:lvlJc w:val="left"/>
+      <w:pPr>
+        <w:ind w:left="5040" w:hanging="360"/>
+      </w:pPr>
+      <w:rPr>
+        <w:rFonts w:ascii="Symbol" w:hAnsi="Symbol" w:hint="default"/>
+      </w:rPr>
+    </w:lvl>
+    <w:lvl w:ilvl="7" w:tplc="40090003" w:tentative="1">
+      <w:start w:val="1"/>
+      <w:numFmt w:val="bullet"/>
+      <w:lvlText w:val="o"/>
+      <w:lvlJc w:val="left"/>
+      <w:pPr>
+        <w:ind w:left="5760" w:hanging="360"/>
+      </w:pPr>
+      <w:rPr>
+        <w:rFonts w:ascii="Courier New" w:hAnsi="Courier New" w:cs="Courier New" w:hint="default"/>
+      </w:rPr>
+    </w:lvl>
+    <w:lvl w:ilvl="8" w:tplc="40090005" w:tentative="1">
+      <w:start w:val="1"/>
+      <w:numFmt w:val="bullet"/>
+      <w:lvlText w:val=""/>
+      <w:lvlJc w:val="left"/>
+      <w:pPr>
+        <w:ind w:left="6480" w:hanging="360"/>
+      </w:pPr>
+      <w:rPr>
+        <w:rFonts w:ascii="Wingdings" w:hAnsi="Wingdings" w:hint="default"/>
+      </w:rPr>
+    </w:lvl>
+  </w:abstractNum>
+  <w:abstractNum w:abstractNumId="1">
+    <w:nsid w:val="448F61A1"/>
+    <w:multiLevelType w:val="hybridMultilevel"/>
+    <w:tmpl w:val="165055AE"/>
+    <w:lvl w:ilvl="0" w:tplc="40090001">
+      <w:start w:val="1"/>
+      <w:numFmt w:val="bullet"/>
+      <w:lvlText w:val=""/>
+      <w:lvlJc w:val="left"/>
+      <w:pPr>
+        <w:ind w:left="720" w:hanging="360"/>
+      </w:pPr>
+      <w:rPr>
+        <w:rFonts w:ascii="Symbol" w:hAnsi="Symbol" w:hint="default"/>
+      </w:rPr>
+    </w:lvl>
+    <w:lvl w:ilvl="1" w:tplc="40090003" w:tentative="1">
+      <w:start w:val="1"/>
+      <w:numFmt w:val="bullet"/>
+      <w:lvlText w:val="o"/>
+      <w:lvlJc w:val="left"/>
+      <w:pPr>
+        <w:ind w:left="1440" w:hanging="360"/>
+      </w:pPr>
+      <w:rPr>
+        <w:rFonts w:ascii="Courier New" w:hAnsi="Courier New" w:cs="Courier New" w:hint="default"/>
+      </w:rPr>
+    </w:lvl>
+    <w:lvl w:ilvl="2" w:tplc="40090005" w:tentative="1">
+      <w:start w:val="1"/>
+      <w:numFmt w:val="bullet"/>
+      <w:lvlText w:val=""/>
+      <w:lvlJc w:val="left"/>
+      <w:pPr>
+        <w:ind w:left="2160" w:hanging="360"/>
+      </w:pPr>
+      <w:rPr>
+        <w:rFonts w:ascii="Wingdings" w:hAnsi="Wingdings" w:hint="default"/>
+      </w:rPr>
+    </w:lvl>
+    <w:lvl w:ilvl="3" w:tplc="40090001" w:tentative="1">
+      <w:start w:val="1"/>
+      <w:numFmt w:val="bullet"/>
+      <w:lvlText w:val=""/>
+      <w:lvlJc w:val="left"/>
+      <w:pPr>
+        <w:ind w:left="2880" w:hanging="360"/>
+      </w:pPr>
+      <w:rPr>
+        <w:rFonts w:ascii="Symbol" w:hAnsi="Symbol" w:hint="default"/>
+      </w:rPr>
+    </w:lvl>
+    <w:lvl w:ilvl="4" w:tplc="40090003" w:tentative="1">
+      <w:start w:val="1"/>
+      <w:numFmt w:val="bullet"/>
+      <w:lvlText w:val="o"/>
+      <w:lvlJc w:val="left"/>
+      <w:pPr>
+        <w:ind w:left="3600" w:hanging="360"/>
+      </w:pPr>
+      <w:rPr>
+        <w:rFonts w:ascii="Courier New" w:hAnsi="Courier New" w:cs="Courier New" w:hint="default"/>
+      </w:rPr>
+    </w:lvl>
+    <w:lvl w:ilvl="5" w:tplc="40090005" w:tentative="1">
+      <w:start w:val="1"/>
+      <w:numFmt w:val="bullet"/>
+      <w:lvlText w:val=""/>
+      <w:lvlJc w:val="left"/>
+      <w:pPr>
+        <w:ind w:left="4320" w:hanging="360"/>
+      </w:pPr>
+      <w:rPr>
+        <w:rFonts w:ascii="Wingdings" w:hAnsi="Wingdings" w:hint="default"/>
+      </w:rPr>
+    </w:lvl>
+    <w:lvl w:ilvl="6" w:tplc="40090001" w:tentative="1">
+      <w:start w:val="1"/>
+      <w:numFmt w:val="bullet"/>
+      <w:lvlText w:val=""/>
+      <w:lvlJc w:val="left"/>
+      <w:pPr>
+        <w:ind w:left="5040" w:hanging="360"/>
+      </w:pPr>
+      <w:rPr>
+        <w:rFonts w:ascii="Symbol" w:hAnsi="Symbol" w:hint="default"/>
+      </w:rPr>
+    </w:lvl>
+    <w:lvl w:ilvl="7" w:tplc="40090003" w:tentative="1">
+      <w:start w:val="1"/>
+      <w:numFmt w:val="bullet"/>
+      <w:lvlText w:val="o"/>
+      <w:lvlJc w:val="left"/>
+      <w:pPr>
+        <w:ind w:left="5760" w:hanging="360"/>
+      </w:pPr>
+      <w:rPr>
+        <w:rFonts w:ascii="Courier New" w:hAnsi="Courier New" w:cs="Courier New" w:hint="default"/>
+      </w:rPr>
+    </w:lvl>
+    <w:lvl w:ilvl="8" w:tplc="40090005" w:tentative="1">
+      <w:start w:val="1"/>
+      <w:numFmt w:val="bullet"/>
+      <w:lvlText w:val=""/>
+      <w:lvlJc w:val="left"/>
+      <w:pPr>
+        <w:ind w:left="6480" w:hanging="360"/>
+      </w:pPr>
+      <w:rPr>
+        <w:rFonts w:ascii="Wingdings" w:hAnsi="Wingdings" w:hint="default"/>
+      </w:rPr>
+    </w:lvl>
+  </w:abstractNum>
+  <w:abstractNum w:abstractNumId="2">
+    <w:nsid w:val="55F73037"/>
+    <w:multiLevelType w:val="hybridMultilevel"/>
+    <w:tmpl w:val="C9B47740"/>
+    <w:lvl w:ilvl="0" w:tplc="40090001">
+      <w:start w:val="1"/>
+      <w:numFmt w:val="bullet"/>
+      <w:lvlText w:val=""/>
+      <w:lvlJc w:val="left"/>
+      <w:pPr>
+        <w:ind w:left="720" w:hanging="360"/>
+      </w:pPr>
+      <w:rPr>
+        <w:rFonts w:ascii="Symbol" w:hAnsi="Symbol" w:hint="default"/>
+      </w:rPr>
+    </w:lvl>
+    <w:lvl w:ilvl="1" w:tplc="40090003" w:tentative="1">
+      <w:start w:val="1"/>
+      <w:numFmt w:val="bullet"/>
+      <w:lvlText w:val="o"/>
+      <w:lvlJc w:val="left"/>
+      <w:pPr>
+        <w:ind w:left="1440" w:hanging="360"/>
+      </w:pPr>
+      <w:rPr>
+        <w:rFonts w:ascii="Courier New" w:hAnsi="Courier New" w:cs="Courier New" w:hint="default"/>
+      </w:rPr>
+    </w:lvl>
+    <w:lvl w:ilvl="2" w:tplc="40090005" w:tentative="1">
+      <w:start w:val="1"/>
+      <w:numFmt w:val="bullet"/>
+      <w:lvlText w:val=""/>
+      <w:lvlJc w:val="left"/>
+      <w:pPr>
+        <w:ind w:left="2160" w:hanging="360"/>
+      </w:pPr>
+      <w:rPr>
+        <w:rFonts w:ascii="Wingdings" w:hAnsi="Wingdings" w:hint="default"/>
+      </w:rPr>
+    </w:lvl>
+    <w:lvl w:ilvl="3" w:tplc="40090001" w:tentative="1">
+      <w:start w:val="1"/>
+      <w:numFmt w:val="bullet"/>
+      <w:lvlText w:val=""/>
+      <w:lvlJc w:val="left"/>
+      <w:pPr>
+        <w:ind w:left="2880" w:hanging="360"/>
+      </w:pPr>
+      <w:rPr>
+        <w:rFonts w:ascii="Symbol" w:hAnsi="Symbol" w:hint="default"/>
+      </w:rPr>
+    </w:lvl>
+    <w:lvl w:ilvl="4" w:tplc="40090003" w:tentative="1">
+      <w:start w:val="1"/>
+      <w:numFmt w:val="bullet"/>
+      <w:lvlText w:val="o"/>
+      <w:lvlJc w:val="left"/>
+      <w:pPr>
+        <w:ind w:left="3600" w:hanging="360"/>
+      </w:pPr>
+      <w:rPr>
+        <w:rFonts w:ascii="Courier New" w:hAnsi="Courier New" w:cs="Courier New" w:hint="default"/>
+      </w:rPr>
+    </w:lvl>
+    <w:lvl w:ilvl="5" w:tplc="40090005" w:tentative="1">
+      <w:start w:val="1"/>
+      <w:numFmt w:val="bullet"/>
+      <w:lvlText w:val=""/>
+      <w:lvlJc w:val="left"/>
+      <w:pPr>
+        <w:ind w:left="4320" w:hanging="360"/>
+      </w:pPr>
+      <w:rPr>
+        <w:rFonts w:ascii="Wingdings" w:hAnsi="Wingdings" w:hint="default"/>
+      </w:rPr>
+    </w:lvl>
+    <w:lvl w:ilvl="6" w:tplc="40090001" w:tentative="1">
+      <w:start w:val="1"/>
+      <w:numFmt w:val="bullet"/>
+      <w:lvlText w:val=""/>
+      <w:lvlJc w:val="left"/>
+      <w:pPr>
+        <w:ind w:left="5040" w:hanging="360"/>
+      </w:pPr>
+      <w:rPr>
+        <w:rFonts w:ascii="Symbol" w:hAnsi="Symbol" w:hint="default"/>
+      </w:rPr>
+    </w:lvl>
+    <w:lvl w:ilvl="7" w:tplc="40090003" w:tentative="1">
+      <w:start w:val="1"/>
+      <w:numFmt w:val="bullet"/>
+      <w:lvlText w:val="o"/>
+      <w:lvlJc w:val="left"/>
+      <w:pPr>
+        <w:ind w:left="5760" w:hanging="360"/>
+      </w:pPr>
+      <w:rPr>
+        <w:rFonts w:ascii="Courier New" w:hAnsi="Courier New" w:cs="Courier New" w:hint="default"/>
+      </w:rPr>
+    </w:lvl>
+    <w:lvl w:ilvl="8" w:tplc="40090005" w:tentative="1">
+      <w:start w:val="1"/>
+      <w:numFmt w:val="bullet"/>
+      <w:lvlText w:val=""/>
+      <w:lvlJc w:val="left"/>
+      <w:pPr>
+        <w:ind w:left="6480" w:hanging="360"/>
+      </w:pPr>
+      <w:rPr>
+        <w:rFonts w:ascii="Wingdings" w:hAnsi="Wingdings" w:hint="default"/>
+      </w:rPr>
+    </w:lvl>
+  </w:abstractNum>
+  <w:abstractNum w:abstractNumId="3">
+    <w:nsid w:val="7D241509"/>
+    <w:multiLevelType w:val="hybridMultilevel"/>
+    <w:tmpl w:val="55FE704A"/>
+    <w:lvl w:ilvl="0" w:tplc="40090001">
+      <w:start w:val="1"/>
+      <w:numFmt w:val="bullet"/>
+      <w:lvlText w:val=""/>
+      <w:lvlJc w:val="left"/>
+      <w:pPr>
+        <w:ind w:left="720" w:hanging="360"/>
+      </w:pPr>
+      <w:rPr>
+        <w:rFonts w:ascii="Symbol" w:hAnsi="Symbol" w:hint="default"/>
+      </w:rPr>
+    </w:lvl>
+    <w:lvl w:ilvl="1" w:tplc="40090003" w:tentative="1">
+      <w:start w:val="1"/>
+      <w:numFmt w:val="bullet"/>
+      <w:lvlText w:val="o"/>
+      <w:lvlJc w:val="left"/>
+      <w:pPr>
+        <w:ind w:left="1440" w:hanging="360"/>
+      </w:pPr>
+      <w:rPr>
+        <w:rFonts w:ascii="Courier New" w:hAnsi="Courier New" w:cs="Courier New" w:hint="default"/>
+      </w:rPr>
+    </w:lvl>
+    <w:lvl w:ilvl="2" w:tplc="40090005" w:tentative="1">
+      <w:start w:val="1"/>
+      <w:numFmt w:val="bullet"/>
+      <w:lvlText w:val=""/>
+      <w:lvlJc w:val="left"/>
+      <w:pPr>
+        <w:ind w:left="2160" w:hanging="360"/>
+      </w:pPr>
+      <w:rPr>
+        <w:rFonts w:ascii="Wingdings" w:hAnsi="Wingdings" w:hint="default"/>
+      </w:rPr>
+    </w:lvl>
+    <w:lvl w:ilvl="3" w:tplc="40090001" w:tentative="1">
+      <w:start w:val="1"/>
+      <w:numFmt w:val="bullet"/>
+      <w:lvlText w:val=""/>
+      <w:lvlJc w:val="left"/>
+      <w:pPr>
+        <w:ind w:left="2880" w:hanging="360"/>
+      </w:pPr>
+      <w:rPr>
+        <w:rFonts w:ascii="Symbol" w:hAnsi="Symbol" w:hint="default"/>
+      </w:rPr>
+    </w:lvl>
+    <w:lvl w:ilvl="4" w:tplc="40090003" w:tentative="1">
+      <w:start w:val="1"/>
+      <w:numFmt w:val="bullet"/>
+      <w:lvlText w:val="o"/>
+      <w:lvlJc w:val="left"/>
+      <w:pPr>
+        <w:ind w:left="3600" w:hanging="360"/>
+      </w:pPr>
+      <w:rPr>
+        <w:rFonts w:ascii="Courier New" w:hAnsi="Courier New" w:cs="Courier New" w:hint="default"/>
+      </w:rPr>
+    </w:lvl>
+    <w:lvl w:ilvl="5" w:tplc="40090005" w:tentative="1">
+      <w:start w:val="1"/>
+      <w:numFmt w:val="bullet"/>
+      <w:lvlText w:val=""/>
+      <w:lvlJc w:val="left"/>
+      <w:pPr>
+        <w:ind w:left="4320" w:hanging="360"/>
+      </w:pPr>
+      <w:rPr>
+        <w:rFonts w:ascii="Wingdings" w:hAnsi="Wingdings" w:hint="default"/>
+      </w:rPr>
+    </w:lvl>
+    <w:lvl w:ilvl="6" w:tplc="40090001" w:tentative="1">
+      <w:start w:val="1"/>
+      <w:numFmt w:val="bullet"/>
+      <w:lvlText w:val=""/>
+      <w:lvlJc w:val="left"/>
+      <w:pPr>
+        <w:ind w:left="5040" w:hanging="360"/>
+      </w:pPr>
+      <w:rPr>
+        <w:rFonts w:ascii="Symbol" w:hAnsi="Symbol" w:hint="default"/>
+      </w:rPr>
+    </w:lvl>
+    <w:lvl w:ilvl="7" w:tplc="40090003" w:tentative="1">
+      <w:start w:val="1"/>
+      <w:numFmt w:val="bullet"/>
+      <w:lvlText w:val="o"/>
+      <w:lvlJc w:val="left"/>
+      <w:pPr>
+        <w:ind w:left="5760" w:hanging="360"/>
+      </w:pPr>
+      <w:rPr>
+        <w:rFonts w:ascii="Courier New" w:hAnsi="Courier New" w:cs="Courier New" w:hint="default"/>
+      </w:rPr>
+    </w:lvl>
+    <w:lvl w:ilvl="8" w:tplc="40090005" w:tentative="1">
+      <w:start w:val="1"/>
+      <w:numFmt w:val="bullet"/>
+      <w:lvlText w:val=""/>
+      <w:lvlJc w:val="left"/>
+      <w:pPr>
+        <w:ind w:left="6480" w:hanging="360"/>
+      </w:pPr>
+      <w:rPr>
+        <w:rFonts w:ascii="Wingdings" w:hAnsi="Wingdings" w:hint="default"/>
+      </w:rPr>
+    </w:lvl>
+  </w:abstractNum>
+  <w:num w:numId="1">
+    <w:abstractNumId w:val="3"/>
+  </w:num>
+  <w:num w:numId="2">
+    <w:abstractNumId w:val="0"/>
+  </w:num>
+  <w:num w:numId="3">
+    <w:abstractNumId w:val="2"/>
+  </w:num>
+  <w:num w:numId="4">
+    <w:abstractNumId w:val="1"/>
+  </w:num>
+</w:numbering>
 </file>
 
 <file path=word/styles.xml><?xml version="1.0" encoding="utf-8"?>
@@ -462,6 +3109,47 @@
     <w:semiHidden/>
     <w:unhideWhenUsed/>
   </w:style>
+  <w:style w:type="paragraph" w:styleId="ListParagraph">
+    <w:name w:val="List Paragraph"/>
+    <w:basedOn w:val="Normal"/>
+    <w:uiPriority w:val="34"/>
+    <w:qFormat/>
+    <w:rsid w:val="003B2EF9"/>
+    <w:pPr>
+      <w:ind w:left="720"/>
+      <w:contextualSpacing/>
+    </w:pPr>
+  </w:style>
+  <w:style w:type="paragraph" w:styleId="BalloonText">
+    <w:name w:val="Balloon Text"/>
+    <w:basedOn w:val="Normal"/>
+    <w:link w:val="BalloonTextChar"/>
+    <w:uiPriority w:val="99"/>
+    <w:semiHidden/>
+    <w:unhideWhenUsed/>
+    <w:rsid w:val="003B2EF9"/>
+    <w:pPr>
+      <w:spacing w:after="0" w:line="240" w:lineRule="auto"/>
+    </w:pPr>
+    <w:rPr>
+      <w:rFonts w:ascii="Tahoma" w:hAnsi="Tahoma"/>
+      <w:sz w:val="16"/>
+      <w:szCs w:val="14"/>
+    </w:rPr>
+  </w:style>
+  <w:style w:type="character" w:customStyle="1" w:styleId="BalloonTextChar">
+    <w:name w:val="Balloon Text Char"/>
+    <w:basedOn w:val="DefaultParagraphFont"/>
+    <w:link w:val="BalloonText"/>
+    <w:uiPriority w:val="99"/>
+    <w:semiHidden/>
+    <w:rsid w:val="003B2EF9"/>
+    <w:rPr>
+      <w:rFonts w:ascii="Tahoma" w:hAnsi="Tahoma" w:cs="Mangal"/>
+      <w:sz w:val="16"/>
+      <w:szCs w:val="14"/>
+    </w:rPr>
+  </w:style>
 </w:styles>
 </file>
 
@@ -653,6 +3341,47 @@
     <w:uiPriority w:val="99"/>
     <w:semiHidden/>
     <w:unhideWhenUsed/>
+  </w:style>
+  <w:style w:type="paragraph" w:styleId="ListParagraph">
+    <w:name w:val="List Paragraph"/>
+    <w:basedOn w:val="Normal"/>
+    <w:uiPriority w:val="34"/>
+    <w:qFormat/>
+    <w:rsid w:val="003B2EF9"/>
+    <w:pPr>
+      <w:ind w:left="720"/>
+      <w:contextualSpacing/>
+    </w:pPr>
+  </w:style>
+  <w:style w:type="paragraph" w:styleId="BalloonText">
+    <w:name w:val="Balloon Text"/>
+    <w:basedOn w:val="Normal"/>
+    <w:link w:val="BalloonTextChar"/>
+    <w:uiPriority w:val="99"/>
+    <w:semiHidden/>
+    <w:unhideWhenUsed/>
+    <w:rsid w:val="003B2EF9"/>
+    <w:pPr>
+      <w:spacing w:after="0" w:line="240" w:lineRule="auto"/>
+    </w:pPr>
+    <w:rPr>
+      <w:rFonts w:ascii="Tahoma" w:hAnsi="Tahoma"/>
+      <w:sz w:val="16"/>
+      <w:szCs w:val="14"/>
+    </w:rPr>
+  </w:style>
+  <w:style w:type="character" w:customStyle="1" w:styleId="BalloonTextChar">
+    <w:name w:val="Balloon Text Char"/>
+    <w:basedOn w:val="DefaultParagraphFont"/>
+    <w:link w:val="BalloonText"/>
+    <w:uiPriority w:val="99"/>
+    <w:semiHidden/>
+    <w:rsid w:val="003B2EF9"/>
+    <w:rPr>
+      <w:rFonts w:ascii="Tahoma" w:hAnsi="Tahoma" w:cs="Mangal"/>
+      <w:sz w:val="16"/>
+      <w:szCs w:val="14"/>
+    </w:rPr>
   </w:style>
 </w:styles>
 </file>

</xml_diff>

<commit_message>
Add Filament notes and implement wizard forms, infolists, tabs, search, sorting, and filters
</commit_message>
<xml_diff>
--- a/Filament/filament notes.docx
+++ b/Filament/filament notes.docx
@@ -308,7 +308,9 @@
       <w:r>
         <w:rPr>
           <w:rFonts w:cstheme="minorHAnsi"/>
-          <w:szCs w:val="22"/>
+          <w:noProof/>
+          <w:szCs w:val="22"/>
+          <w:lang w:eastAsia="en-IN"/>
         </w:rPr>
         <w:drawing>
           <wp:inline distT="0" distB="0" distL="0" distR="0" wp14:anchorId="5EA18D44" wp14:editId="70DF698A">
@@ -1851,9 +1853,17 @@
           <w:color w:val="548DD4" w:themeColor="text2" w:themeTint="99"/>
           <w:szCs w:val="22"/>
         </w:rPr>
-        <w:t>TextInput;</w:t>
+        <w:t>TextInput</w:t>
       </w:r>
       <w:proofErr w:type="spellEnd"/>
+      <w:r>
+        <w:rPr>
+          <w:rFonts w:cstheme="minorHAnsi"/>
+          <w:color w:val="548DD4" w:themeColor="text2" w:themeTint="99"/>
+          <w:szCs w:val="22"/>
+        </w:rPr>
+        <w:t>;</w:t>
+      </w:r>
     </w:p>
     <w:p>
       <w:pPr>
@@ -2287,8 +2297,6 @@
           <w:szCs w:val="22"/>
         </w:rPr>
       </w:pPr>
-      <w:bookmarkStart w:id="0" w:name="_GoBack"/>
-      <w:bookmarkEnd w:id="0"/>
       <w:proofErr w:type="gramStart"/>
       <w:r>
         <w:rPr>
@@ -2440,6 +2448,505 @@
           <w:u w:val="single"/>
         </w:rPr>
       </w:pPr>
+      <w:r>
+        <w:rPr>
+          <w:rFonts w:cstheme="minorHAnsi"/>
+          <w:b/>
+          <w:bCs/>
+          <w:color w:val="FF0000"/>
+          <w:szCs w:val="22"/>
+          <w:u w:val="single"/>
+        </w:rPr>
+        <w:lastRenderedPageBreak/>
+        <w:t xml:space="preserve">Q: What </w:t>
+      </w:r>
+      <w:proofErr w:type="gramStart"/>
+      <w:r>
+        <w:rPr>
+          <w:rFonts w:cstheme="minorHAnsi"/>
+          <w:b/>
+          <w:bCs/>
+          <w:color w:val="FF0000"/>
+          <w:szCs w:val="22"/>
+          <w:u w:val="single"/>
+        </w:rPr>
+        <w:t>do</w:t>
+      </w:r>
+      <w:proofErr w:type="gramEnd"/>
+      <w:r>
+        <w:rPr>
+          <w:rFonts w:cstheme="minorHAnsi"/>
+          <w:b/>
+          <w:bCs/>
+          <w:color w:val="FF0000"/>
+          <w:szCs w:val="22"/>
+          <w:u w:val="single"/>
+        </w:rPr>
+        <w:t xml:space="preserve"> Question asked during creating a resource mean? </w:t>
+      </w:r>
+    </w:p>
+    <w:p>
+      <w:pPr>
+        <w:rPr>
+          <w:rFonts w:cstheme="minorHAnsi"/>
+          <w:b/>
+          <w:bCs/>
+          <w:color w:val="FF0000"/>
+          <w:szCs w:val="22"/>
+          <w:u w:val="single"/>
+        </w:rPr>
+      </w:pPr>
+      <w:proofErr w:type="spellStart"/>
+      <w:r>
+        <w:rPr>
+          <w:rFonts w:cstheme="minorHAnsi"/>
+          <w:b/>
+          <w:bCs/>
+          <w:color w:val="FF0000"/>
+          <w:szCs w:val="22"/>
+          <w:u w:val="single"/>
+        </w:rPr>
+        <w:t>Ans</w:t>
+      </w:r>
+      <w:proofErr w:type="spellEnd"/>
+      <w:r>
+        <w:rPr>
+          <w:rFonts w:cstheme="minorHAnsi"/>
+          <w:b/>
+          <w:bCs/>
+          <w:color w:val="FF0000"/>
+          <w:szCs w:val="22"/>
+          <w:u w:val="single"/>
+        </w:rPr>
+        <w:t>:</w:t>
+      </w:r>
+    </w:p>
+    <w:p>
+      <w:pPr>
+        <w:rPr>
+          <w:rFonts w:cstheme="minorHAnsi"/>
+          <w:b/>
+          <w:bCs/>
+          <w:color w:val="FF0000"/>
+          <w:szCs w:val="22"/>
+          <w:u w:val="single"/>
+        </w:rPr>
+      </w:pPr>
+      <w:r>
+        <w:rPr>
+          <w:rFonts w:cstheme="minorHAnsi"/>
+          <w:b/>
+          <w:bCs/>
+          <w:color w:val="FF0000"/>
+          <w:szCs w:val="22"/>
+          <w:u w:val="single"/>
+        </w:rPr>
+        <w:drawing>
+          <wp:inline distT="0" distB="0" distL="0" distR="0" wp14:anchorId="74F2A239" wp14:editId="04488E85">
+            <wp:extent cx="4220633" cy="1428522"/>
+            <wp:effectExtent l="0" t="0" r="0" b="635"/>
+            <wp:docPr id="2" name="Picture 2"/>
+            <wp:cNvGraphicFramePr>
+              <a:graphicFrameLocks xmlns:a="http://schemas.openxmlformats.org/drawingml/2006/main" noChangeAspect="1"/>
+            </wp:cNvGraphicFramePr>
+            <a:graphic xmlns:a="http://schemas.openxmlformats.org/drawingml/2006/main">
+              <a:graphicData uri="http://schemas.openxmlformats.org/drawingml/2006/picture">
+                <pic:pic xmlns:pic="http://schemas.openxmlformats.org/drawingml/2006/picture">
+                  <pic:nvPicPr>
+                    <pic:cNvPr id="0" name=""/>
+                    <pic:cNvPicPr/>
+                  </pic:nvPicPr>
+                  <pic:blipFill>
+                    <a:blip r:embed="rId7"/>
+                    <a:stretch>
+                      <a:fillRect/>
+                    </a:stretch>
+                  </pic:blipFill>
+                  <pic:spPr>
+                    <a:xfrm>
+                      <a:off x="0" y="0"/>
+                      <a:ext cx="4220322" cy="1428417"/>
+                    </a:xfrm>
+                    <a:prstGeom prst="rect">
+                      <a:avLst/>
+                    </a:prstGeom>
+                  </pic:spPr>
+                </pic:pic>
+              </a:graphicData>
+            </a:graphic>
+          </wp:inline>
+        </w:drawing>
+      </w:r>
+    </w:p>
+    <w:p>
+      <w:pPr>
+        <w:rPr>
+          <w:rFonts w:cstheme="minorHAnsi"/>
+          <w:b/>
+          <w:bCs/>
+          <w:szCs w:val="22"/>
+        </w:rPr>
+      </w:pPr>
+      <w:r>
+        <w:rPr>
+          <w:rFonts w:cstheme="minorHAnsi"/>
+          <w:b/>
+          <w:bCs/>
+          <w:szCs w:val="22"/>
+        </w:rPr>
+        <w:t>1. Title Attribute (name)</w:t>
+      </w:r>
+    </w:p>
+    <w:p>
+      <w:pPr>
+        <w:rPr>
+          <w:rFonts w:cstheme="minorHAnsi"/>
+          <w:szCs w:val="22"/>
+        </w:rPr>
+      </w:pPr>
+      <w:r>
+        <w:rPr>
+          <w:rFonts w:cstheme="minorHAnsi"/>
+          <w:szCs w:val="22"/>
+        </w:rPr>
+        <w:t xml:space="preserve">Simple Word: </w:t>
+      </w:r>
+      <w:r>
+        <w:rPr>
+          <w:rFonts w:cstheme="minorHAnsi"/>
+          <w:b/>
+          <w:bCs/>
+          <w:szCs w:val="22"/>
+        </w:rPr>
+        <w:t>The Label</w:t>
+      </w:r>
+    </w:p>
+    <w:p>
+      <w:pPr>
+        <w:rPr>
+          <w:rFonts w:cstheme="minorHAnsi"/>
+          <w:szCs w:val="22"/>
+        </w:rPr>
+      </w:pPr>
+      <w:r>
+        <w:rPr>
+          <w:rFonts w:cstheme="minorHAnsi"/>
+          <w:szCs w:val="22"/>
+        </w:rPr>
+        <w:t>What it means: It tells Filament which column to use when it needs to display a product's identity. Because you picked name, the admin panel will show "iPhone 15" or "Nike Shoes" instead of an ugly database ID number like #42 inside search bars and dropdown selections.</w:t>
+      </w:r>
+    </w:p>
+    <w:p>
+      <w:pPr>
+        <w:rPr>
+          <w:rFonts w:cstheme="minorHAnsi"/>
+          <w:b/>
+          <w:bCs/>
+          <w:szCs w:val="22"/>
+        </w:rPr>
+      </w:pPr>
+      <w:r>
+        <w:rPr>
+          <w:rFonts w:cstheme="minorHAnsi"/>
+          <w:b/>
+          <w:bCs/>
+          <w:szCs w:val="22"/>
+        </w:rPr>
+        <w:t>2. Read-Only View Page (yes)</w:t>
+      </w:r>
+    </w:p>
+    <w:p>
+      <w:pPr>
+        <w:rPr>
+          <w:rFonts w:cstheme="minorHAnsi"/>
+          <w:szCs w:val="22"/>
+        </w:rPr>
+      </w:pPr>
+      <w:r>
+        <w:rPr>
+          <w:rFonts w:cstheme="minorHAnsi"/>
+          <w:szCs w:val="22"/>
+        </w:rPr>
+        <w:t xml:space="preserve">Simple Word: </w:t>
+      </w:r>
+      <w:r>
+        <w:rPr>
+          <w:rFonts w:cstheme="minorHAnsi"/>
+          <w:b/>
+          <w:bCs/>
+          <w:szCs w:val="22"/>
+        </w:rPr>
+        <w:t>Look, Don't Touch</w:t>
+      </w:r>
+    </w:p>
+    <w:p>
+      <w:pPr>
+        <w:rPr>
+          <w:rFonts w:cstheme="minorHAnsi"/>
+          <w:szCs w:val="22"/>
+        </w:rPr>
+      </w:pPr>
+      <w:r>
+        <w:rPr>
+          <w:rFonts w:cstheme="minorHAnsi"/>
+          <w:szCs w:val="22"/>
+        </w:rPr>
+        <w:t>What it means: It creates an extra, safe page just for reading details. When an admin clicks a product, they get a clean informational dashboard first where they can read descriptions safely without accidentally changing data or wiping out prices by mistake.</w:t>
+      </w:r>
+    </w:p>
+    <w:p>
+      <w:pPr>
+        <w:rPr>
+          <w:rFonts w:cstheme="minorHAnsi"/>
+          <w:b/>
+          <w:bCs/>
+          <w:szCs w:val="22"/>
+        </w:rPr>
+      </w:pPr>
+      <w:r>
+        <w:rPr>
+          <w:rFonts w:cstheme="minorHAnsi"/>
+          <w:b/>
+          <w:bCs/>
+          <w:szCs w:val="22"/>
+        </w:rPr>
+        <w:t>3. Generate from Database (no)</w:t>
+      </w:r>
+    </w:p>
+    <w:p>
+      <w:pPr>
+        <w:rPr>
+          <w:rFonts w:cstheme="minorHAnsi"/>
+          <w:b/>
+          <w:bCs/>
+          <w:szCs w:val="22"/>
+        </w:rPr>
+      </w:pPr>
+      <w:r>
+        <w:rPr>
+          <w:rFonts w:cstheme="minorHAnsi"/>
+          <w:szCs w:val="22"/>
+        </w:rPr>
+        <w:t xml:space="preserve">Simple Word: </w:t>
+      </w:r>
+      <w:r>
+        <w:rPr>
+          <w:rFonts w:cstheme="minorHAnsi"/>
+          <w:b/>
+          <w:bCs/>
+          <w:szCs w:val="22"/>
+        </w:rPr>
+        <w:t>Blank Canvas</w:t>
+      </w:r>
+    </w:p>
+    <w:p>
+      <w:pPr>
+        <w:rPr>
+          <w:rFonts w:cstheme="minorHAnsi"/>
+          <w:szCs w:val="22"/>
+        </w:rPr>
+      </w:pPr>
+      <w:r>
+        <w:rPr>
+          <w:rFonts w:cstheme="minorHAnsi"/>
+          <w:szCs w:val="22"/>
+        </w:rPr>
+        <w:t>What it means: It tells Filament not to guess your form fields based on your database tables. By saying no, Filament gives you an empty file so you can design your own custom layouts and wizards from scratch, without having to delete auto-generated code first.</w:t>
+      </w:r>
+    </w:p>
+    <w:p>
+      <w:pPr>
+        <w:rPr>
+          <w:rFonts w:cstheme="minorHAnsi"/>
+          <w:szCs w:val="22"/>
+          <w:u w:val="single"/>
+        </w:rPr>
+      </w:pPr>
+    </w:p>
+    <w:p>
+      <w:pPr>
+        <w:rPr>
+          <w:rFonts w:cstheme="minorHAnsi"/>
+          <w:b/>
+          <w:bCs/>
+          <w:color w:val="FF0000"/>
+          <w:szCs w:val="22"/>
+          <w:u w:val="single"/>
+        </w:rPr>
+      </w:pPr>
+      <w:proofErr w:type="spellStart"/>
+      <w:r>
+        <w:rPr>
+          <w:rFonts w:cstheme="minorHAnsi"/>
+          <w:b/>
+          <w:bCs/>
+          <w:color w:val="FF0000"/>
+          <w:szCs w:val="22"/>
+          <w:u w:val="single"/>
+        </w:rPr>
+        <w:t>T</w:t>
+      </w:r>
+      <w:r>
+        <w:rPr>
+          <w:rFonts w:cstheme="minorHAnsi"/>
+          <w:b/>
+          <w:bCs/>
+          <w:color w:val="FF0000"/>
+          <w:szCs w:val="22"/>
+          <w:u w:val="single"/>
+        </w:rPr>
+        <w:t>extI</w:t>
+      </w:r>
+      <w:r>
+        <w:rPr>
+          <w:rFonts w:cstheme="minorHAnsi"/>
+          <w:b/>
+          <w:bCs/>
+          <w:color w:val="FF0000"/>
+          <w:szCs w:val="22"/>
+          <w:u w:val="single"/>
+        </w:rPr>
+        <w:t>nput</w:t>
+      </w:r>
+      <w:proofErr w:type="spellEnd"/>
+      <w:r>
+        <w:rPr>
+          <w:rFonts w:cstheme="minorHAnsi"/>
+          <w:b/>
+          <w:bCs/>
+          <w:color w:val="FF0000"/>
+          <w:szCs w:val="22"/>
+          <w:u w:val="single"/>
+        </w:rPr>
+        <w:t xml:space="preserve"> </w:t>
+      </w:r>
+      <w:r>
+        <w:rPr>
+          <w:rFonts w:cstheme="minorHAnsi"/>
+          <w:b/>
+          <w:bCs/>
+          <w:color w:val="FF0000"/>
+          <w:szCs w:val="22"/>
+          <w:u w:val="single"/>
+        </w:rPr>
+        <w:t xml:space="preserve">vs </w:t>
+      </w:r>
+      <w:proofErr w:type="spellStart"/>
+      <w:r>
+        <w:rPr>
+          <w:rFonts w:cstheme="minorHAnsi"/>
+          <w:b/>
+          <w:bCs/>
+          <w:color w:val="FF0000"/>
+          <w:szCs w:val="22"/>
+          <w:u w:val="single"/>
+        </w:rPr>
+        <w:t>TextC</w:t>
+      </w:r>
+      <w:r>
+        <w:rPr>
+          <w:rFonts w:cstheme="minorHAnsi"/>
+          <w:b/>
+          <w:bCs/>
+          <w:color w:val="FF0000"/>
+          <w:szCs w:val="22"/>
+          <w:u w:val="single"/>
+        </w:rPr>
+        <w:t>olumn</w:t>
+      </w:r>
+      <w:proofErr w:type="spellEnd"/>
+      <w:r>
+        <w:rPr>
+          <w:rFonts w:cstheme="minorHAnsi"/>
+          <w:b/>
+          <w:bCs/>
+          <w:color w:val="FF0000"/>
+          <w:szCs w:val="22"/>
+          <w:u w:val="single"/>
+        </w:rPr>
+        <w:t>:</w:t>
+      </w:r>
+    </w:p>
+    <w:p>
+      <w:pPr>
+        <w:rPr>
+          <w:rFonts w:cstheme="minorHAnsi"/>
+          <w:b/>
+          <w:bCs/>
+          <w:szCs w:val="22"/>
+        </w:rPr>
+      </w:pPr>
+      <w:r>
+        <w:rPr>
+          <w:rFonts w:cstheme="minorHAnsi"/>
+          <w:b/>
+          <w:bCs/>
+          <w:szCs w:val="22"/>
+        </w:rPr>
+        <w:t xml:space="preserve">If u </w:t>
+      </w:r>
+      <w:proofErr w:type="gramStart"/>
+      <w:r>
+        <w:rPr>
+          <w:rFonts w:cstheme="minorHAnsi"/>
+          <w:b/>
+          <w:bCs/>
+          <w:szCs w:val="22"/>
+        </w:rPr>
+        <w:t>are</w:t>
+      </w:r>
+      <w:proofErr w:type="gramEnd"/>
+      <w:r>
+        <w:rPr>
+          <w:rFonts w:cstheme="minorHAnsi"/>
+          <w:b/>
+          <w:bCs/>
+          <w:szCs w:val="22"/>
+        </w:rPr>
+        <w:t xml:space="preserve"> dealing with </w:t>
+      </w:r>
+      <w:r>
+        <w:rPr>
+          <w:rFonts w:cstheme="minorHAnsi"/>
+          <w:b/>
+          <w:bCs/>
+          <w:szCs w:val="22"/>
+        </w:rPr>
+        <w:t xml:space="preserve">form use </w:t>
+      </w:r>
+      <w:proofErr w:type="spellStart"/>
+      <w:r>
+        <w:rPr>
+          <w:rFonts w:cstheme="minorHAnsi"/>
+          <w:b/>
+          <w:bCs/>
+          <w:szCs w:val="22"/>
+        </w:rPr>
+        <w:t>TextInput</w:t>
+      </w:r>
+      <w:proofErr w:type="spellEnd"/>
+      <w:r>
+        <w:rPr>
+          <w:rFonts w:cstheme="minorHAnsi"/>
+          <w:b/>
+          <w:bCs/>
+          <w:szCs w:val="22"/>
+        </w:rPr>
+        <w:t xml:space="preserve"> and if u are dealing with table then use </w:t>
+      </w:r>
+      <w:proofErr w:type="spellStart"/>
+      <w:r>
+        <w:rPr>
+          <w:rFonts w:cstheme="minorHAnsi"/>
+          <w:b/>
+          <w:bCs/>
+          <w:szCs w:val="22"/>
+        </w:rPr>
+        <w:t>TextColumn</w:t>
+      </w:r>
+      <w:bookmarkStart w:id="0" w:name="_GoBack"/>
+      <w:bookmarkEnd w:id="0"/>
+      <w:proofErr w:type="spellEnd"/>
     </w:p>
     <w:sectPr>
       <w:pgSz w:w="11906" w:h="16838"/>

</xml_diff>

<commit_message>
Add post view tabs, relationship setup, toggleable columns, and table actions
</commit_message>
<xml_diff>
--- a/Filament/filament notes.docx
+++ b/Filament/filament notes.docx
@@ -2537,9 +2537,11 @@
           <w:rFonts w:cstheme="minorHAnsi"/>
           <w:b/>
           <w:bCs/>
+          <w:noProof/>
           <w:color w:val="FF0000"/>
           <w:szCs w:val="22"/>
           <w:u w:val="single"/>
+          <w:lang w:eastAsia="en-IN"/>
         </w:rPr>
         <w:drawing>
           <wp:inline distT="0" distB="0" distL="0" distR="0" wp14:anchorId="74F2A239" wp14:editId="04488E85">
@@ -2944,9 +2946,413 @@
         </w:rPr>
         <w:t>TextColumn</w:t>
       </w:r>
+      <w:proofErr w:type="spellEnd"/>
+    </w:p>
+    <w:p>
+      <w:pPr>
+        <w:rPr>
+          <w:rFonts w:cstheme="minorHAnsi"/>
+          <w:b/>
+          <w:bCs/>
+          <w:szCs w:val="22"/>
+        </w:rPr>
+      </w:pPr>
+    </w:p>
+    <w:p>
+      <w:pPr>
+        <w:rPr>
+          <w:rFonts w:cstheme="minorHAnsi"/>
+          <w:b/>
+          <w:bCs/>
+          <w:color w:val="FF0000"/>
+          <w:sz w:val="28"/>
+          <w:szCs w:val="28"/>
+          <w:u w:val="single"/>
+        </w:rPr>
+      </w:pPr>
+    </w:p>
+    <w:p>
+      <w:pPr>
+        <w:rPr>
+          <w:rFonts w:cstheme="minorHAnsi"/>
+          <w:b/>
+          <w:bCs/>
+          <w:color w:val="FF0000"/>
+          <w:sz w:val="28"/>
+          <w:szCs w:val="28"/>
+          <w:u w:val="single"/>
+        </w:rPr>
+      </w:pPr>
+      <w:r>
+        <w:rPr>
+          <w:rFonts w:cstheme="minorHAnsi"/>
+          <w:b/>
+          <w:bCs/>
+          <w:color w:val="FF0000"/>
+          <w:sz w:val="28"/>
+          <w:szCs w:val="28"/>
+          <w:u w:val="single"/>
+        </w:rPr>
+        <w:t>Toggle Columns:</w:t>
+      </w:r>
+    </w:p>
+    <w:p>
+      <w:pPr>
+        <w:rPr>
+          <w:rFonts w:cstheme="minorHAnsi"/>
+          <w:b/>
+          <w:bCs/>
+          <w:color w:val="548DD4" w:themeColor="text2" w:themeTint="99"/>
+          <w:szCs w:val="22"/>
+        </w:rPr>
+      </w:pPr>
       <w:bookmarkStart w:id="0" w:name="_GoBack"/>
       <w:bookmarkEnd w:id="0"/>
+      <w:r>
+        <w:rPr>
+          <w:rFonts w:cstheme="minorHAnsi"/>
+          <w:b/>
+          <w:bCs/>
+          <w:szCs w:val="22"/>
+        </w:rPr>
+        <w:t>D</w:t>
+      </w:r>
+      <w:r>
+        <w:rPr>
+          <w:rFonts w:cstheme="minorHAnsi"/>
+          <w:b/>
+          <w:bCs/>
+          <w:szCs w:val="22"/>
+        </w:rPr>
+        <w:t xml:space="preserve">ifference between </w:t>
+      </w:r>
+      <w:r>
+        <w:rPr>
+          <w:rFonts w:cstheme="minorHAnsi"/>
+          <w:b/>
+          <w:bCs/>
+          <w:color w:val="548DD4" w:themeColor="text2" w:themeTint="99"/>
+          <w:szCs w:val="22"/>
+        </w:rPr>
+        <w:t>-&gt;</w:t>
+      </w:r>
+      <w:proofErr w:type="spellStart"/>
+      <w:proofErr w:type="gramStart"/>
+      <w:r>
+        <w:rPr>
+          <w:rFonts w:cstheme="minorHAnsi"/>
+          <w:b/>
+          <w:bCs/>
+          <w:color w:val="548DD4" w:themeColor="text2" w:themeTint="99"/>
+          <w:szCs w:val="22"/>
+        </w:rPr>
+        <w:t>toggleable</w:t>
+      </w:r>
       <w:proofErr w:type="spellEnd"/>
+      <w:r>
+        <w:rPr>
+          <w:rFonts w:cstheme="minorHAnsi"/>
+          <w:b/>
+          <w:bCs/>
+          <w:color w:val="548DD4" w:themeColor="text2" w:themeTint="99"/>
+          <w:szCs w:val="22"/>
+        </w:rPr>
+        <w:t>(</w:t>
+      </w:r>
+      <w:proofErr w:type="spellStart"/>
+      <w:proofErr w:type="gramEnd"/>
+      <w:r>
+        <w:rPr>
+          <w:rFonts w:cstheme="minorHAnsi"/>
+          <w:b/>
+          <w:bCs/>
+          <w:color w:val="548DD4" w:themeColor="text2" w:themeTint="99"/>
+          <w:szCs w:val="22"/>
+        </w:rPr>
+        <w:t>isToggledHiddenByDefault</w:t>
+      </w:r>
+      <w:proofErr w:type="spellEnd"/>
+      <w:r>
+        <w:rPr>
+          <w:rFonts w:cstheme="minorHAnsi"/>
+          <w:b/>
+          <w:bCs/>
+          <w:color w:val="548DD4" w:themeColor="text2" w:themeTint="99"/>
+          <w:szCs w:val="22"/>
+        </w:rPr>
+        <w:t xml:space="preserve">: true) </w:t>
+      </w:r>
+      <w:r>
+        <w:rPr>
+          <w:rFonts w:cstheme="minorHAnsi"/>
+          <w:b/>
+          <w:bCs/>
+          <w:szCs w:val="22"/>
+        </w:rPr>
+        <w:t xml:space="preserve">and </w:t>
+      </w:r>
+      <w:r>
+        <w:rPr>
+          <w:rFonts w:cstheme="minorHAnsi"/>
+          <w:b/>
+          <w:bCs/>
+          <w:color w:val="548DD4" w:themeColor="text2" w:themeTint="99"/>
+          <w:szCs w:val="22"/>
+        </w:rPr>
+        <w:t>-&gt;</w:t>
+      </w:r>
+      <w:proofErr w:type="spellStart"/>
+      <w:r>
+        <w:rPr>
+          <w:rFonts w:cstheme="minorHAnsi"/>
+          <w:b/>
+          <w:bCs/>
+          <w:color w:val="548DD4" w:themeColor="text2" w:themeTint="99"/>
+          <w:szCs w:val="22"/>
+        </w:rPr>
+        <w:t>toggleable</w:t>
+      </w:r>
+      <w:proofErr w:type="spellEnd"/>
+      <w:r>
+        <w:rPr>
+          <w:rFonts w:cstheme="minorHAnsi"/>
+          <w:b/>
+          <w:bCs/>
+          <w:color w:val="548DD4" w:themeColor="text2" w:themeTint="99"/>
+          <w:szCs w:val="22"/>
+        </w:rPr>
+        <w:t>(</w:t>
+      </w:r>
+      <w:proofErr w:type="spellStart"/>
+      <w:r>
+        <w:rPr>
+          <w:rFonts w:cstheme="minorHAnsi"/>
+          <w:b/>
+          <w:bCs/>
+          <w:color w:val="548DD4" w:themeColor="text2" w:themeTint="99"/>
+          <w:szCs w:val="22"/>
+        </w:rPr>
+        <w:t>isToggledHiddenByDefault</w:t>
+      </w:r>
+      <w:proofErr w:type="spellEnd"/>
+      <w:r>
+        <w:rPr>
+          <w:rFonts w:cstheme="minorHAnsi"/>
+          <w:b/>
+          <w:bCs/>
+          <w:color w:val="548DD4" w:themeColor="text2" w:themeTint="99"/>
+          <w:szCs w:val="22"/>
+        </w:rPr>
+        <w:t>: false)</w:t>
+      </w:r>
+    </w:p>
+    <w:p>
+      <w:pPr>
+        <w:rPr>
+          <w:rFonts w:cstheme="minorHAnsi"/>
+          <w:b/>
+          <w:bCs/>
+          <w:color w:val="FF0000"/>
+          <w:szCs w:val="22"/>
+          <w:u w:val="single"/>
+        </w:rPr>
+      </w:pPr>
+    </w:p>
+    <w:p>
+      <w:pPr>
+        <w:rPr>
+          <w:rFonts w:cstheme="minorHAnsi"/>
+          <w:b/>
+          <w:bCs/>
+          <w:color w:val="FF0000"/>
+          <w:szCs w:val="22"/>
+          <w:u w:val="single"/>
+        </w:rPr>
+      </w:pPr>
+      <w:proofErr w:type="spellStart"/>
+      <w:proofErr w:type="gramStart"/>
+      <w:r>
+        <w:rPr>
+          <w:rFonts w:cstheme="minorHAnsi"/>
+          <w:b/>
+          <w:bCs/>
+          <w:color w:val="FF0000"/>
+          <w:szCs w:val="22"/>
+          <w:u w:val="single"/>
+        </w:rPr>
+        <w:t>isToggledHiddenByDefault</w:t>
+      </w:r>
+      <w:proofErr w:type="spellEnd"/>
+      <w:proofErr w:type="gramEnd"/>
+      <w:r>
+        <w:rPr>
+          <w:rFonts w:cstheme="minorHAnsi"/>
+          <w:b/>
+          <w:bCs/>
+          <w:color w:val="FF0000"/>
+          <w:szCs w:val="22"/>
+          <w:u w:val="single"/>
+        </w:rPr>
+        <w:t>: true</w:t>
+      </w:r>
+    </w:p>
+    <w:p>
+      <w:pPr>
+        <w:pStyle w:val="ListParagraph"/>
+        <w:numPr>
+          <w:ilvl w:val="0"/>
+          <w:numId w:val="5"/>
+        </w:numPr>
+        <w:rPr>
+          <w:rFonts w:cstheme="minorHAnsi"/>
+          <w:szCs w:val="22"/>
+        </w:rPr>
+      </w:pPr>
+      <w:r>
+        <w:rPr>
+          <w:rFonts w:cstheme="minorHAnsi"/>
+          <w:szCs w:val="22"/>
+        </w:rPr>
+        <w:t>Starts out hidden.</w:t>
+      </w:r>
+    </w:p>
+    <w:p>
+      <w:pPr>
+        <w:pStyle w:val="ListParagraph"/>
+        <w:numPr>
+          <w:ilvl w:val="0"/>
+          <w:numId w:val="5"/>
+        </w:numPr>
+        <w:rPr>
+          <w:rFonts w:cstheme="minorHAnsi"/>
+          <w:szCs w:val="22"/>
+        </w:rPr>
+      </w:pPr>
+      <w:r>
+        <w:rPr>
+          <w:rFonts w:cstheme="minorHAnsi"/>
+          <w:szCs w:val="22"/>
+        </w:rPr>
+        <w:t>The user must click a box to show it.</w:t>
+      </w:r>
+    </w:p>
+    <w:p>
+      <w:pPr>
+        <w:pStyle w:val="ListParagraph"/>
+        <w:numPr>
+          <w:ilvl w:val="0"/>
+          <w:numId w:val="5"/>
+        </w:numPr>
+        <w:rPr>
+          <w:rFonts w:cstheme="minorHAnsi"/>
+          <w:szCs w:val="22"/>
+        </w:rPr>
+      </w:pPr>
+      <w:r>
+        <w:rPr>
+          <w:rFonts w:cstheme="minorHAnsi"/>
+          <w:szCs w:val="22"/>
+        </w:rPr>
+        <w:t>Use this for extra info you do not need to see every day.</w:t>
+      </w:r>
+    </w:p>
+    <w:p>
+      <w:pPr>
+        <w:rPr>
+          <w:rFonts w:cstheme="minorHAnsi"/>
+          <w:b/>
+          <w:bCs/>
+          <w:color w:val="FF0000"/>
+          <w:szCs w:val="22"/>
+          <w:u w:val="single"/>
+        </w:rPr>
+      </w:pPr>
+      <w:proofErr w:type="spellStart"/>
+      <w:proofErr w:type="gramStart"/>
+      <w:r>
+        <w:rPr>
+          <w:rFonts w:cstheme="minorHAnsi"/>
+          <w:b/>
+          <w:bCs/>
+          <w:color w:val="FF0000"/>
+          <w:szCs w:val="22"/>
+          <w:u w:val="single"/>
+        </w:rPr>
+        <w:t>isToggledHiddenByDefault</w:t>
+      </w:r>
+      <w:proofErr w:type="spellEnd"/>
+      <w:proofErr w:type="gramEnd"/>
+      <w:r>
+        <w:rPr>
+          <w:rFonts w:cstheme="minorHAnsi"/>
+          <w:b/>
+          <w:bCs/>
+          <w:color w:val="FF0000"/>
+          <w:szCs w:val="22"/>
+          <w:u w:val="single"/>
+        </w:rPr>
+        <w:t>: false</w:t>
+      </w:r>
+    </w:p>
+    <w:p>
+      <w:pPr>
+        <w:pStyle w:val="ListParagraph"/>
+        <w:numPr>
+          <w:ilvl w:val="0"/>
+          <w:numId w:val="6"/>
+        </w:numPr>
+        <w:rPr>
+          <w:rFonts w:cstheme="minorHAnsi"/>
+          <w:szCs w:val="22"/>
+        </w:rPr>
+      </w:pPr>
+      <w:r>
+        <w:rPr>
+          <w:rFonts w:cstheme="minorHAnsi"/>
+          <w:szCs w:val="22"/>
+        </w:rPr>
+        <w:t>Starts out visible.</w:t>
+      </w:r>
+    </w:p>
+    <w:p>
+      <w:pPr>
+        <w:pStyle w:val="ListParagraph"/>
+        <w:numPr>
+          <w:ilvl w:val="0"/>
+          <w:numId w:val="6"/>
+        </w:numPr>
+        <w:rPr>
+          <w:rFonts w:cstheme="minorHAnsi"/>
+          <w:szCs w:val="22"/>
+        </w:rPr>
+      </w:pPr>
+      <w:r>
+        <w:rPr>
+          <w:rFonts w:cstheme="minorHAnsi"/>
+          <w:szCs w:val="22"/>
+        </w:rPr>
+        <w:t>The user must click a box to hide it.</w:t>
+      </w:r>
+    </w:p>
+    <w:p>
+      <w:pPr>
+        <w:pStyle w:val="ListParagraph"/>
+        <w:numPr>
+          <w:ilvl w:val="0"/>
+          <w:numId w:val="6"/>
+        </w:numPr>
+        <w:rPr>
+          <w:rFonts w:cstheme="minorHAnsi"/>
+          <w:szCs w:val="22"/>
+        </w:rPr>
+      </w:pPr>
+      <w:r>
+        <w:rPr>
+          <w:rFonts w:cstheme="minorHAnsi"/>
+          <w:szCs w:val="22"/>
+        </w:rPr>
+        <w:t>Use this for important info you want to see immediately.</w:t>
+      </w:r>
     </w:p>
     <w:sectPr>
       <w:pgSz w:w="11906" w:h="16838"/>
@@ -2961,6 +3367,119 @@
 <file path=word/numbering.xml><?xml version="1.0" encoding="utf-8"?>
 <w:numbering xmlns:wpc="http://schemas.microsoft.com/office/word/2010/wordprocessingCanvas" xmlns:mc="http://schemas.openxmlformats.org/markup-compatibility/2006" xmlns:o="urn:schemas-microsoft-com:office:office" xmlns:r="http://schemas.openxmlformats.org/officeDocument/2006/relationships" xmlns:m="http://schemas.openxmlformats.org/officeDocument/2006/math" xmlns:v="urn:schemas-microsoft-com:vml" xmlns:wp14="http://schemas.microsoft.com/office/word/2010/wordprocessingDrawing" xmlns:wp="http://schemas.openxmlformats.org/drawingml/2006/wordprocessingDrawing" xmlns:w10="urn:schemas-microsoft-com:office:word" xmlns:w="http://schemas.openxmlformats.org/wordprocessingml/2006/main" xmlns:w14="http://schemas.microsoft.com/office/word/2010/wordml" xmlns:wpg="http://schemas.microsoft.com/office/word/2010/wordprocessingGroup" xmlns:wpi="http://schemas.microsoft.com/office/word/2010/wordprocessingInk" xmlns:wne="http://schemas.microsoft.com/office/word/2006/wordml" xmlns:wps="http://schemas.microsoft.com/office/word/2010/wordprocessingShape" mc:Ignorable="w14 wp14">
   <w:abstractNum w:abstractNumId="0">
+    <w:nsid w:val="27883FFB"/>
+    <w:multiLevelType w:val="hybridMultilevel"/>
+    <w:tmpl w:val="6A0496F4"/>
+    <w:lvl w:ilvl="0" w:tplc="40090001">
+      <w:start w:val="1"/>
+      <w:numFmt w:val="bullet"/>
+      <w:lvlText w:val=""/>
+      <w:lvlJc w:val="left"/>
+      <w:pPr>
+        <w:ind w:left="720" w:hanging="360"/>
+      </w:pPr>
+      <w:rPr>
+        <w:rFonts w:ascii="Symbol" w:hAnsi="Symbol" w:hint="default"/>
+      </w:rPr>
+    </w:lvl>
+    <w:lvl w:ilvl="1" w:tplc="40090003" w:tentative="1">
+      <w:start w:val="1"/>
+      <w:numFmt w:val="bullet"/>
+      <w:lvlText w:val="o"/>
+      <w:lvlJc w:val="left"/>
+      <w:pPr>
+        <w:ind w:left="1440" w:hanging="360"/>
+      </w:pPr>
+      <w:rPr>
+        <w:rFonts w:ascii="Courier New" w:hAnsi="Courier New" w:cs="Courier New" w:hint="default"/>
+      </w:rPr>
+    </w:lvl>
+    <w:lvl w:ilvl="2" w:tplc="40090005" w:tentative="1">
+      <w:start w:val="1"/>
+      <w:numFmt w:val="bullet"/>
+      <w:lvlText w:val=""/>
+      <w:lvlJc w:val="left"/>
+      <w:pPr>
+        <w:ind w:left="2160" w:hanging="360"/>
+      </w:pPr>
+      <w:rPr>
+        <w:rFonts w:ascii="Wingdings" w:hAnsi="Wingdings" w:hint="default"/>
+      </w:rPr>
+    </w:lvl>
+    <w:lvl w:ilvl="3" w:tplc="40090001" w:tentative="1">
+      <w:start w:val="1"/>
+      <w:numFmt w:val="bullet"/>
+      <w:lvlText w:val=""/>
+      <w:lvlJc w:val="left"/>
+      <w:pPr>
+        <w:ind w:left="2880" w:hanging="360"/>
+      </w:pPr>
+      <w:rPr>
+        <w:rFonts w:ascii="Symbol" w:hAnsi="Symbol" w:hint="default"/>
+      </w:rPr>
+    </w:lvl>
+    <w:lvl w:ilvl="4" w:tplc="40090003" w:tentative="1">
+      <w:start w:val="1"/>
+      <w:numFmt w:val="bullet"/>
+      <w:lvlText w:val="o"/>
+      <w:lvlJc w:val="left"/>
+      <w:pPr>
+        <w:ind w:left="3600" w:hanging="360"/>
+      </w:pPr>
+      <w:rPr>
+        <w:rFonts w:ascii="Courier New" w:hAnsi="Courier New" w:cs="Courier New" w:hint="default"/>
+      </w:rPr>
+    </w:lvl>
+    <w:lvl w:ilvl="5" w:tplc="40090005" w:tentative="1">
+      <w:start w:val="1"/>
+      <w:numFmt w:val="bullet"/>
+      <w:lvlText w:val=""/>
+      <w:lvlJc w:val="left"/>
+      <w:pPr>
+        <w:ind w:left="4320" w:hanging="360"/>
+      </w:pPr>
+      <w:rPr>
+        <w:rFonts w:ascii="Wingdings" w:hAnsi="Wingdings" w:hint="default"/>
+      </w:rPr>
+    </w:lvl>
+    <w:lvl w:ilvl="6" w:tplc="40090001" w:tentative="1">
+      <w:start w:val="1"/>
+      <w:numFmt w:val="bullet"/>
+      <w:lvlText w:val=""/>
+      <w:lvlJc w:val="left"/>
+      <w:pPr>
+        <w:ind w:left="5040" w:hanging="360"/>
+      </w:pPr>
+      <w:rPr>
+        <w:rFonts w:ascii="Symbol" w:hAnsi="Symbol" w:hint="default"/>
+      </w:rPr>
+    </w:lvl>
+    <w:lvl w:ilvl="7" w:tplc="40090003" w:tentative="1">
+      <w:start w:val="1"/>
+      <w:numFmt w:val="bullet"/>
+      <w:lvlText w:val="o"/>
+      <w:lvlJc w:val="left"/>
+      <w:pPr>
+        <w:ind w:left="5760" w:hanging="360"/>
+      </w:pPr>
+      <w:rPr>
+        <w:rFonts w:ascii="Courier New" w:hAnsi="Courier New" w:cs="Courier New" w:hint="default"/>
+      </w:rPr>
+    </w:lvl>
+    <w:lvl w:ilvl="8" w:tplc="40090005" w:tentative="1">
+      <w:start w:val="1"/>
+      <w:numFmt w:val="bullet"/>
+      <w:lvlText w:val=""/>
+      <w:lvlJc w:val="left"/>
+      <w:pPr>
+        <w:ind w:left="6480" w:hanging="360"/>
+      </w:pPr>
+      <w:rPr>
+        <w:rFonts w:ascii="Wingdings" w:hAnsi="Wingdings" w:hint="default"/>
+      </w:rPr>
+    </w:lvl>
+  </w:abstractNum>
+  <w:abstractNum w:abstractNumId="1">
     <w:nsid w:val="3E824C74"/>
     <w:multiLevelType w:val="hybridMultilevel"/>
     <w:tmpl w:val="9A52B122"/>
@@ -3073,7 +3592,7 @@
       </w:rPr>
     </w:lvl>
   </w:abstractNum>
-  <w:abstractNum w:abstractNumId="1">
+  <w:abstractNum w:abstractNumId="2">
     <w:nsid w:val="448F61A1"/>
     <w:multiLevelType w:val="hybridMultilevel"/>
     <w:tmpl w:val="165055AE"/>
@@ -3186,7 +3705,120 @@
       </w:rPr>
     </w:lvl>
   </w:abstractNum>
-  <w:abstractNum w:abstractNumId="2">
+  <w:abstractNum w:abstractNumId="3">
+    <w:nsid w:val="4BA955EF"/>
+    <w:multiLevelType w:val="hybridMultilevel"/>
+    <w:tmpl w:val="0010B848"/>
+    <w:lvl w:ilvl="0" w:tplc="40090001">
+      <w:start w:val="1"/>
+      <w:numFmt w:val="bullet"/>
+      <w:lvlText w:val=""/>
+      <w:lvlJc w:val="left"/>
+      <w:pPr>
+        <w:ind w:left="720" w:hanging="360"/>
+      </w:pPr>
+      <w:rPr>
+        <w:rFonts w:ascii="Symbol" w:hAnsi="Symbol" w:hint="default"/>
+      </w:rPr>
+    </w:lvl>
+    <w:lvl w:ilvl="1" w:tplc="40090003" w:tentative="1">
+      <w:start w:val="1"/>
+      <w:numFmt w:val="bullet"/>
+      <w:lvlText w:val="o"/>
+      <w:lvlJc w:val="left"/>
+      <w:pPr>
+        <w:ind w:left="1440" w:hanging="360"/>
+      </w:pPr>
+      <w:rPr>
+        <w:rFonts w:ascii="Courier New" w:hAnsi="Courier New" w:cs="Courier New" w:hint="default"/>
+      </w:rPr>
+    </w:lvl>
+    <w:lvl w:ilvl="2" w:tplc="40090005" w:tentative="1">
+      <w:start w:val="1"/>
+      <w:numFmt w:val="bullet"/>
+      <w:lvlText w:val=""/>
+      <w:lvlJc w:val="left"/>
+      <w:pPr>
+        <w:ind w:left="2160" w:hanging="360"/>
+      </w:pPr>
+      <w:rPr>
+        <w:rFonts w:ascii="Wingdings" w:hAnsi="Wingdings" w:hint="default"/>
+      </w:rPr>
+    </w:lvl>
+    <w:lvl w:ilvl="3" w:tplc="40090001" w:tentative="1">
+      <w:start w:val="1"/>
+      <w:numFmt w:val="bullet"/>
+      <w:lvlText w:val=""/>
+      <w:lvlJc w:val="left"/>
+      <w:pPr>
+        <w:ind w:left="2880" w:hanging="360"/>
+      </w:pPr>
+      <w:rPr>
+        <w:rFonts w:ascii="Symbol" w:hAnsi="Symbol" w:hint="default"/>
+      </w:rPr>
+    </w:lvl>
+    <w:lvl w:ilvl="4" w:tplc="40090003" w:tentative="1">
+      <w:start w:val="1"/>
+      <w:numFmt w:val="bullet"/>
+      <w:lvlText w:val="o"/>
+      <w:lvlJc w:val="left"/>
+      <w:pPr>
+        <w:ind w:left="3600" w:hanging="360"/>
+      </w:pPr>
+      <w:rPr>
+        <w:rFonts w:ascii="Courier New" w:hAnsi="Courier New" w:cs="Courier New" w:hint="default"/>
+      </w:rPr>
+    </w:lvl>
+    <w:lvl w:ilvl="5" w:tplc="40090005" w:tentative="1">
+      <w:start w:val="1"/>
+      <w:numFmt w:val="bullet"/>
+      <w:lvlText w:val=""/>
+      <w:lvlJc w:val="left"/>
+      <w:pPr>
+        <w:ind w:left="4320" w:hanging="360"/>
+      </w:pPr>
+      <w:rPr>
+        <w:rFonts w:ascii="Wingdings" w:hAnsi="Wingdings" w:hint="default"/>
+      </w:rPr>
+    </w:lvl>
+    <w:lvl w:ilvl="6" w:tplc="40090001" w:tentative="1">
+      <w:start w:val="1"/>
+      <w:numFmt w:val="bullet"/>
+      <w:lvlText w:val=""/>
+      <w:lvlJc w:val="left"/>
+      <w:pPr>
+        <w:ind w:left="5040" w:hanging="360"/>
+      </w:pPr>
+      <w:rPr>
+        <w:rFonts w:ascii="Symbol" w:hAnsi="Symbol" w:hint="default"/>
+      </w:rPr>
+    </w:lvl>
+    <w:lvl w:ilvl="7" w:tplc="40090003" w:tentative="1">
+      <w:start w:val="1"/>
+      <w:numFmt w:val="bullet"/>
+      <w:lvlText w:val="o"/>
+      <w:lvlJc w:val="left"/>
+      <w:pPr>
+        <w:ind w:left="5760" w:hanging="360"/>
+      </w:pPr>
+      <w:rPr>
+        <w:rFonts w:ascii="Courier New" w:hAnsi="Courier New" w:cs="Courier New" w:hint="default"/>
+      </w:rPr>
+    </w:lvl>
+    <w:lvl w:ilvl="8" w:tplc="40090005" w:tentative="1">
+      <w:start w:val="1"/>
+      <w:numFmt w:val="bullet"/>
+      <w:lvlText w:val=""/>
+      <w:lvlJc w:val="left"/>
+      <w:pPr>
+        <w:ind w:left="6480" w:hanging="360"/>
+      </w:pPr>
+      <w:rPr>
+        <w:rFonts w:ascii="Wingdings" w:hAnsi="Wingdings" w:hint="default"/>
+      </w:rPr>
+    </w:lvl>
+  </w:abstractNum>
+  <w:abstractNum w:abstractNumId="4">
     <w:nsid w:val="55F73037"/>
     <w:multiLevelType w:val="hybridMultilevel"/>
     <w:tmpl w:val="C9B47740"/>
@@ -3299,7 +3931,7 @@
       </w:rPr>
     </w:lvl>
   </w:abstractNum>
-  <w:abstractNum w:abstractNumId="3">
+  <w:abstractNum w:abstractNumId="5">
     <w:nsid w:val="7D241509"/>
     <w:multiLevelType w:val="hybridMultilevel"/>
     <w:tmpl w:val="55FE704A"/>
@@ -3413,16 +4045,22 @@
     </w:lvl>
   </w:abstractNum>
   <w:num w:numId="1">
+    <w:abstractNumId w:val="5"/>
+  </w:num>
+  <w:num w:numId="2">
+    <w:abstractNumId w:val="1"/>
+  </w:num>
+  <w:num w:numId="3">
+    <w:abstractNumId w:val="4"/>
+  </w:num>
+  <w:num w:numId="4">
+    <w:abstractNumId w:val="2"/>
+  </w:num>
+  <w:num w:numId="5">
     <w:abstractNumId w:val="3"/>
   </w:num>
-  <w:num w:numId="2">
+  <w:num w:numId="6">
     <w:abstractNumId w:val="0"/>
-  </w:num>
-  <w:num w:numId="3">
-    <w:abstractNumId w:val="2"/>
-  </w:num>
-  <w:num w:numId="4">
-    <w:abstractNumId w:val="1"/>
   </w:num>
 </w:numbering>
 </file>

</xml_diff>

<commit_message>
Add tags RelationManager and post-tag many-to-many relationship
</commit_message>
<xml_diff>
--- a/Filament/filament notes.docx
+++ b/Filament/filament notes.docx
@@ -3006,8 +3006,6 @@
           <w:szCs w:val="22"/>
         </w:rPr>
       </w:pPr>
-      <w:bookmarkStart w:id="0" w:name="_GoBack"/>
-      <w:bookmarkEnd w:id="0"/>
       <w:r>
         <w:rPr>
           <w:rFonts w:cstheme="minorHAnsi"/>
@@ -3353,6 +3351,183 @@
         </w:rPr>
         <w:t>Use this for important info you want to see immediately.</w:t>
       </w:r>
+    </w:p>
+    <w:p>
+      <w:pPr>
+        <w:rPr>
+          <w:rFonts w:cstheme="minorHAnsi"/>
+          <w:szCs w:val="22"/>
+        </w:rPr>
+      </w:pPr>
+      <w:proofErr w:type="gramStart"/>
+      <w:r>
+        <w:rPr>
+          <w:rFonts w:cstheme="minorHAnsi"/>
+          <w:b/>
+          <w:bCs/>
+          <w:color w:val="FF0000"/>
+          <w:sz w:val="28"/>
+          <w:szCs w:val="28"/>
+          <w:u w:val="single"/>
+        </w:rPr>
+        <w:t>constrained(</w:t>
+      </w:r>
+      <w:proofErr w:type="gramEnd"/>
+      <w:r>
+        <w:rPr>
+          <w:rFonts w:cstheme="minorHAnsi"/>
+          <w:b/>
+          <w:bCs/>
+          <w:color w:val="FF0000"/>
+          <w:sz w:val="28"/>
+          <w:szCs w:val="28"/>
+          <w:u w:val="single"/>
+        </w:rPr>
+        <w:t>):</w:t>
+      </w:r>
+      <w:r>
+        <w:rPr>
+          <w:rFonts w:cstheme="minorHAnsi"/>
+          <w:color w:val="FF0000"/>
+          <w:szCs w:val="22"/>
+        </w:rPr>
+        <w:t xml:space="preserve"> </w:t>
+      </w:r>
+      <w:r>
+        <w:rPr>
+          <w:rFonts w:cstheme="minorHAnsi"/>
+          <w:szCs w:val="22"/>
+        </w:rPr>
+        <w:t xml:space="preserve">This tells </w:t>
+      </w:r>
+      <w:proofErr w:type="spellStart"/>
+      <w:r>
+        <w:rPr>
+          <w:rFonts w:cstheme="minorHAnsi"/>
+          <w:szCs w:val="22"/>
+        </w:rPr>
+        <w:t>Laravel</w:t>
+      </w:r>
+      <w:proofErr w:type="spellEnd"/>
+      <w:r>
+        <w:rPr>
+          <w:rFonts w:cstheme="minorHAnsi"/>
+          <w:szCs w:val="22"/>
+        </w:rPr>
+        <w:t xml:space="preserve"> to create a foreign key column and automatically guesses the table and column name based on the column name you define (e.g., if you have </w:t>
+      </w:r>
+      <w:proofErr w:type="spellStart"/>
+      <w:r>
+        <w:rPr>
+          <w:rFonts w:cstheme="minorHAnsi"/>
+          <w:szCs w:val="22"/>
+        </w:rPr>
+        <w:t>user_id</w:t>
+      </w:r>
+      <w:proofErr w:type="spellEnd"/>
+      <w:r>
+        <w:rPr>
+          <w:rFonts w:cstheme="minorHAnsi"/>
+          <w:szCs w:val="22"/>
+        </w:rPr>
+        <w:t>, it automatically references the id column on the users table).</w:t>
+      </w:r>
+    </w:p>
+    <w:p>
+      <w:pPr>
+        <w:rPr>
+          <w:rFonts w:cstheme="minorHAnsi"/>
+          <w:szCs w:val="22"/>
+        </w:rPr>
+      </w:pPr>
+      <w:proofErr w:type="spellStart"/>
+      <w:proofErr w:type="gramStart"/>
+      <w:r>
+        <w:rPr>
+          <w:rFonts w:cstheme="minorHAnsi"/>
+          <w:b/>
+          <w:bCs/>
+          <w:color w:val="FF0000"/>
+          <w:sz w:val="28"/>
+          <w:szCs w:val="28"/>
+          <w:u w:val="single"/>
+        </w:rPr>
+        <w:t>cascadeOnDelete</w:t>
+      </w:r>
+      <w:proofErr w:type="spellEnd"/>
+      <w:r>
+        <w:rPr>
+          <w:rFonts w:cstheme="minorHAnsi"/>
+          <w:b/>
+          <w:bCs/>
+          <w:color w:val="FF0000"/>
+          <w:sz w:val="28"/>
+          <w:szCs w:val="28"/>
+          <w:u w:val="single"/>
+        </w:rPr>
+        <w:t>(</w:t>
+      </w:r>
+      <w:proofErr w:type="gramEnd"/>
+      <w:r>
+        <w:rPr>
+          <w:rFonts w:cstheme="minorHAnsi"/>
+          <w:b/>
+          <w:bCs/>
+          <w:color w:val="FF0000"/>
+          <w:sz w:val="28"/>
+          <w:szCs w:val="28"/>
+          <w:u w:val="single"/>
+        </w:rPr>
+        <w:t>):</w:t>
+      </w:r>
+      <w:r>
+        <w:rPr>
+          <w:rFonts w:cstheme="minorHAnsi"/>
+          <w:color w:val="FF0000"/>
+          <w:szCs w:val="22"/>
+        </w:rPr>
+        <w:t xml:space="preserve"> </w:t>
+      </w:r>
+      <w:r>
+        <w:rPr>
+          <w:rFonts w:cstheme="minorHAnsi"/>
+          <w:szCs w:val="22"/>
+        </w:rPr>
+        <w:t>This applies an ON DELETE CASCADE rule to the database. If a parent record is deleted (like a user), any child records associated with that parent in the foreign table (like their posts or comments) will be automatically deleted by the database.</w:t>
+      </w:r>
+    </w:p>
+    <w:p>
+      <w:pPr>
+        <w:rPr>
+          <w:rFonts w:cstheme="minorHAnsi"/>
+          <w:color w:val="FF0000"/>
+          <w:szCs w:val="22"/>
+        </w:rPr>
+      </w:pPr>
+      <w:r>
+        <w:rPr>
+          <w:rFonts w:cstheme="minorHAnsi"/>
+          <w:szCs w:val="22"/>
+        </w:rPr>
+        <w:t>Make resource then make model</w:t>
+      </w:r>
+      <w:bookmarkStart w:id="0" w:name="_GoBack"/>
+      <w:bookmarkEnd w:id="0"/>
+      <w:r>
+        <w:rPr>
+          <w:rFonts w:cstheme="minorHAnsi"/>
+          <w:szCs w:val="22"/>
+        </w:rPr>
+        <w:t>;</w:t>
+      </w:r>
+    </w:p>
+    <w:p>
+      <w:pPr>
+        <w:rPr>
+          <w:rFonts w:cstheme="minorHAnsi"/>
+          <w:szCs w:val="22"/>
+        </w:rPr>
+      </w:pPr>
     </w:p>
     <w:sectPr>
       <w:pgSz w:w="11906" w:h="16838"/>

</xml_diff>

<commit_message>
Add Filament navigation sidebar with nested location resources
</commit_message>
<xml_diff>
--- a/Filament/filament notes.docx
+++ b/Filament/filament notes.docx
@@ -3500,26 +3500,868 @@
       <w:pPr>
         <w:rPr>
           <w:rFonts w:cstheme="minorHAnsi"/>
-          <w:color w:val="FF0000"/>
-          <w:szCs w:val="22"/>
-        </w:rPr>
-      </w:pPr>
-      <w:r>
-        <w:rPr>
-          <w:rFonts w:cstheme="minorHAnsi"/>
-          <w:szCs w:val="22"/>
-        </w:rPr>
-        <w:t>Make resource then make model</w:t>
+          <w:szCs w:val="22"/>
+        </w:rPr>
+      </w:pPr>
+      <w:r>
+        <w:rPr>
+          <w:rFonts w:cstheme="minorHAnsi"/>
+          <w:szCs w:val="22"/>
+        </w:rPr>
+        <w:t>Make resource then make model;</w:t>
+      </w:r>
+    </w:p>
+    <w:p>
+      <w:pPr>
+        <w:rPr>
+          <w:rFonts w:cstheme="minorHAnsi"/>
+          <w:szCs w:val="22"/>
+        </w:rPr>
+      </w:pPr>
+    </w:p>
+    <w:p>
+      <w:pPr>
+        <w:rPr>
+          <w:rFonts w:cstheme="minorHAnsi"/>
+          <w:b/>
+          <w:bCs/>
+          <w:color w:val="FF0000"/>
+          <w:szCs w:val="22"/>
+        </w:rPr>
+      </w:pPr>
+      <w:r>
+        <w:rPr>
+          <w:rFonts w:cstheme="minorHAnsi"/>
+          <w:b/>
+          <w:bCs/>
+          <w:color w:val="FF0000"/>
+          <w:szCs w:val="22"/>
+        </w:rPr>
+        <w:t>Q: Why use function instead of static property?</w:t>
+      </w:r>
+    </w:p>
+    <w:p>
+      <w:pPr>
+        <w:rPr>
+          <w:rFonts w:cstheme="minorHAnsi"/>
+          <w:b/>
+          <w:bCs/>
+          <w:color w:val="FF0000"/>
+          <w:szCs w:val="22"/>
+        </w:rPr>
+      </w:pPr>
+      <w:r>
+        <w:drawing>
+          <wp:inline distT="0" distB="0" distL="0" distR="0" wp14:anchorId="7A01D12C" wp14:editId="32C28FAE">
+            <wp:extent cx="3654777" cy="1358900"/>
+            <wp:effectExtent l="0" t="0" r="3175" b="0"/>
+            <wp:docPr id="27" name="Picture 27"/>
+            <wp:cNvGraphicFramePr>
+              <a:graphicFrameLocks xmlns:a="http://schemas.openxmlformats.org/drawingml/2006/main" noChangeAspect="1"/>
+            </wp:cNvGraphicFramePr>
+            <a:graphic xmlns:a="http://schemas.openxmlformats.org/drawingml/2006/main">
+              <a:graphicData uri="http://schemas.openxmlformats.org/drawingml/2006/picture">
+                <pic:pic xmlns:pic="http://schemas.openxmlformats.org/drawingml/2006/picture">
+                  <pic:nvPicPr>
+                    <pic:cNvPr id="0" name=""/>
+                    <pic:cNvPicPr/>
+                  </pic:nvPicPr>
+                  <pic:blipFill>
+                    <a:blip r:embed="rId8"/>
+                    <a:stretch>
+                      <a:fillRect/>
+                    </a:stretch>
+                  </pic:blipFill>
+                  <pic:spPr>
+                    <a:xfrm>
+                      <a:off x="0" y="0"/>
+                      <a:ext cx="3657683" cy="1359980"/>
+                    </a:xfrm>
+                    <a:prstGeom prst="rect">
+                      <a:avLst/>
+                    </a:prstGeom>
+                  </pic:spPr>
+                </pic:pic>
+              </a:graphicData>
+            </a:graphic>
+          </wp:inline>
+        </w:drawing>
+      </w:r>
+      <w:r>
+        <w:rPr>
+          <w:rFonts w:cstheme="minorHAnsi"/>
+          <w:color w:val="FF0000"/>
+          <w:szCs w:val="22"/>
+        </w:rPr>
+        <w:drawing>
+          <wp:inline distT="0" distB="0" distL="0" distR="0" wp14:anchorId="66FAC47E" wp14:editId="3D5102DF">
+            <wp:extent cx="3562349" cy="1257300"/>
+            <wp:effectExtent l="0" t="0" r="635" b="0"/>
+            <wp:docPr id="3" name="Picture 3"/>
+            <wp:cNvGraphicFramePr>
+              <a:graphicFrameLocks xmlns:a="http://schemas.openxmlformats.org/drawingml/2006/main" noChangeAspect="1"/>
+            </wp:cNvGraphicFramePr>
+            <a:graphic xmlns:a="http://schemas.openxmlformats.org/drawingml/2006/main">
+              <a:graphicData uri="http://schemas.openxmlformats.org/drawingml/2006/picture">
+                <pic:pic xmlns:pic="http://schemas.openxmlformats.org/drawingml/2006/picture">
+                  <pic:nvPicPr>
+                    <pic:cNvPr id="0" name=""/>
+                    <pic:cNvPicPr/>
+                  </pic:nvPicPr>
+                  <pic:blipFill>
+                    <a:blip r:embed="rId9"/>
+                    <a:stretch>
+                      <a:fillRect/>
+                    </a:stretch>
+                  </pic:blipFill>
+                  <pic:spPr>
+                    <a:xfrm>
+                      <a:off x="0" y="0"/>
+                      <a:ext cx="3562848" cy="1257476"/>
+                    </a:xfrm>
+                    <a:prstGeom prst="rect">
+                      <a:avLst/>
+                    </a:prstGeom>
+                  </pic:spPr>
+                </pic:pic>
+              </a:graphicData>
+            </a:graphic>
+          </wp:inline>
+        </w:drawing>
+      </w:r>
+    </w:p>
+    <w:p>
+      <w:pPr>
+        <w:rPr>
+          <w:rFonts w:cstheme="minorHAnsi"/>
+          <w:b/>
+          <w:bCs/>
+          <w:szCs w:val="22"/>
+        </w:rPr>
+      </w:pPr>
+      <w:proofErr w:type="spellStart"/>
+      <w:r>
+        <w:rPr>
+          <w:rFonts w:cstheme="minorHAnsi"/>
+          <w:b/>
+          <w:bCs/>
+          <w:color w:val="FF0000"/>
+          <w:szCs w:val="22"/>
+        </w:rPr>
+        <w:t>Ans</w:t>
+      </w:r>
+      <w:proofErr w:type="spellEnd"/>
+      <w:proofErr w:type="gramStart"/>
+      <w:r>
+        <w:rPr>
+          <w:rFonts w:cstheme="minorHAnsi"/>
+          <w:b/>
+          <w:bCs/>
+          <w:color w:val="FF0000"/>
+          <w:szCs w:val="22"/>
+        </w:rPr>
+        <w:t>:-</w:t>
+      </w:r>
+      <w:proofErr w:type="gramEnd"/>
+      <w:r>
+        <w:rPr>
+          <w:rFonts w:cstheme="minorHAnsi"/>
+          <w:b/>
+          <w:bCs/>
+          <w:color w:val="FF0000"/>
+          <w:szCs w:val="22"/>
+        </w:rPr>
+        <w:t xml:space="preserve"> </w:t>
+      </w:r>
+      <w:r>
+        <w:rPr>
+          <w:rFonts w:cstheme="minorHAnsi"/>
+          <w:b/>
+          <w:bCs/>
+          <w:color w:val="FF0000"/>
+          <w:szCs w:val="22"/>
+        </w:rPr>
+        <w:t xml:space="preserve"> </w:t>
+      </w:r>
+      <w:r>
+        <w:rPr>
+          <w:rFonts w:cstheme="minorHAnsi"/>
+          <w:b/>
+          <w:bCs/>
+          <w:szCs w:val="22"/>
+        </w:rPr>
+        <w:t>Instead of using a static property like protected static string $</w:t>
+      </w:r>
+      <w:proofErr w:type="spellStart"/>
+      <w:r>
+        <w:rPr>
+          <w:rFonts w:cstheme="minorHAnsi"/>
+          <w:b/>
+          <w:bCs/>
+          <w:szCs w:val="22"/>
+        </w:rPr>
+        <w:t>navigationBadge</w:t>
+      </w:r>
+      <w:proofErr w:type="spellEnd"/>
+      <w:r>
+        <w:rPr>
+          <w:rFonts w:cstheme="minorHAnsi"/>
+          <w:b/>
+          <w:bCs/>
+          <w:szCs w:val="22"/>
+        </w:rPr>
+        <w:t xml:space="preserve"> = '5';, Filament uses the method </w:t>
+      </w:r>
+      <w:proofErr w:type="spellStart"/>
+      <w:r>
+        <w:rPr>
+          <w:rFonts w:cstheme="minorHAnsi"/>
+          <w:b/>
+          <w:bCs/>
+          <w:szCs w:val="22"/>
+        </w:rPr>
+        <w:t>getNavigationBadge</w:t>
+      </w:r>
+      <w:proofErr w:type="spellEnd"/>
+      <w:r>
+        <w:rPr>
+          <w:rFonts w:cstheme="minorHAnsi"/>
+          <w:b/>
+          <w:bCs/>
+          <w:szCs w:val="22"/>
+        </w:rPr>
+        <w:t>() so that your admin dashboard can run live database calculations every single time the page loads.</w:t>
+      </w:r>
+    </w:p>
+    <w:p>
+      <w:pPr>
+        <w:rPr>
+          <w:rFonts w:cstheme="minorHAnsi"/>
+          <w:b/>
+          <w:bCs/>
+          <w:szCs w:val="22"/>
+        </w:rPr>
+      </w:pPr>
+    </w:p>
+    <w:p>
+      <w:pPr>
+        <w:rPr>
+          <w:rFonts w:cstheme="minorHAnsi"/>
+          <w:b/>
+          <w:bCs/>
+          <w:color w:val="FF0000"/>
+          <w:szCs w:val="22"/>
+          <w:u w:val="single"/>
+        </w:rPr>
+      </w:pPr>
+      <w:r>
+        <w:rPr>
+          <w:rFonts w:cstheme="minorHAnsi"/>
+          <w:b/>
+          <w:bCs/>
+          <w:color w:val="FF0000"/>
+          <w:szCs w:val="22"/>
+          <w:u w:val="single"/>
+        </w:rPr>
+        <w:lastRenderedPageBreak/>
+        <w:t xml:space="preserve">Different use case </w:t>
+      </w:r>
+      <w:proofErr w:type="gramStart"/>
+      <w:r>
+        <w:rPr>
+          <w:rFonts w:cstheme="minorHAnsi"/>
+          <w:b/>
+          <w:bCs/>
+          <w:color w:val="FF0000"/>
+          <w:szCs w:val="22"/>
+          <w:u w:val="single"/>
+        </w:rPr>
+        <w:t>of ?</w:t>
+      </w:r>
+      <w:proofErr w:type="gramEnd"/>
+      <w:r>
+        <w:rPr>
+          <w:rFonts w:cstheme="minorHAnsi"/>
+          <w:b/>
+          <w:bCs/>
+          <w:color w:val="FF0000"/>
+          <w:szCs w:val="22"/>
+          <w:u w:val="single"/>
+        </w:rPr>
+        <w:t xml:space="preserve"> </w:t>
+      </w:r>
+      <w:proofErr w:type="gramStart"/>
+      <w:r>
+        <w:rPr>
+          <w:rFonts w:cstheme="minorHAnsi"/>
+          <w:b/>
+          <w:bCs/>
+          <w:color w:val="FF0000"/>
+          <w:szCs w:val="22"/>
+          <w:u w:val="single"/>
+        </w:rPr>
+        <w:t>operator</w:t>
+      </w:r>
+      <w:proofErr w:type="gramEnd"/>
+      <w:r>
+        <w:rPr>
+          <w:rFonts w:cstheme="minorHAnsi"/>
+          <w:b/>
+          <w:bCs/>
+          <w:color w:val="FF0000"/>
+          <w:szCs w:val="22"/>
+          <w:u w:val="single"/>
+        </w:rPr>
+        <w:t>:</w:t>
+      </w:r>
+    </w:p>
+    <w:p>
+      <w:pPr>
+        <w:rPr>
+          <w:rFonts w:cstheme="minorHAnsi"/>
+          <w:b/>
+          <w:bCs/>
+          <w:szCs w:val="22"/>
+        </w:rPr>
+      </w:pPr>
+      <w:r>
+        <w:rPr>
+          <w:rFonts w:cstheme="minorHAnsi"/>
+          <w:b/>
+          <w:bCs/>
+          <w:szCs w:val="22"/>
+        </w:rPr>
+        <w:t xml:space="preserve">1. The </w:t>
+      </w:r>
+      <w:proofErr w:type="spellStart"/>
+      <w:r>
+        <w:rPr>
+          <w:rFonts w:cstheme="minorHAnsi"/>
+          <w:b/>
+          <w:bCs/>
+          <w:szCs w:val="22"/>
+        </w:rPr>
+        <w:t>Nullable</w:t>
+      </w:r>
+      <w:proofErr w:type="spellEnd"/>
+      <w:r>
+        <w:rPr>
+          <w:rFonts w:cstheme="minorHAnsi"/>
+          <w:b/>
+          <w:bCs/>
+          <w:szCs w:val="22"/>
+        </w:rPr>
+        <w:t xml:space="preserve"> Operator (When used with data types)</w:t>
+      </w:r>
+    </w:p>
+    <w:p>
+      <w:pPr>
+        <w:rPr>
+          <w:rFonts w:cstheme="minorHAnsi"/>
+          <w:szCs w:val="22"/>
+        </w:rPr>
+      </w:pPr>
+      <w:r>
+        <w:rPr>
+          <w:rFonts w:cstheme="minorHAnsi"/>
+          <w:szCs w:val="22"/>
+        </w:rPr>
+        <w:t xml:space="preserve">When you </w:t>
+      </w:r>
+      <w:proofErr w:type="gramStart"/>
+      <w:r>
+        <w:rPr>
+          <w:rFonts w:cstheme="minorHAnsi"/>
+          <w:szCs w:val="22"/>
+        </w:rPr>
+        <w:t>see ?</w:t>
+      </w:r>
+      <w:proofErr w:type="gramEnd"/>
+      <w:r>
+        <w:rPr>
+          <w:rFonts w:cstheme="minorHAnsi"/>
+          <w:szCs w:val="22"/>
+        </w:rPr>
+        <w:t xml:space="preserve"> </w:t>
+      </w:r>
+      <w:proofErr w:type="gramStart"/>
+      <w:r>
+        <w:rPr>
+          <w:rFonts w:cstheme="minorHAnsi"/>
+          <w:szCs w:val="22"/>
+        </w:rPr>
+        <w:t>right</w:t>
+      </w:r>
+      <w:proofErr w:type="gramEnd"/>
+      <w:r>
+        <w:rPr>
+          <w:rFonts w:cstheme="minorHAnsi"/>
+          <w:szCs w:val="22"/>
+        </w:rPr>
+        <w:t xml:space="preserve"> before a data type (like : ?string), it means "this or nothing."</w:t>
+      </w:r>
+    </w:p>
+    <w:p>
+      <w:pPr>
+        <w:pStyle w:val="ListParagraph"/>
+        <w:numPr>
+          <w:ilvl w:val="0"/>
+          <w:numId w:val="7"/>
+        </w:numPr>
+        <w:rPr>
+          <w:rFonts w:cstheme="minorHAnsi"/>
+          <w:szCs w:val="22"/>
+        </w:rPr>
+      </w:pPr>
+      <w:proofErr w:type="gramStart"/>
+      <w:r>
+        <w:rPr>
+          <w:rFonts w:cstheme="minorHAnsi"/>
+          <w:szCs w:val="22"/>
+        </w:rPr>
+        <w:t>string</w:t>
+      </w:r>
+      <w:proofErr w:type="gramEnd"/>
+      <w:r>
+        <w:rPr>
+          <w:rFonts w:cstheme="minorHAnsi"/>
+          <w:szCs w:val="22"/>
+        </w:rPr>
+        <w:t xml:space="preserve"> means: The function must return text.</w:t>
+      </w:r>
+    </w:p>
+    <w:p>
+      <w:pPr>
+        <w:pStyle w:val="ListParagraph"/>
+        <w:numPr>
+          <w:ilvl w:val="0"/>
+          <w:numId w:val="7"/>
+        </w:numPr>
+        <w:rPr>
+          <w:rFonts w:cstheme="minorHAnsi"/>
+          <w:szCs w:val="22"/>
+        </w:rPr>
+      </w:pPr>
+      <w:r>
+        <w:rPr>
+          <w:rFonts w:cstheme="minorHAnsi"/>
+          <w:szCs w:val="22"/>
+        </w:rPr>
+        <w:t>?string means: The function can return text OR it can return null (completely empty).</w:t>
+      </w:r>
+    </w:p>
+    <w:p>
+      <w:pPr>
+        <w:rPr>
+          <w:rFonts w:cstheme="minorHAnsi"/>
+          <w:szCs w:val="22"/>
+        </w:rPr>
+      </w:pPr>
+      <w:r>
+        <w:rPr>
+          <w:rFonts w:cstheme="minorHAnsi"/>
+          <w:szCs w:val="22"/>
+        </w:rPr>
+        <w:t>Why it's useful: It prevents your application from crashing if a database query comes back completely empty.</w:t>
+      </w:r>
+    </w:p>
+    <w:p>
+      <w:pPr>
+        <w:rPr>
+          <w:rFonts w:cstheme="minorHAnsi"/>
+          <w:szCs w:val="22"/>
+        </w:rPr>
+      </w:pPr>
+    </w:p>
+    <w:p>
+      <w:pPr>
+        <w:rPr>
+          <w:rFonts w:cstheme="minorHAnsi"/>
+          <w:b/>
+          <w:bCs/>
+          <w:szCs w:val="22"/>
+        </w:rPr>
+      </w:pPr>
+      <w:r>
+        <w:rPr>
+          <w:rFonts w:cstheme="minorHAnsi"/>
+          <w:b/>
+          <w:bCs/>
+          <w:szCs w:val="22"/>
+        </w:rPr>
+        <w:t>2. The Ternary Operator (When used in a shortcut if/else)</w:t>
+      </w:r>
+    </w:p>
+    <w:p>
+      <w:pPr>
+        <w:rPr>
+          <w:rFonts w:cstheme="minorHAnsi"/>
+          <w:szCs w:val="22"/>
+        </w:rPr>
+      </w:pPr>
+      <w:r>
+        <w:rPr>
+          <w:rFonts w:cstheme="minorHAnsi"/>
+          <w:szCs w:val="22"/>
+        </w:rPr>
+        <w:t>When used inside a line of code with a colon (:), it is a quick way to write a question.</w:t>
+      </w:r>
+    </w:p>
+    <w:p>
+      <w:pPr>
+        <w:rPr>
+          <w:rFonts w:cstheme="minorHAnsi"/>
+          <w:b/>
+          <w:bCs/>
+          <w:color w:val="548DD4" w:themeColor="text2" w:themeTint="99"/>
+          <w:szCs w:val="22"/>
+        </w:rPr>
+      </w:pPr>
+      <w:r>
+        <w:rPr>
+          <w:rFonts w:cstheme="minorHAnsi"/>
+          <w:b/>
+          <w:bCs/>
+          <w:color w:val="548DD4" w:themeColor="text2" w:themeTint="99"/>
+          <w:szCs w:val="22"/>
+        </w:rPr>
+        <w:t>PHP</w:t>
+      </w:r>
+    </w:p>
+    <w:p>
+      <w:pPr>
+        <w:rPr>
+          <w:rFonts w:cstheme="minorHAnsi"/>
+          <w:b/>
+          <w:bCs/>
+          <w:color w:val="548DD4" w:themeColor="text2" w:themeTint="99"/>
+          <w:szCs w:val="22"/>
+        </w:rPr>
+      </w:pPr>
+      <w:proofErr w:type="gramStart"/>
+      <w:r>
+        <w:rPr>
+          <w:rFonts w:cstheme="minorHAnsi"/>
+          <w:b/>
+          <w:bCs/>
+          <w:color w:val="548DD4" w:themeColor="text2" w:themeTint="99"/>
+          <w:szCs w:val="22"/>
+        </w:rPr>
+        <w:t>return</w:t>
+      </w:r>
+      <w:proofErr w:type="gramEnd"/>
+      <w:r>
+        <w:rPr>
+          <w:rFonts w:cstheme="minorHAnsi"/>
+          <w:b/>
+          <w:bCs/>
+          <w:color w:val="548DD4" w:themeColor="text2" w:themeTint="99"/>
+          <w:szCs w:val="22"/>
+        </w:rPr>
+        <w:t xml:space="preserve"> ($count &gt; 0) ? "We have data</w:t>
+      </w:r>
+      <w:proofErr w:type="gramStart"/>
+      <w:r>
+        <w:rPr>
+          <w:rFonts w:cstheme="minorHAnsi"/>
+          <w:b/>
+          <w:bCs/>
+          <w:color w:val="548DD4" w:themeColor="text2" w:themeTint="99"/>
+          <w:szCs w:val="22"/>
+        </w:rPr>
+        <w:t>" :</w:t>
+      </w:r>
+      <w:proofErr w:type="gramEnd"/>
+      <w:r>
+        <w:rPr>
+          <w:rFonts w:cstheme="minorHAnsi"/>
+          <w:b/>
+          <w:bCs/>
+          <w:color w:val="548DD4" w:themeColor="text2" w:themeTint="99"/>
+          <w:szCs w:val="22"/>
+        </w:rPr>
+        <w:t xml:space="preserve"> "Empty";</w:t>
+      </w:r>
+    </w:p>
+    <w:p>
+      <w:pPr>
+        <w:rPr>
+          <w:rFonts w:cstheme="minorHAnsi"/>
+          <w:szCs w:val="22"/>
+        </w:rPr>
+      </w:pPr>
+      <w:r>
+        <w:rPr>
+          <w:rFonts w:cstheme="minorHAnsi"/>
+          <w:szCs w:val="22"/>
+        </w:rPr>
+        <w:t xml:space="preserve">Think of </w:t>
+      </w:r>
+      <w:proofErr w:type="gramStart"/>
+      <w:r>
+        <w:rPr>
+          <w:rFonts w:cstheme="minorHAnsi"/>
+          <w:szCs w:val="22"/>
+        </w:rPr>
+        <w:t>the ?</w:t>
+      </w:r>
+      <w:proofErr w:type="gramEnd"/>
+      <w:r>
+        <w:rPr>
+          <w:rFonts w:cstheme="minorHAnsi"/>
+          <w:szCs w:val="22"/>
+        </w:rPr>
+        <w:t xml:space="preserve"> </w:t>
+      </w:r>
+      <w:proofErr w:type="gramStart"/>
+      <w:r>
+        <w:rPr>
+          <w:rFonts w:cstheme="minorHAnsi"/>
+          <w:szCs w:val="22"/>
+        </w:rPr>
+        <w:t>as</w:t>
+      </w:r>
+      <w:proofErr w:type="gramEnd"/>
+      <w:r>
+        <w:rPr>
+          <w:rFonts w:cstheme="minorHAnsi"/>
+          <w:szCs w:val="22"/>
+        </w:rPr>
+        <w:t xml:space="preserve"> asking: "Is the statement on my left true?"</w:t>
+      </w:r>
+    </w:p>
+    <w:p>
+      <w:pPr>
+        <w:pStyle w:val="ListParagraph"/>
+        <w:numPr>
+          <w:ilvl w:val="0"/>
+          <w:numId w:val="8"/>
+        </w:numPr>
+        <w:rPr>
+          <w:rFonts w:cstheme="minorHAnsi"/>
+          <w:szCs w:val="22"/>
+        </w:rPr>
+      </w:pPr>
+      <w:r>
+        <w:rPr>
+          <w:rFonts w:cstheme="minorHAnsi"/>
+          <w:szCs w:val="22"/>
+        </w:rPr>
+        <w:t>If yes, it chooses the first option ("We have data").</w:t>
+      </w:r>
+    </w:p>
+    <w:p>
+      <w:pPr>
+        <w:pStyle w:val="ListParagraph"/>
+        <w:numPr>
+          <w:ilvl w:val="0"/>
+          <w:numId w:val="8"/>
+        </w:numPr>
+        <w:rPr>
+          <w:rFonts w:cstheme="minorHAnsi"/>
+          <w:szCs w:val="22"/>
+        </w:rPr>
+      </w:pPr>
+      <w:r>
+        <w:rPr>
+          <w:rFonts w:cstheme="minorHAnsi"/>
+          <w:szCs w:val="22"/>
+        </w:rPr>
+        <w:t>If no, it chooses the second option after the colon ("Empty").</w:t>
+      </w:r>
+    </w:p>
+    <w:p>
+      <w:pPr>
+        <w:rPr>
+          <w:rFonts w:cstheme="minorHAnsi"/>
+          <w:b/>
+          <w:bCs/>
+          <w:szCs w:val="22"/>
+        </w:rPr>
+      </w:pPr>
+      <w:r>
+        <w:rPr>
+          <w:rFonts w:cstheme="minorHAnsi"/>
+          <w:b/>
+          <w:bCs/>
+          <w:szCs w:val="22"/>
+        </w:rPr>
+        <w:t>3. The Null Coalescing Operator (??)</w:t>
+      </w:r>
+    </w:p>
+    <w:p>
+      <w:pPr>
+        <w:rPr>
+          <w:rFonts w:cstheme="minorHAnsi"/>
+          <w:szCs w:val="22"/>
+        </w:rPr>
+      </w:pPr>
+      <w:r>
+        <w:rPr>
+          <w:rFonts w:cstheme="minorHAnsi"/>
+          <w:szCs w:val="22"/>
+        </w:rPr>
+        <w:t>If you ever string two of them together side-by-side like this</w:t>
+      </w:r>
+      <w:proofErr w:type="gramStart"/>
+      <w:r>
+        <w:rPr>
+          <w:rFonts w:cstheme="minorHAnsi"/>
+          <w:szCs w:val="22"/>
+        </w:rPr>
+        <w:t>: ??</w:t>
+      </w:r>
+      <w:proofErr w:type="gramEnd"/>
+      <w:r>
+        <w:rPr>
+          <w:rFonts w:cstheme="minorHAnsi"/>
+          <w:szCs w:val="22"/>
+        </w:rPr>
+        <w:t>, it becomes the Null Coalescing Operator.</w:t>
+      </w:r>
+    </w:p>
+    <w:p>
+      <w:pPr>
+        <w:rPr>
+          <w:rFonts w:cstheme="minorHAnsi"/>
+          <w:b/>
+          <w:bCs/>
+          <w:color w:val="548DD4" w:themeColor="text2" w:themeTint="99"/>
+          <w:szCs w:val="22"/>
+        </w:rPr>
+      </w:pPr>
+      <w:r>
+        <w:rPr>
+          <w:rFonts w:cstheme="minorHAnsi"/>
+          <w:b/>
+          <w:bCs/>
+          <w:color w:val="548DD4" w:themeColor="text2" w:themeTint="99"/>
+          <w:szCs w:val="22"/>
+        </w:rPr>
+        <w:t>PHP</w:t>
+      </w:r>
+    </w:p>
+    <w:p>
+      <w:pPr>
+        <w:rPr>
+          <w:rFonts w:cstheme="minorHAnsi"/>
+          <w:i/>
+          <w:iCs/>
+          <w:color w:val="548DD4" w:themeColor="text2" w:themeTint="99"/>
+          <w:szCs w:val="22"/>
+        </w:rPr>
+      </w:pPr>
+      <w:r>
+        <w:rPr>
+          <w:rFonts w:cstheme="minorHAnsi"/>
+          <w:i/>
+          <w:iCs/>
+          <w:color w:val="548DD4" w:themeColor="text2" w:themeTint="99"/>
+          <w:szCs w:val="22"/>
+        </w:rPr>
+        <w:t>// If the profile photo is null, fall back to 'default.jpg' automatically</w:t>
+      </w:r>
+    </w:p>
+    <w:p>
+      <w:pPr>
+        <w:rPr>
+          <w:rFonts w:cstheme="minorHAnsi"/>
+          <w:b/>
+          <w:bCs/>
+          <w:color w:val="548DD4" w:themeColor="text2" w:themeTint="99"/>
+          <w:szCs w:val="22"/>
+        </w:rPr>
+      </w:pPr>
+      <w:proofErr w:type="gramStart"/>
+      <w:r>
+        <w:rPr>
+          <w:rFonts w:cstheme="minorHAnsi"/>
+          <w:b/>
+          <w:bCs/>
+          <w:color w:val="548DD4" w:themeColor="text2" w:themeTint="99"/>
+          <w:szCs w:val="22"/>
+        </w:rPr>
+        <w:t>return</w:t>
+      </w:r>
+      <w:proofErr w:type="gramEnd"/>
+      <w:r>
+        <w:rPr>
+          <w:rFonts w:cstheme="minorHAnsi"/>
+          <w:b/>
+          <w:bCs/>
+          <w:color w:val="548DD4" w:themeColor="text2" w:themeTint="99"/>
+          <w:szCs w:val="22"/>
+        </w:rPr>
+        <w:t xml:space="preserve"> $user-&gt;</w:t>
+      </w:r>
+      <w:proofErr w:type="spellStart"/>
+      <w:r>
+        <w:rPr>
+          <w:rFonts w:cstheme="minorHAnsi"/>
+          <w:b/>
+          <w:bCs/>
+          <w:color w:val="548DD4" w:themeColor="text2" w:themeTint="99"/>
+          <w:szCs w:val="22"/>
+        </w:rPr>
+        <w:t>profile_photo</w:t>
+      </w:r>
+      <w:proofErr w:type="spellEnd"/>
+      <w:r>
+        <w:rPr>
+          <w:rFonts w:cstheme="minorHAnsi"/>
+          <w:b/>
+          <w:bCs/>
+          <w:color w:val="548DD4" w:themeColor="text2" w:themeTint="99"/>
+          <w:szCs w:val="22"/>
+        </w:rPr>
+        <w:t xml:space="preserve"> ?? 'default.jp</w:t>
       </w:r>
       <w:bookmarkStart w:id="0" w:name="_GoBack"/>
       <w:bookmarkEnd w:id="0"/>
       <w:r>
         <w:rPr>
           <w:rFonts w:cstheme="minorHAnsi"/>
-          <w:szCs w:val="22"/>
-        </w:rPr>
-        <w:t>;</w:t>
-      </w:r>
+          <w:b/>
+          <w:bCs/>
+          <w:color w:val="548DD4" w:themeColor="text2" w:themeTint="99"/>
+          <w:szCs w:val="22"/>
+        </w:rPr>
+        <w:t>g';</w:t>
+      </w:r>
+    </w:p>
+    <w:p>
+      <w:pPr>
+        <w:rPr>
+          <w:rFonts w:cstheme="minorHAnsi"/>
+          <w:szCs w:val="22"/>
+        </w:rPr>
+      </w:pPr>
+      <w:r>
+        <w:rPr>
+          <w:rFonts w:cstheme="minorHAnsi"/>
+          <w:b/>
+          <w:bCs/>
+          <w:i/>
+          <w:iCs/>
+          <w:szCs w:val="22"/>
+        </w:rPr>
+        <w:t>What it means:</w:t>
+      </w:r>
+      <w:r>
+        <w:rPr>
+          <w:rFonts w:cstheme="minorHAnsi"/>
+          <w:szCs w:val="22"/>
+        </w:rPr>
+        <w:t xml:space="preserve"> It acts as a safety net wrapper that checks if the value on the left exists. If it is null or missing, it seamlessly falls back to the alternative option on the right.</w:t>
+      </w:r>
+    </w:p>
+    <w:p>
+      <w:pPr>
+        <w:rPr>
+          <w:rFonts w:cstheme="minorHAnsi"/>
+          <w:szCs w:val="22"/>
+        </w:rPr>
+      </w:pPr>
     </w:p>
     <w:p>
       <w:pPr>
@@ -3881,6 +4723,119 @@
     </w:lvl>
   </w:abstractNum>
   <w:abstractNum w:abstractNumId="3">
+    <w:nsid w:val="45FB5FEE"/>
+    <w:multiLevelType w:val="hybridMultilevel"/>
+    <w:tmpl w:val="CAA22B96"/>
+    <w:lvl w:ilvl="0" w:tplc="40090001">
+      <w:start w:val="1"/>
+      <w:numFmt w:val="bullet"/>
+      <w:lvlText w:val=""/>
+      <w:lvlJc w:val="left"/>
+      <w:pPr>
+        <w:ind w:left="720" w:hanging="360"/>
+      </w:pPr>
+      <w:rPr>
+        <w:rFonts w:ascii="Symbol" w:hAnsi="Symbol" w:hint="default"/>
+      </w:rPr>
+    </w:lvl>
+    <w:lvl w:ilvl="1" w:tplc="40090003" w:tentative="1">
+      <w:start w:val="1"/>
+      <w:numFmt w:val="bullet"/>
+      <w:lvlText w:val="o"/>
+      <w:lvlJc w:val="left"/>
+      <w:pPr>
+        <w:ind w:left="1440" w:hanging="360"/>
+      </w:pPr>
+      <w:rPr>
+        <w:rFonts w:ascii="Courier New" w:hAnsi="Courier New" w:cs="Courier New" w:hint="default"/>
+      </w:rPr>
+    </w:lvl>
+    <w:lvl w:ilvl="2" w:tplc="40090005" w:tentative="1">
+      <w:start w:val="1"/>
+      <w:numFmt w:val="bullet"/>
+      <w:lvlText w:val=""/>
+      <w:lvlJc w:val="left"/>
+      <w:pPr>
+        <w:ind w:left="2160" w:hanging="360"/>
+      </w:pPr>
+      <w:rPr>
+        <w:rFonts w:ascii="Wingdings" w:hAnsi="Wingdings" w:hint="default"/>
+      </w:rPr>
+    </w:lvl>
+    <w:lvl w:ilvl="3" w:tplc="40090001" w:tentative="1">
+      <w:start w:val="1"/>
+      <w:numFmt w:val="bullet"/>
+      <w:lvlText w:val=""/>
+      <w:lvlJc w:val="left"/>
+      <w:pPr>
+        <w:ind w:left="2880" w:hanging="360"/>
+      </w:pPr>
+      <w:rPr>
+        <w:rFonts w:ascii="Symbol" w:hAnsi="Symbol" w:hint="default"/>
+      </w:rPr>
+    </w:lvl>
+    <w:lvl w:ilvl="4" w:tplc="40090003" w:tentative="1">
+      <w:start w:val="1"/>
+      <w:numFmt w:val="bullet"/>
+      <w:lvlText w:val="o"/>
+      <w:lvlJc w:val="left"/>
+      <w:pPr>
+        <w:ind w:left="3600" w:hanging="360"/>
+      </w:pPr>
+      <w:rPr>
+        <w:rFonts w:ascii="Courier New" w:hAnsi="Courier New" w:cs="Courier New" w:hint="default"/>
+      </w:rPr>
+    </w:lvl>
+    <w:lvl w:ilvl="5" w:tplc="40090005" w:tentative="1">
+      <w:start w:val="1"/>
+      <w:numFmt w:val="bullet"/>
+      <w:lvlText w:val=""/>
+      <w:lvlJc w:val="left"/>
+      <w:pPr>
+        <w:ind w:left="4320" w:hanging="360"/>
+      </w:pPr>
+      <w:rPr>
+        <w:rFonts w:ascii="Wingdings" w:hAnsi="Wingdings" w:hint="default"/>
+      </w:rPr>
+    </w:lvl>
+    <w:lvl w:ilvl="6" w:tplc="40090001" w:tentative="1">
+      <w:start w:val="1"/>
+      <w:numFmt w:val="bullet"/>
+      <w:lvlText w:val=""/>
+      <w:lvlJc w:val="left"/>
+      <w:pPr>
+        <w:ind w:left="5040" w:hanging="360"/>
+      </w:pPr>
+      <w:rPr>
+        <w:rFonts w:ascii="Symbol" w:hAnsi="Symbol" w:hint="default"/>
+      </w:rPr>
+    </w:lvl>
+    <w:lvl w:ilvl="7" w:tplc="40090003" w:tentative="1">
+      <w:start w:val="1"/>
+      <w:numFmt w:val="bullet"/>
+      <w:lvlText w:val="o"/>
+      <w:lvlJc w:val="left"/>
+      <w:pPr>
+        <w:ind w:left="5760" w:hanging="360"/>
+      </w:pPr>
+      <w:rPr>
+        <w:rFonts w:ascii="Courier New" w:hAnsi="Courier New" w:cs="Courier New" w:hint="default"/>
+      </w:rPr>
+    </w:lvl>
+    <w:lvl w:ilvl="8" w:tplc="40090005" w:tentative="1">
+      <w:start w:val="1"/>
+      <w:numFmt w:val="bullet"/>
+      <w:lvlText w:val=""/>
+      <w:lvlJc w:val="left"/>
+      <w:pPr>
+        <w:ind w:left="6480" w:hanging="360"/>
+      </w:pPr>
+      <w:rPr>
+        <w:rFonts w:ascii="Wingdings" w:hAnsi="Wingdings" w:hint="default"/>
+      </w:rPr>
+    </w:lvl>
+  </w:abstractNum>
+  <w:abstractNum w:abstractNumId="4">
     <w:nsid w:val="4BA955EF"/>
     <w:multiLevelType w:val="hybridMultilevel"/>
     <w:tmpl w:val="0010B848"/>
@@ -3993,7 +4948,7 @@
       </w:rPr>
     </w:lvl>
   </w:abstractNum>
-  <w:abstractNum w:abstractNumId="4">
+  <w:abstractNum w:abstractNumId="5">
     <w:nsid w:val="55F73037"/>
     <w:multiLevelType w:val="hybridMultilevel"/>
     <w:tmpl w:val="C9B47740"/>
@@ -4106,7 +5061,120 @@
       </w:rPr>
     </w:lvl>
   </w:abstractNum>
-  <w:abstractNum w:abstractNumId="5">
+  <w:abstractNum w:abstractNumId="6">
+    <w:nsid w:val="76B420E5"/>
+    <w:multiLevelType w:val="hybridMultilevel"/>
+    <w:tmpl w:val="386CE270"/>
+    <w:lvl w:ilvl="0" w:tplc="40090001">
+      <w:start w:val="1"/>
+      <w:numFmt w:val="bullet"/>
+      <w:lvlText w:val=""/>
+      <w:lvlJc w:val="left"/>
+      <w:pPr>
+        <w:ind w:left="720" w:hanging="360"/>
+      </w:pPr>
+      <w:rPr>
+        <w:rFonts w:ascii="Symbol" w:hAnsi="Symbol" w:hint="default"/>
+      </w:rPr>
+    </w:lvl>
+    <w:lvl w:ilvl="1" w:tplc="40090003" w:tentative="1">
+      <w:start w:val="1"/>
+      <w:numFmt w:val="bullet"/>
+      <w:lvlText w:val="o"/>
+      <w:lvlJc w:val="left"/>
+      <w:pPr>
+        <w:ind w:left="1440" w:hanging="360"/>
+      </w:pPr>
+      <w:rPr>
+        <w:rFonts w:ascii="Courier New" w:hAnsi="Courier New" w:cs="Courier New" w:hint="default"/>
+      </w:rPr>
+    </w:lvl>
+    <w:lvl w:ilvl="2" w:tplc="40090005" w:tentative="1">
+      <w:start w:val="1"/>
+      <w:numFmt w:val="bullet"/>
+      <w:lvlText w:val=""/>
+      <w:lvlJc w:val="left"/>
+      <w:pPr>
+        <w:ind w:left="2160" w:hanging="360"/>
+      </w:pPr>
+      <w:rPr>
+        <w:rFonts w:ascii="Wingdings" w:hAnsi="Wingdings" w:hint="default"/>
+      </w:rPr>
+    </w:lvl>
+    <w:lvl w:ilvl="3" w:tplc="40090001" w:tentative="1">
+      <w:start w:val="1"/>
+      <w:numFmt w:val="bullet"/>
+      <w:lvlText w:val=""/>
+      <w:lvlJc w:val="left"/>
+      <w:pPr>
+        <w:ind w:left="2880" w:hanging="360"/>
+      </w:pPr>
+      <w:rPr>
+        <w:rFonts w:ascii="Symbol" w:hAnsi="Symbol" w:hint="default"/>
+      </w:rPr>
+    </w:lvl>
+    <w:lvl w:ilvl="4" w:tplc="40090003" w:tentative="1">
+      <w:start w:val="1"/>
+      <w:numFmt w:val="bullet"/>
+      <w:lvlText w:val="o"/>
+      <w:lvlJc w:val="left"/>
+      <w:pPr>
+        <w:ind w:left="3600" w:hanging="360"/>
+      </w:pPr>
+      <w:rPr>
+        <w:rFonts w:ascii="Courier New" w:hAnsi="Courier New" w:cs="Courier New" w:hint="default"/>
+      </w:rPr>
+    </w:lvl>
+    <w:lvl w:ilvl="5" w:tplc="40090005" w:tentative="1">
+      <w:start w:val="1"/>
+      <w:numFmt w:val="bullet"/>
+      <w:lvlText w:val=""/>
+      <w:lvlJc w:val="left"/>
+      <w:pPr>
+        <w:ind w:left="4320" w:hanging="360"/>
+      </w:pPr>
+      <w:rPr>
+        <w:rFonts w:ascii="Wingdings" w:hAnsi="Wingdings" w:hint="default"/>
+      </w:rPr>
+    </w:lvl>
+    <w:lvl w:ilvl="6" w:tplc="40090001" w:tentative="1">
+      <w:start w:val="1"/>
+      <w:numFmt w:val="bullet"/>
+      <w:lvlText w:val=""/>
+      <w:lvlJc w:val="left"/>
+      <w:pPr>
+        <w:ind w:left="5040" w:hanging="360"/>
+      </w:pPr>
+      <w:rPr>
+        <w:rFonts w:ascii="Symbol" w:hAnsi="Symbol" w:hint="default"/>
+      </w:rPr>
+    </w:lvl>
+    <w:lvl w:ilvl="7" w:tplc="40090003" w:tentative="1">
+      <w:start w:val="1"/>
+      <w:numFmt w:val="bullet"/>
+      <w:lvlText w:val="o"/>
+      <w:lvlJc w:val="left"/>
+      <w:pPr>
+        <w:ind w:left="5760" w:hanging="360"/>
+      </w:pPr>
+      <w:rPr>
+        <w:rFonts w:ascii="Courier New" w:hAnsi="Courier New" w:cs="Courier New" w:hint="default"/>
+      </w:rPr>
+    </w:lvl>
+    <w:lvl w:ilvl="8" w:tplc="40090005" w:tentative="1">
+      <w:start w:val="1"/>
+      <w:numFmt w:val="bullet"/>
+      <w:lvlText w:val=""/>
+      <w:lvlJc w:val="left"/>
+      <w:pPr>
+        <w:ind w:left="6480" w:hanging="360"/>
+      </w:pPr>
+      <w:rPr>
+        <w:rFonts w:ascii="Wingdings" w:hAnsi="Wingdings" w:hint="default"/>
+      </w:rPr>
+    </w:lvl>
+  </w:abstractNum>
+  <w:abstractNum w:abstractNumId="7">
     <w:nsid w:val="7D241509"/>
     <w:multiLevelType w:val="hybridMultilevel"/>
     <w:tmpl w:val="55FE704A"/>
@@ -4220,22 +5288,28 @@
     </w:lvl>
   </w:abstractNum>
   <w:num w:numId="1">
-    <w:abstractNumId w:val="5"/>
+    <w:abstractNumId w:val="7"/>
   </w:num>
   <w:num w:numId="2">
     <w:abstractNumId w:val="1"/>
   </w:num>
   <w:num w:numId="3">
-    <w:abstractNumId w:val="4"/>
+    <w:abstractNumId w:val="5"/>
   </w:num>
   <w:num w:numId="4">
     <w:abstractNumId w:val="2"/>
   </w:num>
   <w:num w:numId="5">
-    <w:abstractNumId w:val="3"/>
+    <w:abstractNumId w:val="4"/>
   </w:num>
   <w:num w:numId="6">
     <w:abstractNumId w:val="0"/>
+  </w:num>
+  <w:num w:numId="7">
+    <w:abstractNumId w:val="3"/>
+  </w:num>
+  <w:num w:numId="8">
+    <w:abstractNumId w:val="6"/>
   </w:num>
 </w:numbering>
 </file>

</xml_diff>

<commit_message>
Implement role-based dashboards and widgets for Filament RBAC panels
</commit_message>
<xml_diff>
--- a/Filament/filament notes.docx
+++ b/Filament/filament notes.docx
@@ -3551,6 +3551,10 @@
         </w:rPr>
       </w:pPr>
       <w:r>
+        <w:rPr>
+          <w:noProof/>
+          <w:lang w:eastAsia="en-IN"/>
+        </w:rPr>
         <w:drawing>
           <wp:inline distT="0" distB="0" distL="0" distR="0" wp14:anchorId="7A01D12C" wp14:editId="32C28FAE">
             <wp:extent cx="3654777" cy="1358900"/>
@@ -3590,8 +3594,10 @@
       <w:r>
         <w:rPr>
           <w:rFonts w:cstheme="minorHAnsi"/>
-          <w:color w:val="FF0000"/>
-          <w:szCs w:val="22"/>
+          <w:noProof/>
+          <w:color w:val="FF0000"/>
+          <w:szCs w:val="22"/>
+          <w:lang w:eastAsia="en-IN"/>
         </w:rPr>
         <w:drawing>
           <wp:inline distT="0" distB="0" distL="0" distR="0" wp14:anchorId="66FAC47E" wp14:editId="3D5102DF">
@@ -4314,19 +4320,7 @@
           <w:color w:val="548DD4" w:themeColor="text2" w:themeTint="99"/>
           <w:szCs w:val="22"/>
         </w:rPr>
-        <w:t xml:space="preserve"> ?? 'default.jp</w:t>
-      </w:r>
-      <w:bookmarkStart w:id="0" w:name="_GoBack"/>
-      <w:bookmarkEnd w:id="0"/>
-      <w:r>
-        <w:rPr>
-          <w:rFonts w:cstheme="minorHAnsi"/>
-          <w:b/>
-          <w:bCs/>
-          <w:color w:val="548DD4" w:themeColor="text2" w:themeTint="99"/>
-          <w:szCs w:val="22"/>
-        </w:rPr>
-        <w:t>g';</w:t>
+        <w:t xml:space="preserve"> ?? 'default.jpg';</w:t>
       </w:r>
     </w:p>
     <w:p>
@@ -4354,6 +4348,701 @@
         </w:rPr>
         <w:t xml:space="preserve"> It acts as a safety net wrapper that checks if the value on the left exists. If it is null or missing, it seamlessly falls back to the alternative option on the right.</w:t>
       </w:r>
+    </w:p>
+    <w:p>
+      <w:pPr>
+        <w:rPr>
+          <w:rFonts w:cstheme="minorHAnsi"/>
+          <w:szCs w:val="22"/>
+        </w:rPr>
+      </w:pPr>
+      <w:r>
+        <w:rPr>
+          <w:rFonts w:cstheme="minorHAnsi"/>
+          <w:szCs w:val="22"/>
+        </w:rPr>
+        <w:t>Here is a short, structured summary of the procedure from `image_d65c7d.jpg` that you can easily copy into your notes:</w:t>
+      </w:r>
+    </w:p>
+    <w:p>
+      <w:pPr>
+        <w:rPr>
+          <w:rFonts w:cstheme="minorHAnsi"/>
+          <w:szCs w:val="22"/>
+        </w:rPr>
+      </w:pPr>
+    </w:p>
+    <w:p>
+      <w:pPr>
+        <w:rPr>
+          <w:rFonts w:cstheme="minorHAnsi"/>
+          <w:szCs w:val="22"/>
+        </w:rPr>
+      </w:pPr>
+    </w:p>
+    <w:p>
+      <w:pPr>
+        <w:rPr>
+          <w:rFonts w:cstheme="minorHAnsi"/>
+          <w:b/>
+          <w:bCs/>
+          <w:sz w:val="28"/>
+          <w:szCs w:val="28"/>
+        </w:rPr>
+      </w:pPr>
+      <w:r>
+        <w:rPr>
+          <w:rFonts w:cstheme="minorHAnsi"/>
+          <w:b/>
+          <w:bCs/>
+          <w:sz w:val="28"/>
+          <w:szCs w:val="28"/>
+        </w:rPr>
+        <w:t xml:space="preserve">How to create </w:t>
+      </w:r>
+      <w:r>
+        <w:rPr>
+          <w:rFonts w:cstheme="minorHAnsi"/>
+          <w:b/>
+          <w:bCs/>
+          <w:sz w:val="28"/>
+          <w:szCs w:val="28"/>
+        </w:rPr>
+        <w:t>a Resource-Specific Widget in Filament</w:t>
+      </w:r>
+    </w:p>
+    <w:p>
+      <w:pPr>
+        <w:rPr>
+          <w:rFonts w:cstheme="minorHAnsi"/>
+          <w:b/>
+          <w:bCs/>
+          <w:sz w:val="28"/>
+          <w:szCs w:val="28"/>
+        </w:rPr>
+      </w:pPr>
+      <w:r>
+        <w:rPr>
+          <w:rFonts w:cstheme="minorHAnsi"/>
+          <w:b/>
+          <w:bCs/>
+          <w:sz w:val="28"/>
+          <w:szCs w:val="28"/>
+        </w:rPr>
+        <w:lastRenderedPageBreak/>
+        <w:drawing>
+          <wp:inline distT="0" distB="0" distL="0" distR="0" wp14:anchorId="2E133CC9" wp14:editId="7B71C50B">
+            <wp:extent cx="5731510" cy="3042109"/>
+            <wp:effectExtent l="0" t="0" r="2540" b="6350"/>
+            <wp:docPr id="4" name="Picture 4"/>
+            <wp:cNvGraphicFramePr>
+              <a:graphicFrameLocks xmlns:a="http://schemas.openxmlformats.org/drawingml/2006/main" noChangeAspect="1"/>
+            </wp:cNvGraphicFramePr>
+            <a:graphic xmlns:a="http://schemas.openxmlformats.org/drawingml/2006/main">
+              <a:graphicData uri="http://schemas.openxmlformats.org/drawingml/2006/picture">
+                <pic:pic xmlns:pic="http://schemas.openxmlformats.org/drawingml/2006/picture">
+                  <pic:nvPicPr>
+                    <pic:cNvPr id="0" name=""/>
+                    <pic:cNvPicPr/>
+                  </pic:nvPicPr>
+                  <pic:blipFill>
+                    <a:blip r:embed="rId10"/>
+                    <a:stretch>
+                      <a:fillRect/>
+                    </a:stretch>
+                  </pic:blipFill>
+                  <pic:spPr>
+                    <a:xfrm>
+                      <a:off x="0" y="0"/>
+                      <a:ext cx="5731510" cy="3042109"/>
+                    </a:xfrm>
+                    <a:prstGeom prst="rect">
+                      <a:avLst/>
+                    </a:prstGeom>
+                  </pic:spPr>
+                </pic:pic>
+              </a:graphicData>
+            </a:graphic>
+          </wp:inline>
+        </w:drawing>
+      </w:r>
+    </w:p>
+    <w:p>
+      <w:pPr>
+        <w:rPr>
+          <w:rFonts w:cstheme="minorHAnsi"/>
+          <w:b/>
+          <w:bCs/>
+          <w:sz w:val="28"/>
+          <w:szCs w:val="28"/>
+        </w:rPr>
+      </w:pPr>
+      <w:r>
+        <w:rPr>
+          <w:rFonts w:cstheme="minorHAnsi"/>
+          <w:b/>
+          <w:bCs/>
+          <w:sz w:val="28"/>
+          <w:szCs w:val="28"/>
+        </w:rPr>
+        <w:t>Like this</w:t>
+      </w:r>
+    </w:p>
+    <w:p>
+      <w:pPr>
+        <w:rPr>
+          <w:rFonts w:cstheme="minorHAnsi"/>
+          <w:szCs w:val="22"/>
+        </w:rPr>
+      </w:pPr>
+      <w:r>
+        <w:rPr>
+          <w:rFonts w:cstheme="minorHAnsi"/>
+          <w:b/>
+          <w:bCs/>
+          <w:i/>
+          <w:iCs/>
+          <w:szCs w:val="22"/>
+        </w:rPr>
+        <w:t>S</w:t>
+      </w:r>
+      <w:r>
+        <w:rPr>
+          <w:rFonts w:cstheme="minorHAnsi"/>
+          <w:b/>
+          <w:bCs/>
+          <w:i/>
+          <w:iCs/>
+          <w:szCs w:val="22"/>
+        </w:rPr>
+        <w:t>tep 1 run these commands into the terminal:</w:t>
+      </w:r>
+    </w:p>
+    <w:p>
+      <w:pPr>
+        <w:rPr>
+          <w:rFonts w:cstheme="minorHAnsi"/>
+          <w:szCs w:val="22"/>
+        </w:rPr>
+      </w:pPr>
+      <w:r>
+        <w:rPr>
+          <w:rFonts w:cstheme="minorHAnsi"/>
+          <w:szCs w:val="22"/>
+        </w:rPr>
+        <w:t>1. Run the Command:</w:t>
+      </w:r>
+    </w:p>
+    <w:p>
+      <w:pPr>
+        <w:rPr>
+          <w:rFonts w:cstheme="minorHAnsi"/>
+          <w:szCs w:val="22"/>
+        </w:rPr>
+      </w:pPr>
+      <w:r>
+        <w:rPr>
+          <w:rFonts w:cstheme="minorHAnsi"/>
+          <w:szCs w:val="22"/>
+        </w:rPr>
+        <w:t>Execute `</w:t>
+      </w:r>
+      <w:proofErr w:type="spellStart"/>
+      <w:r>
+        <w:rPr>
+          <w:rFonts w:cstheme="minorHAnsi"/>
+          <w:szCs w:val="22"/>
+        </w:rPr>
+        <w:t>php</w:t>
+      </w:r>
+      <w:proofErr w:type="spellEnd"/>
+      <w:r>
+        <w:rPr>
+          <w:rFonts w:cstheme="minorHAnsi"/>
+          <w:szCs w:val="22"/>
+        </w:rPr>
+        <w:t xml:space="preserve"> artisan </w:t>
+      </w:r>
+      <w:proofErr w:type="spellStart"/>
+      <w:r>
+        <w:rPr>
+          <w:rFonts w:cstheme="minorHAnsi"/>
+          <w:szCs w:val="22"/>
+        </w:rPr>
+        <w:t>make</w:t>
+      </w:r>
+      <w:proofErr w:type="gramStart"/>
+      <w:r>
+        <w:rPr>
+          <w:rFonts w:cstheme="minorHAnsi"/>
+          <w:szCs w:val="22"/>
+        </w:rPr>
+        <w:t>:filament</w:t>
+      </w:r>
+      <w:proofErr w:type="gramEnd"/>
+      <w:r>
+        <w:rPr>
+          <w:rFonts w:cstheme="minorHAnsi"/>
+          <w:szCs w:val="22"/>
+        </w:rPr>
+        <w:t>-widget</w:t>
+      </w:r>
+      <w:proofErr w:type="spellEnd"/>
+      <w:r>
+        <w:rPr>
+          <w:rFonts w:cstheme="minorHAnsi"/>
+          <w:szCs w:val="22"/>
+        </w:rPr>
+        <w:t xml:space="preserve"> </w:t>
+      </w:r>
+      <w:proofErr w:type="spellStart"/>
+      <w:r>
+        <w:rPr>
+          <w:rFonts w:cstheme="minorHAnsi"/>
+          <w:szCs w:val="22"/>
+        </w:rPr>
+        <w:t>WidgetName</w:t>
+      </w:r>
+      <w:proofErr w:type="spellEnd"/>
+      <w:r>
+        <w:rPr>
+          <w:rFonts w:cstheme="minorHAnsi"/>
+          <w:szCs w:val="22"/>
+        </w:rPr>
+        <w:t>` in the terminal.</w:t>
+      </w:r>
+    </w:p>
+    <w:p>
+      <w:pPr>
+        <w:rPr>
+          <w:rFonts w:cstheme="minorHAnsi"/>
+          <w:szCs w:val="22"/>
+        </w:rPr>
+      </w:pPr>
+      <w:r>
+        <w:rPr>
+          <w:rFonts w:cstheme="minorHAnsi"/>
+          <w:szCs w:val="22"/>
+        </w:rPr>
+        <w:t>2. Select Type:</w:t>
+      </w:r>
+    </w:p>
+    <w:p>
+      <w:pPr>
+        <w:rPr>
+          <w:rFonts w:cstheme="minorHAnsi"/>
+          <w:szCs w:val="22"/>
+        </w:rPr>
+      </w:pPr>
+      <w:r>
+        <w:rPr>
+          <w:rFonts w:cstheme="minorHAnsi"/>
+          <w:szCs w:val="22"/>
+        </w:rPr>
+        <w:t>Choose the widget type (e.g., `Stats overview`, `Chart`, `Table`, or `Custom`).</w:t>
+      </w:r>
+    </w:p>
+    <w:p>
+      <w:pPr>
+        <w:rPr>
+          <w:rFonts w:cstheme="minorHAnsi"/>
+          <w:szCs w:val="22"/>
+        </w:rPr>
+      </w:pPr>
+      <w:r>
+        <w:rPr>
+          <w:rFonts w:cstheme="minorHAnsi"/>
+          <w:szCs w:val="22"/>
+        </w:rPr>
+        <w:t>3. Set Panel Scope:</w:t>
+      </w:r>
+    </w:p>
+    <w:p>
+      <w:pPr>
+        <w:rPr>
+          <w:rFonts w:cstheme="minorHAnsi"/>
+          <w:szCs w:val="22"/>
+        </w:rPr>
+      </w:pPr>
+      <w:r>
+        <w:rPr>
+          <w:rFonts w:cstheme="minorHAnsi"/>
+          <w:szCs w:val="22"/>
+        </w:rPr>
+        <w:t>Answer **yes** to create it in a specific panel (if prompted).</w:t>
+      </w:r>
+    </w:p>
+    <w:p>
+      <w:pPr>
+        <w:rPr>
+          <w:rFonts w:cstheme="minorHAnsi"/>
+          <w:szCs w:val="22"/>
+        </w:rPr>
+      </w:pPr>
+      <w:r>
+        <w:rPr>
+          <w:rFonts w:cstheme="minorHAnsi"/>
+          <w:szCs w:val="22"/>
+        </w:rPr>
+        <w:t>4. **Set Resource Scope</w:t>
+      </w:r>
+      <w:proofErr w:type="gramStart"/>
+      <w:r>
+        <w:rPr>
+          <w:rFonts w:cstheme="minorHAnsi"/>
+          <w:szCs w:val="22"/>
+        </w:rPr>
+        <w:t>:*</w:t>
+      </w:r>
+      <w:proofErr w:type="gramEnd"/>
+      <w:r>
+        <w:rPr>
+          <w:rFonts w:cstheme="minorHAnsi"/>
+          <w:szCs w:val="22"/>
+        </w:rPr>
+        <w:t>*</w:t>
+      </w:r>
+    </w:p>
+    <w:p>
+      <w:pPr>
+        <w:rPr>
+          <w:rFonts w:cstheme="minorHAnsi"/>
+          <w:szCs w:val="22"/>
+        </w:rPr>
+      </w:pPr>
+      <w:r>
+        <w:rPr>
+          <w:rFonts w:cstheme="minorHAnsi"/>
+          <w:szCs w:val="22"/>
+        </w:rPr>
+        <w:t>Answer **yes** to create it inside a resource, then select the target resource (e.g., `Users`).</w:t>
+      </w:r>
+    </w:p>
+    <w:p>
+      <w:pPr>
+        <w:rPr>
+          <w:rFonts w:cstheme="minorHAnsi"/>
+          <w:szCs w:val="22"/>
+        </w:rPr>
+      </w:pPr>
+      <w:r>
+        <w:rPr>
+          <w:rFonts w:cstheme="minorHAnsi"/>
+          <w:szCs w:val="22"/>
+        </w:rPr>
+        <w:t>5. **Confirm &amp; Finalize</w:t>
+      </w:r>
+      <w:proofErr w:type="gramStart"/>
+      <w:r>
+        <w:rPr>
+          <w:rFonts w:cstheme="minorHAnsi"/>
+          <w:szCs w:val="22"/>
+        </w:rPr>
+        <w:t>:*</w:t>
+      </w:r>
+      <w:proofErr w:type="gramEnd"/>
+      <w:r>
+        <w:rPr>
+          <w:rFonts w:cstheme="minorHAnsi"/>
+          <w:szCs w:val="22"/>
+        </w:rPr>
+        <w:t>*</w:t>
+      </w:r>
+    </w:p>
+    <w:p>
+      <w:pPr>
+        <w:rPr>
+          <w:rFonts w:cstheme="minorHAnsi"/>
+          <w:szCs w:val="22"/>
+        </w:rPr>
+      </w:pPr>
+      <w:r>
+        <w:rPr>
+          <w:rFonts w:cstheme="minorHAnsi"/>
+          <w:szCs w:val="22"/>
+        </w:rPr>
+        <w:t>Press **Enter** at the final prompt to generate the files and receive the success confirmation.</w:t>
+      </w:r>
+    </w:p>
+    <w:p>
+      <w:pPr>
+        <w:rPr>
+          <w:rFonts w:cstheme="minorHAnsi"/>
+          <w:szCs w:val="22"/>
+        </w:rPr>
+      </w:pPr>
+    </w:p>
+    <w:p>
+      <w:pPr>
+        <w:rPr>
+          <w:rFonts w:cstheme="minorHAnsi"/>
+          <w:szCs w:val="22"/>
+        </w:rPr>
+      </w:pPr>
+      <w:r>
+        <w:rPr>
+          <w:rFonts w:cstheme="minorHAnsi"/>
+          <w:szCs w:val="22"/>
+        </w:rPr>
+        <w:t>---</w:t>
+      </w:r>
+    </w:p>
+    <w:p>
+      <w:pPr>
+        <w:rPr>
+          <w:rFonts w:cstheme="minorHAnsi"/>
+          <w:szCs w:val="22"/>
+        </w:rPr>
+      </w:pPr>
+    </w:p>
+    <w:p>
+      <w:pPr>
+        <w:rPr>
+          <w:rFonts w:cstheme="minorHAnsi"/>
+          <w:szCs w:val="22"/>
+        </w:rPr>
+      </w:pPr>
+      <w:r>
+        <w:rPr>
+          <w:rFonts w:cstheme="minorHAnsi"/>
+          <w:szCs w:val="22"/>
+        </w:rPr>
+        <w:t>## Displaying the Widget (Code Integration)</w:t>
+      </w:r>
+    </w:p>
+    <w:p>
+      <w:pPr>
+        <w:rPr>
+          <w:rFonts w:cstheme="minorHAnsi"/>
+          <w:szCs w:val="22"/>
+        </w:rPr>
+      </w:pPr>
+    </w:p>
+    <w:p>
+      <w:pPr>
+        <w:rPr>
+          <w:rFonts w:cstheme="minorHAnsi"/>
+          <w:szCs w:val="22"/>
+        </w:rPr>
+      </w:pPr>
+      <w:r>
+        <w:rPr>
+          <w:rFonts w:cstheme="minorHAnsi"/>
+          <w:szCs w:val="22"/>
+        </w:rPr>
+        <w:lastRenderedPageBreak/>
+        <w:t>* **Step 1 (Logic):** Add query/data logic (like `User:</w:t>
+      </w:r>
+      <w:proofErr w:type="gramStart"/>
+      <w:r>
+        <w:rPr>
+          <w:rFonts w:cstheme="minorHAnsi"/>
+          <w:szCs w:val="22"/>
+        </w:rPr>
+        <w:t>:count</w:t>
+      </w:r>
+      <w:proofErr w:type="gramEnd"/>
+      <w:r>
+        <w:rPr>
+          <w:rFonts w:cstheme="minorHAnsi"/>
+          <w:szCs w:val="22"/>
+        </w:rPr>
+        <w:t>()`) inside the generated widget class's `</w:t>
+      </w:r>
+      <w:proofErr w:type="spellStart"/>
+      <w:r>
+        <w:rPr>
+          <w:rFonts w:cstheme="minorHAnsi"/>
+          <w:szCs w:val="22"/>
+        </w:rPr>
+        <w:t>getStats</w:t>
+      </w:r>
+      <w:proofErr w:type="spellEnd"/>
+      <w:r>
+        <w:rPr>
+          <w:rFonts w:cstheme="minorHAnsi"/>
+          <w:szCs w:val="22"/>
+        </w:rPr>
+        <w:t>()` or `</w:t>
+      </w:r>
+      <w:proofErr w:type="spellStart"/>
+      <w:r>
+        <w:rPr>
+          <w:rFonts w:cstheme="minorHAnsi"/>
+          <w:szCs w:val="22"/>
+        </w:rPr>
+        <w:t>getData</w:t>
+      </w:r>
+      <w:proofErr w:type="spellEnd"/>
+      <w:r>
+        <w:rPr>
+          <w:rFonts w:cstheme="minorHAnsi"/>
+          <w:szCs w:val="22"/>
+        </w:rPr>
+        <w:t>()` method.</w:t>
+      </w:r>
+    </w:p>
+    <w:p>
+      <w:pPr>
+        <w:rPr>
+          <w:rFonts w:cstheme="minorHAnsi"/>
+          <w:szCs w:val="22"/>
+        </w:rPr>
+      </w:pPr>
+      <w:r>
+        <w:rPr>
+          <w:rFonts w:cstheme="minorHAnsi"/>
+          <w:szCs w:val="22"/>
+        </w:rPr>
+        <w:t>* **Step 2 (Register):** Return the widget class inside the `</w:t>
+      </w:r>
+      <w:proofErr w:type="spellStart"/>
+      <w:proofErr w:type="gramStart"/>
+      <w:r>
+        <w:rPr>
+          <w:rFonts w:cstheme="minorHAnsi"/>
+          <w:szCs w:val="22"/>
+        </w:rPr>
+        <w:t>getWidgets</w:t>
+      </w:r>
+      <w:proofErr w:type="spellEnd"/>
+      <w:r>
+        <w:rPr>
+          <w:rFonts w:cstheme="minorHAnsi"/>
+          <w:szCs w:val="22"/>
+        </w:rPr>
+        <w:t>(</w:t>
+      </w:r>
+      <w:proofErr w:type="gramEnd"/>
+      <w:r>
+        <w:rPr>
+          <w:rFonts w:cstheme="minorHAnsi"/>
+          <w:szCs w:val="22"/>
+        </w:rPr>
+        <w:t>)` method of your main Resource file (e.g.</w:t>
+      </w:r>
+      <w:bookmarkStart w:id="0" w:name="_GoBack"/>
+      <w:r>
+        <w:rPr>
+          <w:rFonts w:cstheme="minorHAnsi"/>
+          <w:b/>
+          <w:bCs/>
+          <w:szCs w:val="22"/>
+        </w:rPr>
+        <w:t>, `</w:t>
+      </w:r>
+      <w:proofErr w:type="spellStart"/>
+      <w:r>
+        <w:rPr>
+          <w:rFonts w:cstheme="minorHAnsi"/>
+          <w:b/>
+          <w:bCs/>
+          <w:szCs w:val="22"/>
+        </w:rPr>
+        <w:t>UserResource.php</w:t>
+      </w:r>
+      <w:proofErr w:type="spellEnd"/>
+      <w:r>
+        <w:rPr>
+          <w:rFonts w:cstheme="minorHAnsi"/>
+          <w:b/>
+          <w:bCs/>
+          <w:szCs w:val="22"/>
+        </w:rPr>
+        <w:t>`).</w:t>
+      </w:r>
+      <w:bookmarkEnd w:id="0"/>
+    </w:p>
+    <w:p>
+      <w:pPr>
+        <w:rPr>
+          <w:rFonts w:cstheme="minorHAnsi"/>
+          <w:szCs w:val="22"/>
+        </w:rPr>
+      </w:pPr>
+      <w:r>
+        <w:rPr>
+          <w:rFonts w:cstheme="minorHAnsi"/>
+          <w:szCs w:val="22"/>
+        </w:rPr>
+        <w:t>* **Step 3 (Display):** Add the widget class to the `</w:t>
+      </w:r>
+      <w:proofErr w:type="spellStart"/>
+      <w:proofErr w:type="gramStart"/>
+      <w:r>
+        <w:rPr>
+          <w:rFonts w:cstheme="minorHAnsi"/>
+          <w:szCs w:val="22"/>
+        </w:rPr>
+        <w:t>getHeaderWidgets</w:t>
+      </w:r>
+      <w:proofErr w:type="spellEnd"/>
+      <w:r>
+        <w:rPr>
+          <w:rFonts w:cstheme="minorHAnsi"/>
+          <w:szCs w:val="22"/>
+        </w:rPr>
+        <w:t>(</w:t>
+      </w:r>
+      <w:proofErr w:type="gramEnd"/>
+      <w:r>
+        <w:rPr>
+          <w:rFonts w:cstheme="minorHAnsi"/>
+          <w:szCs w:val="22"/>
+        </w:rPr>
+        <w:t>)` or `</w:t>
+      </w:r>
+      <w:proofErr w:type="spellStart"/>
+      <w:r>
+        <w:rPr>
+          <w:rFonts w:cstheme="minorHAnsi"/>
+          <w:szCs w:val="22"/>
+        </w:rPr>
+        <w:t>getFooterWidgets</w:t>
+      </w:r>
+      <w:proofErr w:type="spellEnd"/>
+      <w:r>
+        <w:rPr>
+          <w:rFonts w:cstheme="minorHAnsi"/>
+          <w:szCs w:val="22"/>
+        </w:rPr>
+        <w:t>()` method of the resource page (e.g., `</w:t>
+      </w:r>
+      <w:proofErr w:type="spellStart"/>
+      <w:r>
+        <w:rPr>
+          <w:rFonts w:cstheme="minorHAnsi"/>
+          <w:b/>
+          <w:bCs/>
+          <w:szCs w:val="22"/>
+        </w:rPr>
+        <w:t>ListUsers.php</w:t>
+      </w:r>
+      <w:proofErr w:type="spellEnd"/>
+      <w:r>
+        <w:rPr>
+          <w:rFonts w:cstheme="minorHAnsi"/>
+          <w:szCs w:val="22"/>
+        </w:rPr>
+        <w:t xml:space="preserve">`) </w:t>
+      </w:r>
+      <w:r>
+        <w:rPr>
+          <w:rFonts w:cstheme="minorHAnsi"/>
+          <w:b/>
+          <w:bCs/>
+          <w:szCs w:val="22"/>
+        </w:rPr>
+        <w:t>where you want it to appear.</w:t>
+      </w:r>
+    </w:p>
+    <w:p>
+      <w:pPr>
+        <w:rPr>
+          <w:rFonts w:cstheme="minorHAnsi"/>
+          <w:szCs w:val="22"/>
+        </w:rPr>
+      </w:pPr>
     </w:p>
     <w:p>
       <w:pPr>

</xml_diff>

<commit_message>
Implement SaaS-ready multi-panel architecture with RBAC
</commit_message>
<xml_diff>
--- a/Filament/filament notes.docx
+++ b/Filament/filament notes.docx
@@ -4398,9 +4398,11 @@
           <w:sz w:val="28"/>
           <w:szCs w:val="28"/>
         </w:rPr>
-        <w:t xml:space="preserve">How to create </w:t>
-      </w:r>
-      <w:r>
+        <w:t>How to create a Resource-Specific Widget in Filament</w:t>
+      </w:r>
+    </w:p>
+    <w:p>
+      <w:pPr>
         <w:rPr>
           <w:rFonts w:cstheme="minorHAnsi"/>
           <w:b/>
@@ -4408,26 +4410,16 @@
           <w:sz w:val="28"/>
           <w:szCs w:val="28"/>
         </w:rPr>
-        <w:t>a Resource-Specific Widget in Filament</w:t>
-      </w:r>
-    </w:p>
-    <w:p>
-      <w:pPr>
-        <w:rPr>
-          <w:rFonts w:cstheme="minorHAnsi"/>
-          <w:b/>
-          <w:bCs/>
+      </w:pPr>
+      <w:r>
+        <w:rPr>
+          <w:rFonts w:cstheme="minorHAnsi"/>
+          <w:b/>
+          <w:bCs/>
+          <w:noProof/>
           <w:sz w:val="28"/>
           <w:szCs w:val="28"/>
-        </w:rPr>
-      </w:pPr>
-      <w:r>
-        <w:rPr>
-          <w:rFonts w:cstheme="minorHAnsi"/>
-          <w:b/>
-          <w:bCs/>
-          <w:sz w:val="28"/>
-          <w:szCs w:val="28"/>
+          <w:lang w:eastAsia="en-IN"/>
         </w:rPr>
         <w:lastRenderedPageBreak/>
         <w:drawing>
@@ -4921,7 +4913,6 @@
         </w:rPr>
         <w:t>)` method of your main Resource file (e.g.</w:t>
       </w:r>
-      <w:bookmarkStart w:id="0" w:name="_GoBack"/>
       <w:r>
         <w:rPr>
           <w:rFonts w:cstheme="minorHAnsi"/>
@@ -4951,12 +4942,13 @@
         </w:rPr>
         <w:t>`).</w:t>
       </w:r>
-      <w:bookmarkEnd w:id="0"/>
-    </w:p>
-    <w:p>
-      <w:pPr>
-        <w:rPr>
-          <w:rFonts w:cstheme="minorHAnsi"/>
+    </w:p>
+    <w:p>
+      <w:pPr>
+        <w:rPr>
+          <w:rFonts w:cstheme="minorHAnsi"/>
+          <w:b/>
+          <w:bCs/>
           <w:szCs w:val="22"/>
         </w:rPr>
       </w:pPr>
@@ -5034,6 +5026,1106 @@
           <w:szCs w:val="22"/>
         </w:rPr>
         <w:t>where you want it to appear.</w:t>
+      </w:r>
+    </w:p>
+    <w:p>
+      <w:pPr>
+        <w:rPr>
+          <w:rFonts w:cstheme="minorHAnsi"/>
+          <w:b/>
+          <w:bCs/>
+          <w:szCs w:val="22"/>
+        </w:rPr>
+      </w:pPr>
+    </w:p>
+    <w:p>
+      <w:pPr>
+        <w:rPr>
+          <w:rFonts w:cstheme="minorHAnsi"/>
+          <w:b/>
+          <w:bCs/>
+          <w:color w:val="FF0000"/>
+          <w:sz w:val="28"/>
+          <w:szCs w:val="28"/>
+          <w:u w:val="single"/>
+        </w:rPr>
+      </w:pPr>
+      <w:r>
+        <w:rPr>
+          <w:rFonts w:cstheme="minorHAnsi"/>
+          <w:b/>
+          <w:bCs/>
+          <w:color w:val="FF0000"/>
+          <w:sz w:val="28"/>
+          <w:szCs w:val="28"/>
+          <w:u w:val="single"/>
+        </w:rPr>
+        <w:t xml:space="preserve">How to Implement </w:t>
+      </w:r>
+      <w:proofErr w:type="spellStart"/>
+      <w:r>
+        <w:rPr>
+          <w:rFonts w:cstheme="minorHAnsi"/>
+          <w:b/>
+          <w:bCs/>
+          <w:color w:val="FF0000"/>
+          <w:sz w:val="28"/>
+          <w:szCs w:val="28"/>
+          <w:u w:val="single"/>
+        </w:rPr>
+        <w:t>Multi Tenant</w:t>
+      </w:r>
+      <w:proofErr w:type="spellEnd"/>
+      <w:r>
+        <w:rPr>
+          <w:rFonts w:cstheme="minorHAnsi"/>
+          <w:b/>
+          <w:bCs/>
+          <w:color w:val="FF0000"/>
+          <w:sz w:val="28"/>
+          <w:szCs w:val="28"/>
+          <w:u w:val="single"/>
+        </w:rPr>
+        <w:t xml:space="preserve"> panel:</w:t>
+      </w:r>
+    </w:p>
+    <w:p>
+      <w:pPr>
+        <w:rPr>
+          <w:rFonts w:cstheme="minorHAnsi"/>
+          <w:color w:val="FF0000"/>
+          <w:szCs w:val="22"/>
+          <w:u w:val="single"/>
+        </w:rPr>
+      </w:pPr>
+    </w:p>
+    <w:p>
+      <w:pPr>
+        <w:rPr>
+          <w:rFonts w:cstheme="minorHAnsi"/>
+          <w:szCs w:val="22"/>
+        </w:rPr>
+      </w:pPr>
+      <w:r>
+        <w:rPr>
+          <w:rFonts w:cstheme="minorHAnsi"/>
+          <w:szCs w:val="22"/>
+        </w:rPr>
+        <w:t>Multi-Tenancy Implementation in Filament</w:t>
+      </w:r>
+    </w:p>
+    <w:p>
+      <w:pPr>
+        <w:rPr>
+          <w:rFonts w:cstheme="minorHAnsi"/>
+          <w:b/>
+          <w:bCs/>
+          <w:szCs w:val="22"/>
+          <w:u w:val="single"/>
+        </w:rPr>
+      </w:pPr>
+      <w:r>
+        <w:rPr>
+          <w:rFonts w:cstheme="minorHAnsi"/>
+          <w:b/>
+          <w:bCs/>
+          <w:szCs w:val="22"/>
+          <w:u w:val="single"/>
+        </w:rPr>
+        <w:t>1. What is Multi-Tenancy here?</w:t>
+      </w:r>
+    </w:p>
+    <w:p>
+      <w:pPr>
+        <w:rPr>
+          <w:rFonts w:cstheme="minorHAnsi"/>
+          <w:szCs w:val="22"/>
+        </w:rPr>
+      </w:pPr>
+      <w:r>
+        <w:rPr>
+          <w:rFonts w:cstheme="minorHAnsi"/>
+          <w:szCs w:val="22"/>
+        </w:rPr>
+        <w:t>Instead of users seeing everyone's data, the application is split into separate accounts/groups called Teams (the Tenants).</w:t>
+      </w:r>
+    </w:p>
+    <w:p>
+      <w:pPr>
+        <w:rPr>
+          <w:rFonts w:cstheme="minorHAnsi"/>
+          <w:szCs w:val="22"/>
+        </w:rPr>
+      </w:pPr>
+      <w:r>
+        <w:rPr>
+          <w:rFonts w:cstheme="minorHAnsi"/>
+          <w:szCs w:val="22"/>
+        </w:rPr>
+        <w:t>A user can belong to multiple teams.</w:t>
+      </w:r>
+    </w:p>
+    <w:p>
+      <w:pPr>
+        <w:rPr>
+          <w:rFonts w:cstheme="minorHAnsi"/>
+          <w:szCs w:val="22"/>
+        </w:rPr>
+      </w:pPr>
+      <w:r>
+        <w:rPr>
+          <w:rFonts w:cstheme="minorHAnsi"/>
+          <w:szCs w:val="22"/>
+        </w:rPr>
+        <w:t>When a user logs in, they select a team, and they will only see posts, categories, and products belonging to that specific team.</w:t>
+      </w:r>
+    </w:p>
+    <w:p>
+      <w:pPr>
+        <w:rPr>
+          <w:rFonts w:cstheme="minorHAnsi"/>
+          <w:b/>
+          <w:bCs/>
+          <w:szCs w:val="22"/>
+          <w:u w:val="single"/>
+        </w:rPr>
+      </w:pPr>
+      <w:r>
+        <w:rPr>
+          <w:rFonts w:cstheme="minorHAnsi"/>
+          <w:b/>
+          <w:bCs/>
+          <w:szCs w:val="22"/>
+          <w:u w:val="single"/>
+        </w:rPr>
+        <w:t xml:space="preserve">2. How the Code is </w:t>
+      </w:r>
+      <w:proofErr w:type="gramStart"/>
+      <w:r>
+        <w:rPr>
+          <w:rFonts w:cstheme="minorHAnsi"/>
+          <w:b/>
+          <w:bCs/>
+          <w:szCs w:val="22"/>
+          <w:u w:val="single"/>
+        </w:rPr>
+        <w:t>Structured</w:t>
+      </w:r>
+      <w:proofErr w:type="gramEnd"/>
+    </w:p>
+    <w:p>
+      <w:pPr>
+        <w:rPr>
+          <w:rFonts w:cstheme="minorHAnsi"/>
+          <w:b/>
+          <w:bCs/>
+          <w:szCs w:val="22"/>
+        </w:rPr>
+      </w:pPr>
+      <w:r>
+        <w:rPr>
+          <w:rFonts w:cstheme="minorHAnsi"/>
+          <w:szCs w:val="22"/>
+        </w:rPr>
+        <w:t xml:space="preserve"> </w:t>
+      </w:r>
+      <w:r>
+        <w:rPr>
+          <w:rFonts w:cstheme="minorHAnsi"/>
+          <w:b/>
+          <w:bCs/>
+          <w:szCs w:val="22"/>
+        </w:rPr>
+        <w:t>A. Enabling Tenancy in the Panel</w:t>
+      </w:r>
+    </w:p>
+    <w:p>
+      <w:pPr>
+        <w:rPr>
+          <w:rFonts w:cstheme="minorHAnsi"/>
+          <w:szCs w:val="22"/>
+        </w:rPr>
+      </w:pPr>
+      <w:r>
+        <w:rPr>
+          <w:rFonts w:cstheme="minorHAnsi"/>
+          <w:szCs w:val="22"/>
+        </w:rPr>
+        <w:t xml:space="preserve">In </w:t>
+      </w:r>
+      <w:proofErr w:type="spellStart"/>
+      <w:r>
+        <w:rPr>
+          <w:rFonts w:cstheme="minorHAnsi"/>
+          <w:szCs w:val="22"/>
+        </w:rPr>
+        <w:t>UserPanelProvider.php</w:t>
+      </w:r>
+      <w:proofErr w:type="spellEnd"/>
+    </w:p>
+    <w:p>
+      <w:pPr>
+        <w:rPr>
+          <w:rFonts w:cstheme="minorHAnsi"/>
+          <w:szCs w:val="22"/>
+        </w:rPr>
+      </w:pPr>
+      <w:r>
+        <w:rPr>
+          <w:rFonts w:cstheme="minorHAnsi"/>
+          <w:szCs w:val="22"/>
+        </w:rPr>
+        <w:t>, we register the tenant model and its registration page:</w:t>
+      </w:r>
+    </w:p>
+    <w:p>
+      <w:pPr>
+        <w:rPr>
+          <w:rFonts w:cstheme="minorHAnsi"/>
+          <w:b/>
+          <w:bCs/>
+          <w:color w:val="548DD4" w:themeColor="text2" w:themeTint="99"/>
+          <w:szCs w:val="22"/>
+        </w:rPr>
+      </w:pPr>
+      <w:proofErr w:type="spellStart"/>
+      <w:proofErr w:type="gramStart"/>
+      <w:r>
+        <w:rPr>
+          <w:rFonts w:cstheme="minorHAnsi"/>
+          <w:b/>
+          <w:bCs/>
+          <w:color w:val="548DD4" w:themeColor="text2" w:themeTint="99"/>
+          <w:szCs w:val="22"/>
+        </w:rPr>
+        <w:t>php</w:t>
+      </w:r>
+      <w:proofErr w:type="spellEnd"/>
+      <w:proofErr w:type="gramEnd"/>
+    </w:p>
+    <w:p>
+      <w:pPr>
+        <w:rPr>
+          <w:rFonts w:cstheme="minorHAnsi"/>
+          <w:b/>
+          <w:bCs/>
+          <w:color w:val="548DD4" w:themeColor="text2" w:themeTint="99"/>
+          <w:szCs w:val="22"/>
+        </w:rPr>
+      </w:pPr>
+      <w:r>
+        <w:rPr>
+          <w:rFonts w:cstheme="minorHAnsi"/>
+          <w:b/>
+          <w:bCs/>
+          <w:color w:val="548DD4" w:themeColor="text2" w:themeTint="99"/>
+          <w:szCs w:val="22"/>
+        </w:rPr>
+        <w:t>-&gt;</w:t>
+      </w:r>
+      <w:proofErr w:type="gramStart"/>
+      <w:r>
+        <w:rPr>
+          <w:rFonts w:cstheme="minorHAnsi"/>
+          <w:b/>
+          <w:bCs/>
+          <w:color w:val="548DD4" w:themeColor="text2" w:themeTint="99"/>
+          <w:szCs w:val="22"/>
+        </w:rPr>
+        <w:t>tenant(</w:t>
+      </w:r>
+      <w:proofErr w:type="gramEnd"/>
+      <w:r>
+        <w:rPr>
+          <w:rFonts w:cstheme="minorHAnsi"/>
+          <w:b/>
+          <w:bCs/>
+          <w:color w:val="548DD4" w:themeColor="text2" w:themeTint="99"/>
+          <w:szCs w:val="22"/>
+        </w:rPr>
+        <w:t>Team::class)</w:t>
+      </w:r>
+    </w:p>
+    <w:p>
+      <w:pPr>
+        <w:rPr>
+          <w:rFonts w:cstheme="minorHAnsi"/>
+          <w:b/>
+          <w:bCs/>
+          <w:color w:val="548DD4" w:themeColor="text2" w:themeTint="99"/>
+          <w:szCs w:val="22"/>
+        </w:rPr>
+      </w:pPr>
+      <w:r>
+        <w:rPr>
+          <w:rFonts w:cstheme="minorHAnsi"/>
+          <w:b/>
+          <w:bCs/>
+          <w:color w:val="548DD4" w:themeColor="text2" w:themeTint="99"/>
+          <w:szCs w:val="22"/>
+        </w:rPr>
+        <w:t>-&gt;</w:t>
+      </w:r>
+      <w:proofErr w:type="spellStart"/>
+      <w:proofErr w:type="gramStart"/>
+      <w:r>
+        <w:rPr>
+          <w:rFonts w:cstheme="minorHAnsi"/>
+          <w:b/>
+          <w:bCs/>
+          <w:color w:val="548DD4" w:themeColor="text2" w:themeTint="99"/>
+          <w:szCs w:val="22"/>
+        </w:rPr>
+        <w:t>tenantRegistration</w:t>
+      </w:r>
+      <w:proofErr w:type="spellEnd"/>
+      <w:r>
+        <w:rPr>
+          <w:rFonts w:cstheme="minorHAnsi"/>
+          <w:b/>
+          <w:bCs/>
+          <w:color w:val="548DD4" w:themeColor="text2" w:themeTint="99"/>
+          <w:szCs w:val="22"/>
+        </w:rPr>
+        <w:t>(</w:t>
+      </w:r>
+      <w:proofErr w:type="spellStart"/>
+      <w:proofErr w:type="gramEnd"/>
+      <w:r>
+        <w:rPr>
+          <w:rFonts w:cstheme="minorHAnsi"/>
+          <w:b/>
+          <w:bCs/>
+          <w:color w:val="548DD4" w:themeColor="text2" w:themeTint="99"/>
+          <w:szCs w:val="22"/>
+        </w:rPr>
+        <w:t>RegisterTeam</w:t>
+      </w:r>
+      <w:proofErr w:type="spellEnd"/>
+      <w:r>
+        <w:rPr>
+          <w:rFonts w:cstheme="minorHAnsi"/>
+          <w:b/>
+          <w:bCs/>
+          <w:color w:val="548DD4" w:themeColor="text2" w:themeTint="99"/>
+          <w:szCs w:val="22"/>
+        </w:rPr>
+        <w:t>::class)</w:t>
+      </w:r>
+    </w:p>
+    <w:p>
+      <w:pPr>
+        <w:rPr>
+          <w:rFonts w:cstheme="minorHAnsi"/>
+          <w:b/>
+          <w:bCs/>
+          <w:szCs w:val="22"/>
+          <w:u w:val="single"/>
+        </w:rPr>
+      </w:pPr>
+      <w:r>
+        <w:rPr>
+          <w:rFonts w:cstheme="minorHAnsi"/>
+          <w:b/>
+          <w:bCs/>
+          <w:szCs w:val="22"/>
+          <w:u w:val="single"/>
+        </w:rPr>
+        <w:t xml:space="preserve"> B. Connecting Users to Teams</w:t>
+      </w:r>
+    </w:p>
+    <w:p>
+      <w:pPr>
+        <w:rPr>
+          <w:rFonts w:cstheme="minorHAnsi"/>
+          <w:szCs w:val="22"/>
+        </w:rPr>
+      </w:pPr>
+      <w:r>
+        <w:rPr>
+          <w:rFonts w:cstheme="minorHAnsi"/>
+          <w:szCs w:val="22"/>
+        </w:rPr>
+        <w:t xml:space="preserve">In the </w:t>
+      </w:r>
+      <w:proofErr w:type="spellStart"/>
+      <w:r>
+        <w:rPr>
+          <w:rFonts w:cstheme="minorHAnsi"/>
+          <w:szCs w:val="22"/>
+        </w:rPr>
+        <w:t>User.php</w:t>
+      </w:r>
+      <w:proofErr w:type="spellEnd"/>
+    </w:p>
+    <w:p>
+      <w:pPr>
+        <w:rPr>
+          <w:rFonts w:cstheme="minorHAnsi"/>
+          <w:szCs w:val="22"/>
+        </w:rPr>
+      </w:pPr>
+      <w:proofErr w:type="gramStart"/>
+      <w:r>
+        <w:rPr>
+          <w:rFonts w:cstheme="minorHAnsi"/>
+          <w:szCs w:val="22"/>
+        </w:rPr>
+        <w:t>model</w:t>
+      </w:r>
+      <w:proofErr w:type="gramEnd"/>
+      <w:r>
+        <w:rPr>
+          <w:rFonts w:cstheme="minorHAnsi"/>
+          <w:szCs w:val="22"/>
+        </w:rPr>
+        <w:t xml:space="preserve">, we implement Filament's </w:t>
+      </w:r>
+      <w:proofErr w:type="spellStart"/>
+      <w:r>
+        <w:rPr>
+          <w:rFonts w:cstheme="minorHAnsi"/>
+          <w:b/>
+          <w:bCs/>
+          <w:color w:val="548DD4" w:themeColor="text2" w:themeTint="99"/>
+          <w:szCs w:val="22"/>
+        </w:rPr>
+        <w:t>HasTenants</w:t>
+      </w:r>
+      <w:proofErr w:type="spellEnd"/>
+      <w:r>
+        <w:rPr>
+          <w:rFonts w:cstheme="minorHAnsi"/>
+          <w:szCs w:val="22"/>
+        </w:rPr>
+        <w:t xml:space="preserve"> contract:</w:t>
+      </w:r>
+    </w:p>
+    <w:p>
+      <w:pPr>
+        <w:rPr>
+          <w:rFonts w:cstheme="minorHAnsi"/>
+          <w:szCs w:val="22"/>
+        </w:rPr>
+      </w:pPr>
+    </w:p>
+    <w:p>
+      <w:pPr>
+        <w:rPr>
+          <w:rFonts w:cstheme="minorHAnsi"/>
+          <w:szCs w:val="22"/>
+        </w:rPr>
+      </w:pPr>
+      <w:proofErr w:type="gramStart"/>
+      <w:r>
+        <w:rPr>
+          <w:rFonts w:cstheme="minorHAnsi"/>
+          <w:b/>
+          <w:bCs/>
+          <w:color w:val="548DD4" w:themeColor="text2" w:themeTint="99"/>
+          <w:szCs w:val="22"/>
+        </w:rPr>
+        <w:t>teams(</w:t>
+      </w:r>
+      <w:proofErr w:type="gramEnd"/>
+      <w:r>
+        <w:rPr>
+          <w:rFonts w:cstheme="minorHAnsi"/>
+          <w:b/>
+          <w:bCs/>
+          <w:color w:val="548DD4" w:themeColor="text2" w:themeTint="99"/>
+          <w:szCs w:val="22"/>
+        </w:rPr>
+        <w:t>):</w:t>
+      </w:r>
+      <w:r>
+        <w:rPr>
+          <w:rFonts w:cstheme="minorHAnsi"/>
+          <w:color w:val="548DD4" w:themeColor="text2" w:themeTint="99"/>
+          <w:szCs w:val="22"/>
+        </w:rPr>
+        <w:t xml:space="preserve"> </w:t>
+      </w:r>
+      <w:r>
+        <w:rPr>
+          <w:rFonts w:cstheme="minorHAnsi"/>
+          <w:szCs w:val="22"/>
+        </w:rPr>
+        <w:t>A Many-to-Many relationship (a user can belong to multiple teams).</w:t>
+      </w:r>
+    </w:p>
+    <w:p>
+      <w:pPr>
+        <w:rPr>
+          <w:rFonts w:cstheme="minorHAnsi"/>
+          <w:szCs w:val="22"/>
+        </w:rPr>
+      </w:pPr>
+      <w:proofErr w:type="spellStart"/>
+      <w:proofErr w:type="gramStart"/>
+      <w:r>
+        <w:rPr>
+          <w:rFonts w:cstheme="minorHAnsi"/>
+          <w:b/>
+          <w:bCs/>
+          <w:color w:val="548DD4" w:themeColor="text2" w:themeTint="99"/>
+          <w:szCs w:val="22"/>
+        </w:rPr>
+        <w:t>getTenants</w:t>
+      </w:r>
+      <w:proofErr w:type="spellEnd"/>
+      <w:r>
+        <w:rPr>
+          <w:rFonts w:cstheme="minorHAnsi"/>
+          <w:b/>
+          <w:bCs/>
+          <w:color w:val="548DD4" w:themeColor="text2" w:themeTint="99"/>
+          <w:szCs w:val="22"/>
+        </w:rPr>
+        <w:t>(</w:t>
+      </w:r>
+      <w:proofErr w:type="gramEnd"/>
+      <w:r>
+        <w:rPr>
+          <w:rFonts w:cstheme="minorHAnsi"/>
+          <w:b/>
+          <w:bCs/>
+          <w:color w:val="548DD4" w:themeColor="text2" w:themeTint="99"/>
+          <w:szCs w:val="22"/>
+        </w:rPr>
+        <w:t>):</w:t>
+      </w:r>
+      <w:r>
+        <w:rPr>
+          <w:rFonts w:cstheme="minorHAnsi"/>
+          <w:color w:val="548DD4" w:themeColor="text2" w:themeTint="99"/>
+          <w:szCs w:val="22"/>
+        </w:rPr>
+        <w:t xml:space="preserve"> </w:t>
+      </w:r>
+      <w:r>
+        <w:rPr>
+          <w:rFonts w:cstheme="minorHAnsi"/>
+          <w:szCs w:val="22"/>
+        </w:rPr>
+        <w:t>Tells Filament which teams belong to this user.</w:t>
+      </w:r>
+    </w:p>
+    <w:p>
+      <w:pPr>
+        <w:rPr>
+          <w:rFonts w:cstheme="minorHAnsi"/>
+          <w:szCs w:val="22"/>
+        </w:rPr>
+      </w:pPr>
+      <w:proofErr w:type="spellStart"/>
+      <w:proofErr w:type="gramStart"/>
+      <w:r>
+        <w:rPr>
+          <w:rFonts w:cstheme="minorHAnsi"/>
+          <w:b/>
+          <w:bCs/>
+          <w:color w:val="548DD4" w:themeColor="text2" w:themeTint="99"/>
+          <w:szCs w:val="22"/>
+        </w:rPr>
+        <w:lastRenderedPageBreak/>
+        <w:t>canAccessTenant</w:t>
+      </w:r>
+      <w:proofErr w:type="spellEnd"/>
+      <w:r>
+        <w:rPr>
+          <w:rFonts w:cstheme="minorHAnsi"/>
+          <w:b/>
+          <w:bCs/>
+          <w:color w:val="548DD4" w:themeColor="text2" w:themeTint="99"/>
+          <w:szCs w:val="22"/>
+        </w:rPr>
+        <w:t>(</w:t>
+      </w:r>
+      <w:proofErr w:type="gramEnd"/>
+      <w:r>
+        <w:rPr>
+          <w:rFonts w:cstheme="minorHAnsi"/>
+          <w:b/>
+          <w:bCs/>
+          <w:color w:val="548DD4" w:themeColor="text2" w:themeTint="99"/>
+          <w:szCs w:val="22"/>
+        </w:rPr>
+        <w:t>):</w:t>
+      </w:r>
+      <w:r>
+        <w:rPr>
+          <w:rFonts w:cstheme="minorHAnsi"/>
+          <w:color w:val="548DD4" w:themeColor="text2" w:themeTint="99"/>
+          <w:szCs w:val="22"/>
+        </w:rPr>
+        <w:t xml:space="preserve"> </w:t>
+      </w:r>
+      <w:r>
+        <w:rPr>
+          <w:rFonts w:cstheme="minorHAnsi"/>
+          <w:szCs w:val="22"/>
+        </w:rPr>
+        <w:t>A security check to ensure a user can only enter a team they are actually a member of.</w:t>
+      </w:r>
+    </w:p>
+    <w:p>
+      <w:pPr>
+        <w:rPr>
+          <w:rFonts w:cstheme="minorHAnsi"/>
+          <w:b/>
+          <w:bCs/>
+          <w:szCs w:val="22"/>
+        </w:rPr>
+      </w:pPr>
+      <w:r>
+        <w:rPr>
+          <w:rFonts w:cstheme="minorHAnsi"/>
+          <w:b/>
+          <w:bCs/>
+          <w:szCs w:val="22"/>
+        </w:rPr>
+        <w:t>C. Connecting Resources to Teams</w:t>
+      </w:r>
+    </w:p>
+    <w:p>
+      <w:pPr>
+        <w:rPr>
+          <w:rFonts w:cstheme="minorHAnsi"/>
+          <w:szCs w:val="22"/>
+        </w:rPr>
+      </w:pPr>
+      <w:r>
+        <w:rPr>
+          <w:rFonts w:cstheme="minorHAnsi"/>
+          <w:szCs w:val="22"/>
+        </w:rPr>
+        <w:t xml:space="preserve">The </w:t>
+      </w:r>
+      <w:proofErr w:type="spellStart"/>
+      <w:r>
+        <w:rPr>
+          <w:rFonts w:cstheme="minorHAnsi"/>
+          <w:szCs w:val="22"/>
+        </w:rPr>
+        <w:t>Team.php</w:t>
+      </w:r>
+      <w:proofErr w:type="spellEnd"/>
+    </w:p>
+    <w:p>
+      <w:pPr>
+        <w:rPr>
+          <w:rFonts w:cstheme="minorHAnsi"/>
+          <w:b/>
+          <w:bCs/>
+          <w:szCs w:val="22"/>
+        </w:rPr>
+      </w:pPr>
+      <w:proofErr w:type="gramStart"/>
+      <w:r>
+        <w:rPr>
+          <w:rFonts w:cstheme="minorHAnsi"/>
+          <w:b/>
+          <w:bCs/>
+          <w:szCs w:val="22"/>
+        </w:rPr>
+        <w:t>model</w:t>
+      </w:r>
+      <w:proofErr w:type="gramEnd"/>
+      <w:r>
+        <w:rPr>
+          <w:rFonts w:cstheme="minorHAnsi"/>
+          <w:b/>
+          <w:bCs/>
+          <w:szCs w:val="22"/>
+        </w:rPr>
+        <w:t xml:space="preserve"> has a One-to-Many relationship with models like post, Category, and product.</w:t>
+      </w:r>
+    </w:p>
+    <w:p>
+      <w:pPr>
+        <w:rPr>
+          <w:rFonts w:cstheme="minorHAnsi"/>
+          <w:szCs w:val="22"/>
+        </w:rPr>
+      </w:pPr>
+      <w:r>
+        <w:rPr>
+          <w:rFonts w:cstheme="minorHAnsi"/>
+          <w:szCs w:val="22"/>
+        </w:rPr>
+        <w:t xml:space="preserve">Each resource table (like posts) has a </w:t>
+      </w:r>
+      <w:proofErr w:type="spellStart"/>
+      <w:r>
+        <w:rPr>
+          <w:rFonts w:cstheme="minorHAnsi"/>
+          <w:b/>
+          <w:bCs/>
+          <w:szCs w:val="22"/>
+        </w:rPr>
+        <w:t>team_id</w:t>
+      </w:r>
+      <w:proofErr w:type="spellEnd"/>
+      <w:r>
+        <w:rPr>
+          <w:rFonts w:cstheme="minorHAnsi"/>
+          <w:szCs w:val="22"/>
+        </w:rPr>
+        <w:t xml:space="preserve"> column.</w:t>
+      </w:r>
+    </w:p>
+    <w:p>
+      <w:pPr>
+        <w:rPr>
+          <w:rFonts w:cstheme="minorHAnsi"/>
+          <w:szCs w:val="22"/>
+        </w:rPr>
+      </w:pPr>
+      <w:r>
+        <w:rPr>
+          <w:rFonts w:cstheme="minorHAnsi"/>
+          <w:szCs w:val="22"/>
+        </w:rPr>
+        <w:t xml:space="preserve">Inside models (e.g., </w:t>
+      </w:r>
+      <w:proofErr w:type="spellStart"/>
+      <w:r>
+        <w:rPr>
+          <w:rFonts w:cstheme="minorHAnsi"/>
+          <w:szCs w:val="22"/>
+        </w:rPr>
+        <w:t>post.php</w:t>
+      </w:r>
+      <w:proofErr w:type="spellEnd"/>
+    </w:p>
+    <w:p>
+      <w:pPr>
+        <w:rPr>
+          <w:rFonts w:cstheme="minorHAnsi"/>
+          <w:szCs w:val="22"/>
+        </w:rPr>
+      </w:pPr>
+      <w:r>
+        <w:rPr>
+          <w:rFonts w:cstheme="minorHAnsi"/>
+          <w:szCs w:val="22"/>
+        </w:rPr>
+        <w:t xml:space="preserve">), we define </w:t>
+      </w:r>
+      <w:proofErr w:type="spellStart"/>
+      <w:proofErr w:type="gramStart"/>
+      <w:r>
+        <w:rPr>
+          <w:rFonts w:cstheme="minorHAnsi"/>
+          <w:b/>
+          <w:bCs/>
+          <w:color w:val="548DD4" w:themeColor="text2" w:themeTint="99"/>
+          <w:szCs w:val="22"/>
+        </w:rPr>
+        <w:t>belongsTo</w:t>
+      </w:r>
+      <w:proofErr w:type="spellEnd"/>
+      <w:r>
+        <w:rPr>
+          <w:rFonts w:cstheme="minorHAnsi"/>
+          <w:b/>
+          <w:bCs/>
+          <w:color w:val="548DD4" w:themeColor="text2" w:themeTint="99"/>
+          <w:szCs w:val="22"/>
+        </w:rPr>
+        <w:t>(</w:t>
+      </w:r>
+      <w:proofErr w:type="gramEnd"/>
+      <w:r>
+        <w:rPr>
+          <w:rFonts w:cstheme="minorHAnsi"/>
+          <w:b/>
+          <w:bCs/>
+          <w:color w:val="548DD4" w:themeColor="text2" w:themeTint="99"/>
+          <w:szCs w:val="22"/>
+        </w:rPr>
+        <w:t>Team::class).</w:t>
+      </w:r>
+    </w:p>
+    <w:p>
+      <w:pPr>
+        <w:rPr>
+          <w:rFonts w:cstheme="minorHAnsi"/>
+          <w:b/>
+          <w:bCs/>
+          <w:szCs w:val="22"/>
+          <w:u w:val="single"/>
+        </w:rPr>
+      </w:pPr>
+      <w:r>
+        <w:rPr>
+          <w:rFonts w:cstheme="minorHAnsi"/>
+          <w:b/>
+          <w:bCs/>
+          <w:szCs w:val="22"/>
+          <w:u w:val="single"/>
+        </w:rPr>
+        <w:t xml:space="preserve"> D. Registering New Teams</w:t>
+      </w:r>
+      <w:bookmarkStart w:id="0" w:name="_GoBack"/>
+      <w:bookmarkEnd w:id="0"/>
+    </w:p>
+    <w:p>
+      <w:pPr>
+        <w:rPr>
+          <w:rFonts w:cstheme="minorHAnsi"/>
+          <w:szCs w:val="22"/>
+        </w:rPr>
+      </w:pPr>
+      <w:r>
+        <w:rPr>
+          <w:rFonts w:cstheme="minorHAnsi"/>
+          <w:szCs w:val="22"/>
+        </w:rPr>
+        <w:t xml:space="preserve">In </w:t>
+      </w:r>
+      <w:proofErr w:type="spellStart"/>
+      <w:r>
+        <w:rPr>
+          <w:rFonts w:cstheme="minorHAnsi"/>
+          <w:szCs w:val="22"/>
+        </w:rPr>
+        <w:t>RegisterTeam.php</w:t>
+      </w:r>
+      <w:proofErr w:type="spellEnd"/>
+    </w:p>
+    <w:p>
+      <w:pPr>
+        <w:rPr>
+          <w:rFonts w:cstheme="minorHAnsi"/>
+          <w:szCs w:val="22"/>
+        </w:rPr>
+      </w:pPr>
+    </w:p>
+    <w:p>
+      <w:pPr>
+        <w:rPr>
+          <w:rFonts w:cstheme="minorHAnsi"/>
+          <w:szCs w:val="22"/>
+        </w:rPr>
+      </w:pPr>
+      <w:r>
+        <w:rPr>
+          <w:rFonts w:cstheme="minorHAnsi"/>
+          <w:szCs w:val="22"/>
+        </w:rPr>
+        <w:t>A new team is saved with a name and slug.</w:t>
+      </w:r>
+    </w:p>
+    <w:p>
+      <w:pPr>
+        <w:rPr>
+          <w:rFonts w:cstheme="minorHAnsi"/>
+          <w:b/>
+          <w:bCs/>
+          <w:color w:val="548DD4" w:themeColor="text2" w:themeTint="99"/>
+          <w:szCs w:val="22"/>
+        </w:rPr>
+      </w:pPr>
+      <w:r>
+        <w:rPr>
+          <w:rFonts w:cstheme="minorHAnsi"/>
+          <w:szCs w:val="22"/>
+        </w:rPr>
+        <w:t xml:space="preserve">The logged-in user is automatically linked to the new team using: </w:t>
+      </w:r>
+      <w:r>
+        <w:rPr>
+          <w:rFonts w:cstheme="minorHAnsi"/>
+          <w:b/>
+          <w:bCs/>
+          <w:color w:val="548DD4" w:themeColor="text2" w:themeTint="99"/>
+          <w:szCs w:val="22"/>
+        </w:rPr>
+        <w:t>$team-&gt;</w:t>
+      </w:r>
+      <w:proofErr w:type="gramStart"/>
+      <w:r>
+        <w:rPr>
+          <w:rFonts w:cstheme="minorHAnsi"/>
+          <w:b/>
+          <w:bCs/>
+          <w:color w:val="548DD4" w:themeColor="text2" w:themeTint="99"/>
+          <w:szCs w:val="22"/>
+        </w:rPr>
+        <w:t>members(</w:t>
+      </w:r>
+      <w:proofErr w:type="gramEnd"/>
+      <w:r>
+        <w:rPr>
+          <w:rFonts w:cstheme="minorHAnsi"/>
+          <w:b/>
+          <w:bCs/>
+          <w:color w:val="548DD4" w:themeColor="text2" w:themeTint="99"/>
+          <w:szCs w:val="22"/>
+        </w:rPr>
+        <w:t>)-&gt;attach(</w:t>
+      </w:r>
+      <w:proofErr w:type="spellStart"/>
+      <w:r>
+        <w:rPr>
+          <w:rFonts w:cstheme="minorHAnsi"/>
+          <w:b/>
+          <w:bCs/>
+          <w:color w:val="548DD4" w:themeColor="text2" w:themeTint="99"/>
+          <w:szCs w:val="22"/>
+        </w:rPr>
+        <w:t>auth</w:t>
+      </w:r>
+      <w:proofErr w:type="spellEnd"/>
+      <w:r>
+        <w:rPr>
+          <w:rFonts w:cstheme="minorHAnsi"/>
+          <w:b/>
+          <w:bCs/>
+          <w:color w:val="548DD4" w:themeColor="text2" w:themeTint="99"/>
+          <w:szCs w:val="22"/>
+        </w:rPr>
+        <w:t>()-&gt;user());</w:t>
+      </w:r>
+    </w:p>
+    <w:p>
+      <w:pPr>
+        <w:rPr>
+          <w:rFonts w:cstheme="minorHAnsi"/>
+          <w:b/>
+          <w:bCs/>
+          <w:szCs w:val="22"/>
+        </w:rPr>
+      </w:pPr>
+      <w:r>
+        <w:rPr>
+          <w:rFonts w:cstheme="minorHAnsi"/>
+          <w:b/>
+          <w:bCs/>
+          <w:szCs w:val="22"/>
+        </w:rPr>
+        <w:t xml:space="preserve">3. How Filament handles this automatically </w:t>
+      </w:r>
+    </w:p>
+    <w:p>
+      <w:pPr>
+        <w:rPr>
+          <w:rFonts w:cstheme="minorHAnsi"/>
+          <w:szCs w:val="22"/>
+        </w:rPr>
+      </w:pPr>
+      <w:r>
+        <w:rPr>
+          <w:rFonts w:cstheme="minorHAnsi"/>
+          <w:szCs w:val="22"/>
+        </w:rPr>
+        <w:t>Once configured, Filament does two magic things behind the scenes:</w:t>
+      </w:r>
+    </w:p>
+    <w:p>
+      <w:pPr>
+        <w:rPr>
+          <w:rFonts w:cstheme="minorHAnsi"/>
+          <w:szCs w:val="22"/>
+        </w:rPr>
+      </w:pPr>
+    </w:p>
+    <w:p>
+      <w:pPr>
+        <w:rPr>
+          <w:rFonts w:cstheme="minorHAnsi"/>
+          <w:szCs w:val="22"/>
+        </w:rPr>
+      </w:pPr>
+      <w:r>
+        <w:rPr>
+          <w:rFonts w:cstheme="minorHAnsi"/>
+          <w:b/>
+          <w:bCs/>
+          <w:szCs w:val="22"/>
+        </w:rPr>
+        <w:t>Automatic Scoping:</w:t>
+      </w:r>
+      <w:r>
+        <w:rPr>
+          <w:rFonts w:cstheme="minorHAnsi"/>
+          <w:szCs w:val="22"/>
+        </w:rPr>
+        <w:t xml:space="preserve"> When viewing, editing, or deleting posts/categories/products in the User panel, Filament automatically appends WHERE </w:t>
+      </w:r>
+      <w:proofErr w:type="spellStart"/>
+      <w:r>
+        <w:rPr>
+          <w:rFonts w:cstheme="minorHAnsi"/>
+          <w:szCs w:val="22"/>
+        </w:rPr>
+        <w:t>team_id</w:t>
+      </w:r>
+      <w:proofErr w:type="spellEnd"/>
+      <w:r>
+        <w:rPr>
+          <w:rFonts w:cstheme="minorHAnsi"/>
+          <w:szCs w:val="22"/>
+        </w:rPr>
+        <w:t xml:space="preserve"> = </w:t>
+      </w:r>
+      <w:proofErr w:type="spellStart"/>
+      <w:r>
+        <w:rPr>
+          <w:rFonts w:cstheme="minorHAnsi"/>
+          <w:szCs w:val="22"/>
+        </w:rPr>
+        <w:t>current_team_id</w:t>
+      </w:r>
+      <w:proofErr w:type="spellEnd"/>
+      <w:r>
+        <w:rPr>
+          <w:rFonts w:cstheme="minorHAnsi"/>
+          <w:szCs w:val="22"/>
+        </w:rPr>
+        <w:t xml:space="preserve"> to database queries.</w:t>
+      </w:r>
+    </w:p>
+    <w:p>
+      <w:pPr>
+        <w:rPr>
+          <w:rFonts w:cstheme="minorHAnsi"/>
+          <w:szCs w:val="22"/>
+        </w:rPr>
+      </w:pPr>
+      <w:r>
+        <w:rPr>
+          <w:rFonts w:cstheme="minorHAnsi"/>
+          <w:b/>
+          <w:bCs/>
+          <w:szCs w:val="22"/>
+        </w:rPr>
+        <w:t>Automatic Insertion:</w:t>
+      </w:r>
+      <w:r>
+        <w:rPr>
+          <w:rFonts w:cstheme="minorHAnsi"/>
+          <w:szCs w:val="22"/>
+        </w:rPr>
+        <w:t xml:space="preserve"> When creating a new post, Filament automatically fills the </w:t>
+      </w:r>
+      <w:proofErr w:type="spellStart"/>
+      <w:r>
+        <w:rPr>
+          <w:rFonts w:cstheme="minorHAnsi"/>
+          <w:szCs w:val="22"/>
+        </w:rPr>
+        <w:t>team_id</w:t>
+      </w:r>
+      <w:proofErr w:type="spellEnd"/>
+      <w:r>
+        <w:rPr>
+          <w:rFonts w:cstheme="minorHAnsi"/>
+          <w:szCs w:val="22"/>
+        </w:rPr>
+        <w:t xml:space="preserve"> column with the ID of the active team.</w:t>
       </w:r>
     </w:p>
     <w:p>

</xml_diff>

<commit_message>
Update Filament notes:Type Hinting Eloquent Relations
</commit_message>
<xml_diff>
--- a/Filament/filament notes.docx
+++ b/Filament/filament notes.docx
@@ -16379,125 +16379,1099 @@
         </w:rPr>
         <w:t>A Global Scope automatically glues a hidden filter (like a WHERE clause) onto every single database query you run for a model.</w:t>
       </w:r>
+    </w:p>
+    <w:p>
+      <w:pPr>
+        <w:rPr>
+          <w:rFonts w:cstheme="minorHAnsi"/>
+          <w:szCs w:val="22"/>
+        </w:rPr>
+      </w:pPr>
+      <w:r>
+        <w:rPr>
+          <w:rFonts w:cstheme="minorHAnsi"/>
+          <w:szCs w:val="22"/>
+        </w:rPr>
+        <w:t xml:space="preserve">Example: Instead of writing </w:t>
+      </w:r>
+      <w:r>
+        <w:rPr>
+          <w:rFonts w:cstheme="minorHAnsi"/>
+          <w:b/>
+          <w:bCs/>
+          <w:color w:val="548DD4" w:themeColor="text2" w:themeTint="99"/>
+          <w:szCs w:val="22"/>
+        </w:rPr>
+        <w:t>Patient::</w:t>
+      </w:r>
+      <w:proofErr w:type="gramStart"/>
+      <w:r>
+        <w:rPr>
+          <w:rFonts w:cstheme="minorHAnsi"/>
+          <w:b/>
+          <w:bCs/>
+          <w:color w:val="548DD4" w:themeColor="text2" w:themeTint="99"/>
+          <w:szCs w:val="22"/>
+        </w:rPr>
+        <w:t>where(</w:t>
+      </w:r>
+      <w:proofErr w:type="gramEnd"/>
+      <w:r>
+        <w:rPr>
+          <w:rFonts w:cstheme="minorHAnsi"/>
+          <w:b/>
+          <w:bCs/>
+          <w:color w:val="548DD4" w:themeColor="text2" w:themeTint="99"/>
+          <w:szCs w:val="22"/>
+        </w:rPr>
+        <w:t>'</w:t>
+      </w:r>
+      <w:proofErr w:type="spellStart"/>
+      <w:r>
+        <w:rPr>
+          <w:rFonts w:cstheme="minorHAnsi"/>
+          <w:b/>
+          <w:bCs/>
+          <w:color w:val="548DD4" w:themeColor="text2" w:themeTint="99"/>
+          <w:szCs w:val="22"/>
+        </w:rPr>
+        <w:t>team_id</w:t>
+      </w:r>
+      <w:proofErr w:type="spellEnd"/>
+      <w:r>
+        <w:rPr>
+          <w:rFonts w:cstheme="minorHAnsi"/>
+          <w:b/>
+          <w:bCs/>
+          <w:color w:val="548DD4" w:themeColor="text2" w:themeTint="99"/>
+          <w:szCs w:val="22"/>
+        </w:rPr>
+        <w:t>', 5)-&gt;get(),</w:t>
+      </w:r>
+      <w:r>
+        <w:rPr>
+          <w:rFonts w:cstheme="minorHAnsi"/>
+          <w:color w:val="548DD4" w:themeColor="text2" w:themeTint="99"/>
+          <w:szCs w:val="22"/>
+        </w:rPr>
+        <w:t xml:space="preserve"> </w:t>
+      </w:r>
+      <w:r>
+        <w:rPr>
+          <w:rFonts w:cstheme="minorHAnsi"/>
+          <w:szCs w:val="22"/>
+        </w:rPr>
+        <w:t xml:space="preserve">you just write </w:t>
+      </w:r>
+      <w:r>
+        <w:rPr>
+          <w:rFonts w:cstheme="minorHAnsi"/>
+          <w:b/>
+          <w:bCs/>
+          <w:color w:val="548DD4" w:themeColor="text2" w:themeTint="99"/>
+          <w:szCs w:val="22"/>
+        </w:rPr>
+        <w:t>Patient::all()</w:t>
+      </w:r>
+      <w:r>
+        <w:rPr>
+          <w:rFonts w:cstheme="minorHAnsi"/>
+          <w:szCs w:val="22"/>
+        </w:rPr>
+        <w:t xml:space="preserve">, and </w:t>
+      </w:r>
+      <w:proofErr w:type="spellStart"/>
+      <w:r>
+        <w:rPr>
+          <w:rFonts w:cstheme="minorHAnsi"/>
+          <w:szCs w:val="22"/>
+        </w:rPr>
+        <w:t>Laravel</w:t>
+      </w:r>
+      <w:proofErr w:type="spellEnd"/>
+      <w:r>
+        <w:rPr>
+          <w:rFonts w:cstheme="minorHAnsi"/>
+          <w:szCs w:val="22"/>
+        </w:rPr>
+        <w:t xml:space="preserve"> automatically forces it to only return patients belonging to team 5 behind the scenes.</w:t>
+      </w:r>
+    </w:p>
+    <w:p>
+      <w:pPr>
+        <w:rPr>
+          <w:rFonts w:cstheme="minorHAnsi"/>
+          <w:szCs w:val="22"/>
+        </w:rPr>
+      </w:pPr>
+    </w:p>
+    <w:p>
+      <w:pPr>
+        <w:rPr>
+          <w:rFonts w:cstheme="minorHAnsi"/>
+          <w:szCs w:val="22"/>
+        </w:rPr>
+      </w:pPr>
+    </w:p>
+    <w:p>
+      <w:pPr>
+        <w:rPr>
+          <w:rFonts w:eastAsia="Consolas" w:cstheme="minorHAnsi"/>
+          <w:szCs w:val="22"/>
+        </w:rPr>
+      </w:pPr>
+      <w:r>
+        <w:rPr>
+          <w:rFonts w:eastAsia="Consolas" w:cstheme="minorHAnsi"/>
+          <w:b/>
+          <w:bCs/>
+          <w:szCs w:val="22"/>
+          <w:lang w:val="en-GB"/>
+        </w:rPr>
+        <w:t xml:space="preserve">PHP / </w:t>
+      </w:r>
+      <w:proofErr w:type="spellStart"/>
+      <w:r>
+        <w:rPr>
+          <w:rFonts w:eastAsia="Consolas" w:cstheme="minorHAnsi"/>
+          <w:b/>
+          <w:bCs/>
+          <w:szCs w:val="22"/>
+          <w:lang w:val="en-GB"/>
+        </w:rPr>
+        <w:t>Laravel</w:t>
+      </w:r>
+      <w:proofErr w:type="spellEnd"/>
+      <w:r>
+        <w:rPr>
+          <w:rFonts w:eastAsia="Consolas" w:cstheme="minorHAnsi"/>
+          <w:b/>
+          <w:bCs/>
+          <w:szCs w:val="22"/>
+          <w:lang w:val="en-GB"/>
+        </w:rPr>
+        <w:t xml:space="preserve"> Type Hinting:</w:t>
+      </w:r>
+      <w:r>
+        <w:rPr>
+          <w:rFonts w:eastAsia="Consolas" w:cstheme="minorHAnsi"/>
+          <w:szCs w:val="22"/>
+          <w:lang w:val="en-GB"/>
+        </w:rPr>
+        <w:t xml:space="preserve"> </w:t>
+      </w:r>
+      <w:r>
+        <w:rPr>
+          <w:rFonts w:eastAsia="Consolas" w:cstheme="minorHAnsi"/>
+          <w:b/>
+          <w:bCs/>
+          <w:color w:val="FF0000"/>
+          <w:szCs w:val="22"/>
+          <w:u w:val="single"/>
+          <w:lang w:val="en-GB"/>
+        </w:rPr>
+        <w:t xml:space="preserve">Typed vs. </w:t>
+      </w:r>
+      <w:proofErr w:type="spellStart"/>
+      <w:r>
+        <w:rPr>
+          <w:rFonts w:eastAsia="Consolas" w:cstheme="minorHAnsi"/>
+          <w:b/>
+          <w:bCs/>
+          <w:color w:val="FF0000"/>
+          <w:szCs w:val="22"/>
+          <w:u w:val="single"/>
+          <w:lang w:val="en-GB"/>
+        </w:rPr>
+        <w:t>Untyped</w:t>
+      </w:r>
+      <w:proofErr w:type="spellEnd"/>
+      <w:r>
+        <w:rPr>
+          <w:rFonts w:eastAsia="Consolas" w:cstheme="minorHAnsi"/>
+          <w:b/>
+          <w:bCs/>
+          <w:color w:val="FF0000"/>
+          <w:szCs w:val="22"/>
+          <w:u w:val="single"/>
+          <w:lang w:val="en-GB"/>
+        </w:rPr>
+        <w:t xml:space="preserve"> Eloquent Relations</w:t>
+      </w:r>
+      <w:r>
+        <w:rPr>
+          <w:rFonts w:cstheme="minorHAnsi"/>
+          <w:szCs w:val="22"/>
+        </w:rPr>
+        <w:br/>
+      </w:r>
+      <w:r>
+        <w:rPr>
+          <w:rFonts w:cstheme="minorHAnsi"/>
+          <w:szCs w:val="22"/>
+        </w:rPr>
+        <w:br/>
+      </w:r>
+      <w:proofErr w:type="gramStart"/>
+      <w:r>
+        <w:rPr>
+          <w:rFonts w:eastAsia="Consolas" w:cstheme="minorHAnsi"/>
+          <w:szCs w:val="22"/>
+          <w:lang w:val="en-GB"/>
+        </w:rPr>
+        <w:t>When</w:t>
+      </w:r>
+      <w:proofErr w:type="gramEnd"/>
+      <w:r>
+        <w:rPr>
+          <w:rFonts w:eastAsia="Consolas" w:cstheme="minorHAnsi"/>
+          <w:szCs w:val="22"/>
+          <w:lang w:val="en-GB"/>
+        </w:rPr>
+        <w:t xml:space="preserve"> defining Eloquent relationships in </w:t>
+      </w:r>
+      <w:proofErr w:type="spellStart"/>
+      <w:r>
+        <w:rPr>
+          <w:rFonts w:eastAsia="Consolas" w:cstheme="minorHAnsi"/>
+          <w:szCs w:val="22"/>
+          <w:lang w:val="en-GB"/>
+        </w:rPr>
+        <w:t>Laravel</w:t>
+      </w:r>
+      <w:proofErr w:type="spellEnd"/>
+      <w:r>
+        <w:rPr>
+          <w:rFonts w:eastAsia="Consolas" w:cstheme="minorHAnsi"/>
+          <w:szCs w:val="22"/>
+          <w:lang w:val="en-GB"/>
+        </w:rPr>
+        <w:t>, you can choose to declare the return type explicitly or omit it.</w:t>
+      </w:r>
+      <w:r>
+        <w:rPr>
+          <w:rFonts w:cstheme="minorHAnsi"/>
+          <w:szCs w:val="22"/>
+        </w:rPr>
+        <w:br/>
+      </w:r>
+      <w:r>
+        <w:rPr>
+          <w:rFonts w:cstheme="minorHAnsi"/>
+          <w:szCs w:val="22"/>
+        </w:rPr>
+        <w:br/>
+      </w:r>
+      <w:r>
+        <w:rPr>
+          <w:rFonts w:eastAsia="Consolas" w:cstheme="minorHAnsi"/>
+          <w:b/>
+          <w:bCs/>
+          <w:szCs w:val="22"/>
+          <w:lang w:val="en-GB"/>
+        </w:rPr>
+        <w:t>1. Typed Method:</w:t>
+      </w:r>
+      <w:r>
+        <w:rPr>
+          <w:rFonts w:eastAsia="Consolas" w:cstheme="minorHAnsi"/>
+          <w:szCs w:val="22"/>
+          <w:lang w:val="en-GB"/>
+        </w:rPr>
+        <w:t xml:space="preserve"> Best Practice</w:t>
+      </w:r>
+      <w:r>
+        <w:rPr>
+          <w:rFonts w:cstheme="minorHAnsi"/>
+          <w:szCs w:val="22"/>
+        </w:rPr>
+        <w:br/>
+      </w:r>
+    </w:p>
+    <w:p>
+      <w:pPr>
+        <w:rPr>
+          <w:rFonts w:cstheme="minorHAnsi"/>
+          <w:szCs w:val="22"/>
+        </w:rPr>
+      </w:pPr>
+      <w:proofErr w:type="spellStart"/>
+      <w:proofErr w:type="gramStart"/>
+      <w:r>
+        <w:rPr>
+          <w:rFonts w:eastAsia="Consolas" w:cstheme="minorHAnsi"/>
+          <w:b/>
+          <w:bCs/>
+          <w:color w:val="709FDB" w:themeColor="text2" w:themeTint="80"/>
+          <w:szCs w:val="22"/>
+          <w:lang w:val="en-GB"/>
+        </w:rPr>
+        <w:t>php</w:t>
+      </w:r>
+      <w:proofErr w:type="spellEnd"/>
+      <w:proofErr w:type="gramEnd"/>
+      <w:r>
+        <w:rPr>
+          <w:rFonts w:cstheme="minorHAnsi"/>
+          <w:szCs w:val="22"/>
+        </w:rPr>
+        <w:br/>
+      </w:r>
+      <w:r>
+        <w:rPr>
+          <w:rFonts w:eastAsia="Consolas" w:cstheme="minorHAnsi"/>
+          <w:b/>
+          <w:bCs/>
+          <w:color w:val="709FDB" w:themeColor="text2" w:themeTint="80"/>
+          <w:szCs w:val="22"/>
+          <w:lang w:val="en-GB"/>
+        </w:rPr>
+        <w:t>use Illuminate\Database\Eloquent\Relations\</w:t>
+      </w:r>
+      <w:proofErr w:type="spellStart"/>
+      <w:r>
+        <w:rPr>
+          <w:rFonts w:eastAsia="Consolas" w:cstheme="minorHAnsi"/>
+          <w:b/>
+          <w:bCs/>
+          <w:color w:val="709FDB" w:themeColor="text2" w:themeTint="80"/>
+          <w:szCs w:val="22"/>
+          <w:lang w:val="en-GB"/>
+        </w:rPr>
+        <w:t>BelongsTo</w:t>
+      </w:r>
+      <w:proofErr w:type="spellEnd"/>
+      <w:r>
+        <w:rPr>
+          <w:rFonts w:eastAsia="Consolas" w:cstheme="minorHAnsi"/>
+          <w:b/>
+          <w:bCs/>
+          <w:color w:val="709FDB" w:themeColor="text2" w:themeTint="80"/>
+          <w:szCs w:val="22"/>
+          <w:lang w:val="en-GB"/>
+        </w:rPr>
+        <w:t>;</w:t>
+      </w:r>
+      <w:r>
+        <w:rPr>
+          <w:rFonts w:cstheme="minorHAnsi"/>
+          <w:szCs w:val="22"/>
+        </w:rPr>
+        <w:br/>
+      </w:r>
+      <w:r>
+        <w:rPr>
+          <w:rFonts w:cstheme="minorHAnsi"/>
+          <w:szCs w:val="22"/>
+        </w:rPr>
+        <w:br/>
+      </w:r>
+      <w:r>
+        <w:rPr>
+          <w:rFonts w:eastAsia="Consolas" w:cstheme="minorHAnsi"/>
+          <w:b/>
+          <w:bCs/>
+          <w:color w:val="709FDB" w:themeColor="text2" w:themeTint="80"/>
+          <w:szCs w:val="22"/>
+          <w:lang w:val="en-GB"/>
+        </w:rPr>
+        <w:t xml:space="preserve">public function team(): </w:t>
+      </w:r>
+      <w:proofErr w:type="spellStart"/>
+      <w:r>
+        <w:rPr>
+          <w:rFonts w:eastAsia="Consolas" w:cstheme="minorHAnsi"/>
+          <w:b/>
+          <w:bCs/>
+          <w:color w:val="709FDB" w:themeColor="text2" w:themeTint="80"/>
+          <w:szCs w:val="22"/>
+          <w:lang w:val="en-GB"/>
+        </w:rPr>
+        <w:t>BelongsTo</w:t>
+      </w:r>
+      <w:proofErr w:type="spellEnd"/>
+      <w:r>
+        <w:rPr>
+          <w:rFonts w:cstheme="minorHAnsi"/>
+          <w:szCs w:val="22"/>
+        </w:rPr>
+        <w:br/>
+      </w:r>
+      <w:r>
+        <w:rPr>
+          <w:rFonts w:eastAsia="Consolas" w:cstheme="minorHAnsi"/>
+          <w:b/>
+          <w:bCs/>
+          <w:color w:val="709FDB" w:themeColor="text2" w:themeTint="80"/>
+          <w:szCs w:val="22"/>
+          <w:lang w:val="en-GB"/>
+        </w:rPr>
+        <w:t>{</w:t>
+      </w:r>
+      <w:r>
+        <w:rPr>
+          <w:rFonts w:cstheme="minorHAnsi"/>
+          <w:szCs w:val="22"/>
+        </w:rPr>
+        <w:br/>
+      </w:r>
+      <w:r>
+        <w:rPr>
+          <w:rFonts w:eastAsia="Consolas" w:cstheme="minorHAnsi"/>
+          <w:b/>
+          <w:bCs/>
+          <w:color w:val="709FDB" w:themeColor="text2" w:themeTint="80"/>
+          <w:szCs w:val="22"/>
+          <w:lang w:val="en-GB"/>
+        </w:rPr>
+        <w:t xml:space="preserve">    return $this-&gt;</w:t>
+      </w:r>
+      <w:proofErr w:type="spellStart"/>
+      <w:r>
+        <w:rPr>
+          <w:rFonts w:eastAsia="Consolas" w:cstheme="minorHAnsi"/>
+          <w:b/>
+          <w:bCs/>
+          <w:color w:val="709FDB" w:themeColor="text2" w:themeTint="80"/>
+          <w:szCs w:val="22"/>
+          <w:lang w:val="en-GB"/>
+        </w:rPr>
+        <w:t>belongsTo</w:t>
+      </w:r>
+      <w:proofErr w:type="spellEnd"/>
+      <w:r>
+        <w:rPr>
+          <w:rFonts w:eastAsia="Consolas" w:cstheme="minorHAnsi"/>
+          <w:b/>
+          <w:bCs/>
+          <w:color w:val="709FDB" w:themeColor="text2" w:themeTint="80"/>
+          <w:szCs w:val="22"/>
+          <w:lang w:val="en-GB"/>
+        </w:rPr>
+        <w:t>(Team::class);</w:t>
+      </w:r>
+      <w:r>
+        <w:rPr>
+          <w:rFonts w:cstheme="minorHAnsi"/>
+          <w:szCs w:val="22"/>
+        </w:rPr>
+        <w:br/>
+      </w:r>
+      <w:r>
+        <w:rPr>
+          <w:rFonts w:eastAsia="Consolas" w:cstheme="minorHAnsi"/>
+          <w:b/>
+          <w:bCs/>
+          <w:color w:val="709FDB" w:themeColor="text2" w:themeTint="80"/>
+          <w:szCs w:val="22"/>
+          <w:lang w:val="en-GB"/>
+        </w:rPr>
+        <w:t>}</w:t>
+      </w:r>
+      <w:r>
+        <w:rPr>
+          <w:rFonts w:cstheme="minorHAnsi"/>
+          <w:szCs w:val="22"/>
+        </w:rPr>
+        <w:br/>
+      </w:r>
+      <w:r>
+        <w:rPr>
+          <w:rFonts w:eastAsia="Aptos" w:cstheme="minorHAnsi"/>
+          <w:szCs w:val="22"/>
+          <w:lang w:val="en-GB"/>
+        </w:rPr>
+        <w:t xml:space="preserve"> </w:t>
+      </w:r>
+    </w:p>
+    <w:p>
+      <w:pPr>
+        <w:pStyle w:val="ListParagraph"/>
+        <w:numPr>
+          <w:ilvl w:val="0"/>
+          <w:numId w:val="22"/>
+        </w:numPr>
+        <w:spacing w:after="0" w:line="279" w:lineRule="auto"/>
+        <w:rPr>
+          <w:rFonts w:eastAsia="Aptos" w:cstheme="minorHAnsi"/>
+          <w:szCs w:val="22"/>
+        </w:rPr>
+      </w:pPr>
+      <w:r>
+        <w:rPr>
+          <w:rFonts w:eastAsia="Aptos" w:cstheme="minorHAnsi"/>
+          <w:b/>
+          <w:bCs/>
+          <w:szCs w:val="22"/>
+          <w:lang w:val="en-GB"/>
+        </w:rPr>
+        <w:t>Pros:</w:t>
+      </w:r>
+      <w:r>
+        <w:rPr>
+          <w:rFonts w:eastAsia="Aptos" w:cstheme="minorHAnsi"/>
+          <w:szCs w:val="22"/>
+          <w:lang w:val="en-GB"/>
+        </w:rPr>
+        <w:t xml:space="preserve"> </w:t>
+      </w:r>
+    </w:p>
+    <w:p>
+      <w:pPr>
+        <w:pStyle w:val="ListParagraph"/>
+        <w:numPr>
+          <w:ilvl w:val="1"/>
+          <w:numId w:val="22"/>
+        </w:numPr>
+        <w:spacing w:after="0" w:line="279" w:lineRule="auto"/>
+        <w:rPr>
+          <w:rFonts w:eastAsia="Aptos" w:cstheme="minorHAnsi"/>
+          <w:szCs w:val="22"/>
+        </w:rPr>
+      </w:pPr>
+      <w:r>
+        <w:rPr>
+          <w:rFonts w:eastAsia="Aptos" w:cstheme="minorHAnsi"/>
+          <w:b/>
+          <w:bCs/>
+          <w:szCs w:val="22"/>
+          <w:lang w:val="en-GB"/>
+        </w:rPr>
+        <w:t>IDE Support:</w:t>
+      </w:r>
+      <w:r>
+        <w:rPr>
+          <w:rFonts w:eastAsia="Aptos" w:cstheme="minorHAnsi"/>
+          <w:szCs w:val="22"/>
+          <w:lang w:val="en-GB"/>
+        </w:rPr>
+        <w:t xml:space="preserve"> Enables auto-complete suggestions for relationship methods (like </w:t>
+      </w:r>
+      <w:proofErr w:type="gramStart"/>
+      <w:r>
+        <w:rPr>
+          <w:rFonts w:eastAsia="Consolas" w:cstheme="minorHAnsi"/>
+          <w:szCs w:val="22"/>
+          <w:lang w:val="en-GB"/>
+        </w:rPr>
+        <w:t>associate(</w:t>
+      </w:r>
+      <w:proofErr w:type="gramEnd"/>
+      <w:r>
+        <w:rPr>
+          <w:rFonts w:eastAsia="Consolas" w:cstheme="minorHAnsi"/>
+          <w:szCs w:val="22"/>
+          <w:lang w:val="en-GB"/>
+        </w:rPr>
+        <w:t>)</w:t>
+      </w:r>
+      <w:r>
+        <w:rPr>
+          <w:rFonts w:eastAsia="Aptos" w:cstheme="minorHAnsi"/>
+          <w:szCs w:val="22"/>
+          <w:lang w:val="en-GB"/>
+        </w:rPr>
+        <w:t xml:space="preserve"> or </w:t>
+      </w:r>
+      <w:r>
+        <w:rPr>
+          <w:rFonts w:eastAsia="Consolas" w:cstheme="minorHAnsi"/>
+          <w:szCs w:val="22"/>
+          <w:lang w:val="en-GB"/>
+        </w:rPr>
+        <w:t>where()</w:t>
+      </w:r>
+      <w:r>
+        <w:rPr>
+          <w:rFonts w:eastAsia="Aptos" w:cstheme="minorHAnsi"/>
+          <w:szCs w:val="22"/>
+          <w:lang w:val="en-GB"/>
+        </w:rPr>
+        <w:t>).</w:t>
+      </w:r>
+    </w:p>
+    <w:p>
+      <w:pPr>
+        <w:pStyle w:val="ListParagraph"/>
+        <w:numPr>
+          <w:ilvl w:val="1"/>
+          <w:numId w:val="22"/>
+        </w:numPr>
+        <w:spacing w:after="0" w:line="279" w:lineRule="auto"/>
+        <w:rPr>
+          <w:rFonts w:eastAsia="Aptos" w:cstheme="minorHAnsi"/>
+          <w:szCs w:val="22"/>
+        </w:rPr>
+      </w:pPr>
+      <w:r>
+        <w:rPr>
+          <w:rFonts w:eastAsia="Aptos" w:cstheme="minorHAnsi"/>
+          <w:b/>
+          <w:bCs/>
+          <w:szCs w:val="22"/>
+          <w:lang w:val="en-GB"/>
+        </w:rPr>
+        <w:t>Bug Prevention:</w:t>
+      </w:r>
+      <w:r>
+        <w:rPr>
+          <w:rFonts w:eastAsia="Aptos" w:cstheme="minorHAnsi"/>
+          <w:szCs w:val="22"/>
+          <w:lang w:val="en-GB"/>
+        </w:rPr>
+        <w:t xml:space="preserve"> Catches type mismatches during development and static analysis (e.g., </w:t>
+      </w:r>
+      <w:proofErr w:type="spellStart"/>
+      <w:r>
+        <w:rPr>
+          <w:rFonts w:eastAsia="Aptos" w:cstheme="minorHAnsi"/>
+          <w:szCs w:val="22"/>
+          <w:lang w:val="en-GB"/>
+        </w:rPr>
+        <w:t>Larastan</w:t>
+      </w:r>
+      <w:proofErr w:type="spellEnd"/>
+      <w:r>
+        <w:rPr>
+          <w:rFonts w:eastAsia="Aptos" w:cstheme="minorHAnsi"/>
+          <w:szCs w:val="22"/>
+          <w:lang w:val="en-GB"/>
+        </w:rPr>
+        <w:t>/</w:t>
+      </w:r>
+      <w:proofErr w:type="spellStart"/>
+      <w:r>
+        <w:rPr>
+          <w:rFonts w:eastAsia="Aptos" w:cstheme="minorHAnsi"/>
+          <w:szCs w:val="22"/>
+          <w:lang w:val="en-GB"/>
+        </w:rPr>
+        <w:t>PHPStan</w:t>
+      </w:r>
+      <w:proofErr w:type="spellEnd"/>
+      <w:r>
+        <w:rPr>
+          <w:rFonts w:eastAsia="Aptos" w:cstheme="minorHAnsi"/>
+          <w:szCs w:val="22"/>
+          <w:lang w:val="en-GB"/>
+        </w:rPr>
+        <w:t>).</w:t>
+      </w:r>
+    </w:p>
+    <w:p>
+      <w:pPr>
+        <w:pStyle w:val="ListParagraph"/>
+        <w:numPr>
+          <w:ilvl w:val="1"/>
+          <w:numId w:val="22"/>
+        </w:numPr>
+        <w:spacing w:after="0" w:line="279" w:lineRule="auto"/>
+        <w:rPr>
+          <w:rFonts w:eastAsia="Aptos" w:cstheme="minorHAnsi"/>
+          <w:szCs w:val="22"/>
+        </w:rPr>
+      </w:pPr>
       <w:bookmarkStart w:id="0" w:name="_GoBack"/>
       <w:bookmarkEnd w:id="0"/>
-    </w:p>
-    <w:p>
-      <w:pPr>
-        <w:rPr>
-          <w:rFonts w:cstheme="minorHAnsi"/>
-          <w:szCs w:val="22"/>
-        </w:rPr>
-      </w:pPr>
-      <w:r>
-        <w:rPr>
-          <w:rFonts w:cstheme="minorHAnsi"/>
-          <w:szCs w:val="22"/>
-        </w:rPr>
-        <w:t xml:space="preserve">Example: Instead of writing </w:t>
-      </w:r>
-      <w:r>
-        <w:rPr>
-          <w:rFonts w:cstheme="minorHAnsi"/>
-          <w:b/>
-          <w:bCs/>
-          <w:color w:val="548DD4" w:themeColor="text2" w:themeTint="99"/>
-          <w:szCs w:val="22"/>
-        </w:rPr>
-        <w:t>Patient::</w:t>
-      </w:r>
+      <w:r>
+        <w:rPr>
+          <w:rFonts w:eastAsia="Aptos" w:cstheme="minorHAnsi"/>
+          <w:b/>
+          <w:bCs/>
+          <w:szCs w:val="22"/>
+          <w:lang w:val="en-GB"/>
+        </w:rPr>
+        <w:t>Documentation:</w:t>
+      </w:r>
+      <w:r>
+        <w:rPr>
+          <w:rFonts w:eastAsia="Aptos" w:cstheme="minorHAnsi"/>
+          <w:szCs w:val="22"/>
+          <w:lang w:val="en-GB"/>
+        </w:rPr>
+        <w:t xml:space="preserve"> Explicitly tells other developers what the function returns.</w:t>
+      </w:r>
+    </w:p>
+    <w:p>
+      <w:pPr>
+        <w:pStyle w:val="ListParagraph"/>
+        <w:numPr>
+          <w:ilvl w:val="0"/>
+          <w:numId w:val="22"/>
+        </w:numPr>
+        <w:spacing w:after="0" w:line="279" w:lineRule="auto"/>
+        <w:rPr>
+          <w:rFonts w:eastAsia="Aptos" w:cstheme="minorHAnsi"/>
+          <w:szCs w:val="22"/>
+        </w:rPr>
+      </w:pPr>
+      <w:r>
+        <w:rPr>
+          <w:rFonts w:eastAsia="Aptos" w:cstheme="minorHAnsi"/>
+          <w:b/>
+          <w:bCs/>
+          <w:szCs w:val="22"/>
+          <w:lang w:val="en-GB"/>
+        </w:rPr>
+        <w:lastRenderedPageBreak/>
+        <w:t>Cons:</w:t>
+      </w:r>
+      <w:r>
+        <w:rPr>
+          <w:rFonts w:eastAsia="Aptos" w:cstheme="minorHAnsi"/>
+          <w:szCs w:val="22"/>
+          <w:lang w:val="en-GB"/>
+        </w:rPr>
+        <w:t xml:space="preserve"> Requires importing the correct relation class (</w:t>
+      </w:r>
+      <w:r>
+        <w:rPr>
+          <w:rFonts w:eastAsia="Consolas" w:cstheme="minorHAnsi"/>
+          <w:szCs w:val="22"/>
+          <w:lang w:val="en-GB"/>
+        </w:rPr>
+        <w:t>use Illuminate\Database\Eloquent\Relations\</w:t>
+      </w:r>
+      <w:proofErr w:type="spellStart"/>
       <w:proofErr w:type="gramStart"/>
       <w:r>
         <w:rPr>
-          <w:rFonts w:cstheme="minorHAnsi"/>
-          <w:b/>
-          <w:bCs/>
-          <w:color w:val="548DD4" w:themeColor="text2" w:themeTint="99"/>
-          <w:szCs w:val="22"/>
-        </w:rPr>
-        <w:t>where(</w:t>
+          <w:rFonts w:eastAsia="Consolas" w:cstheme="minorHAnsi"/>
+          <w:szCs w:val="22"/>
+          <w:lang w:val="en-GB"/>
+        </w:rPr>
+        <w:t>BelongsTo</w:t>
+      </w:r>
+      <w:proofErr w:type="spellEnd"/>
+      <w:r>
+        <w:rPr>
+          <w:rFonts w:eastAsia="Consolas" w:cstheme="minorHAnsi"/>
+          <w:szCs w:val="22"/>
+          <w:lang w:val="en-GB"/>
+        </w:rPr>
+        <w:t>;</w:t>
       </w:r>
       <w:proofErr w:type="gramEnd"/>
       <w:r>
         <w:rPr>
-          <w:rFonts w:cstheme="minorHAnsi"/>
-          <w:b/>
-          <w:bCs/>
-          <w:color w:val="548DD4" w:themeColor="text2" w:themeTint="99"/>
-          <w:szCs w:val="22"/>
-        </w:rPr>
-        <w:t>'</w:t>
+          <w:rFonts w:eastAsia="Aptos" w:cstheme="minorHAnsi"/>
+          <w:szCs w:val="22"/>
+          <w:lang w:val="en-GB"/>
+        </w:rPr>
+        <w:t>) at the top of the file.</w:t>
+      </w:r>
+    </w:p>
+    <w:p>
+      <w:pPr>
+        <w:rPr>
+          <w:rFonts w:cstheme="minorHAnsi"/>
+          <w:szCs w:val="22"/>
+        </w:rPr>
+      </w:pPr>
+    </w:p>
+    <w:p>
+      <w:pPr>
+        <w:pStyle w:val="Heading3"/>
+        <w:spacing w:before="281" w:after="281"/>
+        <w:rPr>
+          <w:rFonts w:cstheme="minorHAnsi"/>
+          <w:sz w:val="22"/>
+          <w:szCs w:val="22"/>
+        </w:rPr>
+      </w:pPr>
+      <w:r>
+        <w:rPr>
+          <w:rFonts w:eastAsia="Aptos" w:cstheme="minorHAnsi"/>
+          <w:b/>
+          <w:bCs/>
+          <w:sz w:val="22"/>
+          <w:szCs w:val="22"/>
+        </w:rPr>
+        <w:t xml:space="preserve">2. </w:t>
       </w:r>
       <w:proofErr w:type="spellStart"/>
       <w:r>
         <w:rPr>
-          <w:rFonts w:cstheme="minorHAnsi"/>
-          <w:b/>
-          <w:bCs/>
-          <w:color w:val="548DD4" w:themeColor="text2" w:themeTint="99"/>
-          <w:szCs w:val="22"/>
-        </w:rPr>
-        <w:t>team_id</w:t>
+          <w:rFonts w:eastAsia="Aptos" w:cstheme="minorHAnsi"/>
+          <w:b/>
+          <w:bCs/>
+          <w:sz w:val="22"/>
+          <w:szCs w:val="22"/>
+        </w:rPr>
+        <w:t>Untyped</w:t>
       </w:r>
       <w:proofErr w:type="spellEnd"/>
       <w:r>
         <w:rPr>
-          <w:rFonts w:cstheme="minorHAnsi"/>
-          <w:b/>
-          <w:bCs/>
-          <w:color w:val="548DD4" w:themeColor="text2" w:themeTint="99"/>
-          <w:szCs w:val="22"/>
-        </w:rPr>
-        <w:t>', 5)-&gt;get(),</w:t>
-      </w:r>
-      <w:r>
-        <w:rPr>
-          <w:rFonts w:cstheme="minorHAnsi"/>
-          <w:color w:val="548DD4" w:themeColor="text2" w:themeTint="99"/>
-          <w:szCs w:val="22"/>
+          <w:rFonts w:eastAsia="Aptos" w:cstheme="minorHAnsi"/>
+          <w:b/>
+          <w:bCs/>
+          <w:sz w:val="22"/>
+          <w:szCs w:val="22"/>
+        </w:rPr>
+        <w:t xml:space="preserve"> Method</w:t>
+      </w:r>
+    </w:p>
+    <w:p>
+      <w:pPr>
+        <w:rPr>
+          <w:rFonts w:cstheme="minorHAnsi"/>
+          <w:szCs w:val="22"/>
+        </w:rPr>
+      </w:pPr>
+      <w:proofErr w:type="gramStart"/>
+      <w:r>
+        <w:rPr>
+          <w:rFonts w:eastAsia="Consolas" w:cstheme="minorHAnsi"/>
+          <w:b/>
+          <w:bCs/>
+          <w:color w:val="709FDB" w:themeColor="text2" w:themeTint="80"/>
+          <w:szCs w:val="22"/>
+          <w:lang w:val="en-GB"/>
+        </w:rPr>
+        <w:t>public</w:t>
+      </w:r>
+      <w:proofErr w:type="gramEnd"/>
+      <w:r>
+        <w:rPr>
+          <w:rFonts w:eastAsia="Consolas" w:cstheme="minorHAnsi"/>
+          <w:b/>
+          <w:bCs/>
+          <w:color w:val="709FDB" w:themeColor="text2" w:themeTint="80"/>
+          <w:szCs w:val="22"/>
+          <w:lang w:val="en-GB"/>
+        </w:rPr>
+        <w:t xml:space="preserve"> function team()</w:t>
+      </w:r>
+      <w:r>
+        <w:rPr>
+          <w:rFonts w:cstheme="minorHAnsi"/>
+          <w:szCs w:val="22"/>
+        </w:rPr>
+        <w:br/>
+      </w:r>
+      <w:r>
+        <w:rPr>
+          <w:rFonts w:eastAsia="Consolas" w:cstheme="minorHAnsi"/>
+          <w:b/>
+          <w:bCs/>
+          <w:color w:val="709FDB" w:themeColor="text2" w:themeTint="80"/>
+          <w:szCs w:val="22"/>
+          <w:lang w:val="en-GB"/>
+        </w:rPr>
+        <w:t>{</w:t>
+      </w:r>
+      <w:r>
+        <w:rPr>
+          <w:rFonts w:cstheme="minorHAnsi"/>
+          <w:szCs w:val="22"/>
+        </w:rPr>
+        <w:br/>
+      </w:r>
+      <w:r>
+        <w:rPr>
+          <w:rFonts w:eastAsia="Consolas" w:cstheme="minorHAnsi"/>
+          <w:b/>
+          <w:bCs/>
+          <w:color w:val="709FDB" w:themeColor="text2" w:themeTint="80"/>
+          <w:szCs w:val="22"/>
+          <w:lang w:val="en-GB"/>
+        </w:rPr>
+        <w:t xml:space="preserve">    return $this-&gt;</w:t>
+      </w:r>
+      <w:proofErr w:type="spellStart"/>
+      <w:r>
+        <w:rPr>
+          <w:rFonts w:eastAsia="Consolas" w:cstheme="minorHAnsi"/>
+          <w:b/>
+          <w:bCs/>
+          <w:color w:val="709FDB" w:themeColor="text2" w:themeTint="80"/>
+          <w:szCs w:val="22"/>
+          <w:lang w:val="en-GB"/>
+        </w:rPr>
+        <w:t>belongsTo</w:t>
+      </w:r>
+      <w:proofErr w:type="spellEnd"/>
+      <w:r>
+        <w:rPr>
+          <w:rFonts w:eastAsia="Consolas" w:cstheme="minorHAnsi"/>
+          <w:b/>
+          <w:bCs/>
+          <w:color w:val="709FDB" w:themeColor="text2" w:themeTint="80"/>
+          <w:szCs w:val="22"/>
+          <w:lang w:val="en-GB"/>
+        </w:rPr>
+        <w:t>(Team::class);</w:t>
+      </w:r>
+      <w:r>
+        <w:rPr>
+          <w:rFonts w:cstheme="minorHAnsi"/>
+          <w:szCs w:val="22"/>
+        </w:rPr>
+        <w:br/>
+      </w:r>
+      <w:r>
+        <w:rPr>
+          <w:rFonts w:eastAsia="Consolas" w:cstheme="minorHAnsi"/>
+          <w:b/>
+          <w:bCs/>
+          <w:color w:val="709FDB" w:themeColor="text2" w:themeTint="80"/>
+          <w:szCs w:val="22"/>
+          <w:lang w:val="en-GB"/>
+        </w:rPr>
+        <w:t>}</w:t>
+      </w:r>
+      <w:r>
+        <w:rPr>
+          <w:rFonts w:cstheme="minorHAnsi"/>
+          <w:szCs w:val="22"/>
+        </w:rPr>
+        <w:br/>
+      </w:r>
+      <w:r>
+        <w:rPr>
+          <w:rFonts w:eastAsia="Aptos" w:cstheme="minorHAnsi"/>
+          <w:szCs w:val="22"/>
+          <w:lang w:val="en-GB"/>
         </w:rPr>
         <w:t xml:space="preserve"> </w:t>
       </w:r>
-      <w:r>
-        <w:rPr>
-          <w:rFonts w:cstheme="minorHAnsi"/>
-          <w:szCs w:val="22"/>
-        </w:rPr>
-        <w:t xml:space="preserve">you just write </w:t>
-      </w:r>
-      <w:r>
-        <w:rPr>
-          <w:rFonts w:cstheme="minorHAnsi"/>
-          <w:b/>
-          <w:bCs/>
-          <w:color w:val="548DD4" w:themeColor="text2" w:themeTint="99"/>
-          <w:szCs w:val="22"/>
-        </w:rPr>
-        <w:t>Patient::all()</w:t>
-      </w:r>
-      <w:r>
-        <w:rPr>
-          <w:rFonts w:cstheme="minorHAnsi"/>
-          <w:szCs w:val="22"/>
-        </w:rPr>
-        <w:t xml:space="preserve">, and </w:t>
-      </w:r>
-      <w:proofErr w:type="spellStart"/>
-      <w:r>
-        <w:rPr>
-          <w:rFonts w:cstheme="minorHAnsi"/>
-          <w:szCs w:val="22"/>
-        </w:rPr>
-        <w:t>Laravel</w:t>
-      </w:r>
-      <w:proofErr w:type="spellEnd"/>
-      <w:r>
-        <w:rPr>
-          <w:rFonts w:cstheme="minorHAnsi"/>
-          <w:szCs w:val="22"/>
-        </w:rPr>
-        <w:t xml:space="preserve"> automatically forces it to only return patients belonging to team 5 behind the scenes.</w:t>
-      </w:r>
+    </w:p>
+    <w:p>
+      <w:pPr>
+        <w:pStyle w:val="ListParagraph"/>
+        <w:numPr>
+          <w:ilvl w:val="0"/>
+          <w:numId w:val="21"/>
+        </w:numPr>
+        <w:spacing w:after="0" w:line="279" w:lineRule="auto"/>
+        <w:rPr>
+          <w:rFonts w:eastAsia="Aptos" w:cstheme="minorHAnsi"/>
+          <w:szCs w:val="22"/>
+        </w:rPr>
+      </w:pPr>
+      <w:r>
+        <w:rPr>
+          <w:rFonts w:eastAsia="Aptos" w:cstheme="minorHAnsi"/>
+          <w:b/>
+          <w:bCs/>
+          <w:szCs w:val="22"/>
+          <w:lang w:val="en-GB"/>
+        </w:rPr>
+        <w:t>Pros:</w:t>
+      </w:r>
+      <w:r>
+        <w:rPr>
+          <w:rFonts w:eastAsia="Aptos" w:cstheme="minorHAnsi"/>
+          <w:szCs w:val="22"/>
+          <w:lang w:val="en-GB"/>
+        </w:rPr>
+        <w:t xml:space="preserve"> Simpler code, fewer imports at the top of the file, faster to prototype.</w:t>
+      </w:r>
+    </w:p>
+    <w:p>
+      <w:pPr>
+        <w:pStyle w:val="ListParagraph"/>
+        <w:numPr>
+          <w:ilvl w:val="0"/>
+          <w:numId w:val="21"/>
+        </w:numPr>
+        <w:spacing w:after="0" w:line="279" w:lineRule="auto"/>
+        <w:rPr>
+          <w:rFonts w:eastAsia="Aptos" w:cstheme="minorHAnsi"/>
+          <w:szCs w:val="22"/>
+        </w:rPr>
+      </w:pPr>
+      <w:r>
+        <w:rPr>
+          <w:rFonts w:eastAsia="Aptos" w:cstheme="minorHAnsi"/>
+          <w:b/>
+          <w:bCs/>
+          <w:szCs w:val="22"/>
+          <w:lang w:val="en-GB"/>
+        </w:rPr>
+        <w:t>Cons:</w:t>
+      </w:r>
+      <w:r>
+        <w:rPr>
+          <w:rFonts w:eastAsia="Aptos" w:cstheme="minorHAnsi"/>
+          <w:szCs w:val="22"/>
+          <w:lang w:val="en-GB"/>
+        </w:rPr>
+        <w:t xml:space="preserve"> Lacks IDE auto-completion and static analysis checks.</w:t>
+      </w:r>
+    </w:p>
+    <w:p>
+      <w:pPr>
+        <w:pStyle w:val="Heading3"/>
+        <w:spacing w:before="281" w:after="281"/>
+        <w:rPr>
+          <w:rFonts w:cstheme="minorHAnsi"/>
+          <w:sz w:val="22"/>
+          <w:szCs w:val="22"/>
+        </w:rPr>
+      </w:pPr>
+      <w:r>
+        <w:rPr>
+          <w:rFonts w:eastAsia="Aptos" w:cstheme="minorHAnsi"/>
+          <w:b/>
+          <w:bCs/>
+          <w:sz w:val="22"/>
+          <w:szCs w:val="22"/>
+        </w:rPr>
+        <w:t>Best Practice</w:t>
+      </w:r>
+    </w:p>
+    <w:p>
+      <w:pPr>
+        <w:spacing w:before="240" w:after="240"/>
+        <w:rPr>
+          <w:rFonts w:cstheme="minorHAnsi"/>
+          <w:szCs w:val="22"/>
+        </w:rPr>
+      </w:pPr>
+      <w:r>
+        <w:rPr>
+          <w:rFonts w:eastAsia="Aptos" w:cstheme="minorHAnsi"/>
+          <w:szCs w:val="22"/>
+          <w:lang w:val="en-GB"/>
+        </w:rPr>
+        <w:t xml:space="preserve">Always use </w:t>
+      </w:r>
+      <w:r>
+        <w:rPr>
+          <w:rFonts w:eastAsia="Aptos" w:cstheme="minorHAnsi"/>
+          <w:b/>
+          <w:bCs/>
+          <w:szCs w:val="22"/>
+          <w:lang w:val="en-GB"/>
+        </w:rPr>
+        <w:t>Typed Methods</w:t>
+      </w:r>
+      <w:r>
+        <w:rPr>
+          <w:rFonts w:eastAsia="Aptos" w:cstheme="minorHAnsi"/>
+          <w:szCs w:val="22"/>
+          <w:lang w:val="en-GB"/>
+        </w:rPr>
+        <w:t xml:space="preserve"> for production applications. The small effort of adding the import pays off in safety, auto-completion, and code maintainability. ```</w:t>
+      </w:r>
+    </w:p>
+    <w:p>
+      <w:pPr>
+        <w:rPr>
+          <w:rFonts w:cstheme="minorHAnsi"/>
+          <w:szCs w:val="22"/>
+        </w:rPr>
+      </w:pPr>
+    </w:p>
+    <w:p>
+      <w:pPr>
+        <w:rPr>
+          <w:rFonts w:cstheme="minorHAnsi"/>
+          <w:szCs w:val="22"/>
+        </w:rPr>
+      </w:pPr>
     </w:p>
     <w:sectPr>
       <w:pgSz w:w="11906" w:h="16838"/>
@@ -17303,6 +18277,119 @@
     </w:lvl>
   </w:abstractNum>
   <w:abstractNum w:abstractNumId="7">
+    <w:nsid w:val="49B7E5F0"/>
+    <w:multiLevelType w:val="hybridMultilevel"/>
+    <w:tmpl w:val="3B8860C4"/>
+    <w:lvl w:ilvl="0" w:tplc="BB565DC4">
+      <w:start w:val="1"/>
+      <w:numFmt w:val="bullet"/>
+      <w:lvlText w:val=""/>
+      <w:lvlJc w:val="left"/>
+      <w:pPr>
+        <w:ind w:left="720" w:hanging="360"/>
+      </w:pPr>
+      <w:rPr>
+        <w:rFonts w:ascii="Symbol" w:hAnsi="Symbol" w:hint="default"/>
+      </w:rPr>
+    </w:lvl>
+    <w:lvl w:ilvl="1" w:tplc="AA922EA2">
+      <w:start w:val="1"/>
+      <w:numFmt w:val="bullet"/>
+      <w:lvlText w:val="o"/>
+      <w:lvlJc w:val="left"/>
+      <w:pPr>
+        <w:ind w:left="1440" w:hanging="360"/>
+      </w:pPr>
+      <w:rPr>
+        <w:rFonts w:ascii="Courier New" w:hAnsi="Courier New" w:hint="default"/>
+      </w:rPr>
+    </w:lvl>
+    <w:lvl w:ilvl="2" w:tplc="5184868E">
+      <w:start w:val="1"/>
+      <w:numFmt w:val="bullet"/>
+      <w:lvlText w:val=""/>
+      <w:lvlJc w:val="left"/>
+      <w:pPr>
+        <w:ind w:left="2160" w:hanging="360"/>
+      </w:pPr>
+      <w:rPr>
+        <w:rFonts w:ascii="Wingdings" w:hAnsi="Wingdings" w:hint="default"/>
+      </w:rPr>
+    </w:lvl>
+    <w:lvl w:ilvl="3" w:tplc="A0B6FA54">
+      <w:start w:val="1"/>
+      <w:numFmt w:val="bullet"/>
+      <w:lvlText w:val=""/>
+      <w:lvlJc w:val="left"/>
+      <w:pPr>
+        <w:ind w:left="2880" w:hanging="360"/>
+      </w:pPr>
+      <w:rPr>
+        <w:rFonts w:ascii="Symbol" w:hAnsi="Symbol" w:hint="default"/>
+      </w:rPr>
+    </w:lvl>
+    <w:lvl w:ilvl="4" w:tplc="F9AAA932">
+      <w:start w:val="1"/>
+      <w:numFmt w:val="bullet"/>
+      <w:lvlText w:val="o"/>
+      <w:lvlJc w:val="left"/>
+      <w:pPr>
+        <w:ind w:left="3600" w:hanging="360"/>
+      </w:pPr>
+      <w:rPr>
+        <w:rFonts w:ascii="Courier New" w:hAnsi="Courier New" w:hint="default"/>
+      </w:rPr>
+    </w:lvl>
+    <w:lvl w:ilvl="5" w:tplc="66E61A2C">
+      <w:start w:val="1"/>
+      <w:numFmt w:val="bullet"/>
+      <w:lvlText w:val=""/>
+      <w:lvlJc w:val="left"/>
+      <w:pPr>
+        <w:ind w:left="4320" w:hanging="360"/>
+      </w:pPr>
+      <w:rPr>
+        <w:rFonts w:ascii="Wingdings" w:hAnsi="Wingdings" w:hint="default"/>
+      </w:rPr>
+    </w:lvl>
+    <w:lvl w:ilvl="6" w:tplc="7B3E948E">
+      <w:start w:val="1"/>
+      <w:numFmt w:val="bullet"/>
+      <w:lvlText w:val=""/>
+      <w:lvlJc w:val="left"/>
+      <w:pPr>
+        <w:ind w:left="5040" w:hanging="360"/>
+      </w:pPr>
+      <w:rPr>
+        <w:rFonts w:ascii="Symbol" w:hAnsi="Symbol" w:hint="default"/>
+      </w:rPr>
+    </w:lvl>
+    <w:lvl w:ilvl="7" w:tplc="A9B2959A">
+      <w:start w:val="1"/>
+      <w:numFmt w:val="bullet"/>
+      <w:lvlText w:val="o"/>
+      <w:lvlJc w:val="left"/>
+      <w:pPr>
+        <w:ind w:left="5760" w:hanging="360"/>
+      </w:pPr>
+      <w:rPr>
+        <w:rFonts w:ascii="Courier New" w:hAnsi="Courier New" w:hint="default"/>
+      </w:rPr>
+    </w:lvl>
+    <w:lvl w:ilvl="8" w:tplc="9FB0A2DC">
+      <w:start w:val="1"/>
+      <w:numFmt w:val="bullet"/>
+      <w:lvlText w:val=""/>
+      <w:lvlJc w:val="left"/>
+      <w:pPr>
+        <w:ind w:left="6480" w:hanging="360"/>
+      </w:pPr>
+      <w:rPr>
+        <w:rFonts w:ascii="Wingdings" w:hAnsi="Wingdings" w:hint="default"/>
+      </w:rPr>
+    </w:lvl>
+  </w:abstractNum>
+  <w:abstractNum w:abstractNumId="8">
     <w:nsid w:val="4BA955EF"/>
     <w:multiLevelType w:val="hybridMultilevel"/>
     <w:tmpl w:val="0010B848"/>
@@ -17415,7 +18502,7 @@
       </w:rPr>
     </w:lvl>
   </w:abstractNum>
-  <w:abstractNum w:abstractNumId="8">
+  <w:abstractNum w:abstractNumId="9">
     <w:nsid w:val="515A1F99"/>
     <w:multiLevelType w:val="hybridMultilevel"/>
     <w:tmpl w:val="C242F62E"/>
@@ -17528,7 +18615,7 @@
       </w:rPr>
     </w:lvl>
   </w:abstractNum>
-  <w:abstractNum w:abstractNumId="9">
+  <w:abstractNum w:abstractNumId="10">
     <w:nsid w:val="55F73037"/>
     <w:multiLevelType w:val="hybridMultilevel"/>
     <w:tmpl w:val="C9B47740"/>
@@ -17641,7 +18728,7 @@
       </w:rPr>
     </w:lvl>
   </w:abstractNum>
-  <w:abstractNum w:abstractNumId="10">
+  <w:abstractNum w:abstractNumId="11">
     <w:nsid w:val="5F19EEA1"/>
     <w:multiLevelType w:val="hybridMultilevel"/>
     <w:tmpl w:val="4A064B52"/>
@@ -17754,7 +18841,120 @@
       </w:rPr>
     </w:lvl>
   </w:abstractNum>
-  <w:abstractNum w:abstractNumId="11">
+  <w:abstractNum w:abstractNumId="12">
+    <w:nsid w:val="638D4CE5"/>
+    <w:multiLevelType w:val="hybridMultilevel"/>
+    <w:tmpl w:val="7158DEDA"/>
+    <w:lvl w:ilvl="0" w:tplc="F97E16C4">
+      <w:start w:val="1"/>
+      <w:numFmt w:val="bullet"/>
+      <w:lvlText w:val=""/>
+      <w:lvlJc w:val="left"/>
+      <w:pPr>
+        <w:ind w:left="720" w:hanging="360"/>
+      </w:pPr>
+      <w:rPr>
+        <w:rFonts w:ascii="Symbol" w:hAnsi="Symbol" w:hint="default"/>
+      </w:rPr>
+    </w:lvl>
+    <w:lvl w:ilvl="1" w:tplc="4009000B">
+      <w:start w:val="1"/>
+      <w:numFmt w:val="bullet"/>
+      <w:lvlText w:val=""/>
+      <w:lvlJc w:val="left"/>
+      <w:pPr>
+        <w:ind w:left="1440" w:hanging="360"/>
+      </w:pPr>
+      <w:rPr>
+        <w:rFonts w:ascii="Wingdings" w:hAnsi="Wingdings" w:hint="default"/>
+      </w:rPr>
+    </w:lvl>
+    <w:lvl w:ilvl="2" w:tplc="ACD29522">
+      <w:start w:val="1"/>
+      <w:numFmt w:val="bullet"/>
+      <w:lvlText w:val=""/>
+      <w:lvlJc w:val="left"/>
+      <w:pPr>
+        <w:ind w:left="2160" w:hanging="360"/>
+      </w:pPr>
+      <w:rPr>
+        <w:rFonts w:ascii="Wingdings" w:hAnsi="Wingdings" w:hint="default"/>
+      </w:rPr>
+    </w:lvl>
+    <w:lvl w:ilvl="3" w:tplc="E2E61D56">
+      <w:start w:val="1"/>
+      <w:numFmt w:val="bullet"/>
+      <w:lvlText w:val=""/>
+      <w:lvlJc w:val="left"/>
+      <w:pPr>
+        <w:ind w:left="2880" w:hanging="360"/>
+      </w:pPr>
+      <w:rPr>
+        <w:rFonts w:ascii="Symbol" w:hAnsi="Symbol" w:hint="default"/>
+      </w:rPr>
+    </w:lvl>
+    <w:lvl w:ilvl="4" w:tplc="AE0CAA56">
+      <w:start w:val="1"/>
+      <w:numFmt w:val="bullet"/>
+      <w:lvlText w:val="o"/>
+      <w:lvlJc w:val="left"/>
+      <w:pPr>
+        <w:ind w:left="3600" w:hanging="360"/>
+      </w:pPr>
+      <w:rPr>
+        <w:rFonts w:ascii="Courier New" w:hAnsi="Courier New" w:hint="default"/>
+      </w:rPr>
+    </w:lvl>
+    <w:lvl w:ilvl="5" w:tplc="4F328F76">
+      <w:start w:val="1"/>
+      <w:numFmt w:val="bullet"/>
+      <w:lvlText w:val=""/>
+      <w:lvlJc w:val="left"/>
+      <w:pPr>
+        <w:ind w:left="4320" w:hanging="360"/>
+      </w:pPr>
+      <w:rPr>
+        <w:rFonts w:ascii="Wingdings" w:hAnsi="Wingdings" w:hint="default"/>
+      </w:rPr>
+    </w:lvl>
+    <w:lvl w:ilvl="6" w:tplc="0BAE74B4">
+      <w:start w:val="1"/>
+      <w:numFmt w:val="bullet"/>
+      <w:lvlText w:val=""/>
+      <w:lvlJc w:val="left"/>
+      <w:pPr>
+        <w:ind w:left="5040" w:hanging="360"/>
+      </w:pPr>
+      <w:rPr>
+        <w:rFonts w:ascii="Symbol" w:hAnsi="Symbol" w:hint="default"/>
+      </w:rPr>
+    </w:lvl>
+    <w:lvl w:ilvl="7" w:tplc="8D1E5480">
+      <w:start w:val="1"/>
+      <w:numFmt w:val="bullet"/>
+      <w:lvlText w:val="o"/>
+      <w:lvlJc w:val="left"/>
+      <w:pPr>
+        <w:ind w:left="5760" w:hanging="360"/>
+      </w:pPr>
+      <w:rPr>
+        <w:rFonts w:ascii="Courier New" w:hAnsi="Courier New" w:hint="default"/>
+      </w:rPr>
+    </w:lvl>
+    <w:lvl w:ilvl="8" w:tplc="17D47242">
+      <w:start w:val="1"/>
+      <w:numFmt w:val="bullet"/>
+      <w:lvlText w:val=""/>
+      <w:lvlJc w:val="left"/>
+      <w:pPr>
+        <w:ind w:left="6480" w:hanging="360"/>
+      </w:pPr>
+      <w:rPr>
+        <w:rFonts w:ascii="Wingdings" w:hAnsi="Wingdings" w:hint="default"/>
+      </w:rPr>
+    </w:lvl>
+  </w:abstractNum>
+  <w:abstractNum w:abstractNumId="13">
     <w:nsid w:val="64C669D5"/>
     <w:multiLevelType w:val="hybridMultilevel"/>
     <w:tmpl w:val="B8564516"/>
@@ -17867,7 +19067,7 @@
       </w:rPr>
     </w:lvl>
   </w:abstractNum>
-  <w:abstractNum w:abstractNumId="12">
+  <w:abstractNum w:abstractNumId="14">
     <w:nsid w:val="6D14B790"/>
     <w:multiLevelType w:val="hybridMultilevel"/>
     <w:tmpl w:val="FEB4F556"/>
@@ -17980,7 +19180,7 @@
       </w:rPr>
     </w:lvl>
   </w:abstractNum>
-  <w:abstractNum w:abstractNumId="13">
+  <w:abstractNum w:abstractNumId="15">
     <w:nsid w:val="6F49F606"/>
     <w:multiLevelType w:val="hybridMultilevel"/>
     <w:tmpl w:val="B0B0C0C4"/>
@@ -18093,7 +19293,7 @@
       </w:rPr>
     </w:lvl>
   </w:abstractNum>
-  <w:abstractNum w:abstractNumId="14">
+  <w:abstractNum w:abstractNumId="16">
     <w:nsid w:val="70E94C29"/>
     <w:multiLevelType w:val="hybridMultilevel"/>
     <w:tmpl w:val="226E4AC6"/>
@@ -18206,7 +19406,7 @@
       </w:rPr>
     </w:lvl>
   </w:abstractNum>
-  <w:abstractNum w:abstractNumId="15">
+  <w:abstractNum w:abstractNumId="17">
     <w:nsid w:val="7553C419"/>
     <w:multiLevelType w:val="hybridMultilevel"/>
     <w:tmpl w:val="FB742A26"/>
@@ -18319,7 +19519,7 @@
       </w:rPr>
     </w:lvl>
   </w:abstractNum>
-  <w:abstractNum w:abstractNumId="16">
+  <w:abstractNum w:abstractNumId="18">
     <w:nsid w:val="75822CC5"/>
     <w:multiLevelType w:val="hybridMultilevel"/>
     <w:tmpl w:val="AFFE5774"/>
@@ -18432,7 +19632,7 @@
       </w:rPr>
     </w:lvl>
   </w:abstractNum>
-  <w:abstractNum w:abstractNumId="17">
+  <w:abstractNum w:abstractNumId="19">
     <w:nsid w:val="76B420E5"/>
     <w:multiLevelType w:val="hybridMultilevel"/>
     <w:tmpl w:val="386CE270"/>
@@ -18545,7 +19745,7 @@
       </w:rPr>
     </w:lvl>
   </w:abstractNum>
-  <w:abstractNum w:abstractNumId="18">
+  <w:abstractNum w:abstractNumId="20">
     <w:nsid w:val="7936C793"/>
     <w:multiLevelType w:val="hybridMultilevel"/>
     <w:tmpl w:val="DA88566E"/>
@@ -18658,7 +19858,7 @@
       </w:rPr>
     </w:lvl>
   </w:abstractNum>
-  <w:abstractNum w:abstractNumId="19">
+  <w:abstractNum w:abstractNumId="21">
     <w:nsid w:val="7D241509"/>
     <w:multiLevelType w:val="hybridMultilevel"/>
     <w:tmpl w:val="55FE704A"/>
@@ -18772,19 +19972,19 @@
     </w:lvl>
   </w:abstractNum>
   <w:num w:numId="1">
-    <w:abstractNumId w:val="19"/>
+    <w:abstractNumId w:val="21"/>
   </w:num>
   <w:num w:numId="2">
     <w:abstractNumId w:val="3"/>
   </w:num>
   <w:num w:numId="3">
-    <w:abstractNumId w:val="9"/>
+    <w:abstractNumId w:val="10"/>
   </w:num>
   <w:num w:numId="4">
     <w:abstractNumId w:val="5"/>
   </w:num>
   <w:num w:numId="5">
-    <w:abstractNumId w:val="7"/>
+    <w:abstractNumId w:val="8"/>
   </w:num>
   <w:num w:numId="6">
     <w:abstractNumId w:val="2"/>
@@ -18793,43 +19993,49 @@
     <w:abstractNumId w:val="6"/>
   </w:num>
   <w:num w:numId="8">
-    <w:abstractNumId w:val="17"/>
+    <w:abstractNumId w:val="19"/>
   </w:num>
   <w:num w:numId="9">
-    <w:abstractNumId w:val="13"/>
+    <w:abstractNumId w:val="15"/>
   </w:num>
   <w:num w:numId="10">
-    <w:abstractNumId w:val="12"/>
+    <w:abstractNumId w:val="14"/>
   </w:num>
   <w:num w:numId="11">
     <w:abstractNumId w:val="0"/>
   </w:num>
   <w:num w:numId="12">
-    <w:abstractNumId w:val="15"/>
+    <w:abstractNumId w:val="17"/>
   </w:num>
   <w:num w:numId="13">
     <w:abstractNumId w:val="4"/>
   </w:num>
   <w:num w:numId="14">
-    <w:abstractNumId w:val="8"/>
+    <w:abstractNumId w:val="9"/>
   </w:num>
   <w:num w:numId="15">
-    <w:abstractNumId w:val="10"/>
+    <w:abstractNumId w:val="11"/>
   </w:num>
   <w:num w:numId="16">
-    <w:abstractNumId w:val="16"/>
+    <w:abstractNumId w:val="18"/>
   </w:num>
   <w:num w:numId="17">
-    <w:abstractNumId w:val="11"/>
+    <w:abstractNumId w:val="13"/>
   </w:num>
   <w:num w:numId="18">
-    <w:abstractNumId w:val="14"/>
+    <w:abstractNumId w:val="16"/>
   </w:num>
   <w:num w:numId="19">
     <w:abstractNumId w:val="1"/>
   </w:num>
   <w:num w:numId="20">
-    <w:abstractNumId w:val="18"/>
+    <w:abstractNumId w:val="20"/>
+  </w:num>
+  <w:num w:numId="21">
+    <w:abstractNumId w:val="7"/>
+  </w:num>
+  <w:num w:numId="22">
+    <w:abstractNumId w:val="12"/>
   </w:num>
 </w:numbering>
 </file>

</xml_diff>

<commit_message>
Update Filament notes:Spatie Roles and Permissions
</commit_message>
<xml_diff>
--- a/Filament/filament notes.docx
+++ b/Filament/filament notes.docx
@@ -17071,8 +17071,6 @@
           <w:szCs w:val="22"/>
         </w:rPr>
       </w:pPr>
-      <w:bookmarkStart w:id="0" w:name="_GoBack"/>
-      <w:bookmarkEnd w:id="0"/>
       <w:r>
         <w:rPr>
           <w:rFonts w:eastAsia="Aptos" w:cstheme="minorHAnsi"/>
@@ -17426,16 +17424,17 @@
       <w:pPr>
         <w:spacing w:before="240" w:after="240"/>
         <w:rPr>
-          <w:rFonts w:cstheme="minorHAnsi"/>
-          <w:szCs w:val="22"/>
-        </w:rPr>
-      </w:pPr>
-      <w:r>
-        <w:rPr>
           <w:rFonts w:eastAsia="Aptos" w:cstheme="minorHAnsi"/>
           <w:szCs w:val="22"/>
           <w:lang w:val="en-GB"/>
         </w:rPr>
+      </w:pPr>
+      <w:r>
+        <w:rPr>
+          <w:rFonts w:eastAsia="Aptos" w:cstheme="minorHAnsi"/>
+          <w:szCs w:val="22"/>
+          <w:lang w:val="en-GB"/>
+        </w:rPr>
         <w:t xml:space="preserve">Always use </w:t>
       </w:r>
       <w:r>
@@ -17456,6 +17455,407 @@
         </w:rPr>
         <w:t xml:space="preserve"> for production applications. The small effort of adding the import pays off in safety, auto-completion, and code maintainability. ```</w:t>
       </w:r>
+    </w:p>
+    <w:p>
+      <w:pPr>
+        <w:spacing w:before="240" w:after="240"/>
+        <w:rPr>
+          <w:rFonts w:eastAsia="Aptos" w:cstheme="minorHAnsi"/>
+          <w:b/>
+          <w:bCs/>
+          <w:color w:val="FF0000"/>
+          <w:sz w:val="32"/>
+          <w:szCs w:val="32"/>
+          <w:u w:val="single"/>
+          <w:lang w:val="en-GB"/>
+        </w:rPr>
+      </w:pPr>
+    </w:p>
+    <w:p>
+      <w:pPr>
+        <w:spacing w:before="240" w:after="240"/>
+        <w:rPr>
+          <w:rFonts w:eastAsia="Aptos" w:cstheme="minorHAnsi"/>
+          <w:b/>
+          <w:bCs/>
+          <w:color w:val="FF0000"/>
+          <w:sz w:val="32"/>
+          <w:szCs w:val="32"/>
+          <w:u w:val="single"/>
+          <w:lang w:val="en-GB"/>
+        </w:rPr>
+      </w:pPr>
+      <w:proofErr w:type="spellStart"/>
+      <w:r>
+        <w:rPr>
+          <w:rFonts w:eastAsia="Aptos" w:cstheme="minorHAnsi"/>
+          <w:b/>
+          <w:bCs/>
+          <w:color w:val="FF0000"/>
+          <w:sz w:val="32"/>
+          <w:szCs w:val="32"/>
+          <w:u w:val="single"/>
+          <w:lang w:val="en-GB"/>
+        </w:rPr>
+        <w:t>Spatie</w:t>
+      </w:r>
+      <w:proofErr w:type="spellEnd"/>
+      <w:r>
+        <w:rPr>
+          <w:rFonts w:eastAsia="Aptos" w:cstheme="minorHAnsi"/>
+          <w:b/>
+          <w:bCs/>
+          <w:color w:val="FF0000"/>
+          <w:sz w:val="32"/>
+          <w:szCs w:val="32"/>
+          <w:u w:val="single"/>
+          <w:lang w:val="en-GB"/>
+        </w:rPr>
+        <w:t xml:space="preserve"> Roles &amp; Permissions (Theory &amp; Execution)</w:t>
+      </w:r>
+    </w:p>
+    <w:p>
+      <w:pPr>
+        <w:pStyle w:val="NormalWeb"/>
+        <w:rPr>
+          <w:rFonts w:asciiTheme="minorHAnsi" w:hAnsiTheme="minorHAnsi" w:cstheme="minorHAnsi"/>
+          <w:sz w:val="22"/>
+          <w:szCs w:val="22"/>
+        </w:rPr>
+      </w:pPr>
+      <w:proofErr w:type="spellStart"/>
+      <w:r>
+        <w:rPr>
+          <w:rFonts w:asciiTheme="minorHAnsi" w:hAnsiTheme="minorHAnsi" w:cstheme="minorHAnsi"/>
+          <w:b/>
+          <w:bCs/>
+          <w:sz w:val="22"/>
+          <w:szCs w:val="22"/>
+        </w:rPr>
+        <w:t>Spatie</w:t>
+      </w:r>
+      <w:proofErr w:type="spellEnd"/>
+      <w:r>
+        <w:rPr>
+          <w:rFonts w:asciiTheme="minorHAnsi" w:hAnsiTheme="minorHAnsi" w:cstheme="minorHAnsi"/>
+          <w:sz w:val="22"/>
+          <w:szCs w:val="22"/>
+        </w:rPr>
+        <w:t xml:space="preserve"> is a highly respected web development agency based in Belgium that is famous in the open-source world for building and maintaining hundreds of top-tier, essential packages for the </w:t>
+      </w:r>
+      <w:proofErr w:type="spellStart"/>
+      <w:r>
+        <w:rPr>
+          <w:rFonts w:asciiTheme="minorHAnsi" w:hAnsiTheme="minorHAnsi" w:cstheme="minorHAnsi"/>
+          <w:b/>
+          <w:bCs/>
+          <w:sz w:val="22"/>
+          <w:szCs w:val="22"/>
+        </w:rPr>
+        <w:t>Laravel</w:t>
+      </w:r>
+      <w:proofErr w:type="spellEnd"/>
+      <w:r>
+        <w:rPr>
+          <w:rFonts w:asciiTheme="minorHAnsi" w:hAnsiTheme="minorHAnsi" w:cstheme="minorHAnsi"/>
+          <w:b/>
+          <w:bCs/>
+          <w:sz w:val="22"/>
+          <w:szCs w:val="22"/>
+        </w:rPr>
+        <w:t xml:space="preserve"> (PHP)</w:t>
+      </w:r>
+      <w:r>
+        <w:rPr>
+          <w:rFonts w:asciiTheme="minorHAnsi" w:hAnsiTheme="minorHAnsi" w:cstheme="minorHAnsi"/>
+          <w:sz w:val="22"/>
+          <w:szCs w:val="22"/>
+        </w:rPr>
+        <w:t xml:space="preserve"> ecosystem.</w:t>
+      </w:r>
+    </w:p>
+    <w:p>
+      <w:pPr>
+        <w:pStyle w:val="NormalWeb"/>
+        <w:rPr>
+          <w:rFonts w:asciiTheme="minorHAnsi" w:hAnsiTheme="minorHAnsi" w:cstheme="minorHAnsi"/>
+          <w:sz w:val="22"/>
+          <w:szCs w:val="22"/>
+        </w:rPr>
+      </w:pPr>
+      <w:r>
+        <w:rPr>
+          <w:rFonts w:asciiTheme="minorHAnsi" w:hAnsiTheme="minorHAnsi" w:cstheme="minorHAnsi"/>
+          <w:sz w:val="22"/>
+          <w:szCs w:val="22"/>
+        </w:rPr>
+        <w:t xml:space="preserve">When </w:t>
+      </w:r>
+      <w:proofErr w:type="spellStart"/>
+      <w:r>
+        <w:rPr>
+          <w:rFonts w:asciiTheme="minorHAnsi" w:hAnsiTheme="minorHAnsi" w:cstheme="minorHAnsi"/>
+          <w:sz w:val="22"/>
+          <w:szCs w:val="22"/>
+        </w:rPr>
+        <w:t>Laravel</w:t>
+      </w:r>
+      <w:proofErr w:type="spellEnd"/>
+      <w:r>
+        <w:rPr>
+          <w:rFonts w:asciiTheme="minorHAnsi" w:hAnsiTheme="minorHAnsi" w:cstheme="minorHAnsi"/>
+          <w:sz w:val="22"/>
+          <w:szCs w:val="22"/>
+        </w:rPr>
+        <w:t xml:space="preserve"> developers say "</w:t>
+      </w:r>
+      <w:proofErr w:type="spellStart"/>
+      <w:r>
+        <w:rPr>
+          <w:rFonts w:asciiTheme="minorHAnsi" w:hAnsiTheme="minorHAnsi" w:cstheme="minorHAnsi"/>
+          <w:sz w:val="22"/>
+          <w:szCs w:val="22"/>
+        </w:rPr>
+        <w:t>Spatie</w:t>
+      </w:r>
+      <w:proofErr w:type="spellEnd"/>
+      <w:r>
+        <w:rPr>
+          <w:rFonts w:asciiTheme="minorHAnsi" w:hAnsiTheme="minorHAnsi" w:cstheme="minorHAnsi"/>
+          <w:sz w:val="22"/>
+          <w:szCs w:val="22"/>
+        </w:rPr>
+        <w:t xml:space="preserve">," they are usually referring to one of their incredibly popular packages. Instead of reinventing the wheel, developers use </w:t>
+      </w:r>
+      <w:proofErr w:type="spellStart"/>
+      <w:r>
+        <w:rPr>
+          <w:rFonts w:asciiTheme="minorHAnsi" w:hAnsiTheme="minorHAnsi" w:cstheme="minorHAnsi"/>
+          <w:sz w:val="22"/>
+          <w:szCs w:val="22"/>
+        </w:rPr>
+        <w:t>Spatie</w:t>
+      </w:r>
+      <w:proofErr w:type="spellEnd"/>
+      <w:r>
+        <w:rPr>
+          <w:rFonts w:asciiTheme="minorHAnsi" w:hAnsiTheme="minorHAnsi" w:cstheme="minorHAnsi"/>
+          <w:sz w:val="22"/>
+          <w:szCs w:val="22"/>
+        </w:rPr>
+        <w:t xml:space="preserve"> packages to instantly drop complex features into their apps.</w:t>
+      </w:r>
+    </w:p>
+    <w:p>
+      <w:pPr>
+        <w:spacing w:before="240" w:after="240"/>
+        <w:rPr>
+          <w:rFonts w:eastAsia="Aptos" w:cstheme="minorHAnsi"/>
+          <w:b/>
+          <w:bCs/>
+          <w:szCs w:val="22"/>
+          <w:lang w:val="en-GB"/>
+        </w:rPr>
+      </w:pPr>
+      <w:r>
+        <w:rPr>
+          <w:rFonts w:eastAsia="Aptos" w:cstheme="minorHAnsi"/>
+          <w:b/>
+          <w:bCs/>
+          <w:szCs w:val="22"/>
+          <w:lang w:val="en-GB"/>
+        </w:rPr>
+        <w:t>1. The Theory: What is RBAC?</w:t>
+      </w:r>
+    </w:p>
+    <w:p>
+      <w:pPr>
+        <w:spacing w:before="240" w:after="240"/>
+        <w:rPr>
+          <w:rFonts w:eastAsia="Aptos" w:cstheme="minorHAnsi"/>
+          <w:szCs w:val="22"/>
+          <w:lang w:val="en-GB"/>
+        </w:rPr>
+      </w:pPr>
+      <w:proofErr w:type="spellStart"/>
+      <w:r>
+        <w:rPr>
+          <w:rFonts w:eastAsia="Aptos" w:cstheme="minorHAnsi"/>
+          <w:b/>
+          <w:bCs/>
+          <w:szCs w:val="22"/>
+          <w:lang w:val="en-GB"/>
+        </w:rPr>
+        <w:t>Spatie’s</w:t>
+      </w:r>
+      <w:proofErr w:type="spellEnd"/>
+      <w:r>
+        <w:rPr>
+          <w:rFonts w:eastAsia="Aptos" w:cstheme="minorHAnsi"/>
+          <w:b/>
+          <w:bCs/>
+          <w:szCs w:val="22"/>
+          <w:lang w:val="en-GB"/>
+        </w:rPr>
+        <w:t xml:space="preserve"> </w:t>
+      </w:r>
+      <w:proofErr w:type="spellStart"/>
+      <w:r>
+        <w:rPr>
+          <w:rFonts w:eastAsia="Aptos" w:cstheme="minorHAnsi"/>
+          <w:b/>
+          <w:bCs/>
+          <w:szCs w:val="22"/>
+          <w:lang w:val="en-GB"/>
+        </w:rPr>
+        <w:t>laravel</w:t>
+      </w:r>
+      <w:proofErr w:type="spellEnd"/>
+      <w:r>
+        <w:rPr>
+          <w:rFonts w:eastAsia="Aptos" w:cstheme="minorHAnsi"/>
+          <w:b/>
+          <w:bCs/>
+          <w:szCs w:val="22"/>
+          <w:lang w:val="en-GB"/>
+        </w:rPr>
+        <w:t>-permission</w:t>
+      </w:r>
+      <w:r>
+        <w:rPr>
+          <w:rFonts w:eastAsia="Aptos" w:cstheme="minorHAnsi"/>
+          <w:szCs w:val="22"/>
+          <w:lang w:val="en-GB"/>
+        </w:rPr>
+        <w:t xml:space="preserve"> implements Role-Based Access Control (RBAC). Instead of assigning individual rights directly to users (which becomes messy to maintain), access is managed through two layers:</w:t>
+      </w:r>
+    </w:p>
+    <w:p>
+      <w:pPr>
+        <w:pStyle w:val="ListParagraph"/>
+        <w:numPr>
+          <w:ilvl w:val="0"/>
+          <w:numId w:val="23"/>
+        </w:numPr>
+        <w:spacing w:before="240" w:after="240"/>
+        <w:rPr>
+          <w:rFonts w:eastAsia="Aptos" w:cstheme="minorHAnsi"/>
+          <w:szCs w:val="22"/>
+          <w:lang w:val="en-GB"/>
+        </w:rPr>
+      </w:pPr>
+      <w:r>
+        <w:rPr>
+          <w:rFonts w:eastAsia="Aptos" w:cstheme="minorHAnsi"/>
+          <w:b/>
+          <w:bCs/>
+          <w:szCs w:val="22"/>
+          <w:lang w:val="en-GB"/>
+        </w:rPr>
+        <w:t>Permissions</w:t>
+      </w:r>
+      <w:r>
+        <w:rPr>
+          <w:rFonts w:eastAsia="Aptos" w:cstheme="minorHAnsi"/>
+          <w:szCs w:val="22"/>
+          <w:lang w:val="en-GB"/>
+        </w:rPr>
+        <w:t>: Granular actions a user can perform (e.g., create articles, delete users).</w:t>
+      </w:r>
+    </w:p>
+    <w:p>
+      <w:pPr>
+        <w:pStyle w:val="ListParagraph"/>
+        <w:numPr>
+          <w:ilvl w:val="0"/>
+          <w:numId w:val="23"/>
+        </w:numPr>
+        <w:spacing w:before="240" w:after="240"/>
+        <w:rPr>
+          <w:rFonts w:eastAsia="Aptos" w:cstheme="minorHAnsi"/>
+          <w:szCs w:val="22"/>
+          <w:lang w:val="en-GB"/>
+        </w:rPr>
+      </w:pPr>
+      <w:r>
+        <w:rPr>
+          <w:rFonts w:eastAsia="Aptos" w:cstheme="minorHAnsi"/>
+          <w:b/>
+          <w:bCs/>
+          <w:szCs w:val="22"/>
+          <w:lang w:val="en-GB"/>
+        </w:rPr>
+        <w:t>Roles:</w:t>
+      </w:r>
+      <w:r>
+        <w:rPr>
+          <w:rFonts w:eastAsia="Aptos" w:cstheme="minorHAnsi"/>
+          <w:szCs w:val="22"/>
+          <w:lang w:val="en-GB"/>
+        </w:rPr>
+        <w:t xml:space="preserve"> Bundles of permissions mapped to a title (e.g., an Editor role bundles create articles and edit articles).</w:t>
+      </w:r>
+    </w:p>
+    <w:p>
+      <w:pPr>
+        <w:spacing w:before="240" w:after="240"/>
+        <w:rPr>
+          <w:rFonts w:eastAsia="Aptos" w:cstheme="minorHAnsi"/>
+          <w:szCs w:val="22"/>
+          <w:lang w:val="en-GB"/>
+        </w:rPr>
+      </w:pPr>
+      <w:bookmarkStart w:id="0" w:name="_GoBack"/>
+      <w:bookmarkEnd w:id="0"/>
+      <w:r>
+        <w:rPr>
+          <w:rFonts w:eastAsia="Aptos" w:cstheme="minorHAnsi"/>
+          <w:b/>
+          <w:bCs/>
+          <w:szCs w:val="22"/>
+          <w:highlight w:val="yellow"/>
+          <w:lang w:val="en-GB"/>
+        </w:rPr>
+        <w:t xml:space="preserve">The Golden Rule: </w:t>
+      </w:r>
+      <w:r>
+        <w:rPr>
+          <w:rFonts w:eastAsia="Aptos" w:cstheme="minorHAnsi"/>
+          <w:szCs w:val="22"/>
+          <w:highlight w:val="yellow"/>
+          <w:lang w:val="en-GB"/>
+        </w:rPr>
+        <w:t>Always assign permissions to roles, and then assign roles to users.</w:t>
+      </w:r>
+    </w:p>
+    <w:p>
+      <w:pPr>
+        <w:spacing w:before="240" w:after="240"/>
+        <w:rPr>
+          <w:rFonts w:eastAsia="Aptos" w:cstheme="minorHAnsi"/>
+          <w:szCs w:val="22"/>
+          <w:lang w:val="en-GB"/>
+        </w:rPr>
+      </w:pPr>
+    </w:p>
+    <w:p>
+      <w:pPr>
+        <w:spacing w:before="240" w:after="240"/>
+        <w:rPr>
+          <w:rFonts w:eastAsia="Aptos" w:cstheme="minorHAnsi"/>
+          <w:szCs w:val="22"/>
+          <w:lang w:val="en-GB"/>
+        </w:rPr>
+      </w:pPr>
+    </w:p>
+    <w:p>
+      <w:pPr>
+        <w:spacing w:before="240" w:after="240"/>
+        <w:rPr>
+          <w:rFonts w:cstheme="minorHAnsi"/>
+          <w:szCs w:val="22"/>
+        </w:rPr>
+      </w:pPr>
     </w:p>
     <w:p>
       <w:pPr>
@@ -17938,6 +18338,119 @@
     </w:lvl>
   </w:abstractNum>
   <w:abstractNum w:abstractNumId="4">
+    <w:nsid w:val="40611D4A"/>
+    <w:multiLevelType w:val="hybridMultilevel"/>
+    <w:tmpl w:val="A3B4B8CC"/>
+    <w:lvl w:ilvl="0" w:tplc="40090001">
+      <w:start w:val="1"/>
+      <w:numFmt w:val="bullet"/>
+      <w:lvlText w:val=""/>
+      <w:lvlJc w:val="left"/>
+      <w:pPr>
+        <w:ind w:left="720" w:hanging="360"/>
+      </w:pPr>
+      <w:rPr>
+        <w:rFonts w:ascii="Symbol" w:hAnsi="Symbol" w:hint="default"/>
+      </w:rPr>
+    </w:lvl>
+    <w:lvl w:ilvl="1" w:tplc="40090003" w:tentative="1">
+      <w:start w:val="1"/>
+      <w:numFmt w:val="bullet"/>
+      <w:lvlText w:val="o"/>
+      <w:lvlJc w:val="left"/>
+      <w:pPr>
+        <w:ind w:left="1440" w:hanging="360"/>
+      </w:pPr>
+      <w:rPr>
+        <w:rFonts w:ascii="Courier New" w:hAnsi="Courier New" w:cs="Courier New" w:hint="default"/>
+      </w:rPr>
+    </w:lvl>
+    <w:lvl w:ilvl="2" w:tplc="40090005" w:tentative="1">
+      <w:start w:val="1"/>
+      <w:numFmt w:val="bullet"/>
+      <w:lvlText w:val=""/>
+      <w:lvlJc w:val="left"/>
+      <w:pPr>
+        <w:ind w:left="2160" w:hanging="360"/>
+      </w:pPr>
+      <w:rPr>
+        <w:rFonts w:ascii="Wingdings" w:hAnsi="Wingdings" w:hint="default"/>
+      </w:rPr>
+    </w:lvl>
+    <w:lvl w:ilvl="3" w:tplc="40090001" w:tentative="1">
+      <w:start w:val="1"/>
+      <w:numFmt w:val="bullet"/>
+      <w:lvlText w:val=""/>
+      <w:lvlJc w:val="left"/>
+      <w:pPr>
+        <w:ind w:left="2880" w:hanging="360"/>
+      </w:pPr>
+      <w:rPr>
+        <w:rFonts w:ascii="Symbol" w:hAnsi="Symbol" w:hint="default"/>
+      </w:rPr>
+    </w:lvl>
+    <w:lvl w:ilvl="4" w:tplc="40090003" w:tentative="1">
+      <w:start w:val="1"/>
+      <w:numFmt w:val="bullet"/>
+      <w:lvlText w:val="o"/>
+      <w:lvlJc w:val="left"/>
+      <w:pPr>
+        <w:ind w:left="3600" w:hanging="360"/>
+      </w:pPr>
+      <w:rPr>
+        <w:rFonts w:ascii="Courier New" w:hAnsi="Courier New" w:cs="Courier New" w:hint="default"/>
+      </w:rPr>
+    </w:lvl>
+    <w:lvl w:ilvl="5" w:tplc="40090005" w:tentative="1">
+      <w:start w:val="1"/>
+      <w:numFmt w:val="bullet"/>
+      <w:lvlText w:val=""/>
+      <w:lvlJc w:val="left"/>
+      <w:pPr>
+        <w:ind w:left="4320" w:hanging="360"/>
+      </w:pPr>
+      <w:rPr>
+        <w:rFonts w:ascii="Wingdings" w:hAnsi="Wingdings" w:hint="default"/>
+      </w:rPr>
+    </w:lvl>
+    <w:lvl w:ilvl="6" w:tplc="40090001" w:tentative="1">
+      <w:start w:val="1"/>
+      <w:numFmt w:val="bullet"/>
+      <w:lvlText w:val=""/>
+      <w:lvlJc w:val="left"/>
+      <w:pPr>
+        <w:ind w:left="5040" w:hanging="360"/>
+      </w:pPr>
+      <w:rPr>
+        <w:rFonts w:ascii="Symbol" w:hAnsi="Symbol" w:hint="default"/>
+      </w:rPr>
+    </w:lvl>
+    <w:lvl w:ilvl="7" w:tplc="40090003" w:tentative="1">
+      <w:start w:val="1"/>
+      <w:numFmt w:val="bullet"/>
+      <w:lvlText w:val="o"/>
+      <w:lvlJc w:val="left"/>
+      <w:pPr>
+        <w:ind w:left="5760" w:hanging="360"/>
+      </w:pPr>
+      <w:rPr>
+        <w:rFonts w:ascii="Courier New" w:hAnsi="Courier New" w:cs="Courier New" w:hint="default"/>
+      </w:rPr>
+    </w:lvl>
+    <w:lvl w:ilvl="8" w:tplc="40090005" w:tentative="1">
+      <w:start w:val="1"/>
+      <w:numFmt w:val="bullet"/>
+      <w:lvlText w:val=""/>
+      <w:lvlJc w:val="left"/>
+      <w:pPr>
+        <w:ind w:left="6480" w:hanging="360"/>
+      </w:pPr>
+      <w:rPr>
+        <w:rFonts w:ascii="Wingdings" w:hAnsi="Wingdings" w:hint="default"/>
+      </w:rPr>
+    </w:lvl>
+  </w:abstractNum>
+  <w:abstractNum w:abstractNumId="5">
     <w:nsid w:val="43D8995C"/>
     <w:multiLevelType w:val="hybridMultilevel"/>
     <w:tmpl w:val="E1284C72"/>
@@ -18050,7 +18563,7 @@
       </w:rPr>
     </w:lvl>
   </w:abstractNum>
-  <w:abstractNum w:abstractNumId="5">
+  <w:abstractNum w:abstractNumId="6">
     <w:nsid w:val="448F61A1"/>
     <w:multiLevelType w:val="hybridMultilevel"/>
     <w:tmpl w:val="165055AE"/>
@@ -18163,7 +18676,7 @@
       </w:rPr>
     </w:lvl>
   </w:abstractNum>
-  <w:abstractNum w:abstractNumId="6">
+  <w:abstractNum w:abstractNumId="7">
     <w:nsid w:val="45FB5FEE"/>
     <w:multiLevelType w:val="hybridMultilevel"/>
     <w:tmpl w:val="CAA22B96"/>
@@ -18276,7 +18789,7 @@
       </w:rPr>
     </w:lvl>
   </w:abstractNum>
-  <w:abstractNum w:abstractNumId="7">
+  <w:abstractNum w:abstractNumId="8">
     <w:nsid w:val="49B7E5F0"/>
     <w:multiLevelType w:val="hybridMultilevel"/>
     <w:tmpl w:val="3B8860C4"/>
@@ -18389,7 +18902,7 @@
       </w:rPr>
     </w:lvl>
   </w:abstractNum>
-  <w:abstractNum w:abstractNumId="8">
+  <w:abstractNum w:abstractNumId="9">
     <w:nsid w:val="4BA955EF"/>
     <w:multiLevelType w:val="hybridMultilevel"/>
     <w:tmpl w:val="0010B848"/>
@@ -18502,7 +19015,7 @@
       </w:rPr>
     </w:lvl>
   </w:abstractNum>
-  <w:abstractNum w:abstractNumId="9">
+  <w:abstractNum w:abstractNumId="10">
     <w:nsid w:val="515A1F99"/>
     <w:multiLevelType w:val="hybridMultilevel"/>
     <w:tmpl w:val="C242F62E"/>
@@ -18615,7 +19128,7 @@
       </w:rPr>
     </w:lvl>
   </w:abstractNum>
-  <w:abstractNum w:abstractNumId="10">
+  <w:abstractNum w:abstractNumId="11">
     <w:nsid w:val="55F73037"/>
     <w:multiLevelType w:val="hybridMultilevel"/>
     <w:tmpl w:val="C9B47740"/>
@@ -18728,7 +19241,7 @@
       </w:rPr>
     </w:lvl>
   </w:abstractNum>
-  <w:abstractNum w:abstractNumId="11">
+  <w:abstractNum w:abstractNumId="12">
     <w:nsid w:val="5F19EEA1"/>
     <w:multiLevelType w:val="hybridMultilevel"/>
     <w:tmpl w:val="4A064B52"/>
@@ -18841,7 +19354,7 @@
       </w:rPr>
     </w:lvl>
   </w:abstractNum>
-  <w:abstractNum w:abstractNumId="12">
+  <w:abstractNum w:abstractNumId="13">
     <w:nsid w:val="638D4CE5"/>
     <w:multiLevelType w:val="hybridMultilevel"/>
     <w:tmpl w:val="7158DEDA"/>
@@ -18954,7 +19467,7 @@
       </w:rPr>
     </w:lvl>
   </w:abstractNum>
-  <w:abstractNum w:abstractNumId="13">
+  <w:abstractNum w:abstractNumId="14">
     <w:nsid w:val="64C669D5"/>
     <w:multiLevelType w:val="hybridMultilevel"/>
     <w:tmpl w:val="B8564516"/>
@@ -19067,7 +19580,7 @@
       </w:rPr>
     </w:lvl>
   </w:abstractNum>
-  <w:abstractNum w:abstractNumId="14">
+  <w:abstractNum w:abstractNumId="15">
     <w:nsid w:val="6D14B790"/>
     <w:multiLevelType w:val="hybridMultilevel"/>
     <w:tmpl w:val="FEB4F556"/>
@@ -19180,7 +19693,7 @@
       </w:rPr>
     </w:lvl>
   </w:abstractNum>
-  <w:abstractNum w:abstractNumId="15">
+  <w:abstractNum w:abstractNumId="16">
     <w:nsid w:val="6F49F606"/>
     <w:multiLevelType w:val="hybridMultilevel"/>
     <w:tmpl w:val="B0B0C0C4"/>
@@ -19293,7 +19806,7 @@
       </w:rPr>
     </w:lvl>
   </w:abstractNum>
-  <w:abstractNum w:abstractNumId="16">
+  <w:abstractNum w:abstractNumId="17">
     <w:nsid w:val="70E94C29"/>
     <w:multiLevelType w:val="hybridMultilevel"/>
     <w:tmpl w:val="226E4AC6"/>
@@ -19406,7 +19919,7 @@
       </w:rPr>
     </w:lvl>
   </w:abstractNum>
-  <w:abstractNum w:abstractNumId="17">
+  <w:abstractNum w:abstractNumId="18">
     <w:nsid w:val="7553C419"/>
     <w:multiLevelType w:val="hybridMultilevel"/>
     <w:tmpl w:val="FB742A26"/>
@@ -19519,7 +20032,7 @@
       </w:rPr>
     </w:lvl>
   </w:abstractNum>
-  <w:abstractNum w:abstractNumId="18">
+  <w:abstractNum w:abstractNumId="19">
     <w:nsid w:val="75822CC5"/>
     <w:multiLevelType w:val="hybridMultilevel"/>
     <w:tmpl w:val="AFFE5774"/>
@@ -19632,7 +20145,7 @@
       </w:rPr>
     </w:lvl>
   </w:abstractNum>
-  <w:abstractNum w:abstractNumId="19">
+  <w:abstractNum w:abstractNumId="20">
     <w:nsid w:val="76B420E5"/>
     <w:multiLevelType w:val="hybridMultilevel"/>
     <w:tmpl w:val="386CE270"/>
@@ -19745,7 +20258,7 @@
       </w:rPr>
     </w:lvl>
   </w:abstractNum>
-  <w:abstractNum w:abstractNumId="20">
+  <w:abstractNum w:abstractNumId="21">
     <w:nsid w:val="7936C793"/>
     <w:multiLevelType w:val="hybridMultilevel"/>
     <w:tmpl w:val="DA88566E"/>
@@ -19858,7 +20371,7 @@
       </w:rPr>
     </w:lvl>
   </w:abstractNum>
-  <w:abstractNum w:abstractNumId="21">
+  <w:abstractNum w:abstractNumId="22">
     <w:nsid w:val="7D241509"/>
     <w:multiLevelType w:val="hybridMultilevel"/>
     <w:tmpl w:val="55FE704A"/>
@@ -19972,70 +20485,73 @@
     </w:lvl>
   </w:abstractNum>
   <w:num w:numId="1">
-    <w:abstractNumId w:val="21"/>
+    <w:abstractNumId w:val="22"/>
   </w:num>
   <w:num w:numId="2">
     <w:abstractNumId w:val="3"/>
   </w:num>
   <w:num w:numId="3">
-    <w:abstractNumId w:val="10"/>
+    <w:abstractNumId w:val="11"/>
   </w:num>
   <w:num w:numId="4">
-    <w:abstractNumId w:val="5"/>
+    <w:abstractNumId w:val="6"/>
   </w:num>
   <w:num w:numId="5">
-    <w:abstractNumId w:val="8"/>
+    <w:abstractNumId w:val="9"/>
   </w:num>
   <w:num w:numId="6">
     <w:abstractNumId w:val="2"/>
   </w:num>
   <w:num w:numId="7">
-    <w:abstractNumId w:val="6"/>
+    <w:abstractNumId w:val="7"/>
   </w:num>
   <w:num w:numId="8">
-    <w:abstractNumId w:val="19"/>
+    <w:abstractNumId w:val="20"/>
   </w:num>
   <w:num w:numId="9">
-    <w:abstractNumId w:val="15"/>
+    <w:abstractNumId w:val="16"/>
   </w:num>
   <w:num w:numId="10">
-    <w:abstractNumId w:val="14"/>
+    <w:abstractNumId w:val="15"/>
   </w:num>
   <w:num w:numId="11">
     <w:abstractNumId w:val="0"/>
   </w:num>
   <w:num w:numId="12">
-    <w:abstractNumId w:val="17"/>
+    <w:abstractNumId w:val="18"/>
   </w:num>
   <w:num w:numId="13">
-    <w:abstractNumId w:val="4"/>
+    <w:abstractNumId w:val="5"/>
   </w:num>
   <w:num w:numId="14">
-    <w:abstractNumId w:val="9"/>
+    <w:abstractNumId w:val="10"/>
   </w:num>
   <w:num w:numId="15">
-    <w:abstractNumId w:val="11"/>
+    <w:abstractNumId w:val="12"/>
   </w:num>
   <w:num w:numId="16">
-    <w:abstractNumId w:val="18"/>
+    <w:abstractNumId w:val="19"/>
   </w:num>
   <w:num w:numId="17">
-    <w:abstractNumId w:val="13"/>
+    <w:abstractNumId w:val="14"/>
   </w:num>
   <w:num w:numId="18">
-    <w:abstractNumId w:val="16"/>
+    <w:abstractNumId w:val="17"/>
   </w:num>
   <w:num w:numId="19">
     <w:abstractNumId w:val="1"/>
   </w:num>
   <w:num w:numId="20">
-    <w:abstractNumId w:val="20"/>
+    <w:abstractNumId w:val="21"/>
   </w:num>
   <w:num w:numId="21">
-    <w:abstractNumId w:val="7"/>
+    <w:abstractNumId w:val="8"/>
   </w:num>
   <w:num w:numId="22">
-    <w:abstractNumId w:val="12"/>
+    <w:abstractNumId w:val="13"/>
+  </w:num>
+  <w:num w:numId="23">
+    <w:abstractNumId w:val="4"/>
   </w:num>
 </w:numbering>
 </file>
@@ -20273,6 +20789,31 @@
       <w:lang w:val="en-GB" w:eastAsia="ja-JP" w:bidi="ar-SA"/>
     </w:rPr>
   </w:style>
+  <w:style w:type="paragraph" w:styleId="Heading4">
+    <w:name w:val="heading 4"/>
+    <w:basedOn w:val="Normal"/>
+    <w:next w:val="Normal"/>
+    <w:link w:val="Heading4Char"/>
+    <w:uiPriority w:val="9"/>
+    <w:semiHidden/>
+    <w:unhideWhenUsed/>
+    <w:qFormat/>
+    <w:rsid w:val="008246D0"/>
+    <w:pPr>
+      <w:keepNext/>
+      <w:keepLines/>
+      <w:spacing w:before="200" w:after="0"/>
+      <w:outlineLvl w:val="3"/>
+    </w:pPr>
+    <w:rPr>
+      <w:rFonts w:asciiTheme="majorHAnsi" w:eastAsiaTheme="majorEastAsia" w:hAnsiTheme="majorHAnsi" w:cstheme="majorBidi"/>
+      <w:b/>
+      <w:bCs/>
+      <w:i/>
+      <w:iCs/>
+      <w:color w:val="4F81BD" w:themeColor="accent1"/>
+    </w:rPr>
+  </w:style>
   <w:style w:type="character" w:default="1" w:styleId="DefaultParagraphFont">
     <w:name w:val="Default Paragraph Font"/>
     <w:uiPriority w:val="1"/>
@@ -20396,6 +20937,39 @@
       <w:color w:val="4F81BD" w:themeColor="accent1"/>
       <w:sz w:val="26"/>
       <w:szCs w:val="23"/>
+    </w:rPr>
+  </w:style>
+  <w:style w:type="character" w:customStyle="1" w:styleId="Heading4Char">
+    <w:name w:val="Heading 4 Char"/>
+    <w:basedOn w:val="DefaultParagraphFont"/>
+    <w:link w:val="Heading4"/>
+    <w:uiPriority w:val="9"/>
+    <w:semiHidden/>
+    <w:rsid w:val="008246D0"/>
+    <w:rPr>
+      <w:rFonts w:asciiTheme="majorHAnsi" w:eastAsiaTheme="majorEastAsia" w:hAnsiTheme="majorHAnsi" w:cstheme="majorBidi"/>
+      <w:b/>
+      <w:bCs/>
+      <w:i/>
+      <w:iCs/>
+      <w:color w:val="4F81BD" w:themeColor="accent1"/>
+    </w:rPr>
+  </w:style>
+  <w:style w:type="paragraph" w:styleId="NormalWeb">
+    <w:name w:val="Normal (Web)"/>
+    <w:basedOn w:val="Normal"/>
+    <w:uiPriority w:val="99"/>
+    <w:semiHidden/>
+    <w:unhideWhenUsed/>
+    <w:rsid w:val="008246D0"/>
+    <w:pPr>
+      <w:spacing w:before="100" w:beforeAutospacing="1" w:after="100" w:afterAutospacing="1" w:line="240" w:lineRule="auto"/>
+    </w:pPr>
+    <w:rPr>
+      <w:rFonts w:ascii="Times New Roman" w:eastAsia="Times New Roman" w:hAnsi="Times New Roman" w:cs="Times New Roman"/>
+      <w:sz w:val="24"/>
+      <w:szCs w:val="24"/>
+      <w:lang w:eastAsia="en-IN"/>
     </w:rPr>
   </w:style>
 </w:styles>
@@ -20634,6 +21208,31 @@
       <w:lang w:val="en-GB" w:eastAsia="ja-JP" w:bidi="ar-SA"/>
     </w:rPr>
   </w:style>
+  <w:style w:type="paragraph" w:styleId="Heading4">
+    <w:name w:val="heading 4"/>
+    <w:basedOn w:val="Normal"/>
+    <w:next w:val="Normal"/>
+    <w:link w:val="Heading4Char"/>
+    <w:uiPriority w:val="9"/>
+    <w:semiHidden/>
+    <w:unhideWhenUsed/>
+    <w:qFormat/>
+    <w:rsid w:val="008246D0"/>
+    <w:pPr>
+      <w:keepNext/>
+      <w:keepLines/>
+      <w:spacing w:before="200" w:after="0"/>
+      <w:outlineLvl w:val="3"/>
+    </w:pPr>
+    <w:rPr>
+      <w:rFonts w:asciiTheme="majorHAnsi" w:eastAsiaTheme="majorEastAsia" w:hAnsiTheme="majorHAnsi" w:cstheme="majorBidi"/>
+      <w:b/>
+      <w:bCs/>
+      <w:i/>
+      <w:iCs/>
+      <w:color w:val="4F81BD" w:themeColor="accent1"/>
+    </w:rPr>
+  </w:style>
   <w:style w:type="character" w:default="1" w:styleId="DefaultParagraphFont">
     <w:name w:val="Default Paragraph Font"/>
     <w:uiPriority w:val="1"/>
@@ -20757,6 +21356,39 @@
       <w:color w:val="4F81BD" w:themeColor="accent1"/>
       <w:sz w:val="26"/>
       <w:szCs w:val="23"/>
+    </w:rPr>
+  </w:style>
+  <w:style w:type="character" w:customStyle="1" w:styleId="Heading4Char">
+    <w:name w:val="Heading 4 Char"/>
+    <w:basedOn w:val="DefaultParagraphFont"/>
+    <w:link w:val="Heading4"/>
+    <w:uiPriority w:val="9"/>
+    <w:semiHidden/>
+    <w:rsid w:val="008246D0"/>
+    <w:rPr>
+      <w:rFonts w:asciiTheme="majorHAnsi" w:eastAsiaTheme="majorEastAsia" w:hAnsiTheme="majorHAnsi" w:cstheme="majorBidi"/>
+      <w:b/>
+      <w:bCs/>
+      <w:i/>
+      <w:iCs/>
+      <w:color w:val="4F81BD" w:themeColor="accent1"/>
+    </w:rPr>
+  </w:style>
+  <w:style w:type="paragraph" w:styleId="NormalWeb">
+    <w:name w:val="Normal (Web)"/>
+    <w:basedOn w:val="Normal"/>
+    <w:uiPriority w:val="99"/>
+    <w:semiHidden/>
+    <w:unhideWhenUsed/>
+    <w:rsid w:val="008246D0"/>
+    <w:pPr>
+      <w:spacing w:before="100" w:beforeAutospacing="1" w:after="100" w:afterAutospacing="1" w:line="240" w:lineRule="auto"/>
+    </w:pPr>
+    <w:rPr>
+      <w:rFonts w:ascii="Times New Roman" w:eastAsia="Times New Roman" w:hAnsi="Times New Roman" w:cs="Times New Roman"/>
+      <w:sz w:val="24"/>
+      <w:szCs w:val="24"/>
+      <w:lang w:eastAsia="en-IN"/>
     </w:rPr>
   </w:style>
 </w:styles>

</xml_diff>

<commit_message>
Update Filament notes: firstOrCreate() vs factory()->create()
</commit_message>
<xml_diff>
--- a/Filament/filament notes.docx
+++ b/Filament/filament notes.docx
@@ -17805,28 +17805,478 @@
           <w:lang w:val="en-GB"/>
         </w:rPr>
       </w:pPr>
+      <w:r>
+        <w:rPr>
+          <w:rFonts w:eastAsia="Aptos" w:cstheme="minorHAnsi"/>
+          <w:b/>
+          <w:bCs/>
+          <w:szCs w:val="22"/>
+          <w:highlight w:val="yellow"/>
+          <w:lang w:val="en-GB"/>
+        </w:rPr>
+        <w:t xml:space="preserve">The Golden Rule: </w:t>
+      </w:r>
+      <w:r>
+        <w:rPr>
+          <w:rFonts w:eastAsia="Aptos" w:cstheme="minorHAnsi"/>
+          <w:szCs w:val="22"/>
+          <w:highlight w:val="yellow"/>
+          <w:lang w:val="en-GB"/>
+        </w:rPr>
+        <w:t>Always assign permissions to roles, and then assign roles to users.</w:t>
+      </w:r>
+    </w:p>
+    <w:p>
+      <w:pPr>
+        <w:spacing w:before="240" w:after="240"/>
+        <w:rPr>
+          <w:rFonts w:eastAsia="Aptos" w:cstheme="minorHAnsi"/>
+          <w:szCs w:val="22"/>
+          <w:lang w:val="en-GB"/>
+        </w:rPr>
+      </w:pPr>
+    </w:p>
+    <w:p>
+      <w:pPr>
+        <w:pStyle w:val="Heading1"/>
+        <w:spacing w:before="322" w:after="322"/>
+        <w:rPr>
+          <w:rFonts w:asciiTheme="minorHAnsi" w:hAnsiTheme="minorHAnsi" w:cstheme="minorHAnsi"/>
+          <w:b/>
+          <w:bCs/>
+          <w:color w:val="FF0000"/>
+          <w:sz w:val="32"/>
+          <w:szCs w:val="32"/>
+          <w:u w:val="single"/>
+        </w:rPr>
+      </w:pPr>
+      <w:r>
+        <w:rPr>
+          <w:rFonts w:asciiTheme="minorHAnsi" w:eastAsia="Aptos" w:hAnsiTheme="minorHAnsi" w:cstheme="minorHAnsi"/>
+          <w:b/>
+          <w:bCs/>
+          <w:color w:val="FF0000"/>
+          <w:sz w:val="32"/>
+          <w:szCs w:val="32"/>
+          <w:u w:val="single"/>
+        </w:rPr>
+        <w:lastRenderedPageBreak/>
+        <w:t xml:space="preserve">Eloquent: </w:t>
+      </w:r>
+      <w:proofErr w:type="spellStart"/>
+      <w:proofErr w:type="gramStart"/>
+      <w:r>
+        <w:rPr>
+          <w:rFonts w:asciiTheme="minorHAnsi" w:eastAsia="Aptos" w:hAnsiTheme="minorHAnsi" w:cstheme="minorHAnsi"/>
+          <w:b/>
+          <w:bCs/>
+          <w:color w:val="FF0000"/>
+          <w:sz w:val="32"/>
+          <w:szCs w:val="32"/>
+          <w:u w:val="single"/>
+        </w:rPr>
+        <w:t>firstOrCreate</w:t>
+      </w:r>
+      <w:proofErr w:type="spellEnd"/>
+      <w:r>
+        <w:rPr>
+          <w:rFonts w:asciiTheme="minorHAnsi" w:eastAsia="Aptos" w:hAnsiTheme="minorHAnsi" w:cstheme="minorHAnsi"/>
+          <w:b/>
+          <w:bCs/>
+          <w:color w:val="FF0000"/>
+          <w:sz w:val="32"/>
+          <w:szCs w:val="32"/>
+          <w:u w:val="single"/>
+        </w:rPr>
+        <w:t>(</w:t>
+      </w:r>
+      <w:proofErr w:type="gramEnd"/>
+      <w:r>
+        <w:rPr>
+          <w:rFonts w:asciiTheme="minorHAnsi" w:eastAsia="Aptos" w:hAnsiTheme="minorHAnsi" w:cstheme="minorHAnsi"/>
+          <w:b/>
+          <w:bCs/>
+          <w:color w:val="FF0000"/>
+          <w:sz w:val="32"/>
+          <w:szCs w:val="32"/>
+          <w:u w:val="single"/>
+        </w:rPr>
+        <w:t>) vs. factory()-&gt;create()</w:t>
+      </w:r>
+      <w:r>
+        <w:rPr>
+          <w:rFonts w:asciiTheme="minorHAnsi" w:eastAsia="Aptos" w:hAnsiTheme="minorHAnsi" w:cstheme="minorHAnsi"/>
+          <w:b/>
+          <w:bCs/>
+          <w:color w:val="FF0000"/>
+          <w:sz w:val="32"/>
+          <w:szCs w:val="32"/>
+          <w:u w:val="single"/>
+        </w:rPr>
+        <w:t xml:space="preserve"> :</w:t>
+      </w:r>
       <w:bookmarkStart w:id="0" w:name="_GoBack"/>
       <w:bookmarkEnd w:id="0"/>
+    </w:p>
+    <w:p>
+      <w:pPr>
+        <w:pStyle w:val="Heading3"/>
+        <w:spacing w:before="281" w:after="281"/>
+        <w:rPr>
+          <w:rFonts w:cstheme="minorHAnsi"/>
+          <w:sz w:val="22"/>
+          <w:szCs w:val="22"/>
+        </w:rPr>
+      </w:pPr>
       <w:r>
         <w:rPr>
           <w:rFonts w:eastAsia="Aptos" w:cstheme="minorHAnsi"/>
           <w:b/>
           <w:bCs/>
+          <w:sz w:val="22"/>
+          <w:szCs w:val="22"/>
+        </w:rPr>
+        <w:t xml:space="preserve">1. </w:t>
+      </w:r>
+      <w:proofErr w:type="spellStart"/>
+      <w:proofErr w:type="gramStart"/>
+      <w:r>
+        <w:rPr>
+          <w:rFonts w:eastAsia="Consolas" w:cstheme="minorHAnsi"/>
+          <w:b/>
+          <w:bCs/>
+          <w:sz w:val="22"/>
+          <w:szCs w:val="22"/>
+        </w:rPr>
+        <w:t>firstOrCreate</w:t>
+      </w:r>
+      <w:proofErr w:type="spellEnd"/>
+      <w:r>
+        <w:rPr>
+          <w:rFonts w:eastAsia="Consolas" w:cstheme="minorHAnsi"/>
+          <w:b/>
+          <w:bCs/>
+          <w:sz w:val="22"/>
+          <w:szCs w:val="22"/>
+        </w:rPr>
+        <w:t>()</w:t>
+      </w:r>
+      <w:proofErr w:type="gramEnd"/>
+    </w:p>
+    <w:p>
+      <w:pPr>
+        <w:pStyle w:val="ListParagraph"/>
+        <w:numPr>
+          <w:ilvl w:val="0"/>
+          <w:numId w:val="25"/>
+        </w:numPr>
+        <w:spacing w:after="0" w:line="279" w:lineRule="auto"/>
+        <w:rPr>
+          <w:rFonts w:eastAsia="Aptos" w:cstheme="minorHAnsi"/>
+          <w:szCs w:val="22"/>
+        </w:rPr>
+      </w:pPr>
+      <w:r>
+        <w:rPr>
+          <w:rFonts w:eastAsia="Aptos" w:cstheme="minorHAnsi"/>
+          <w:b/>
+          <w:bCs/>
+          <w:szCs w:val="22"/>
+          <w:lang w:val="en-GB"/>
+        </w:rPr>
+        <w:t>What it does:</w:t>
+      </w:r>
+      <w:r>
+        <w:rPr>
+          <w:rFonts w:eastAsia="Aptos" w:cstheme="minorHAnsi"/>
+          <w:szCs w:val="22"/>
+          <w:lang w:val="en-GB"/>
+        </w:rPr>
+        <w:t xml:space="preserve"> Searches the database for a matching record using the first array. If found, it returns that record. If not found, it inserts a new record using both arrays.</w:t>
+      </w:r>
+    </w:p>
+    <w:p>
+      <w:pPr>
+        <w:pStyle w:val="ListParagraph"/>
+        <w:numPr>
+          <w:ilvl w:val="0"/>
+          <w:numId w:val="25"/>
+        </w:numPr>
+        <w:spacing w:after="0" w:line="279" w:lineRule="auto"/>
+        <w:rPr>
+          <w:rFonts w:eastAsia="Aptos" w:cstheme="minorHAnsi"/>
+          <w:szCs w:val="22"/>
+        </w:rPr>
+      </w:pPr>
+      <w:r>
+        <w:rPr>
+          <w:rFonts w:eastAsia="Aptos" w:cstheme="minorHAnsi"/>
+          <w:b/>
+          <w:bCs/>
+          <w:szCs w:val="22"/>
+          <w:lang w:val="en-GB"/>
+        </w:rPr>
+        <w:t>When to use:</w:t>
+      </w:r>
+      <w:r>
+        <w:rPr>
+          <w:rFonts w:eastAsia="Aptos" w:cstheme="minorHAnsi"/>
+          <w:szCs w:val="22"/>
+          <w:lang w:val="en-GB"/>
+        </w:rPr>
+        <w:t xml:space="preserve"> When you need a </w:t>
+      </w:r>
+      <w:r>
+        <w:rPr>
+          <w:rFonts w:eastAsia="Aptos" w:cstheme="minorHAnsi"/>
+          <w:b/>
+          <w:bCs/>
+          <w:szCs w:val="22"/>
+          <w:lang w:val="en-GB"/>
+        </w:rPr>
+        <w:t>specific, fixed record</w:t>
+      </w:r>
+      <w:r>
+        <w:rPr>
+          <w:rFonts w:eastAsia="Aptos" w:cstheme="minorHAnsi"/>
+          <w:szCs w:val="22"/>
+          <w:lang w:val="en-GB"/>
+        </w:rPr>
+        <w:t xml:space="preserve"> (e.g., seeding a specific Admin user like </w:t>
+      </w:r>
+      <w:hyperlink r:id="rId14">
+        <w:r>
+          <w:rPr>
+            <w:rStyle w:val="Hyperlink"/>
+            <w:rFonts w:cstheme="minorHAnsi"/>
+            <w:szCs w:val="22"/>
+            <w:lang w:val="en-GB"/>
+          </w:rPr>
+          <w:t>admin@exam</w:t>
+        </w:r>
+        <w:r>
+          <w:rPr>
+            <w:rStyle w:val="Hyperlink"/>
+            <w:rFonts w:cstheme="minorHAnsi"/>
+            <w:szCs w:val="22"/>
+            <w:lang w:val="en-GB"/>
+          </w:rPr>
+          <w:t>p</w:t>
+        </w:r>
+        <w:r>
+          <w:rPr>
+            <w:rStyle w:val="Hyperlink"/>
+            <w:rFonts w:cstheme="minorHAnsi"/>
+            <w:szCs w:val="22"/>
+            <w:lang w:val="en-GB"/>
+          </w:rPr>
+          <w:t>le.com</w:t>
+        </w:r>
+      </w:hyperlink>
+      <w:r>
+        <w:rPr>
+          <w:rFonts w:eastAsia="Aptos" w:cstheme="minorHAnsi"/>
+          <w:szCs w:val="22"/>
+          <w:lang w:val="en-GB"/>
+        </w:rPr>
+        <w:t xml:space="preserve">) and want to prevent duplicate key errors if the </w:t>
+      </w:r>
+      <w:proofErr w:type="spellStart"/>
+      <w:r>
+        <w:rPr>
+          <w:rFonts w:eastAsia="Aptos" w:cstheme="minorHAnsi"/>
+          <w:szCs w:val="22"/>
+          <w:lang w:val="en-GB"/>
+        </w:rPr>
+        <w:t>seeder</w:t>
+      </w:r>
+      <w:proofErr w:type="spellEnd"/>
+      <w:r>
+        <w:rPr>
+          <w:rFonts w:eastAsia="Aptos" w:cstheme="minorHAnsi"/>
+          <w:szCs w:val="22"/>
+          <w:lang w:val="en-GB"/>
+        </w:rPr>
+        <w:t xml:space="preserve"> is run multiple times.</w:t>
+      </w:r>
+    </w:p>
+    <w:p>
+      <w:pPr>
+        <w:pStyle w:val="ListParagraph"/>
+        <w:numPr>
+          <w:ilvl w:val="0"/>
+          <w:numId w:val="25"/>
+        </w:numPr>
+        <w:spacing w:after="0" w:line="279" w:lineRule="auto"/>
+        <w:rPr>
+          <w:rFonts w:eastAsia="Aptos" w:cstheme="minorHAnsi"/>
           <w:szCs w:val="22"/>
           <w:highlight w:val="yellow"/>
-          <w:lang w:val="en-GB"/>
-        </w:rPr>
-        <w:t xml:space="preserve">The Golden Rule: </w:t>
-      </w:r>
+        </w:rPr>
+      </w:pPr>
+      <w:r>
+        <w:rPr>
+          <w:highlight w:val="yellow"/>
+        </w:rPr>
+        <w:t xml:space="preserve">It accepts only two arrays; if you provide a third array, it will be completely ignored. Therefore, pass the unique column (such as the email) in the first </w:t>
+      </w:r>
+      <w:proofErr w:type="gramStart"/>
+      <w:r>
+        <w:rPr>
+          <w:highlight w:val="yellow"/>
+        </w:rPr>
+        <w:t>array,</w:t>
+      </w:r>
+      <w:proofErr w:type="gramEnd"/>
+      <w:r>
+        <w:rPr>
+          <w:highlight w:val="yellow"/>
+        </w:rPr>
+        <w:t xml:space="preserve"> and the rest of the data (such as the name and password) in the second array.</w:t>
+      </w:r>
+    </w:p>
+    <w:p>
+      <w:pPr>
+        <w:pStyle w:val="Heading3"/>
+        <w:spacing w:before="281" w:after="281"/>
+        <w:rPr>
+          <w:rFonts w:cstheme="minorHAnsi"/>
+          <w:sz w:val="22"/>
+          <w:szCs w:val="22"/>
+        </w:rPr>
+      </w:pPr>
       <w:r>
         <w:rPr>
           <w:rFonts w:eastAsia="Aptos" w:cstheme="minorHAnsi"/>
-          <w:szCs w:val="22"/>
-          <w:highlight w:val="yellow"/>
-          <w:lang w:val="en-GB"/>
-        </w:rPr>
-        <w:t>Always assign permissions to roles, and then assign roles to users.</w:t>
-      </w:r>
+          <w:b/>
+          <w:bCs/>
+          <w:sz w:val="22"/>
+          <w:szCs w:val="22"/>
+        </w:rPr>
+        <w:t xml:space="preserve">2. </w:t>
+      </w:r>
+      <w:proofErr w:type="gramStart"/>
+      <w:r>
+        <w:rPr>
+          <w:rFonts w:eastAsia="Consolas" w:cstheme="minorHAnsi"/>
+          <w:b/>
+          <w:bCs/>
+          <w:sz w:val="22"/>
+          <w:szCs w:val="22"/>
+        </w:rPr>
+        <w:t>factory(</w:t>
+      </w:r>
+      <w:proofErr w:type="gramEnd"/>
+      <w:r>
+        <w:rPr>
+          <w:rFonts w:eastAsia="Consolas" w:cstheme="minorHAnsi"/>
+          <w:b/>
+          <w:bCs/>
+          <w:sz w:val="22"/>
+          <w:szCs w:val="22"/>
+        </w:rPr>
+        <w:t>)-&gt;create()</w:t>
+      </w:r>
+    </w:p>
+    <w:p>
+      <w:pPr>
+        <w:pStyle w:val="ListParagraph"/>
+        <w:numPr>
+          <w:ilvl w:val="0"/>
+          <w:numId w:val="24"/>
+        </w:numPr>
+        <w:spacing w:after="0" w:line="279" w:lineRule="auto"/>
+        <w:rPr>
+          <w:rFonts w:eastAsia="Aptos" w:cstheme="minorHAnsi"/>
+          <w:szCs w:val="22"/>
+        </w:rPr>
+      </w:pPr>
+      <w:r>
+        <w:rPr>
+          <w:rFonts w:eastAsia="Aptos" w:cstheme="minorHAnsi"/>
+          <w:b/>
+          <w:bCs/>
+          <w:szCs w:val="22"/>
+          <w:lang w:val="en-GB"/>
+        </w:rPr>
+        <w:t>What it does:</w:t>
+      </w:r>
+      <w:r>
+        <w:rPr>
+          <w:rFonts w:eastAsia="Aptos" w:cstheme="minorHAnsi"/>
+          <w:szCs w:val="22"/>
+          <w:lang w:val="en-GB"/>
+        </w:rPr>
+        <w:t xml:space="preserve"> Generates and inserts completely new records utilizing mock data templates (Factories).</w:t>
+      </w:r>
+    </w:p>
+    <w:p>
+      <w:pPr>
+        <w:pStyle w:val="ListParagraph"/>
+        <w:numPr>
+          <w:ilvl w:val="0"/>
+          <w:numId w:val="24"/>
+        </w:numPr>
+        <w:spacing w:after="0" w:line="279" w:lineRule="auto"/>
+        <w:rPr>
+          <w:rFonts w:eastAsia="Aptos" w:cstheme="minorHAnsi"/>
+          <w:szCs w:val="22"/>
+        </w:rPr>
+      </w:pPr>
+      <w:r>
+        <w:rPr>
+          <w:rFonts w:eastAsia="Aptos" w:cstheme="minorHAnsi"/>
+          <w:b/>
+          <w:bCs/>
+          <w:szCs w:val="22"/>
+          <w:lang w:val="en-GB"/>
+        </w:rPr>
+        <w:t>When to use:</w:t>
+      </w:r>
+      <w:r>
+        <w:rPr>
+          <w:rFonts w:eastAsia="Aptos" w:cstheme="minorHAnsi"/>
+          <w:szCs w:val="22"/>
+          <w:lang w:val="en-GB"/>
+        </w:rPr>
+        <w:t xml:space="preserve"> When you need to generate </w:t>
+      </w:r>
+      <w:r>
+        <w:rPr>
+          <w:rFonts w:eastAsia="Aptos" w:cstheme="minorHAnsi"/>
+          <w:b/>
+          <w:bCs/>
+          <w:szCs w:val="22"/>
+          <w:lang w:val="en-GB"/>
+        </w:rPr>
+        <w:t>bulk, randomized test data</w:t>
+      </w:r>
+      <w:r>
+        <w:rPr>
+          <w:rFonts w:eastAsia="Aptos" w:cstheme="minorHAnsi"/>
+          <w:szCs w:val="22"/>
+          <w:lang w:val="en-GB"/>
+        </w:rPr>
+        <w:t xml:space="preserve"> (e.g., creating 20 fake users or 50 fake patients) and do not care if they are recreated as new records on subsequent runs.</w:t>
+      </w:r>
+    </w:p>
+    <w:p>
+      <w:pPr>
+        <w:rPr>
+          <w:rFonts w:cstheme="minorHAnsi"/>
+          <w:szCs w:val="22"/>
+        </w:rPr>
+      </w:pPr>
+    </w:p>
+    <w:p>
+      <w:pPr>
+        <w:spacing w:before="240" w:after="240"/>
+        <w:rPr>
+          <w:rFonts w:eastAsia="Aptos" w:cstheme="minorHAnsi"/>
+          <w:szCs w:val="22"/>
+          <w:lang w:val="en-GB"/>
+        </w:rPr>
+      </w:pPr>
     </w:p>
     <w:p>
       <w:pPr>
@@ -18112,6 +18562,232 @@
     </w:lvl>
   </w:abstractNum>
   <w:abstractNum w:abstractNumId="2">
+    <w:nsid w:val="0E9BBB52"/>
+    <w:multiLevelType w:val="hybridMultilevel"/>
+    <w:tmpl w:val="4BCAE91C"/>
+    <w:lvl w:ilvl="0" w:tplc="55DE8AE8">
+      <w:start w:val="1"/>
+      <w:numFmt w:val="bullet"/>
+      <w:lvlText w:val=""/>
+      <w:lvlJc w:val="left"/>
+      <w:pPr>
+        <w:ind w:left="720" w:hanging="360"/>
+      </w:pPr>
+      <w:rPr>
+        <w:rFonts w:ascii="Symbol" w:hAnsi="Symbol" w:hint="default"/>
+      </w:rPr>
+    </w:lvl>
+    <w:lvl w:ilvl="1" w:tplc="7110D6F4">
+      <w:start w:val="1"/>
+      <w:numFmt w:val="bullet"/>
+      <w:lvlText w:val="o"/>
+      <w:lvlJc w:val="left"/>
+      <w:pPr>
+        <w:ind w:left="1440" w:hanging="360"/>
+      </w:pPr>
+      <w:rPr>
+        <w:rFonts w:ascii="Courier New" w:hAnsi="Courier New" w:hint="default"/>
+      </w:rPr>
+    </w:lvl>
+    <w:lvl w:ilvl="2" w:tplc="DC1CA932">
+      <w:start w:val="1"/>
+      <w:numFmt w:val="bullet"/>
+      <w:lvlText w:val=""/>
+      <w:lvlJc w:val="left"/>
+      <w:pPr>
+        <w:ind w:left="2160" w:hanging="360"/>
+      </w:pPr>
+      <w:rPr>
+        <w:rFonts w:ascii="Wingdings" w:hAnsi="Wingdings" w:hint="default"/>
+      </w:rPr>
+    </w:lvl>
+    <w:lvl w:ilvl="3" w:tplc="7AD4B4A0">
+      <w:start w:val="1"/>
+      <w:numFmt w:val="bullet"/>
+      <w:lvlText w:val=""/>
+      <w:lvlJc w:val="left"/>
+      <w:pPr>
+        <w:ind w:left="2880" w:hanging="360"/>
+      </w:pPr>
+      <w:rPr>
+        <w:rFonts w:ascii="Symbol" w:hAnsi="Symbol" w:hint="default"/>
+      </w:rPr>
+    </w:lvl>
+    <w:lvl w:ilvl="4" w:tplc="E5244F06">
+      <w:start w:val="1"/>
+      <w:numFmt w:val="bullet"/>
+      <w:lvlText w:val="o"/>
+      <w:lvlJc w:val="left"/>
+      <w:pPr>
+        <w:ind w:left="3600" w:hanging="360"/>
+      </w:pPr>
+      <w:rPr>
+        <w:rFonts w:ascii="Courier New" w:hAnsi="Courier New" w:hint="default"/>
+      </w:rPr>
+    </w:lvl>
+    <w:lvl w:ilvl="5" w:tplc="31EEEADC">
+      <w:start w:val="1"/>
+      <w:numFmt w:val="bullet"/>
+      <w:lvlText w:val=""/>
+      <w:lvlJc w:val="left"/>
+      <w:pPr>
+        <w:ind w:left="4320" w:hanging="360"/>
+      </w:pPr>
+      <w:rPr>
+        <w:rFonts w:ascii="Wingdings" w:hAnsi="Wingdings" w:hint="default"/>
+      </w:rPr>
+    </w:lvl>
+    <w:lvl w:ilvl="6" w:tplc="AA143742">
+      <w:start w:val="1"/>
+      <w:numFmt w:val="bullet"/>
+      <w:lvlText w:val=""/>
+      <w:lvlJc w:val="left"/>
+      <w:pPr>
+        <w:ind w:left="5040" w:hanging="360"/>
+      </w:pPr>
+      <w:rPr>
+        <w:rFonts w:ascii="Symbol" w:hAnsi="Symbol" w:hint="default"/>
+      </w:rPr>
+    </w:lvl>
+    <w:lvl w:ilvl="7" w:tplc="7136AF24">
+      <w:start w:val="1"/>
+      <w:numFmt w:val="bullet"/>
+      <w:lvlText w:val="o"/>
+      <w:lvlJc w:val="left"/>
+      <w:pPr>
+        <w:ind w:left="5760" w:hanging="360"/>
+      </w:pPr>
+      <w:rPr>
+        <w:rFonts w:ascii="Courier New" w:hAnsi="Courier New" w:hint="default"/>
+      </w:rPr>
+    </w:lvl>
+    <w:lvl w:ilvl="8" w:tplc="9B909012">
+      <w:start w:val="1"/>
+      <w:numFmt w:val="bullet"/>
+      <w:lvlText w:val=""/>
+      <w:lvlJc w:val="left"/>
+      <w:pPr>
+        <w:ind w:left="6480" w:hanging="360"/>
+      </w:pPr>
+      <w:rPr>
+        <w:rFonts w:ascii="Wingdings" w:hAnsi="Wingdings" w:hint="default"/>
+      </w:rPr>
+    </w:lvl>
+  </w:abstractNum>
+  <w:abstractNum w:abstractNumId="3">
+    <w:nsid w:val="12FBE7F2"/>
+    <w:multiLevelType w:val="hybridMultilevel"/>
+    <w:tmpl w:val="4ACE3492"/>
+    <w:lvl w:ilvl="0" w:tplc="3DCC3CE0">
+      <w:start w:val="1"/>
+      <w:numFmt w:val="bullet"/>
+      <w:lvlText w:val=""/>
+      <w:lvlJc w:val="left"/>
+      <w:pPr>
+        <w:ind w:left="720" w:hanging="360"/>
+      </w:pPr>
+      <w:rPr>
+        <w:rFonts w:ascii="Symbol" w:hAnsi="Symbol" w:hint="default"/>
+      </w:rPr>
+    </w:lvl>
+    <w:lvl w:ilvl="1" w:tplc="C104521A">
+      <w:start w:val="1"/>
+      <w:numFmt w:val="bullet"/>
+      <w:lvlText w:val="o"/>
+      <w:lvlJc w:val="left"/>
+      <w:pPr>
+        <w:ind w:left="1440" w:hanging="360"/>
+      </w:pPr>
+      <w:rPr>
+        <w:rFonts w:ascii="Courier New" w:hAnsi="Courier New" w:hint="default"/>
+      </w:rPr>
+    </w:lvl>
+    <w:lvl w:ilvl="2" w:tplc="3BFCB016">
+      <w:start w:val="1"/>
+      <w:numFmt w:val="bullet"/>
+      <w:lvlText w:val=""/>
+      <w:lvlJc w:val="left"/>
+      <w:pPr>
+        <w:ind w:left="2160" w:hanging="360"/>
+      </w:pPr>
+      <w:rPr>
+        <w:rFonts w:ascii="Wingdings" w:hAnsi="Wingdings" w:hint="default"/>
+      </w:rPr>
+    </w:lvl>
+    <w:lvl w:ilvl="3" w:tplc="BC661348">
+      <w:start w:val="1"/>
+      <w:numFmt w:val="bullet"/>
+      <w:lvlText w:val=""/>
+      <w:lvlJc w:val="left"/>
+      <w:pPr>
+        <w:ind w:left="2880" w:hanging="360"/>
+      </w:pPr>
+      <w:rPr>
+        <w:rFonts w:ascii="Symbol" w:hAnsi="Symbol" w:hint="default"/>
+      </w:rPr>
+    </w:lvl>
+    <w:lvl w:ilvl="4" w:tplc="F498FB62">
+      <w:start w:val="1"/>
+      <w:numFmt w:val="bullet"/>
+      <w:lvlText w:val="o"/>
+      <w:lvlJc w:val="left"/>
+      <w:pPr>
+        <w:ind w:left="3600" w:hanging="360"/>
+      </w:pPr>
+      <w:rPr>
+        <w:rFonts w:ascii="Courier New" w:hAnsi="Courier New" w:hint="default"/>
+      </w:rPr>
+    </w:lvl>
+    <w:lvl w:ilvl="5" w:tplc="6FD2644E">
+      <w:start w:val="1"/>
+      <w:numFmt w:val="bullet"/>
+      <w:lvlText w:val=""/>
+      <w:lvlJc w:val="left"/>
+      <w:pPr>
+        <w:ind w:left="4320" w:hanging="360"/>
+      </w:pPr>
+      <w:rPr>
+        <w:rFonts w:ascii="Wingdings" w:hAnsi="Wingdings" w:hint="default"/>
+      </w:rPr>
+    </w:lvl>
+    <w:lvl w:ilvl="6" w:tplc="68D2AF5E">
+      <w:start w:val="1"/>
+      <w:numFmt w:val="bullet"/>
+      <w:lvlText w:val=""/>
+      <w:lvlJc w:val="left"/>
+      <w:pPr>
+        <w:ind w:left="5040" w:hanging="360"/>
+      </w:pPr>
+      <w:rPr>
+        <w:rFonts w:ascii="Symbol" w:hAnsi="Symbol" w:hint="default"/>
+      </w:rPr>
+    </w:lvl>
+    <w:lvl w:ilvl="7" w:tplc="16A29C2E">
+      <w:start w:val="1"/>
+      <w:numFmt w:val="bullet"/>
+      <w:lvlText w:val="o"/>
+      <w:lvlJc w:val="left"/>
+      <w:pPr>
+        <w:ind w:left="5760" w:hanging="360"/>
+      </w:pPr>
+      <w:rPr>
+        <w:rFonts w:ascii="Courier New" w:hAnsi="Courier New" w:hint="default"/>
+      </w:rPr>
+    </w:lvl>
+    <w:lvl w:ilvl="8" w:tplc="F968A5E2">
+      <w:start w:val="1"/>
+      <w:numFmt w:val="bullet"/>
+      <w:lvlText w:val=""/>
+      <w:lvlJc w:val="left"/>
+      <w:pPr>
+        <w:ind w:left="6480" w:hanging="360"/>
+      </w:pPr>
+      <w:rPr>
+        <w:rFonts w:ascii="Wingdings" w:hAnsi="Wingdings" w:hint="default"/>
+      </w:rPr>
+    </w:lvl>
+  </w:abstractNum>
+  <w:abstractNum w:abstractNumId="4">
     <w:nsid w:val="27883FFB"/>
     <w:multiLevelType w:val="hybridMultilevel"/>
     <w:tmpl w:val="6A0496F4"/>
@@ -18224,7 +18900,7 @@
       </w:rPr>
     </w:lvl>
   </w:abstractNum>
-  <w:abstractNum w:abstractNumId="3">
+  <w:abstractNum w:abstractNumId="5">
     <w:nsid w:val="3E824C74"/>
     <w:multiLevelType w:val="hybridMultilevel"/>
     <w:tmpl w:val="9A52B122"/>
@@ -18337,7 +19013,7 @@
       </w:rPr>
     </w:lvl>
   </w:abstractNum>
-  <w:abstractNum w:abstractNumId="4">
+  <w:abstractNum w:abstractNumId="6">
     <w:nsid w:val="40611D4A"/>
     <w:multiLevelType w:val="hybridMultilevel"/>
     <w:tmpl w:val="A3B4B8CC"/>
@@ -18450,7 +19126,7 @@
       </w:rPr>
     </w:lvl>
   </w:abstractNum>
-  <w:abstractNum w:abstractNumId="5">
+  <w:abstractNum w:abstractNumId="7">
     <w:nsid w:val="43D8995C"/>
     <w:multiLevelType w:val="hybridMultilevel"/>
     <w:tmpl w:val="E1284C72"/>
@@ -18563,7 +19239,7 @@
       </w:rPr>
     </w:lvl>
   </w:abstractNum>
-  <w:abstractNum w:abstractNumId="6">
+  <w:abstractNum w:abstractNumId="8">
     <w:nsid w:val="448F61A1"/>
     <w:multiLevelType w:val="hybridMultilevel"/>
     <w:tmpl w:val="165055AE"/>
@@ -18676,7 +19352,7 @@
       </w:rPr>
     </w:lvl>
   </w:abstractNum>
-  <w:abstractNum w:abstractNumId="7">
+  <w:abstractNum w:abstractNumId="9">
     <w:nsid w:val="45FB5FEE"/>
     <w:multiLevelType w:val="hybridMultilevel"/>
     <w:tmpl w:val="CAA22B96"/>
@@ -18789,7 +19465,7 @@
       </w:rPr>
     </w:lvl>
   </w:abstractNum>
-  <w:abstractNum w:abstractNumId="8">
+  <w:abstractNum w:abstractNumId="10">
     <w:nsid w:val="49B7E5F0"/>
     <w:multiLevelType w:val="hybridMultilevel"/>
     <w:tmpl w:val="3B8860C4"/>
@@ -18902,7 +19578,7 @@
       </w:rPr>
     </w:lvl>
   </w:abstractNum>
-  <w:abstractNum w:abstractNumId="9">
+  <w:abstractNum w:abstractNumId="11">
     <w:nsid w:val="4BA955EF"/>
     <w:multiLevelType w:val="hybridMultilevel"/>
     <w:tmpl w:val="0010B848"/>
@@ -19015,7 +19691,7 @@
       </w:rPr>
     </w:lvl>
   </w:abstractNum>
-  <w:abstractNum w:abstractNumId="10">
+  <w:abstractNum w:abstractNumId="12">
     <w:nsid w:val="515A1F99"/>
     <w:multiLevelType w:val="hybridMultilevel"/>
     <w:tmpl w:val="C242F62E"/>
@@ -19128,7 +19804,7 @@
       </w:rPr>
     </w:lvl>
   </w:abstractNum>
-  <w:abstractNum w:abstractNumId="11">
+  <w:abstractNum w:abstractNumId="13">
     <w:nsid w:val="55F73037"/>
     <w:multiLevelType w:val="hybridMultilevel"/>
     <w:tmpl w:val="C9B47740"/>
@@ -19241,7 +19917,7 @@
       </w:rPr>
     </w:lvl>
   </w:abstractNum>
-  <w:abstractNum w:abstractNumId="12">
+  <w:abstractNum w:abstractNumId="14">
     <w:nsid w:val="5F19EEA1"/>
     <w:multiLevelType w:val="hybridMultilevel"/>
     <w:tmpl w:val="4A064B52"/>
@@ -19354,7 +20030,7 @@
       </w:rPr>
     </w:lvl>
   </w:abstractNum>
-  <w:abstractNum w:abstractNumId="13">
+  <w:abstractNum w:abstractNumId="15">
     <w:nsid w:val="638D4CE5"/>
     <w:multiLevelType w:val="hybridMultilevel"/>
     <w:tmpl w:val="7158DEDA"/>
@@ -19467,7 +20143,7 @@
       </w:rPr>
     </w:lvl>
   </w:abstractNum>
-  <w:abstractNum w:abstractNumId="14">
+  <w:abstractNum w:abstractNumId="16">
     <w:nsid w:val="64C669D5"/>
     <w:multiLevelType w:val="hybridMultilevel"/>
     <w:tmpl w:val="B8564516"/>
@@ -19580,7 +20256,7 @@
       </w:rPr>
     </w:lvl>
   </w:abstractNum>
-  <w:abstractNum w:abstractNumId="15">
+  <w:abstractNum w:abstractNumId="17">
     <w:nsid w:val="6D14B790"/>
     <w:multiLevelType w:val="hybridMultilevel"/>
     <w:tmpl w:val="FEB4F556"/>
@@ -19693,7 +20369,7 @@
       </w:rPr>
     </w:lvl>
   </w:abstractNum>
-  <w:abstractNum w:abstractNumId="16">
+  <w:abstractNum w:abstractNumId="18">
     <w:nsid w:val="6F49F606"/>
     <w:multiLevelType w:val="hybridMultilevel"/>
     <w:tmpl w:val="B0B0C0C4"/>
@@ -19806,7 +20482,7 @@
       </w:rPr>
     </w:lvl>
   </w:abstractNum>
-  <w:abstractNum w:abstractNumId="17">
+  <w:abstractNum w:abstractNumId="19">
     <w:nsid w:val="70E94C29"/>
     <w:multiLevelType w:val="hybridMultilevel"/>
     <w:tmpl w:val="226E4AC6"/>
@@ -19919,7 +20595,7 @@
       </w:rPr>
     </w:lvl>
   </w:abstractNum>
-  <w:abstractNum w:abstractNumId="18">
+  <w:abstractNum w:abstractNumId="20">
     <w:nsid w:val="7553C419"/>
     <w:multiLevelType w:val="hybridMultilevel"/>
     <w:tmpl w:val="FB742A26"/>
@@ -20032,7 +20708,7 @@
       </w:rPr>
     </w:lvl>
   </w:abstractNum>
-  <w:abstractNum w:abstractNumId="19">
+  <w:abstractNum w:abstractNumId="21">
     <w:nsid w:val="75822CC5"/>
     <w:multiLevelType w:val="hybridMultilevel"/>
     <w:tmpl w:val="AFFE5774"/>
@@ -20145,7 +20821,7 @@
       </w:rPr>
     </w:lvl>
   </w:abstractNum>
-  <w:abstractNum w:abstractNumId="20">
+  <w:abstractNum w:abstractNumId="22">
     <w:nsid w:val="76B420E5"/>
     <w:multiLevelType w:val="hybridMultilevel"/>
     <w:tmpl w:val="386CE270"/>
@@ -20258,7 +20934,7 @@
       </w:rPr>
     </w:lvl>
   </w:abstractNum>
-  <w:abstractNum w:abstractNumId="21">
+  <w:abstractNum w:abstractNumId="23">
     <w:nsid w:val="7936C793"/>
     <w:multiLevelType w:val="hybridMultilevel"/>
     <w:tmpl w:val="DA88566E"/>
@@ -20371,7 +21047,7 @@
       </w:rPr>
     </w:lvl>
   </w:abstractNum>
-  <w:abstractNum w:abstractNumId="22">
+  <w:abstractNum w:abstractNumId="24">
     <w:nsid w:val="7D241509"/>
     <w:multiLevelType w:val="hybridMultilevel"/>
     <w:tmpl w:val="55FE704A"/>
@@ -20485,73 +21161,79 @@
     </w:lvl>
   </w:abstractNum>
   <w:num w:numId="1">
+    <w:abstractNumId w:val="24"/>
+  </w:num>
+  <w:num w:numId="2">
+    <w:abstractNumId w:val="5"/>
+  </w:num>
+  <w:num w:numId="3">
+    <w:abstractNumId w:val="13"/>
+  </w:num>
+  <w:num w:numId="4">
+    <w:abstractNumId w:val="8"/>
+  </w:num>
+  <w:num w:numId="5">
+    <w:abstractNumId w:val="11"/>
+  </w:num>
+  <w:num w:numId="6">
+    <w:abstractNumId w:val="4"/>
+  </w:num>
+  <w:num w:numId="7">
+    <w:abstractNumId w:val="9"/>
+  </w:num>
+  <w:num w:numId="8">
     <w:abstractNumId w:val="22"/>
   </w:num>
-  <w:num w:numId="2">
-    <w:abstractNumId w:val="3"/>
-  </w:num>
-  <w:num w:numId="3">
-    <w:abstractNumId w:val="11"/>
-  </w:num>
-  <w:num w:numId="4">
-    <w:abstractNumId w:val="6"/>
-  </w:num>
-  <w:num w:numId="5">
-    <w:abstractNumId w:val="9"/>
-  </w:num>
-  <w:num w:numId="6">
-    <w:abstractNumId w:val="2"/>
-  </w:num>
-  <w:num w:numId="7">
-    <w:abstractNumId w:val="7"/>
-  </w:num>
-  <w:num w:numId="8">
-    <w:abstractNumId w:val="20"/>
-  </w:num>
   <w:num w:numId="9">
-    <w:abstractNumId w:val="16"/>
+    <w:abstractNumId w:val="18"/>
   </w:num>
   <w:num w:numId="10">
-    <w:abstractNumId w:val="15"/>
+    <w:abstractNumId w:val="17"/>
   </w:num>
   <w:num w:numId="11">
     <w:abstractNumId w:val="0"/>
   </w:num>
   <w:num w:numId="12">
-    <w:abstractNumId w:val="18"/>
+    <w:abstractNumId w:val="20"/>
   </w:num>
   <w:num w:numId="13">
-    <w:abstractNumId w:val="5"/>
+    <w:abstractNumId w:val="7"/>
   </w:num>
   <w:num w:numId="14">
-    <w:abstractNumId w:val="10"/>
+    <w:abstractNumId w:val="12"/>
   </w:num>
   <w:num w:numId="15">
-    <w:abstractNumId w:val="12"/>
+    <w:abstractNumId w:val="14"/>
   </w:num>
   <w:num w:numId="16">
-    <w:abstractNumId w:val="19"/>
+    <w:abstractNumId w:val="21"/>
   </w:num>
   <w:num w:numId="17">
-    <w:abstractNumId w:val="14"/>
+    <w:abstractNumId w:val="16"/>
   </w:num>
   <w:num w:numId="18">
-    <w:abstractNumId w:val="17"/>
+    <w:abstractNumId w:val="19"/>
   </w:num>
   <w:num w:numId="19">
     <w:abstractNumId w:val="1"/>
   </w:num>
   <w:num w:numId="20">
-    <w:abstractNumId w:val="21"/>
+    <w:abstractNumId w:val="23"/>
   </w:num>
   <w:num w:numId="21">
-    <w:abstractNumId w:val="8"/>
+    <w:abstractNumId w:val="10"/>
   </w:num>
   <w:num w:numId="22">
-    <w:abstractNumId w:val="13"/>
+    <w:abstractNumId w:val="15"/>
   </w:num>
   <w:num w:numId="23">
-    <w:abstractNumId w:val="4"/>
+    <w:abstractNumId w:val="6"/>
+  </w:num>
+  <w:num w:numId="24">
+    <w:abstractNumId w:val="3"/>
+  </w:num>
+  <w:num w:numId="25">
+    <w:abstractNumId w:val="2"/>
   </w:num>
 </w:numbering>
 </file>
@@ -20972,6 +21654,18 @@
       <w:lang w:eastAsia="en-IN"/>
     </w:rPr>
   </w:style>
+  <w:style w:type="character" w:styleId="FollowedHyperlink">
+    <w:name w:val="FollowedHyperlink"/>
+    <w:basedOn w:val="DefaultParagraphFont"/>
+    <w:uiPriority w:val="99"/>
+    <w:semiHidden/>
+    <w:unhideWhenUsed/>
+    <w:rsid w:val="00E8640E"/>
+    <w:rPr>
+      <w:color w:val="800080" w:themeColor="followedHyperlink"/>
+      <w:u w:val="single"/>
+    </w:rPr>
+  </w:style>
 </w:styles>
 </file>
 
@@ -21391,6 +22085,18 @@
       <w:lang w:eastAsia="en-IN"/>
     </w:rPr>
   </w:style>
+  <w:style w:type="character" w:styleId="FollowedHyperlink">
+    <w:name w:val="FollowedHyperlink"/>
+    <w:basedOn w:val="DefaultParagraphFont"/>
+    <w:uiPriority w:val="99"/>
+    <w:semiHidden/>
+    <w:unhideWhenUsed/>
+    <w:rsid w:val="00E8640E"/>
+    <w:rPr>
+      <w:color w:val="800080" w:themeColor="followedHyperlink"/>
+      <w:u w:val="single"/>
+    </w:rPr>
+  </w:style>
 </w:styles>
 </file>
 

</xml_diff>

<commit_message>
Update Filament notes:Clearing stuck caches
</commit_message>
<xml_diff>
--- a/Filament/filament notes.docx
+++ b/Filament/filament notes.docx
@@ -17915,8 +17915,6 @@
         </w:rPr>
         <w:t xml:space="preserve"> :</w:t>
       </w:r>
-      <w:bookmarkStart w:id="0" w:name="_GoBack"/>
-      <w:bookmarkEnd w:id="0"/>
     </w:p>
     <w:p>
       <w:pPr>
@@ -18052,25 +18050,7 @@
             <w:szCs w:val="22"/>
             <w:lang w:val="en-GB"/>
           </w:rPr>
-          <w:t>admin@exam</w:t>
-        </w:r>
-        <w:r>
-          <w:rPr>
-            <w:rStyle w:val="Hyperlink"/>
-            <w:rFonts w:cstheme="minorHAnsi"/>
-            <w:szCs w:val="22"/>
-            <w:lang w:val="en-GB"/>
-          </w:rPr>
-          <w:t>p</w:t>
-        </w:r>
-        <w:r>
-          <w:rPr>
-            <w:rStyle w:val="Hyperlink"/>
-            <w:rFonts w:cstheme="minorHAnsi"/>
-            <w:szCs w:val="22"/>
-            <w:lang w:val="en-GB"/>
-          </w:rPr>
-          <w:t>le.com</w:t>
+          <w:t>admin@example.com</w:t>
         </w:r>
       </w:hyperlink>
       <w:r>
@@ -18262,21 +18242,53 @@
     </w:p>
     <w:p>
       <w:pPr>
-        <w:rPr>
-          <w:rFonts w:cstheme="minorHAnsi"/>
-          <w:szCs w:val="22"/>
-        </w:rPr>
-      </w:pPr>
-    </w:p>
-    <w:p>
-      <w:pPr>
+        <w:spacing w:after="0" w:line="279" w:lineRule="auto"/>
+        <w:rPr>
+          <w:rFonts w:eastAsia="Aptos" w:cstheme="minorHAnsi"/>
+          <w:szCs w:val="22"/>
+        </w:rPr>
+      </w:pPr>
+    </w:p>
+    <w:p>
+      <w:pPr>
+        <w:tabs>
+          <w:tab w:val="left" w:pos="2173"/>
+        </w:tabs>
         <w:spacing w:before="240" w:after="240"/>
         <w:rPr>
           <w:rFonts w:eastAsia="Aptos" w:cstheme="minorHAnsi"/>
-          <w:szCs w:val="22"/>
-          <w:lang w:val="en-GB"/>
-        </w:rPr>
-      </w:pPr>
+          <w:b/>
+          <w:bCs/>
+          <w:color w:val="FF0000"/>
+          <w:szCs w:val="22"/>
+          <w:u w:val="single"/>
+          <w:lang w:val="en-GB"/>
+        </w:rPr>
+      </w:pPr>
+      <w:r>
+        <w:rPr>
+          <w:rFonts w:eastAsia="Aptos" w:cstheme="minorHAnsi"/>
+          <w:b/>
+          <w:bCs/>
+          <w:color w:val="FF0000"/>
+          <w:szCs w:val="22"/>
+          <w:u w:val="single"/>
+          <w:lang w:val="en-GB"/>
+        </w:rPr>
+        <w:t>For Clearing Stuck Caches (Development)</w:t>
+      </w:r>
+      <w:r>
+        <w:rPr>
+          <w:rFonts w:eastAsia="Aptos" w:cstheme="minorHAnsi"/>
+          <w:b/>
+          <w:bCs/>
+          <w:color w:val="FF0000"/>
+          <w:szCs w:val="22"/>
+          <w:u w:val="single"/>
+          <w:lang w:val="en-GB"/>
+        </w:rPr>
+        <w:t>:</w:t>
+      </w:r>
     </w:p>
     <w:p>
       <w:pPr>
@@ -18287,6 +18299,50 @@
           <w:lang w:val="en-GB"/>
         </w:rPr>
       </w:pPr>
+      <w:r>
+        <w:rPr>
+          <w:rFonts w:eastAsia="Aptos" w:cstheme="minorHAnsi"/>
+          <w:szCs w:val="22"/>
+          <w:lang w:val="en-GB"/>
+        </w:rPr>
+        <w:t xml:space="preserve">If you are local and things are acting </w:t>
+      </w:r>
+      <w:proofErr w:type="spellStart"/>
+      <w:r>
+        <w:rPr>
+          <w:rFonts w:eastAsia="Aptos" w:cstheme="minorHAnsi"/>
+          <w:szCs w:val="22"/>
+          <w:lang w:val="en-GB"/>
+        </w:rPr>
+        <w:t>glitchy</w:t>
+      </w:r>
+      <w:proofErr w:type="spellEnd"/>
+      <w:r>
+        <w:rPr>
+          <w:rFonts w:eastAsia="Aptos" w:cstheme="minorHAnsi"/>
+          <w:szCs w:val="22"/>
+          <w:lang w:val="en-GB"/>
+        </w:rPr>
+        <w:t xml:space="preserve">, </w:t>
+      </w:r>
+      <w:r>
+        <w:rPr>
+          <w:rFonts w:eastAsia="Aptos" w:cstheme="minorHAnsi"/>
+          <w:b/>
+          <w:bCs/>
+          <w:szCs w:val="22"/>
+          <w:lang w:val="en-GB"/>
+        </w:rPr>
+        <w:t>clear only the specific cache you need</w:t>
+      </w:r>
+      <w:r>
+        <w:rPr>
+          <w:rFonts w:eastAsia="Aptos" w:cstheme="minorHAnsi"/>
+          <w:szCs w:val="22"/>
+          <w:lang w:val="en-GB"/>
+        </w:rPr>
+        <w:t>, or use the native all-in-one clear command:</w:t>
+      </w:r>
     </w:p>
     <w:p>
       <w:pPr>
@@ -18297,6 +18353,108 @@
           <w:lang w:val="en-GB"/>
         </w:rPr>
       </w:pPr>
+      <w:proofErr w:type="spellStart"/>
+      <w:proofErr w:type="gramStart"/>
+      <w:r>
+        <w:rPr>
+          <w:rFonts w:eastAsia="Aptos" w:cstheme="minorHAnsi"/>
+          <w:b/>
+          <w:bCs/>
+          <w:color w:val="548DD4" w:themeColor="text2" w:themeTint="99"/>
+          <w:szCs w:val="22"/>
+          <w:lang w:val="en-GB"/>
+        </w:rPr>
+        <w:t>php</w:t>
+      </w:r>
+      <w:proofErr w:type="spellEnd"/>
+      <w:proofErr w:type="gramEnd"/>
+      <w:r>
+        <w:rPr>
+          <w:rFonts w:eastAsia="Aptos" w:cstheme="minorHAnsi"/>
+          <w:b/>
+          <w:bCs/>
+          <w:color w:val="548DD4" w:themeColor="text2" w:themeTint="99"/>
+          <w:szCs w:val="22"/>
+          <w:lang w:val="en-GB"/>
+        </w:rPr>
+        <w:t xml:space="preserve"> artisan </w:t>
+      </w:r>
+      <w:proofErr w:type="spellStart"/>
+      <w:r>
+        <w:rPr>
+          <w:rFonts w:eastAsia="Aptos" w:cstheme="minorHAnsi"/>
+          <w:b/>
+          <w:bCs/>
+          <w:color w:val="548DD4" w:themeColor="text2" w:themeTint="99"/>
+          <w:szCs w:val="22"/>
+          <w:lang w:val="en-GB"/>
+        </w:rPr>
+        <w:t>optimize:clear</w:t>
+      </w:r>
+      <w:proofErr w:type="spellEnd"/>
+      <w:r>
+        <w:rPr>
+          <w:rFonts w:eastAsia="Aptos" w:cstheme="minorHAnsi"/>
+          <w:b/>
+          <w:bCs/>
+          <w:color w:val="548DD4" w:themeColor="text2" w:themeTint="99"/>
+          <w:szCs w:val="22"/>
+          <w:lang w:val="en-GB"/>
+        </w:rPr>
+        <w:t xml:space="preserve"> </w:t>
+      </w:r>
+      <w:r>
+        <w:rPr>
+          <w:rFonts w:eastAsia="Aptos" w:cstheme="minorHAnsi"/>
+          <w:szCs w:val="22"/>
+          <w:lang w:val="en-GB"/>
+        </w:rPr>
+        <w:t>-</w:t>
+      </w:r>
+      <w:r>
+        <w:rPr>
+          <w:rFonts w:eastAsia="Aptos" w:cstheme="minorHAnsi"/>
+          <w:szCs w:val="22"/>
+          <w:lang w:val="en-GB"/>
+        </w:rPr>
+        <w:t xml:space="preserve"> Safely purges the framework's internal caches (compiled code, </w:t>
+      </w:r>
+      <w:proofErr w:type="spellStart"/>
+      <w:r>
+        <w:rPr>
+          <w:rFonts w:eastAsia="Aptos" w:cstheme="minorHAnsi"/>
+          <w:szCs w:val="22"/>
+          <w:lang w:val="en-GB"/>
+        </w:rPr>
+        <w:t>config</w:t>
+      </w:r>
+      <w:proofErr w:type="spellEnd"/>
+      <w:r>
+        <w:rPr>
+          <w:rFonts w:eastAsia="Aptos" w:cstheme="minorHAnsi"/>
+          <w:szCs w:val="22"/>
+          <w:lang w:val="en-GB"/>
+        </w:rPr>
+        <w:t xml:space="preserve">, route, view) </w:t>
+      </w:r>
+      <w:r>
+        <w:rPr>
+          <w:rFonts w:eastAsia="Aptos" w:cstheme="minorHAnsi"/>
+          <w:b/>
+          <w:bCs/>
+          <w:szCs w:val="22"/>
+          <w:lang w:val="en-GB"/>
+        </w:rPr>
+        <w:t>without touching your database or deleting runtime user sessions</w:t>
+      </w:r>
+      <w:r>
+        <w:rPr>
+          <w:rFonts w:eastAsia="Aptos" w:cstheme="minorHAnsi"/>
+          <w:szCs w:val="22"/>
+          <w:lang w:val="en-GB"/>
+        </w:rPr>
+        <w:t>.</w:t>
+      </w:r>
     </w:p>
     <w:p>
       <w:pPr>
@@ -18306,6 +18464,8 @@
           <w:szCs w:val="22"/>
         </w:rPr>
       </w:pPr>
+      <w:bookmarkStart w:id="0" w:name="_GoBack"/>
+      <w:bookmarkEnd w:id="0"/>
     </w:p>
     <w:p>
       <w:pPr>

</xml_diff>

<commit_message>
Update Filament notes:Implementing Themes in FilamentPHP
</commit_message>
<xml_diff>
--- a/Filament/filament notes.docx
+++ b/Filament/filament notes.docx
@@ -18460,12 +18460,1851 @@
       <w:pPr>
         <w:spacing w:before="240" w:after="240"/>
         <w:rPr>
-          <w:rFonts w:cstheme="minorHAnsi"/>
-          <w:szCs w:val="22"/>
-        </w:rPr>
-      </w:pPr>
+          <w:rFonts w:eastAsia="Aptos" w:cstheme="minorHAnsi"/>
+          <w:szCs w:val="22"/>
+          <w:lang w:val="en-GB"/>
+        </w:rPr>
+      </w:pPr>
+    </w:p>
+    <w:p>
+      <w:pPr>
+        <w:spacing w:before="240" w:after="240"/>
+        <w:rPr>
+          <w:rFonts w:eastAsia="Aptos" w:cstheme="minorHAnsi"/>
+          <w:b/>
+          <w:bCs/>
+          <w:color w:val="FF0000"/>
+          <w:sz w:val="32"/>
+          <w:szCs w:val="32"/>
+          <w:u w:val="single"/>
+          <w:lang w:val="en-GB"/>
+        </w:rPr>
+      </w:pPr>
+      <w:r>
+        <w:rPr>
+          <w:rFonts w:eastAsia="Aptos" w:cstheme="minorHAnsi"/>
+          <w:b/>
+          <w:bCs/>
+          <w:color w:val="FF0000"/>
+          <w:sz w:val="32"/>
+          <w:szCs w:val="32"/>
+          <w:u w:val="single"/>
+          <w:lang w:val="en-GB"/>
+        </w:rPr>
+        <w:t xml:space="preserve">Implementing Themes in </w:t>
+      </w:r>
+      <w:proofErr w:type="spellStart"/>
+      <w:r>
+        <w:rPr>
+          <w:rFonts w:eastAsia="Aptos" w:cstheme="minorHAnsi"/>
+          <w:b/>
+          <w:bCs/>
+          <w:color w:val="FF0000"/>
+          <w:sz w:val="32"/>
+          <w:szCs w:val="32"/>
+          <w:u w:val="single"/>
+          <w:lang w:val="en-GB"/>
+        </w:rPr>
+        <w:t>Filamentphp</w:t>
+      </w:r>
+      <w:proofErr w:type="spellEnd"/>
+      <w:r>
+        <w:rPr>
+          <w:rFonts w:eastAsia="Aptos" w:cstheme="minorHAnsi"/>
+          <w:b/>
+          <w:bCs/>
+          <w:color w:val="FF0000"/>
+          <w:sz w:val="32"/>
+          <w:szCs w:val="32"/>
+          <w:u w:val="single"/>
+          <w:lang w:val="en-GB"/>
+        </w:rPr>
+        <w:t>:</w:t>
+      </w:r>
+    </w:p>
+    <w:p>
+      <w:pPr>
+        <w:spacing w:before="240" w:after="240"/>
+        <w:rPr>
+          <w:rFonts w:cstheme="minorHAnsi"/>
+          <w:szCs w:val="22"/>
+        </w:rPr>
+      </w:pPr>
+      <w:r>
+        <w:rPr>
+          <w:rFonts w:eastAsia="Aptos" w:cstheme="minorHAnsi"/>
+          <w:szCs w:val="22"/>
+          <w:lang w:val="en-GB"/>
+        </w:rPr>
+        <w:t>Implementing themes in Filame</w:t>
+      </w:r>
       <w:bookmarkStart w:id="0" w:name="_GoBack"/>
       <w:bookmarkEnd w:id="0"/>
+      <w:r>
+        <w:rPr>
+          <w:rFonts w:eastAsia="Aptos" w:cstheme="minorHAnsi"/>
+          <w:szCs w:val="22"/>
+          <w:lang w:val="en-GB"/>
+        </w:rPr>
+        <w:t>nt v4 can be done in two ways, depending on how much customization you need:</w:t>
+      </w:r>
+    </w:p>
+    <w:p>
+      <w:pPr>
+        <w:rPr>
+          <w:rFonts w:cstheme="minorHAnsi"/>
+          <w:szCs w:val="22"/>
+        </w:rPr>
+      </w:pPr>
+    </w:p>
+    <w:p>
+      <w:pPr>
+        <w:pStyle w:val="Heading3"/>
+        <w:spacing w:before="281" w:after="281"/>
+        <w:rPr>
+          <w:rFonts w:cstheme="minorHAnsi"/>
+          <w:sz w:val="22"/>
+          <w:szCs w:val="22"/>
+        </w:rPr>
+      </w:pPr>
+      <w:r>
+        <w:rPr>
+          <w:rFonts w:eastAsia="Aptos" w:cstheme="minorHAnsi"/>
+          <w:b/>
+          <w:bCs/>
+          <w:sz w:val="22"/>
+          <w:szCs w:val="22"/>
+        </w:rPr>
+        <w:t xml:space="preserve">Method 1: The Simple Way (Changing </w:t>
+      </w:r>
+      <w:proofErr w:type="spellStart"/>
+      <w:r>
+        <w:rPr>
+          <w:rFonts w:eastAsia="Aptos" w:cstheme="minorHAnsi"/>
+          <w:b/>
+          <w:bCs/>
+          <w:sz w:val="22"/>
+          <w:szCs w:val="22"/>
+        </w:rPr>
+        <w:t>Colors</w:t>
+      </w:r>
+      <w:proofErr w:type="spellEnd"/>
+      <w:r>
+        <w:rPr>
+          <w:rFonts w:eastAsia="Aptos" w:cstheme="minorHAnsi"/>
+          <w:b/>
+          <w:bCs/>
+          <w:sz w:val="22"/>
+          <w:szCs w:val="22"/>
+        </w:rPr>
+        <w:t xml:space="preserve"> and Fonts)</w:t>
+      </w:r>
+    </w:p>
+    <w:p>
+      <w:pPr>
+        <w:spacing w:before="240" w:after="240"/>
+        <w:rPr>
+          <w:rFonts w:cstheme="minorHAnsi"/>
+          <w:szCs w:val="22"/>
+        </w:rPr>
+      </w:pPr>
+      <w:r>
+        <w:rPr>
+          <w:rFonts w:eastAsia="Aptos" w:cstheme="minorHAnsi"/>
+          <w:szCs w:val="22"/>
+          <w:lang w:val="en-GB"/>
+        </w:rPr>
+        <w:t xml:space="preserve">If you only want to change the primary </w:t>
+      </w:r>
+      <w:proofErr w:type="spellStart"/>
+      <w:r>
+        <w:rPr>
+          <w:rFonts w:eastAsia="Aptos" w:cstheme="minorHAnsi"/>
+          <w:szCs w:val="22"/>
+          <w:lang w:val="en-GB"/>
+        </w:rPr>
+        <w:t>colors</w:t>
+      </w:r>
+      <w:proofErr w:type="spellEnd"/>
+      <w:r>
+        <w:rPr>
+          <w:rFonts w:eastAsia="Aptos" w:cstheme="minorHAnsi"/>
+          <w:szCs w:val="22"/>
+          <w:lang w:val="en-GB"/>
+        </w:rPr>
+        <w:t xml:space="preserve">, state </w:t>
+      </w:r>
+      <w:proofErr w:type="spellStart"/>
+      <w:r>
+        <w:rPr>
+          <w:rFonts w:eastAsia="Aptos" w:cstheme="minorHAnsi"/>
+          <w:szCs w:val="22"/>
+          <w:lang w:val="en-GB"/>
+        </w:rPr>
+        <w:t>colors</w:t>
+      </w:r>
+      <w:proofErr w:type="spellEnd"/>
+      <w:r>
+        <w:rPr>
+          <w:rFonts w:eastAsia="Aptos" w:cstheme="minorHAnsi"/>
+          <w:szCs w:val="22"/>
+          <w:lang w:val="en-GB"/>
+        </w:rPr>
+        <w:t xml:space="preserve"> (success, danger, info, etc.), and the font, you can do this directly in your Panel Provider without generating any theme files or compiling CSS.</w:t>
+      </w:r>
+    </w:p>
+    <w:p>
+      <w:pPr>
+        <w:spacing w:before="240" w:after="240"/>
+        <w:rPr>
+          <w:rFonts w:cstheme="minorHAnsi"/>
+          <w:szCs w:val="22"/>
+        </w:rPr>
+      </w:pPr>
+      <w:r>
+        <w:rPr>
+          <w:rFonts w:eastAsia="Aptos" w:cstheme="minorHAnsi"/>
+          <w:szCs w:val="22"/>
+          <w:lang w:val="en-GB"/>
+        </w:rPr>
+        <w:t xml:space="preserve">Open your </w:t>
+      </w:r>
+      <w:proofErr w:type="spellStart"/>
+      <w:r>
+        <w:rPr>
+          <w:rFonts w:eastAsia="Aptos" w:cstheme="minorHAnsi"/>
+          <w:szCs w:val="22"/>
+          <w:lang w:val="en-GB"/>
+        </w:rPr>
+        <w:t>AdminPanelProvider.php</w:t>
+      </w:r>
+      <w:proofErr w:type="spellEnd"/>
+      <w:r>
+        <w:rPr>
+          <w:rFonts w:eastAsia="Aptos" w:cstheme="minorHAnsi"/>
+          <w:szCs w:val="22"/>
+          <w:lang w:val="en-GB"/>
+        </w:rPr>
+        <w:t xml:space="preserve"> and adjust the </w:t>
+      </w:r>
+      <w:proofErr w:type="spellStart"/>
+      <w:r>
+        <w:rPr>
+          <w:rFonts w:eastAsia="Consolas" w:cstheme="minorHAnsi"/>
+          <w:szCs w:val="22"/>
+          <w:lang w:val="en-GB"/>
+        </w:rPr>
+        <w:t>colors</w:t>
+      </w:r>
+      <w:proofErr w:type="spellEnd"/>
+      <w:r>
+        <w:rPr>
+          <w:rFonts w:eastAsia="Aptos" w:cstheme="minorHAnsi"/>
+          <w:szCs w:val="22"/>
+          <w:lang w:val="en-GB"/>
+        </w:rPr>
+        <w:t xml:space="preserve"> array and specify the </w:t>
+      </w:r>
+      <w:r>
+        <w:rPr>
+          <w:rFonts w:eastAsia="Consolas" w:cstheme="minorHAnsi"/>
+          <w:szCs w:val="22"/>
+          <w:lang w:val="en-GB"/>
+        </w:rPr>
+        <w:t>font</w:t>
+      </w:r>
+      <w:r>
+        <w:rPr>
+          <w:rFonts w:eastAsia="Aptos" w:cstheme="minorHAnsi"/>
+          <w:szCs w:val="22"/>
+          <w:lang w:val="en-GB"/>
+        </w:rPr>
+        <w:t>:</w:t>
+      </w:r>
+    </w:p>
+    <w:p>
+      <w:pPr>
+        <w:rPr>
+          <w:rFonts w:cstheme="minorHAnsi"/>
+          <w:szCs w:val="22"/>
+        </w:rPr>
+      </w:pPr>
+      <w:r>
+        <w:rPr>
+          <w:rFonts w:eastAsia="Consolas" w:cstheme="minorHAnsi"/>
+          <w:szCs w:val="22"/>
+          <w:lang w:val="en-GB"/>
+        </w:rPr>
+        <w:lastRenderedPageBreak/>
+        <w:t>use Filament\Support\</w:t>
+      </w:r>
+      <w:proofErr w:type="spellStart"/>
+      <w:r>
+        <w:rPr>
+          <w:rFonts w:eastAsia="Consolas" w:cstheme="minorHAnsi"/>
+          <w:szCs w:val="22"/>
+          <w:lang w:val="en-GB"/>
+        </w:rPr>
+        <w:t>Colors</w:t>
+      </w:r>
+      <w:proofErr w:type="spellEnd"/>
+      <w:r>
+        <w:rPr>
+          <w:rFonts w:eastAsia="Consolas" w:cstheme="minorHAnsi"/>
+          <w:szCs w:val="22"/>
+          <w:lang w:val="en-GB"/>
+        </w:rPr>
+        <w:t>\</w:t>
+      </w:r>
+      <w:proofErr w:type="spellStart"/>
+      <w:r>
+        <w:rPr>
+          <w:rFonts w:eastAsia="Consolas" w:cstheme="minorHAnsi"/>
+          <w:szCs w:val="22"/>
+          <w:lang w:val="en-GB"/>
+        </w:rPr>
+        <w:t>Color</w:t>
+      </w:r>
+      <w:proofErr w:type="spellEnd"/>
+      <w:r>
+        <w:rPr>
+          <w:rFonts w:eastAsia="Consolas" w:cstheme="minorHAnsi"/>
+          <w:szCs w:val="22"/>
+          <w:lang w:val="en-GB"/>
+        </w:rPr>
+        <w:t>;</w:t>
+      </w:r>
+      <w:r>
+        <w:rPr>
+          <w:rFonts w:cstheme="minorHAnsi"/>
+          <w:szCs w:val="22"/>
+        </w:rPr>
+        <w:br/>
+      </w:r>
+      <w:r>
+        <w:rPr>
+          <w:rFonts w:cstheme="minorHAnsi"/>
+          <w:szCs w:val="22"/>
+        </w:rPr>
+        <w:br/>
+      </w:r>
+      <w:r>
+        <w:rPr>
+          <w:rFonts w:eastAsia="Consolas" w:cstheme="minorHAnsi"/>
+          <w:szCs w:val="22"/>
+          <w:lang w:val="en-GB"/>
+        </w:rPr>
+        <w:t>public function panel(Panel $panel): Panel</w:t>
+      </w:r>
+      <w:r>
+        <w:rPr>
+          <w:rFonts w:cstheme="minorHAnsi"/>
+          <w:szCs w:val="22"/>
+        </w:rPr>
+        <w:br/>
+      </w:r>
+      <w:r>
+        <w:rPr>
+          <w:rFonts w:eastAsia="Consolas" w:cstheme="minorHAnsi"/>
+          <w:szCs w:val="22"/>
+          <w:lang w:val="en-GB"/>
+        </w:rPr>
+        <w:t>{</w:t>
+      </w:r>
+      <w:r>
+        <w:rPr>
+          <w:rFonts w:cstheme="minorHAnsi"/>
+          <w:szCs w:val="22"/>
+        </w:rPr>
+        <w:br/>
+      </w:r>
+      <w:r>
+        <w:rPr>
+          <w:rFonts w:eastAsia="Consolas" w:cstheme="minorHAnsi"/>
+          <w:szCs w:val="22"/>
+          <w:lang w:val="en-GB"/>
+        </w:rPr>
+        <w:t xml:space="preserve">    return $panel</w:t>
+      </w:r>
+      <w:r>
+        <w:rPr>
+          <w:rFonts w:cstheme="minorHAnsi"/>
+          <w:szCs w:val="22"/>
+        </w:rPr>
+        <w:br/>
+      </w:r>
+      <w:r>
+        <w:rPr>
+          <w:rFonts w:eastAsia="Consolas" w:cstheme="minorHAnsi"/>
+          <w:szCs w:val="22"/>
+          <w:lang w:val="en-GB"/>
+        </w:rPr>
+        <w:t xml:space="preserve">        // ...</w:t>
+      </w:r>
+      <w:r>
+        <w:rPr>
+          <w:rFonts w:cstheme="minorHAnsi"/>
+          <w:szCs w:val="22"/>
+        </w:rPr>
+        <w:br/>
+      </w:r>
+      <w:r>
+        <w:rPr>
+          <w:rFonts w:eastAsia="Consolas" w:cstheme="minorHAnsi"/>
+          <w:szCs w:val="22"/>
+          <w:lang w:val="en-GB"/>
+        </w:rPr>
+        <w:t xml:space="preserve">        -&gt;font('Inter') // Load any Google Font by its name (e.g., 'Inter', 'Outfit', 'Poppins')</w:t>
+      </w:r>
+      <w:r>
+        <w:rPr>
+          <w:rFonts w:cstheme="minorHAnsi"/>
+          <w:szCs w:val="22"/>
+        </w:rPr>
+        <w:br/>
+      </w:r>
+      <w:r>
+        <w:rPr>
+          <w:rFonts w:eastAsia="Consolas" w:cstheme="minorHAnsi"/>
+          <w:szCs w:val="22"/>
+          <w:lang w:val="en-GB"/>
+        </w:rPr>
+        <w:t xml:space="preserve">        -&gt;</w:t>
+      </w:r>
+      <w:proofErr w:type="spellStart"/>
+      <w:r>
+        <w:rPr>
+          <w:rFonts w:eastAsia="Consolas" w:cstheme="minorHAnsi"/>
+          <w:szCs w:val="22"/>
+          <w:lang w:val="en-GB"/>
+        </w:rPr>
+        <w:t>colors</w:t>
+      </w:r>
+      <w:proofErr w:type="spellEnd"/>
+      <w:r>
+        <w:rPr>
+          <w:rFonts w:eastAsia="Consolas" w:cstheme="minorHAnsi"/>
+          <w:szCs w:val="22"/>
+          <w:lang w:val="en-GB"/>
+        </w:rPr>
+        <w:t>([</w:t>
+      </w:r>
+      <w:r>
+        <w:rPr>
+          <w:rFonts w:cstheme="minorHAnsi"/>
+          <w:szCs w:val="22"/>
+        </w:rPr>
+        <w:br/>
+      </w:r>
+      <w:r>
+        <w:rPr>
+          <w:rFonts w:eastAsia="Consolas" w:cstheme="minorHAnsi"/>
+          <w:szCs w:val="22"/>
+          <w:lang w:val="en-GB"/>
+        </w:rPr>
+        <w:t xml:space="preserve">            'primary' =&gt; </w:t>
+      </w:r>
+      <w:proofErr w:type="spellStart"/>
+      <w:r>
+        <w:rPr>
+          <w:rFonts w:eastAsia="Consolas" w:cstheme="minorHAnsi"/>
+          <w:szCs w:val="22"/>
+          <w:lang w:val="en-GB"/>
+        </w:rPr>
+        <w:t>Color</w:t>
+      </w:r>
+      <w:proofErr w:type="spellEnd"/>
+      <w:r>
+        <w:rPr>
+          <w:rFonts w:eastAsia="Consolas" w:cstheme="minorHAnsi"/>
+          <w:szCs w:val="22"/>
+          <w:lang w:val="en-GB"/>
+        </w:rPr>
+        <w:t xml:space="preserve">::Amber,     // Main theme </w:t>
+      </w:r>
+      <w:proofErr w:type="spellStart"/>
+      <w:r>
+        <w:rPr>
+          <w:rFonts w:eastAsia="Consolas" w:cstheme="minorHAnsi"/>
+          <w:szCs w:val="22"/>
+          <w:lang w:val="en-GB"/>
+        </w:rPr>
+        <w:t>color</w:t>
+      </w:r>
+      <w:proofErr w:type="spellEnd"/>
+      <w:r>
+        <w:rPr>
+          <w:rFonts w:eastAsia="Consolas" w:cstheme="minorHAnsi"/>
+          <w:szCs w:val="22"/>
+          <w:lang w:val="en-GB"/>
+        </w:rPr>
+        <w:t xml:space="preserve"> (buttons, active tabs, etc.)</w:t>
+      </w:r>
+      <w:r>
+        <w:rPr>
+          <w:rFonts w:cstheme="minorHAnsi"/>
+          <w:szCs w:val="22"/>
+        </w:rPr>
+        <w:br/>
+      </w:r>
+      <w:r>
+        <w:rPr>
+          <w:rFonts w:eastAsia="Consolas" w:cstheme="minorHAnsi"/>
+          <w:szCs w:val="22"/>
+          <w:lang w:val="en-GB"/>
+        </w:rPr>
+        <w:t xml:space="preserve">            'danger' =&gt; </w:t>
+      </w:r>
+      <w:proofErr w:type="spellStart"/>
+      <w:r>
+        <w:rPr>
+          <w:rFonts w:eastAsia="Consolas" w:cstheme="minorHAnsi"/>
+          <w:szCs w:val="22"/>
+          <w:lang w:val="en-GB"/>
+        </w:rPr>
+        <w:t>Color</w:t>
+      </w:r>
+      <w:proofErr w:type="spellEnd"/>
+      <w:r>
+        <w:rPr>
+          <w:rFonts w:eastAsia="Consolas" w:cstheme="minorHAnsi"/>
+          <w:szCs w:val="22"/>
+          <w:lang w:val="en-GB"/>
+        </w:rPr>
+        <w:t>::Rose,       // Destructive actions</w:t>
+      </w:r>
+      <w:r>
+        <w:rPr>
+          <w:rFonts w:cstheme="minorHAnsi"/>
+          <w:szCs w:val="22"/>
+        </w:rPr>
+        <w:br/>
+      </w:r>
+      <w:r>
+        <w:rPr>
+          <w:rFonts w:eastAsia="Consolas" w:cstheme="minorHAnsi"/>
+          <w:szCs w:val="22"/>
+          <w:lang w:val="en-GB"/>
+        </w:rPr>
+        <w:t xml:space="preserve">            '</w:t>
+      </w:r>
+      <w:proofErr w:type="spellStart"/>
+      <w:r>
+        <w:rPr>
+          <w:rFonts w:eastAsia="Consolas" w:cstheme="minorHAnsi"/>
+          <w:szCs w:val="22"/>
+          <w:lang w:val="en-GB"/>
+        </w:rPr>
+        <w:t>gray</w:t>
+      </w:r>
+      <w:proofErr w:type="spellEnd"/>
+      <w:r>
+        <w:rPr>
+          <w:rFonts w:eastAsia="Consolas" w:cstheme="minorHAnsi"/>
+          <w:szCs w:val="22"/>
+          <w:lang w:val="en-GB"/>
+        </w:rPr>
+        <w:t xml:space="preserve">' =&gt; </w:t>
+      </w:r>
+      <w:proofErr w:type="spellStart"/>
+      <w:r>
+        <w:rPr>
+          <w:rFonts w:eastAsia="Consolas" w:cstheme="minorHAnsi"/>
+          <w:szCs w:val="22"/>
+          <w:lang w:val="en-GB"/>
+        </w:rPr>
+        <w:t>Color</w:t>
+      </w:r>
+      <w:proofErr w:type="spellEnd"/>
+      <w:r>
+        <w:rPr>
+          <w:rFonts w:eastAsia="Consolas" w:cstheme="minorHAnsi"/>
+          <w:szCs w:val="22"/>
+          <w:lang w:val="en-GB"/>
+        </w:rPr>
+        <w:t>::</w:t>
+      </w:r>
+      <w:proofErr w:type="spellStart"/>
+      <w:r>
+        <w:rPr>
+          <w:rFonts w:eastAsia="Consolas" w:cstheme="minorHAnsi"/>
+          <w:szCs w:val="22"/>
+          <w:lang w:val="en-GB"/>
+        </w:rPr>
+        <w:t>Gray</w:t>
+      </w:r>
+      <w:proofErr w:type="spellEnd"/>
+      <w:r>
+        <w:rPr>
+          <w:rFonts w:eastAsia="Consolas" w:cstheme="minorHAnsi"/>
+          <w:szCs w:val="22"/>
+          <w:lang w:val="en-GB"/>
+        </w:rPr>
+        <w:t xml:space="preserve">,         // Backgrounds and </w:t>
+      </w:r>
+      <w:proofErr w:type="spellStart"/>
+      <w:r>
+        <w:rPr>
+          <w:rFonts w:eastAsia="Consolas" w:cstheme="minorHAnsi"/>
+          <w:szCs w:val="22"/>
+          <w:lang w:val="en-GB"/>
+        </w:rPr>
+        <w:t>gray</w:t>
+      </w:r>
+      <w:proofErr w:type="spellEnd"/>
+      <w:r>
+        <w:rPr>
+          <w:rFonts w:eastAsia="Consolas" w:cstheme="minorHAnsi"/>
+          <w:szCs w:val="22"/>
+          <w:lang w:val="en-GB"/>
+        </w:rPr>
+        <w:t xml:space="preserve"> texts</w:t>
+      </w:r>
+      <w:r>
+        <w:rPr>
+          <w:rFonts w:cstheme="minorHAnsi"/>
+          <w:szCs w:val="22"/>
+        </w:rPr>
+        <w:br/>
+      </w:r>
+      <w:r>
+        <w:rPr>
+          <w:rFonts w:eastAsia="Consolas" w:cstheme="minorHAnsi"/>
+          <w:szCs w:val="22"/>
+          <w:lang w:val="en-GB"/>
+        </w:rPr>
+        <w:t xml:space="preserve">            'info' =&gt; </w:t>
+      </w:r>
+      <w:proofErr w:type="spellStart"/>
+      <w:r>
+        <w:rPr>
+          <w:rFonts w:eastAsia="Consolas" w:cstheme="minorHAnsi"/>
+          <w:szCs w:val="22"/>
+          <w:lang w:val="en-GB"/>
+        </w:rPr>
+        <w:t>Color</w:t>
+      </w:r>
+      <w:proofErr w:type="spellEnd"/>
+      <w:r>
+        <w:rPr>
+          <w:rFonts w:eastAsia="Consolas" w:cstheme="minorHAnsi"/>
+          <w:szCs w:val="22"/>
+          <w:lang w:val="en-GB"/>
+        </w:rPr>
+        <w:t>::Blue,         // Informational alerts</w:t>
+      </w:r>
+      <w:r>
+        <w:rPr>
+          <w:rFonts w:cstheme="minorHAnsi"/>
+          <w:szCs w:val="22"/>
+        </w:rPr>
+        <w:br/>
+      </w:r>
+      <w:r>
+        <w:rPr>
+          <w:rFonts w:eastAsia="Consolas" w:cstheme="minorHAnsi"/>
+          <w:szCs w:val="22"/>
+          <w:lang w:val="en-GB"/>
+        </w:rPr>
+        <w:t xml:space="preserve">            'success' =&gt; </w:t>
+      </w:r>
+      <w:proofErr w:type="spellStart"/>
+      <w:r>
+        <w:rPr>
+          <w:rFonts w:eastAsia="Consolas" w:cstheme="minorHAnsi"/>
+          <w:szCs w:val="22"/>
+          <w:lang w:val="en-GB"/>
+        </w:rPr>
+        <w:t>Color</w:t>
+      </w:r>
+      <w:proofErr w:type="spellEnd"/>
+      <w:r>
+        <w:rPr>
+          <w:rFonts w:eastAsia="Consolas" w:cstheme="minorHAnsi"/>
+          <w:szCs w:val="22"/>
+          <w:lang w:val="en-GB"/>
+        </w:rPr>
+        <w:t>::Emerald,   // Success states</w:t>
+      </w:r>
+      <w:r>
+        <w:rPr>
+          <w:rFonts w:cstheme="minorHAnsi"/>
+          <w:szCs w:val="22"/>
+        </w:rPr>
+        <w:br/>
+      </w:r>
+      <w:r>
+        <w:rPr>
+          <w:rFonts w:eastAsia="Consolas" w:cstheme="minorHAnsi"/>
+          <w:szCs w:val="22"/>
+          <w:lang w:val="en-GB"/>
+        </w:rPr>
+        <w:t xml:space="preserve">            'warning' =&gt; </w:t>
+      </w:r>
+      <w:proofErr w:type="spellStart"/>
+      <w:r>
+        <w:rPr>
+          <w:rFonts w:eastAsia="Consolas" w:cstheme="minorHAnsi"/>
+          <w:szCs w:val="22"/>
+          <w:lang w:val="en-GB"/>
+        </w:rPr>
+        <w:t>Color</w:t>
+      </w:r>
+      <w:proofErr w:type="spellEnd"/>
+      <w:r>
+        <w:rPr>
+          <w:rFonts w:eastAsia="Consolas" w:cstheme="minorHAnsi"/>
+          <w:szCs w:val="22"/>
+          <w:lang w:val="en-GB"/>
+        </w:rPr>
+        <w:t>::Orange,    // Warning messages</w:t>
+      </w:r>
+      <w:r>
+        <w:rPr>
+          <w:rFonts w:cstheme="minorHAnsi"/>
+          <w:szCs w:val="22"/>
+        </w:rPr>
+        <w:br/>
+      </w:r>
+      <w:r>
+        <w:rPr>
+          <w:rFonts w:eastAsia="Consolas" w:cstheme="minorHAnsi"/>
+          <w:szCs w:val="22"/>
+          <w:lang w:val="en-GB"/>
+        </w:rPr>
+        <w:t xml:space="preserve">        ]);</w:t>
+      </w:r>
+      <w:r>
+        <w:rPr>
+          <w:rFonts w:cstheme="minorHAnsi"/>
+          <w:szCs w:val="22"/>
+        </w:rPr>
+        <w:br/>
+      </w:r>
+      <w:r>
+        <w:rPr>
+          <w:rFonts w:eastAsia="Consolas" w:cstheme="minorHAnsi"/>
+          <w:szCs w:val="22"/>
+          <w:lang w:val="en-GB"/>
+        </w:rPr>
+        <w:t>}</w:t>
+      </w:r>
+      <w:r>
+        <w:rPr>
+          <w:rFonts w:cstheme="minorHAnsi"/>
+          <w:szCs w:val="22"/>
+        </w:rPr>
+        <w:br/>
+      </w:r>
+      <w:r>
+        <w:rPr>
+          <w:rFonts w:eastAsia="Aptos" w:cstheme="minorHAnsi"/>
+          <w:szCs w:val="22"/>
+          <w:lang w:val="en-GB"/>
+        </w:rPr>
+        <w:t xml:space="preserve"> </w:t>
+      </w:r>
+    </w:p>
+    <w:p>
+      <w:pPr>
+        <w:rPr>
+          <w:rFonts w:cstheme="minorHAnsi"/>
+          <w:szCs w:val="22"/>
+        </w:rPr>
+      </w:pPr>
+    </w:p>
+    <w:p>
+      <w:pPr>
+        <w:pStyle w:val="Heading3"/>
+        <w:spacing w:before="281" w:after="281"/>
+        <w:rPr>
+          <w:rFonts w:cstheme="minorHAnsi"/>
+          <w:sz w:val="22"/>
+          <w:szCs w:val="22"/>
+        </w:rPr>
+      </w:pPr>
+      <w:r>
+        <w:rPr>
+          <w:rFonts w:eastAsia="Aptos" w:cstheme="minorHAnsi"/>
+          <w:b/>
+          <w:bCs/>
+          <w:sz w:val="22"/>
+          <w:szCs w:val="22"/>
+        </w:rPr>
+        <w:t>Method 2: The Advanced Way (Creating a Custom Tailwind/CSS Theme)</w:t>
+      </w:r>
+    </w:p>
+    <w:p>
+      <w:pPr>
+        <w:spacing w:before="240" w:after="240"/>
+        <w:rPr>
+          <w:rFonts w:cstheme="minorHAnsi"/>
+          <w:szCs w:val="22"/>
+        </w:rPr>
+      </w:pPr>
+      <w:r>
+        <w:rPr>
+          <w:rFonts w:eastAsia="Aptos" w:cstheme="minorHAnsi"/>
+          <w:szCs w:val="22"/>
+          <w:lang w:val="en-GB"/>
+        </w:rPr>
+        <w:t>If you want to completely override Filament’s default styles, customize components using custom Tailwind classes, or write raw CSS, you should create a custom theme.</w:t>
+      </w:r>
+    </w:p>
+    <w:p>
+      <w:pPr>
+        <w:pStyle w:val="Heading4"/>
+        <w:spacing w:before="319" w:after="319"/>
+        <w:rPr>
+          <w:rFonts w:asciiTheme="minorHAnsi" w:hAnsiTheme="minorHAnsi" w:cstheme="minorHAnsi"/>
+          <w:szCs w:val="22"/>
+        </w:rPr>
+      </w:pPr>
+      <w:r>
+        <w:rPr>
+          <w:rFonts w:asciiTheme="minorHAnsi" w:eastAsia="Aptos" w:hAnsiTheme="minorHAnsi" w:cstheme="minorHAnsi"/>
+          <w:szCs w:val="22"/>
+          <w:lang w:val="en-GB"/>
+        </w:rPr>
+        <w:t>Step 1: Generate the Theme Files</w:t>
+      </w:r>
+    </w:p>
+    <w:p>
+      <w:pPr>
+        <w:spacing w:before="240" w:after="240"/>
+        <w:rPr>
+          <w:rFonts w:cstheme="minorHAnsi"/>
+          <w:szCs w:val="22"/>
+        </w:rPr>
+      </w:pPr>
+      <w:r>
+        <w:rPr>
+          <w:rFonts w:eastAsia="Aptos" w:cstheme="minorHAnsi"/>
+          <w:szCs w:val="22"/>
+          <w:lang w:val="en-GB"/>
+        </w:rPr>
+        <w:t>Run this Artisan command in your terminal:</w:t>
+      </w:r>
+    </w:p>
+    <w:p>
+      <w:pPr>
+        <w:rPr>
+          <w:rFonts w:cstheme="minorHAnsi"/>
+          <w:szCs w:val="22"/>
+        </w:rPr>
+      </w:pPr>
+      <w:proofErr w:type="spellStart"/>
+      <w:proofErr w:type="gramStart"/>
+      <w:r>
+        <w:rPr>
+          <w:rFonts w:eastAsia="Consolas" w:cstheme="minorHAnsi"/>
+          <w:szCs w:val="22"/>
+          <w:lang w:val="en-GB"/>
+        </w:rPr>
+        <w:t>php</w:t>
+      </w:r>
+      <w:proofErr w:type="spellEnd"/>
+      <w:proofErr w:type="gramEnd"/>
+      <w:r>
+        <w:rPr>
+          <w:rFonts w:eastAsia="Consolas" w:cstheme="minorHAnsi"/>
+          <w:szCs w:val="22"/>
+          <w:lang w:val="en-GB"/>
+        </w:rPr>
+        <w:t xml:space="preserve"> artisan </w:t>
+      </w:r>
+      <w:proofErr w:type="spellStart"/>
+      <w:r>
+        <w:rPr>
+          <w:rFonts w:eastAsia="Consolas" w:cstheme="minorHAnsi"/>
+          <w:szCs w:val="22"/>
+          <w:lang w:val="en-GB"/>
+        </w:rPr>
+        <w:t>make:filament-theme</w:t>
+      </w:r>
+      <w:proofErr w:type="spellEnd"/>
+      <w:r>
+        <w:rPr>
+          <w:rFonts w:cstheme="minorHAnsi"/>
+          <w:szCs w:val="22"/>
+        </w:rPr>
+        <w:br/>
+      </w:r>
+      <w:r>
+        <w:rPr>
+          <w:rFonts w:eastAsia="Aptos" w:cstheme="minorHAnsi"/>
+          <w:szCs w:val="22"/>
+          <w:lang w:val="en-GB"/>
+        </w:rPr>
+        <w:t xml:space="preserve"> </w:t>
+      </w:r>
+    </w:p>
+    <w:p>
+      <w:pPr>
+        <w:spacing w:before="240" w:after="240"/>
+        <w:rPr>
+          <w:rFonts w:cstheme="minorHAnsi"/>
+          <w:szCs w:val="22"/>
+        </w:rPr>
+      </w:pPr>
+      <w:r>
+        <w:rPr>
+          <w:rFonts w:eastAsia="Aptos" w:cstheme="minorHAnsi"/>
+          <w:i/>
+          <w:iCs/>
+          <w:szCs w:val="22"/>
+          <w:lang w:val="en-GB"/>
+        </w:rPr>
+        <w:t xml:space="preserve">It will ask you a few questions (e.g., which panel it's for, and whether you are using </w:t>
+      </w:r>
+      <w:proofErr w:type="spellStart"/>
+      <w:r>
+        <w:rPr>
+          <w:rFonts w:eastAsia="Aptos" w:cstheme="minorHAnsi"/>
+          <w:i/>
+          <w:iCs/>
+          <w:szCs w:val="22"/>
+          <w:lang w:val="en-GB"/>
+        </w:rPr>
+        <w:t>Vite</w:t>
+      </w:r>
+      <w:proofErr w:type="spellEnd"/>
+      <w:r>
+        <w:rPr>
+          <w:rFonts w:eastAsia="Aptos" w:cstheme="minorHAnsi"/>
+          <w:i/>
+          <w:iCs/>
+          <w:szCs w:val="22"/>
+          <w:lang w:val="en-GB"/>
+        </w:rPr>
+        <w:t>). Follow the prompts.</w:t>
+      </w:r>
+      <w:r>
+        <w:rPr>
+          <w:rFonts w:eastAsia="Aptos" w:cstheme="minorHAnsi"/>
+          <w:szCs w:val="22"/>
+          <w:lang w:val="en-GB"/>
+        </w:rPr>
+        <w:t xml:space="preserve"> This command will create:</w:t>
+      </w:r>
+    </w:p>
+    <w:p>
+      <w:pPr>
+        <w:pStyle w:val="ListParagraph"/>
+        <w:numPr>
+          <w:ilvl w:val="0"/>
+          <w:numId w:val="26"/>
+        </w:numPr>
+        <w:spacing w:after="0" w:line="279" w:lineRule="auto"/>
+        <w:rPr>
+          <w:rFonts w:eastAsia="Aptos" w:cstheme="minorHAnsi"/>
+          <w:szCs w:val="22"/>
+        </w:rPr>
+      </w:pPr>
+      <w:proofErr w:type="gramStart"/>
+      <w:r>
+        <w:rPr>
+          <w:rFonts w:eastAsia="Aptos" w:cstheme="minorHAnsi"/>
+          <w:szCs w:val="22"/>
+          <w:lang w:val="en-GB"/>
+        </w:rPr>
+        <w:t>A configuration file</w:t>
+      </w:r>
+      <w:proofErr w:type="gramEnd"/>
+      <w:r>
+        <w:rPr>
+          <w:rFonts w:eastAsia="Aptos" w:cstheme="minorHAnsi"/>
+          <w:szCs w:val="22"/>
+          <w:lang w:val="en-GB"/>
+        </w:rPr>
+        <w:t xml:space="preserve"> (usually </w:t>
+      </w:r>
+      <w:r>
+        <w:rPr>
+          <w:rFonts w:eastAsia="Consolas" w:cstheme="minorHAnsi"/>
+          <w:szCs w:val="22"/>
+          <w:lang w:val="en-GB"/>
+        </w:rPr>
+        <w:t>tailwind.config.js</w:t>
+      </w:r>
+      <w:r>
+        <w:rPr>
+          <w:rFonts w:eastAsia="Aptos" w:cstheme="minorHAnsi"/>
+          <w:szCs w:val="22"/>
+          <w:lang w:val="en-GB"/>
+        </w:rPr>
+        <w:t xml:space="preserve"> or updates to it).</w:t>
+      </w:r>
+    </w:p>
+    <w:p>
+      <w:pPr>
+        <w:pStyle w:val="ListParagraph"/>
+        <w:numPr>
+          <w:ilvl w:val="0"/>
+          <w:numId w:val="26"/>
+        </w:numPr>
+        <w:spacing w:after="0" w:line="279" w:lineRule="auto"/>
+        <w:rPr>
+          <w:rFonts w:eastAsia="Aptos" w:cstheme="minorHAnsi"/>
+          <w:szCs w:val="22"/>
+        </w:rPr>
+      </w:pPr>
+      <w:r>
+        <w:rPr>
+          <w:rFonts w:eastAsia="Aptos" w:cstheme="minorHAnsi"/>
+          <w:szCs w:val="22"/>
+          <w:lang w:val="en-GB"/>
+        </w:rPr>
+        <w:t xml:space="preserve">A theme CSS file located at </w:t>
+      </w:r>
+      <w:r>
+        <w:rPr>
+          <w:rFonts w:eastAsia="Consolas" w:cstheme="minorHAnsi"/>
+          <w:szCs w:val="22"/>
+          <w:lang w:val="en-GB"/>
+        </w:rPr>
+        <w:t>resources/</w:t>
+      </w:r>
+      <w:proofErr w:type="spellStart"/>
+      <w:r>
+        <w:rPr>
+          <w:rFonts w:eastAsia="Consolas" w:cstheme="minorHAnsi"/>
+          <w:szCs w:val="22"/>
+          <w:lang w:val="en-GB"/>
+        </w:rPr>
+        <w:t>css</w:t>
+      </w:r>
+      <w:proofErr w:type="spellEnd"/>
+      <w:r>
+        <w:rPr>
+          <w:rFonts w:eastAsia="Consolas" w:cstheme="minorHAnsi"/>
+          <w:szCs w:val="22"/>
+          <w:lang w:val="en-GB"/>
+        </w:rPr>
+        <w:t>/filament/admin/theme.css</w:t>
+      </w:r>
+      <w:r>
+        <w:rPr>
+          <w:rFonts w:eastAsia="Aptos" w:cstheme="minorHAnsi"/>
+          <w:szCs w:val="22"/>
+          <w:lang w:val="en-GB"/>
+        </w:rPr>
+        <w:t>.</w:t>
+      </w:r>
+    </w:p>
+    <w:p>
+      <w:pPr>
+        <w:pStyle w:val="Heading4"/>
+        <w:spacing w:before="319" w:after="319"/>
+        <w:rPr>
+          <w:rFonts w:asciiTheme="minorHAnsi" w:hAnsiTheme="minorHAnsi" w:cstheme="minorHAnsi"/>
+          <w:szCs w:val="22"/>
+        </w:rPr>
+      </w:pPr>
+      <w:r>
+        <w:rPr>
+          <w:rFonts w:asciiTheme="minorHAnsi" w:eastAsia="Aptos" w:hAnsiTheme="minorHAnsi" w:cstheme="minorHAnsi"/>
+          <w:szCs w:val="22"/>
+          <w:lang w:val="en-GB"/>
+        </w:rPr>
+        <w:t xml:space="preserve">Step 2: Register the Theme file in </w:t>
+      </w:r>
+      <w:proofErr w:type="spellStart"/>
+      <w:r>
+        <w:rPr>
+          <w:rFonts w:asciiTheme="minorHAnsi" w:eastAsia="Aptos" w:hAnsiTheme="minorHAnsi" w:cstheme="minorHAnsi"/>
+          <w:szCs w:val="22"/>
+          <w:lang w:val="en-GB"/>
+        </w:rPr>
+        <w:t>Vite</w:t>
+      </w:r>
+      <w:proofErr w:type="spellEnd"/>
+    </w:p>
+    <w:p>
+      <w:pPr>
+        <w:spacing w:before="240" w:after="240"/>
+        <w:rPr>
+          <w:rFonts w:cstheme="minorHAnsi"/>
+          <w:szCs w:val="22"/>
+        </w:rPr>
+      </w:pPr>
+      <w:r>
+        <w:rPr>
+          <w:rFonts w:eastAsia="Aptos" w:cstheme="minorHAnsi"/>
+          <w:szCs w:val="22"/>
+          <w:lang w:val="en-GB"/>
+        </w:rPr>
+        <w:t xml:space="preserve">Open your </w:t>
+      </w:r>
+      <w:r>
+        <w:rPr>
+          <w:rFonts w:eastAsia="Consolas" w:cstheme="minorHAnsi"/>
+          <w:szCs w:val="22"/>
+          <w:lang w:val="en-GB"/>
+        </w:rPr>
+        <w:t>vite.config.js</w:t>
+      </w:r>
+      <w:r>
+        <w:rPr>
+          <w:rFonts w:eastAsia="Aptos" w:cstheme="minorHAnsi"/>
+          <w:szCs w:val="22"/>
+          <w:lang w:val="en-GB"/>
+        </w:rPr>
+        <w:t xml:space="preserve"> file and add the path to the newly generated </w:t>
+      </w:r>
+      <w:r>
+        <w:rPr>
+          <w:rFonts w:eastAsia="Consolas" w:cstheme="minorHAnsi"/>
+          <w:szCs w:val="22"/>
+          <w:lang w:val="en-GB"/>
+        </w:rPr>
+        <w:t>theme.css</w:t>
+      </w:r>
+      <w:r>
+        <w:rPr>
+          <w:rFonts w:eastAsia="Aptos" w:cstheme="minorHAnsi"/>
+          <w:szCs w:val="22"/>
+          <w:lang w:val="en-GB"/>
+        </w:rPr>
+        <w:t xml:space="preserve"> under the </w:t>
+      </w:r>
+      <w:r>
+        <w:rPr>
+          <w:rFonts w:eastAsia="Consolas" w:cstheme="minorHAnsi"/>
+          <w:szCs w:val="22"/>
+          <w:lang w:val="en-GB"/>
+        </w:rPr>
+        <w:t>input</w:t>
+      </w:r>
+      <w:r>
+        <w:rPr>
+          <w:rFonts w:eastAsia="Aptos" w:cstheme="minorHAnsi"/>
+          <w:szCs w:val="22"/>
+          <w:lang w:val="en-GB"/>
+        </w:rPr>
+        <w:t xml:space="preserve"> array:</w:t>
+      </w:r>
+    </w:p>
+    <w:p>
+      <w:pPr>
+        <w:rPr>
+          <w:rFonts w:cstheme="minorHAnsi"/>
+          <w:szCs w:val="22"/>
+        </w:rPr>
+      </w:pPr>
+      <w:r>
+        <w:rPr>
+          <w:rFonts w:eastAsia="Consolas" w:cstheme="minorHAnsi"/>
+          <w:szCs w:val="22"/>
+          <w:lang w:val="en-GB"/>
+        </w:rPr>
+        <w:t>// vite.config.js</w:t>
+      </w:r>
+      <w:r>
+        <w:rPr>
+          <w:rFonts w:cstheme="minorHAnsi"/>
+          <w:szCs w:val="22"/>
+        </w:rPr>
+        <w:br/>
+      </w:r>
+      <w:r>
+        <w:rPr>
+          <w:rFonts w:eastAsia="Consolas" w:cstheme="minorHAnsi"/>
+          <w:szCs w:val="22"/>
+          <w:lang w:val="en-GB"/>
+        </w:rPr>
+        <w:t xml:space="preserve">export default </w:t>
+      </w:r>
+      <w:proofErr w:type="spellStart"/>
+      <w:proofErr w:type="gramStart"/>
+      <w:r>
+        <w:rPr>
+          <w:rFonts w:eastAsia="Consolas" w:cstheme="minorHAnsi"/>
+          <w:szCs w:val="22"/>
+          <w:lang w:val="en-GB"/>
+        </w:rPr>
+        <w:t>defineConfig</w:t>
+      </w:r>
+      <w:proofErr w:type="spellEnd"/>
+      <w:r>
+        <w:rPr>
+          <w:rFonts w:eastAsia="Consolas" w:cstheme="minorHAnsi"/>
+          <w:szCs w:val="22"/>
+          <w:lang w:val="en-GB"/>
+        </w:rPr>
+        <w:t>(</w:t>
+      </w:r>
+      <w:proofErr w:type="gramEnd"/>
+      <w:r>
+        <w:rPr>
+          <w:rFonts w:eastAsia="Consolas" w:cstheme="minorHAnsi"/>
+          <w:szCs w:val="22"/>
+          <w:lang w:val="en-GB"/>
+        </w:rPr>
+        <w:t>{</w:t>
+      </w:r>
+      <w:r>
+        <w:rPr>
+          <w:rFonts w:cstheme="minorHAnsi"/>
+          <w:szCs w:val="22"/>
+        </w:rPr>
+        <w:br/>
+      </w:r>
+      <w:r>
+        <w:rPr>
+          <w:rFonts w:eastAsia="Consolas" w:cstheme="minorHAnsi"/>
+          <w:szCs w:val="22"/>
+          <w:lang w:val="en-GB"/>
+        </w:rPr>
+        <w:t xml:space="preserve">    plugins: [</w:t>
+      </w:r>
+      <w:r>
+        <w:rPr>
+          <w:rFonts w:cstheme="minorHAnsi"/>
+          <w:szCs w:val="22"/>
+        </w:rPr>
+        <w:br/>
+      </w:r>
+      <w:r>
+        <w:rPr>
+          <w:rFonts w:eastAsia="Consolas" w:cstheme="minorHAnsi"/>
+          <w:szCs w:val="22"/>
+          <w:lang w:val="en-GB"/>
+        </w:rPr>
+        <w:lastRenderedPageBreak/>
+        <w:t xml:space="preserve">        </w:t>
+      </w:r>
+      <w:proofErr w:type="spellStart"/>
+      <w:r>
+        <w:rPr>
+          <w:rFonts w:eastAsia="Consolas" w:cstheme="minorHAnsi"/>
+          <w:szCs w:val="22"/>
+          <w:lang w:val="en-GB"/>
+        </w:rPr>
+        <w:t>laravel</w:t>
+      </w:r>
+      <w:proofErr w:type="spellEnd"/>
+      <w:r>
+        <w:rPr>
+          <w:rFonts w:eastAsia="Consolas" w:cstheme="minorHAnsi"/>
+          <w:szCs w:val="22"/>
+          <w:lang w:val="en-GB"/>
+        </w:rPr>
+        <w:t>({</w:t>
+      </w:r>
+      <w:r>
+        <w:rPr>
+          <w:rFonts w:cstheme="minorHAnsi"/>
+          <w:szCs w:val="22"/>
+        </w:rPr>
+        <w:br/>
+      </w:r>
+      <w:r>
+        <w:rPr>
+          <w:rFonts w:eastAsia="Consolas" w:cstheme="minorHAnsi"/>
+          <w:szCs w:val="22"/>
+          <w:lang w:val="en-GB"/>
+        </w:rPr>
+        <w:t xml:space="preserve">            input: [</w:t>
+      </w:r>
+      <w:r>
+        <w:rPr>
+          <w:rFonts w:cstheme="minorHAnsi"/>
+          <w:szCs w:val="22"/>
+        </w:rPr>
+        <w:br/>
+      </w:r>
+      <w:r>
+        <w:rPr>
+          <w:rFonts w:eastAsia="Consolas" w:cstheme="minorHAnsi"/>
+          <w:szCs w:val="22"/>
+          <w:lang w:val="en-GB"/>
+        </w:rPr>
+        <w:t xml:space="preserve">                'resources/</w:t>
+      </w:r>
+      <w:proofErr w:type="spellStart"/>
+      <w:r>
+        <w:rPr>
+          <w:rFonts w:eastAsia="Consolas" w:cstheme="minorHAnsi"/>
+          <w:szCs w:val="22"/>
+          <w:lang w:val="en-GB"/>
+        </w:rPr>
+        <w:t>css</w:t>
+      </w:r>
+      <w:proofErr w:type="spellEnd"/>
+      <w:r>
+        <w:rPr>
+          <w:rFonts w:eastAsia="Consolas" w:cstheme="minorHAnsi"/>
+          <w:szCs w:val="22"/>
+          <w:lang w:val="en-GB"/>
+        </w:rPr>
+        <w:t>/app.css',</w:t>
+      </w:r>
+      <w:r>
+        <w:rPr>
+          <w:rFonts w:cstheme="minorHAnsi"/>
+          <w:szCs w:val="22"/>
+        </w:rPr>
+        <w:br/>
+      </w:r>
+      <w:r>
+        <w:rPr>
+          <w:rFonts w:eastAsia="Consolas" w:cstheme="minorHAnsi"/>
+          <w:szCs w:val="22"/>
+          <w:lang w:val="en-GB"/>
+        </w:rPr>
+        <w:t xml:space="preserve">                'resources/</w:t>
+      </w:r>
+      <w:proofErr w:type="spellStart"/>
+      <w:r>
+        <w:rPr>
+          <w:rFonts w:eastAsia="Consolas" w:cstheme="minorHAnsi"/>
+          <w:szCs w:val="22"/>
+          <w:lang w:val="en-GB"/>
+        </w:rPr>
+        <w:t>js</w:t>
+      </w:r>
+      <w:proofErr w:type="spellEnd"/>
+      <w:r>
+        <w:rPr>
+          <w:rFonts w:eastAsia="Consolas" w:cstheme="minorHAnsi"/>
+          <w:szCs w:val="22"/>
+          <w:lang w:val="en-GB"/>
+        </w:rPr>
+        <w:t>/app.js',</w:t>
+      </w:r>
+      <w:r>
+        <w:rPr>
+          <w:rFonts w:cstheme="minorHAnsi"/>
+          <w:szCs w:val="22"/>
+        </w:rPr>
+        <w:br/>
+      </w:r>
+      <w:r>
+        <w:rPr>
+          <w:rFonts w:eastAsia="Consolas" w:cstheme="minorHAnsi"/>
+          <w:szCs w:val="22"/>
+          <w:lang w:val="en-GB"/>
+        </w:rPr>
+        <w:t xml:space="preserve">                'resources/</w:t>
+      </w:r>
+      <w:proofErr w:type="spellStart"/>
+      <w:r>
+        <w:rPr>
+          <w:rFonts w:eastAsia="Consolas" w:cstheme="minorHAnsi"/>
+          <w:szCs w:val="22"/>
+          <w:lang w:val="en-GB"/>
+        </w:rPr>
+        <w:t>css</w:t>
+      </w:r>
+      <w:proofErr w:type="spellEnd"/>
+      <w:r>
+        <w:rPr>
+          <w:rFonts w:eastAsia="Consolas" w:cstheme="minorHAnsi"/>
+          <w:szCs w:val="22"/>
+          <w:lang w:val="en-GB"/>
+        </w:rPr>
+        <w:t>/filament/admin/theme.css', // &lt;-- Add this line</w:t>
+      </w:r>
+      <w:r>
+        <w:rPr>
+          <w:rFonts w:cstheme="minorHAnsi"/>
+          <w:szCs w:val="22"/>
+        </w:rPr>
+        <w:br/>
+      </w:r>
+      <w:r>
+        <w:rPr>
+          <w:rFonts w:eastAsia="Consolas" w:cstheme="minorHAnsi"/>
+          <w:szCs w:val="22"/>
+          <w:lang w:val="en-GB"/>
+        </w:rPr>
+        <w:t xml:space="preserve">            ],</w:t>
+      </w:r>
+      <w:r>
+        <w:rPr>
+          <w:rFonts w:cstheme="minorHAnsi"/>
+          <w:szCs w:val="22"/>
+        </w:rPr>
+        <w:br/>
+      </w:r>
+      <w:r>
+        <w:rPr>
+          <w:rFonts w:eastAsia="Consolas" w:cstheme="minorHAnsi"/>
+          <w:szCs w:val="22"/>
+          <w:lang w:val="en-GB"/>
+        </w:rPr>
+        <w:t xml:space="preserve">            refresh: true,</w:t>
+      </w:r>
+      <w:r>
+        <w:rPr>
+          <w:rFonts w:cstheme="minorHAnsi"/>
+          <w:szCs w:val="22"/>
+        </w:rPr>
+        <w:br/>
+      </w:r>
+      <w:r>
+        <w:rPr>
+          <w:rFonts w:eastAsia="Consolas" w:cstheme="minorHAnsi"/>
+          <w:szCs w:val="22"/>
+          <w:lang w:val="en-GB"/>
+        </w:rPr>
+        <w:t xml:space="preserve">        }),</w:t>
+      </w:r>
+      <w:r>
+        <w:rPr>
+          <w:rFonts w:cstheme="minorHAnsi"/>
+          <w:szCs w:val="22"/>
+        </w:rPr>
+        <w:br/>
+      </w:r>
+      <w:r>
+        <w:rPr>
+          <w:rFonts w:eastAsia="Consolas" w:cstheme="minorHAnsi"/>
+          <w:szCs w:val="22"/>
+          <w:lang w:val="en-GB"/>
+        </w:rPr>
+        <w:t xml:space="preserve">    ],</w:t>
+      </w:r>
+      <w:r>
+        <w:rPr>
+          <w:rFonts w:cstheme="minorHAnsi"/>
+          <w:szCs w:val="22"/>
+        </w:rPr>
+        <w:br/>
+      </w:r>
+      <w:r>
+        <w:rPr>
+          <w:rFonts w:eastAsia="Consolas" w:cstheme="minorHAnsi"/>
+          <w:szCs w:val="22"/>
+          <w:lang w:val="en-GB"/>
+        </w:rPr>
+        <w:t>});</w:t>
+      </w:r>
+      <w:r>
+        <w:rPr>
+          <w:rFonts w:cstheme="minorHAnsi"/>
+          <w:szCs w:val="22"/>
+        </w:rPr>
+        <w:br/>
+      </w:r>
+      <w:r>
+        <w:rPr>
+          <w:rFonts w:eastAsia="Aptos" w:cstheme="minorHAnsi"/>
+          <w:szCs w:val="22"/>
+          <w:lang w:val="en-GB"/>
+        </w:rPr>
+        <w:t xml:space="preserve"> </w:t>
+      </w:r>
+    </w:p>
+    <w:p>
+      <w:pPr>
+        <w:pStyle w:val="Heading4"/>
+        <w:spacing w:before="319" w:after="319"/>
+        <w:rPr>
+          <w:rFonts w:asciiTheme="minorHAnsi" w:hAnsiTheme="minorHAnsi" w:cstheme="minorHAnsi"/>
+          <w:szCs w:val="22"/>
+        </w:rPr>
+      </w:pPr>
+      <w:r>
+        <w:rPr>
+          <w:rFonts w:asciiTheme="minorHAnsi" w:eastAsia="Aptos" w:hAnsiTheme="minorHAnsi" w:cstheme="minorHAnsi"/>
+          <w:szCs w:val="22"/>
+          <w:lang w:val="en-GB"/>
+        </w:rPr>
+        <w:t xml:space="preserve">Step 3: Register the </w:t>
+      </w:r>
+      <w:proofErr w:type="spellStart"/>
+      <w:r>
+        <w:rPr>
+          <w:rFonts w:asciiTheme="minorHAnsi" w:eastAsia="Aptos" w:hAnsiTheme="minorHAnsi" w:cstheme="minorHAnsi"/>
+          <w:szCs w:val="22"/>
+          <w:lang w:val="en-GB"/>
+        </w:rPr>
+        <w:t>Vite</w:t>
+      </w:r>
+      <w:proofErr w:type="spellEnd"/>
+      <w:r>
+        <w:rPr>
+          <w:rFonts w:asciiTheme="minorHAnsi" w:eastAsia="Aptos" w:hAnsiTheme="minorHAnsi" w:cstheme="minorHAnsi"/>
+          <w:szCs w:val="22"/>
+          <w:lang w:val="en-GB"/>
+        </w:rPr>
+        <w:t xml:space="preserve"> Theme in your Panel Provider</w:t>
+      </w:r>
+    </w:p>
+    <w:p>
+      <w:pPr>
+        <w:spacing w:before="240" w:after="240"/>
+        <w:rPr>
+          <w:rFonts w:cstheme="minorHAnsi"/>
+          <w:szCs w:val="22"/>
+        </w:rPr>
+      </w:pPr>
+      <w:r>
+        <w:rPr>
+          <w:rFonts w:eastAsia="Aptos" w:cstheme="minorHAnsi"/>
+          <w:szCs w:val="22"/>
+          <w:lang w:val="en-GB"/>
+        </w:rPr>
+        <w:t xml:space="preserve">Open your </w:t>
+      </w:r>
+      <w:proofErr w:type="spellStart"/>
+      <w:r>
+        <w:rPr>
+          <w:rFonts w:eastAsia="Aptos" w:cstheme="minorHAnsi"/>
+          <w:szCs w:val="22"/>
+          <w:lang w:val="en-GB"/>
+        </w:rPr>
+        <w:t>AdminPanelProvider.php</w:t>
+      </w:r>
+      <w:proofErr w:type="spellEnd"/>
+      <w:r>
+        <w:rPr>
+          <w:rFonts w:eastAsia="Aptos" w:cstheme="minorHAnsi"/>
+          <w:szCs w:val="22"/>
+          <w:lang w:val="en-GB"/>
+        </w:rPr>
+        <w:t xml:space="preserve"> and replace any default styling configurations with the custom theme:</w:t>
+      </w:r>
+    </w:p>
+    <w:p>
+      <w:pPr>
+        <w:rPr>
+          <w:rFonts w:cstheme="minorHAnsi"/>
+          <w:szCs w:val="22"/>
+        </w:rPr>
+      </w:pPr>
+      <w:proofErr w:type="gramStart"/>
+      <w:r>
+        <w:rPr>
+          <w:rFonts w:eastAsia="Consolas" w:cstheme="minorHAnsi"/>
+          <w:szCs w:val="22"/>
+          <w:lang w:val="en-GB"/>
+        </w:rPr>
+        <w:t>public</w:t>
+      </w:r>
+      <w:proofErr w:type="gramEnd"/>
+      <w:r>
+        <w:rPr>
+          <w:rFonts w:eastAsia="Consolas" w:cstheme="minorHAnsi"/>
+          <w:szCs w:val="22"/>
+          <w:lang w:val="en-GB"/>
+        </w:rPr>
+        <w:t xml:space="preserve"> function panel(Panel $panel): Panel</w:t>
+      </w:r>
+      <w:r>
+        <w:rPr>
+          <w:rFonts w:cstheme="minorHAnsi"/>
+          <w:szCs w:val="22"/>
+        </w:rPr>
+        <w:br/>
+      </w:r>
+      <w:r>
+        <w:rPr>
+          <w:rFonts w:eastAsia="Consolas" w:cstheme="minorHAnsi"/>
+          <w:szCs w:val="22"/>
+          <w:lang w:val="en-GB"/>
+        </w:rPr>
+        <w:t>{</w:t>
+      </w:r>
+      <w:r>
+        <w:rPr>
+          <w:rFonts w:cstheme="minorHAnsi"/>
+          <w:szCs w:val="22"/>
+        </w:rPr>
+        <w:br/>
+      </w:r>
+      <w:r>
+        <w:rPr>
+          <w:rFonts w:eastAsia="Consolas" w:cstheme="minorHAnsi"/>
+          <w:szCs w:val="22"/>
+          <w:lang w:val="en-GB"/>
+        </w:rPr>
+        <w:t xml:space="preserve">    return $panel</w:t>
+      </w:r>
+      <w:r>
+        <w:rPr>
+          <w:rFonts w:cstheme="minorHAnsi"/>
+          <w:szCs w:val="22"/>
+        </w:rPr>
+        <w:br/>
+      </w:r>
+      <w:r>
+        <w:rPr>
+          <w:rFonts w:eastAsia="Consolas" w:cstheme="minorHAnsi"/>
+          <w:szCs w:val="22"/>
+          <w:lang w:val="en-GB"/>
+        </w:rPr>
+        <w:t xml:space="preserve">        // ...</w:t>
+      </w:r>
+      <w:r>
+        <w:rPr>
+          <w:rFonts w:cstheme="minorHAnsi"/>
+          <w:szCs w:val="22"/>
+        </w:rPr>
+        <w:br/>
+      </w:r>
+      <w:r>
+        <w:rPr>
+          <w:rFonts w:eastAsia="Consolas" w:cstheme="minorHAnsi"/>
+          <w:szCs w:val="22"/>
+          <w:lang w:val="en-GB"/>
+        </w:rPr>
+        <w:t xml:space="preserve">        -&gt;</w:t>
+      </w:r>
+      <w:proofErr w:type="spellStart"/>
+      <w:r>
+        <w:rPr>
+          <w:rFonts w:eastAsia="Consolas" w:cstheme="minorHAnsi"/>
+          <w:szCs w:val="22"/>
+          <w:lang w:val="en-GB"/>
+        </w:rPr>
+        <w:t>viteTheme</w:t>
+      </w:r>
+      <w:proofErr w:type="spellEnd"/>
+      <w:r>
+        <w:rPr>
+          <w:rFonts w:eastAsia="Consolas" w:cstheme="minorHAnsi"/>
+          <w:szCs w:val="22"/>
+          <w:lang w:val="en-GB"/>
+        </w:rPr>
+        <w:t>('resources/</w:t>
+      </w:r>
+      <w:proofErr w:type="spellStart"/>
+      <w:r>
+        <w:rPr>
+          <w:rFonts w:eastAsia="Consolas" w:cstheme="minorHAnsi"/>
+          <w:szCs w:val="22"/>
+          <w:lang w:val="en-GB"/>
+        </w:rPr>
+        <w:t>css</w:t>
+      </w:r>
+      <w:proofErr w:type="spellEnd"/>
+      <w:r>
+        <w:rPr>
+          <w:rFonts w:eastAsia="Consolas" w:cstheme="minorHAnsi"/>
+          <w:szCs w:val="22"/>
+          <w:lang w:val="en-GB"/>
+        </w:rPr>
+        <w:t>/filament/admin/theme.css'); // &lt;-- Register the custom theme</w:t>
+      </w:r>
+      <w:r>
+        <w:rPr>
+          <w:rFonts w:cstheme="minorHAnsi"/>
+          <w:szCs w:val="22"/>
+        </w:rPr>
+        <w:br/>
+      </w:r>
+      <w:r>
+        <w:rPr>
+          <w:rFonts w:eastAsia="Consolas" w:cstheme="minorHAnsi"/>
+          <w:szCs w:val="22"/>
+          <w:lang w:val="en-GB"/>
+        </w:rPr>
+        <w:t>}</w:t>
+      </w:r>
+      <w:r>
+        <w:rPr>
+          <w:rFonts w:cstheme="minorHAnsi"/>
+          <w:szCs w:val="22"/>
+        </w:rPr>
+        <w:br/>
+      </w:r>
+      <w:r>
+        <w:rPr>
+          <w:rFonts w:eastAsia="Aptos" w:cstheme="minorHAnsi"/>
+          <w:szCs w:val="22"/>
+          <w:lang w:val="en-GB"/>
+        </w:rPr>
+        <w:t xml:space="preserve"> </w:t>
+      </w:r>
+    </w:p>
+    <w:p>
+      <w:pPr>
+        <w:pStyle w:val="Heading4"/>
+        <w:spacing w:before="319" w:after="319"/>
+        <w:rPr>
+          <w:rFonts w:asciiTheme="minorHAnsi" w:hAnsiTheme="minorHAnsi" w:cstheme="minorHAnsi"/>
+          <w:szCs w:val="22"/>
+        </w:rPr>
+      </w:pPr>
+      <w:r>
+        <w:rPr>
+          <w:rFonts w:asciiTheme="minorHAnsi" w:eastAsia="Aptos" w:hAnsiTheme="minorHAnsi" w:cstheme="minorHAnsi"/>
+          <w:szCs w:val="22"/>
+          <w:lang w:val="en-GB"/>
+        </w:rPr>
+        <w:t>Step 4: Build Assets</w:t>
+      </w:r>
+    </w:p>
+    <w:p>
+      <w:pPr>
+        <w:spacing w:before="240" w:after="240"/>
+        <w:rPr>
+          <w:rFonts w:cstheme="minorHAnsi"/>
+          <w:szCs w:val="22"/>
+        </w:rPr>
+      </w:pPr>
+      <w:r>
+        <w:rPr>
+          <w:rFonts w:eastAsia="Aptos" w:cstheme="minorHAnsi"/>
+          <w:szCs w:val="22"/>
+          <w:lang w:val="en-GB"/>
+        </w:rPr>
+        <w:t>Compile your assets to see the changes:</w:t>
+      </w:r>
+    </w:p>
+    <w:p>
+      <w:pPr>
+        <w:rPr>
+          <w:rFonts w:cstheme="minorHAnsi"/>
+          <w:szCs w:val="22"/>
+        </w:rPr>
+      </w:pPr>
+      <w:proofErr w:type="spellStart"/>
+      <w:proofErr w:type="gramStart"/>
+      <w:r>
+        <w:rPr>
+          <w:rFonts w:eastAsia="Consolas" w:cstheme="minorHAnsi"/>
+          <w:szCs w:val="22"/>
+          <w:lang w:val="en-GB"/>
+        </w:rPr>
+        <w:t>npm</w:t>
+      </w:r>
+      <w:proofErr w:type="spellEnd"/>
+      <w:proofErr w:type="gramEnd"/>
+      <w:r>
+        <w:rPr>
+          <w:rFonts w:eastAsia="Consolas" w:cstheme="minorHAnsi"/>
+          <w:szCs w:val="22"/>
+          <w:lang w:val="en-GB"/>
+        </w:rPr>
+        <w:t xml:space="preserve"> run dev</w:t>
+      </w:r>
+      <w:r>
+        <w:rPr>
+          <w:rFonts w:cstheme="minorHAnsi"/>
+          <w:szCs w:val="22"/>
+        </w:rPr>
+        <w:br/>
+      </w:r>
+      <w:r>
+        <w:rPr>
+          <w:rFonts w:eastAsia="Consolas" w:cstheme="minorHAnsi"/>
+          <w:szCs w:val="22"/>
+          <w:lang w:val="en-GB"/>
+        </w:rPr>
+        <w:t># OR for production:</w:t>
+      </w:r>
+      <w:r>
+        <w:rPr>
+          <w:rFonts w:cstheme="minorHAnsi"/>
+          <w:szCs w:val="22"/>
+        </w:rPr>
+        <w:br/>
+      </w:r>
+      <w:proofErr w:type="spellStart"/>
+      <w:r>
+        <w:rPr>
+          <w:rFonts w:eastAsia="Consolas" w:cstheme="minorHAnsi"/>
+          <w:szCs w:val="22"/>
+          <w:lang w:val="en-GB"/>
+        </w:rPr>
+        <w:t>npm</w:t>
+      </w:r>
+      <w:proofErr w:type="spellEnd"/>
+      <w:r>
+        <w:rPr>
+          <w:rFonts w:eastAsia="Consolas" w:cstheme="minorHAnsi"/>
+          <w:szCs w:val="22"/>
+          <w:lang w:val="en-GB"/>
+        </w:rPr>
+        <w:t xml:space="preserve"> run build</w:t>
+      </w:r>
+      <w:r>
+        <w:rPr>
+          <w:rFonts w:cstheme="minorHAnsi"/>
+          <w:szCs w:val="22"/>
+        </w:rPr>
+        <w:br/>
+      </w:r>
+      <w:r>
+        <w:rPr>
+          <w:rFonts w:eastAsia="Aptos" w:cstheme="minorHAnsi"/>
+          <w:szCs w:val="22"/>
+          <w:lang w:val="en-GB"/>
+        </w:rPr>
+        <w:t xml:space="preserve"> </w:t>
+      </w:r>
+    </w:p>
+    <w:p>
+      <w:pPr>
+        <w:spacing w:before="240" w:after="240"/>
+        <w:rPr>
+          <w:rFonts w:cstheme="minorHAnsi"/>
+          <w:szCs w:val="22"/>
+        </w:rPr>
+      </w:pPr>
+      <w:r>
+        <w:rPr>
+          <w:rFonts w:eastAsia="Aptos" w:cstheme="minorHAnsi"/>
+          <w:szCs w:val="22"/>
+          <w:lang w:val="en-GB"/>
+        </w:rPr>
+        <w:t xml:space="preserve">Now, any CSS rules or custom utility configurations you add to </w:t>
+      </w:r>
+      <w:r>
+        <w:rPr>
+          <w:rFonts w:eastAsia="Consolas" w:cstheme="minorHAnsi"/>
+          <w:szCs w:val="22"/>
+          <w:lang w:val="en-GB"/>
+        </w:rPr>
+        <w:t>resources/</w:t>
+      </w:r>
+      <w:proofErr w:type="spellStart"/>
+      <w:r>
+        <w:rPr>
+          <w:rFonts w:eastAsia="Consolas" w:cstheme="minorHAnsi"/>
+          <w:szCs w:val="22"/>
+          <w:lang w:val="en-GB"/>
+        </w:rPr>
+        <w:t>css</w:t>
+      </w:r>
+      <w:proofErr w:type="spellEnd"/>
+      <w:r>
+        <w:rPr>
+          <w:rFonts w:eastAsia="Consolas" w:cstheme="minorHAnsi"/>
+          <w:szCs w:val="22"/>
+          <w:lang w:val="en-GB"/>
+        </w:rPr>
+        <w:t>/filament/admin/theme.css</w:t>
+      </w:r>
+      <w:r>
+        <w:rPr>
+          <w:rFonts w:eastAsia="Aptos" w:cstheme="minorHAnsi"/>
+          <w:szCs w:val="22"/>
+          <w:lang w:val="en-GB"/>
+        </w:rPr>
+        <w:t xml:space="preserve"> will be compiled and applied to your panel.</w:t>
+      </w:r>
+    </w:p>
+    <w:p>
+      <w:pPr>
+        <w:rPr>
+          <w:rFonts w:cstheme="minorHAnsi"/>
+          <w:szCs w:val="22"/>
+        </w:rPr>
+      </w:pPr>
+    </w:p>
+    <w:p>
+      <w:pPr>
+        <w:spacing w:before="240" w:after="240"/>
+        <w:rPr>
+          <w:rFonts w:cstheme="minorHAnsi"/>
+          <w:szCs w:val="22"/>
+        </w:rPr>
+      </w:pPr>
     </w:p>
     <w:p>
       <w:pPr>
@@ -18835,6 +20674,119 @@
     </w:lvl>
   </w:abstractNum>
   <w:abstractNum w:abstractNumId="3">
+    <w:nsid w:val="0FCADC33"/>
+    <w:multiLevelType w:val="hybridMultilevel"/>
+    <w:tmpl w:val="E5ACB21E"/>
+    <w:lvl w:ilvl="0" w:tplc="980A511C">
+      <w:start w:val="1"/>
+      <w:numFmt w:val="bullet"/>
+      <w:lvlText w:val=""/>
+      <w:lvlJc w:val="left"/>
+      <w:pPr>
+        <w:ind w:left="720" w:hanging="360"/>
+      </w:pPr>
+      <w:rPr>
+        <w:rFonts w:ascii="Symbol" w:hAnsi="Symbol" w:hint="default"/>
+      </w:rPr>
+    </w:lvl>
+    <w:lvl w:ilvl="1" w:tplc="2C622448">
+      <w:start w:val="1"/>
+      <w:numFmt w:val="bullet"/>
+      <w:lvlText w:val="o"/>
+      <w:lvlJc w:val="left"/>
+      <w:pPr>
+        <w:ind w:left="1440" w:hanging="360"/>
+      </w:pPr>
+      <w:rPr>
+        <w:rFonts w:ascii="Courier New" w:hAnsi="Courier New" w:hint="default"/>
+      </w:rPr>
+    </w:lvl>
+    <w:lvl w:ilvl="2" w:tplc="28C45E14">
+      <w:start w:val="1"/>
+      <w:numFmt w:val="bullet"/>
+      <w:lvlText w:val=""/>
+      <w:lvlJc w:val="left"/>
+      <w:pPr>
+        <w:ind w:left="2160" w:hanging="360"/>
+      </w:pPr>
+      <w:rPr>
+        <w:rFonts w:ascii="Wingdings" w:hAnsi="Wingdings" w:hint="default"/>
+      </w:rPr>
+    </w:lvl>
+    <w:lvl w:ilvl="3" w:tplc="B4F8FD58">
+      <w:start w:val="1"/>
+      <w:numFmt w:val="bullet"/>
+      <w:lvlText w:val=""/>
+      <w:lvlJc w:val="left"/>
+      <w:pPr>
+        <w:ind w:left="2880" w:hanging="360"/>
+      </w:pPr>
+      <w:rPr>
+        <w:rFonts w:ascii="Symbol" w:hAnsi="Symbol" w:hint="default"/>
+      </w:rPr>
+    </w:lvl>
+    <w:lvl w:ilvl="4" w:tplc="B9769B84">
+      <w:start w:val="1"/>
+      <w:numFmt w:val="bullet"/>
+      <w:lvlText w:val="o"/>
+      <w:lvlJc w:val="left"/>
+      <w:pPr>
+        <w:ind w:left="3600" w:hanging="360"/>
+      </w:pPr>
+      <w:rPr>
+        <w:rFonts w:ascii="Courier New" w:hAnsi="Courier New" w:hint="default"/>
+      </w:rPr>
+    </w:lvl>
+    <w:lvl w:ilvl="5" w:tplc="B434DED2">
+      <w:start w:val="1"/>
+      <w:numFmt w:val="bullet"/>
+      <w:lvlText w:val=""/>
+      <w:lvlJc w:val="left"/>
+      <w:pPr>
+        <w:ind w:left="4320" w:hanging="360"/>
+      </w:pPr>
+      <w:rPr>
+        <w:rFonts w:ascii="Wingdings" w:hAnsi="Wingdings" w:hint="default"/>
+      </w:rPr>
+    </w:lvl>
+    <w:lvl w:ilvl="6" w:tplc="9BD01718">
+      <w:start w:val="1"/>
+      <w:numFmt w:val="bullet"/>
+      <w:lvlText w:val=""/>
+      <w:lvlJc w:val="left"/>
+      <w:pPr>
+        <w:ind w:left="5040" w:hanging="360"/>
+      </w:pPr>
+      <w:rPr>
+        <w:rFonts w:ascii="Symbol" w:hAnsi="Symbol" w:hint="default"/>
+      </w:rPr>
+    </w:lvl>
+    <w:lvl w:ilvl="7" w:tplc="475CEB06">
+      <w:start w:val="1"/>
+      <w:numFmt w:val="bullet"/>
+      <w:lvlText w:val="o"/>
+      <w:lvlJc w:val="left"/>
+      <w:pPr>
+        <w:ind w:left="5760" w:hanging="360"/>
+      </w:pPr>
+      <w:rPr>
+        <w:rFonts w:ascii="Courier New" w:hAnsi="Courier New" w:hint="default"/>
+      </w:rPr>
+    </w:lvl>
+    <w:lvl w:ilvl="8" w:tplc="EFC2967A">
+      <w:start w:val="1"/>
+      <w:numFmt w:val="bullet"/>
+      <w:lvlText w:val=""/>
+      <w:lvlJc w:val="left"/>
+      <w:pPr>
+        <w:ind w:left="6480" w:hanging="360"/>
+      </w:pPr>
+      <w:rPr>
+        <w:rFonts w:ascii="Wingdings" w:hAnsi="Wingdings" w:hint="default"/>
+      </w:rPr>
+    </w:lvl>
+  </w:abstractNum>
+  <w:abstractNum w:abstractNumId="4">
     <w:nsid w:val="12FBE7F2"/>
     <w:multiLevelType w:val="hybridMultilevel"/>
     <w:tmpl w:val="4ACE3492"/>
@@ -18947,7 +20899,7 @@
       </w:rPr>
     </w:lvl>
   </w:abstractNum>
-  <w:abstractNum w:abstractNumId="4">
+  <w:abstractNum w:abstractNumId="5">
     <w:nsid w:val="27883FFB"/>
     <w:multiLevelType w:val="hybridMultilevel"/>
     <w:tmpl w:val="6A0496F4"/>
@@ -19060,7 +21012,7 @@
       </w:rPr>
     </w:lvl>
   </w:abstractNum>
-  <w:abstractNum w:abstractNumId="5">
+  <w:abstractNum w:abstractNumId="6">
     <w:nsid w:val="3E824C74"/>
     <w:multiLevelType w:val="hybridMultilevel"/>
     <w:tmpl w:val="9A52B122"/>
@@ -19173,7 +21125,7 @@
       </w:rPr>
     </w:lvl>
   </w:abstractNum>
-  <w:abstractNum w:abstractNumId="6">
+  <w:abstractNum w:abstractNumId="7">
     <w:nsid w:val="40611D4A"/>
     <w:multiLevelType w:val="hybridMultilevel"/>
     <w:tmpl w:val="A3B4B8CC"/>
@@ -19286,7 +21238,7 @@
       </w:rPr>
     </w:lvl>
   </w:abstractNum>
-  <w:abstractNum w:abstractNumId="7">
+  <w:abstractNum w:abstractNumId="8">
     <w:nsid w:val="43D8995C"/>
     <w:multiLevelType w:val="hybridMultilevel"/>
     <w:tmpl w:val="E1284C72"/>
@@ -19399,7 +21351,7 @@
       </w:rPr>
     </w:lvl>
   </w:abstractNum>
-  <w:abstractNum w:abstractNumId="8">
+  <w:abstractNum w:abstractNumId="9">
     <w:nsid w:val="448F61A1"/>
     <w:multiLevelType w:val="hybridMultilevel"/>
     <w:tmpl w:val="165055AE"/>
@@ -19512,7 +21464,7 @@
       </w:rPr>
     </w:lvl>
   </w:abstractNum>
-  <w:abstractNum w:abstractNumId="9">
+  <w:abstractNum w:abstractNumId="10">
     <w:nsid w:val="45FB5FEE"/>
     <w:multiLevelType w:val="hybridMultilevel"/>
     <w:tmpl w:val="CAA22B96"/>
@@ -19625,7 +21577,7 @@
       </w:rPr>
     </w:lvl>
   </w:abstractNum>
-  <w:abstractNum w:abstractNumId="10">
+  <w:abstractNum w:abstractNumId="11">
     <w:nsid w:val="49B7E5F0"/>
     <w:multiLevelType w:val="hybridMultilevel"/>
     <w:tmpl w:val="3B8860C4"/>
@@ -19738,7 +21690,7 @@
       </w:rPr>
     </w:lvl>
   </w:abstractNum>
-  <w:abstractNum w:abstractNumId="11">
+  <w:abstractNum w:abstractNumId="12">
     <w:nsid w:val="4BA955EF"/>
     <w:multiLevelType w:val="hybridMultilevel"/>
     <w:tmpl w:val="0010B848"/>
@@ -19851,7 +21803,7 @@
       </w:rPr>
     </w:lvl>
   </w:abstractNum>
-  <w:abstractNum w:abstractNumId="12">
+  <w:abstractNum w:abstractNumId="13">
     <w:nsid w:val="515A1F99"/>
     <w:multiLevelType w:val="hybridMultilevel"/>
     <w:tmpl w:val="C242F62E"/>
@@ -19964,7 +21916,7 @@
       </w:rPr>
     </w:lvl>
   </w:abstractNum>
-  <w:abstractNum w:abstractNumId="13">
+  <w:abstractNum w:abstractNumId="14">
     <w:nsid w:val="55F73037"/>
     <w:multiLevelType w:val="hybridMultilevel"/>
     <w:tmpl w:val="C9B47740"/>
@@ -20077,7 +22029,7 @@
       </w:rPr>
     </w:lvl>
   </w:abstractNum>
-  <w:abstractNum w:abstractNumId="14">
+  <w:abstractNum w:abstractNumId="15">
     <w:nsid w:val="5F19EEA1"/>
     <w:multiLevelType w:val="hybridMultilevel"/>
     <w:tmpl w:val="4A064B52"/>
@@ -20190,7 +22142,7 @@
       </w:rPr>
     </w:lvl>
   </w:abstractNum>
-  <w:abstractNum w:abstractNumId="15">
+  <w:abstractNum w:abstractNumId="16">
     <w:nsid w:val="638D4CE5"/>
     <w:multiLevelType w:val="hybridMultilevel"/>
     <w:tmpl w:val="7158DEDA"/>
@@ -20303,7 +22255,7 @@
       </w:rPr>
     </w:lvl>
   </w:abstractNum>
-  <w:abstractNum w:abstractNumId="16">
+  <w:abstractNum w:abstractNumId="17">
     <w:nsid w:val="64C669D5"/>
     <w:multiLevelType w:val="hybridMultilevel"/>
     <w:tmpl w:val="B8564516"/>
@@ -20416,7 +22368,7 @@
       </w:rPr>
     </w:lvl>
   </w:abstractNum>
-  <w:abstractNum w:abstractNumId="17">
+  <w:abstractNum w:abstractNumId="18">
     <w:nsid w:val="6D14B790"/>
     <w:multiLevelType w:val="hybridMultilevel"/>
     <w:tmpl w:val="FEB4F556"/>
@@ -20529,7 +22481,7 @@
       </w:rPr>
     </w:lvl>
   </w:abstractNum>
-  <w:abstractNum w:abstractNumId="18">
+  <w:abstractNum w:abstractNumId="19">
     <w:nsid w:val="6F49F606"/>
     <w:multiLevelType w:val="hybridMultilevel"/>
     <w:tmpl w:val="B0B0C0C4"/>
@@ -20642,7 +22594,7 @@
       </w:rPr>
     </w:lvl>
   </w:abstractNum>
-  <w:abstractNum w:abstractNumId="19">
+  <w:abstractNum w:abstractNumId="20">
     <w:nsid w:val="70E94C29"/>
     <w:multiLevelType w:val="hybridMultilevel"/>
     <w:tmpl w:val="226E4AC6"/>
@@ -20755,7 +22707,7 @@
       </w:rPr>
     </w:lvl>
   </w:abstractNum>
-  <w:abstractNum w:abstractNumId="20">
+  <w:abstractNum w:abstractNumId="21">
     <w:nsid w:val="7553C419"/>
     <w:multiLevelType w:val="hybridMultilevel"/>
     <w:tmpl w:val="FB742A26"/>
@@ -20868,7 +22820,7 @@
       </w:rPr>
     </w:lvl>
   </w:abstractNum>
-  <w:abstractNum w:abstractNumId="21">
+  <w:abstractNum w:abstractNumId="22">
     <w:nsid w:val="75822CC5"/>
     <w:multiLevelType w:val="hybridMultilevel"/>
     <w:tmpl w:val="AFFE5774"/>
@@ -20981,7 +22933,7 @@
       </w:rPr>
     </w:lvl>
   </w:abstractNum>
-  <w:abstractNum w:abstractNumId="22">
+  <w:abstractNum w:abstractNumId="23">
     <w:nsid w:val="76B420E5"/>
     <w:multiLevelType w:val="hybridMultilevel"/>
     <w:tmpl w:val="386CE270"/>
@@ -21094,7 +23046,7 @@
       </w:rPr>
     </w:lvl>
   </w:abstractNum>
-  <w:abstractNum w:abstractNumId="23">
+  <w:abstractNum w:abstractNumId="24">
     <w:nsid w:val="7936C793"/>
     <w:multiLevelType w:val="hybridMultilevel"/>
     <w:tmpl w:val="DA88566E"/>
@@ -21207,7 +23159,7 @@
       </w:rPr>
     </w:lvl>
   </w:abstractNum>
-  <w:abstractNum w:abstractNumId="24">
+  <w:abstractNum w:abstractNumId="25">
     <w:nsid w:val="7D241509"/>
     <w:multiLevelType w:val="hybridMultilevel"/>
     <w:tmpl w:val="55FE704A"/>
@@ -21321,79 +23273,82 @@
     </w:lvl>
   </w:abstractNum>
   <w:num w:numId="1">
-    <w:abstractNumId w:val="24"/>
+    <w:abstractNumId w:val="25"/>
   </w:num>
   <w:num w:numId="2">
+    <w:abstractNumId w:val="6"/>
+  </w:num>
+  <w:num w:numId="3">
+    <w:abstractNumId w:val="14"/>
+  </w:num>
+  <w:num w:numId="4">
+    <w:abstractNumId w:val="9"/>
+  </w:num>
+  <w:num w:numId="5">
+    <w:abstractNumId w:val="12"/>
+  </w:num>
+  <w:num w:numId="6">
     <w:abstractNumId w:val="5"/>
   </w:num>
-  <w:num w:numId="3">
-    <w:abstractNumId w:val="13"/>
-  </w:num>
-  <w:num w:numId="4">
-    <w:abstractNumId w:val="8"/>
-  </w:num>
-  <w:num w:numId="5">
-    <w:abstractNumId w:val="11"/>
-  </w:num>
-  <w:num w:numId="6">
-    <w:abstractNumId w:val="4"/>
-  </w:num>
   <w:num w:numId="7">
-    <w:abstractNumId w:val="9"/>
+    <w:abstractNumId w:val="10"/>
   </w:num>
   <w:num w:numId="8">
-    <w:abstractNumId w:val="22"/>
+    <w:abstractNumId w:val="23"/>
   </w:num>
   <w:num w:numId="9">
-    <w:abstractNumId w:val="18"/>
+    <w:abstractNumId w:val="19"/>
   </w:num>
   <w:num w:numId="10">
-    <w:abstractNumId w:val="17"/>
+    <w:abstractNumId w:val="18"/>
   </w:num>
   <w:num w:numId="11">
     <w:abstractNumId w:val="0"/>
   </w:num>
   <w:num w:numId="12">
-    <w:abstractNumId w:val="20"/>
+    <w:abstractNumId w:val="21"/>
   </w:num>
   <w:num w:numId="13">
-    <w:abstractNumId w:val="7"/>
+    <w:abstractNumId w:val="8"/>
   </w:num>
   <w:num w:numId="14">
-    <w:abstractNumId w:val="12"/>
+    <w:abstractNumId w:val="13"/>
   </w:num>
   <w:num w:numId="15">
-    <w:abstractNumId w:val="14"/>
+    <w:abstractNumId w:val="15"/>
   </w:num>
   <w:num w:numId="16">
-    <w:abstractNumId w:val="21"/>
+    <w:abstractNumId w:val="22"/>
   </w:num>
   <w:num w:numId="17">
-    <w:abstractNumId w:val="16"/>
+    <w:abstractNumId w:val="17"/>
   </w:num>
   <w:num w:numId="18">
-    <w:abstractNumId w:val="19"/>
+    <w:abstractNumId w:val="20"/>
   </w:num>
   <w:num w:numId="19">
     <w:abstractNumId w:val="1"/>
   </w:num>
   <w:num w:numId="20">
-    <w:abstractNumId w:val="23"/>
+    <w:abstractNumId w:val="24"/>
   </w:num>
   <w:num w:numId="21">
-    <w:abstractNumId w:val="10"/>
+    <w:abstractNumId w:val="11"/>
   </w:num>
   <w:num w:numId="22">
-    <w:abstractNumId w:val="15"/>
+    <w:abstractNumId w:val="16"/>
   </w:num>
   <w:num w:numId="23">
-    <w:abstractNumId w:val="6"/>
+    <w:abstractNumId w:val="7"/>
   </w:num>
   <w:num w:numId="24">
-    <w:abstractNumId w:val="3"/>
+    <w:abstractNumId w:val="4"/>
   </w:num>
   <w:num w:numId="25">
     <w:abstractNumId w:val="2"/>
+  </w:num>
+  <w:num w:numId="26">
+    <w:abstractNumId w:val="3"/>
   </w:num>
 </w:numbering>
 </file>

</xml_diff>

<commit_message>
Update Filament notes:Using Tabs to Filter Records
</commit_message>
<xml_diff>
--- a/Filament/filament notes.docx
+++ b/Filament/filament notes.docx
@@ -20617,6 +20617,719 @@
         </w:rPr>
         <w:t xml:space="preserve"> to delete the cache files if your site breaks or stops updating.</w:t>
       </w:r>
+    </w:p>
+    <w:p>
+      <w:pPr>
+        <w:spacing w:before="240" w:after="240"/>
+        <w:rPr>
+          <w:rFonts w:cstheme="minorHAnsi"/>
+          <w:szCs w:val="22"/>
+        </w:rPr>
+      </w:pPr>
+    </w:p>
+    <w:p>
+      <w:pPr>
+        <w:pStyle w:val="Heading2"/>
+        <w:pBdr>
+          <w:top w:val="single" w:sz="2" w:space="0" w:color="F4F2EE"/>
+          <w:left w:val="single" w:sz="2" w:space="0" w:color="F4F2EE"/>
+          <w:bottom w:val="single" w:sz="2" w:space="0" w:color="F4F2EE"/>
+          <w:right w:val="single" w:sz="2" w:space="0" w:color="F4F2EE"/>
+        </w:pBdr>
+        <w:spacing w:before="0"/>
+        <w:rPr>
+          <w:rFonts w:ascii="Segoe UI" w:hAnsi="Segoe UI" w:cs="Segoe UI"/>
+          <w:u w:val="single"/>
+        </w:rPr>
+      </w:pPr>
+      <w:r>
+        <w:rPr>
+          <w:rFonts w:ascii="Segoe UI" w:hAnsi="Segoe UI" w:cs="Segoe UI"/>
+          <w:b w:val="0"/>
+          <w:bCs w:val="0"/>
+          <w:bdr w:val="single" w:sz="2" w:space="0" w:color="F4F2EE" w:frame="1"/>
+        </w:rPr>
+        <w:br/>
+      </w:r>
+      <w:r>
+        <w:rPr>
+          <w:rStyle w:val="cursor-pointer"/>
+          <w:rFonts w:ascii="Segoe UI" w:hAnsi="Segoe UI" w:cs="Segoe UI"/>
+          <w:color w:val="FF0000"/>
+          <w:u w:val="single"/>
+          <w:bdr w:val="single" w:sz="2" w:space="0" w:color="F4F2EE" w:frame="1"/>
+        </w:rPr>
+        <w:t>Using tabs to filter the records</w:t>
+      </w:r>
+      <w:r>
+        <w:rPr>
+          <w:rStyle w:val="cursor-pointer"/>
+          <w:rFonts w:ascii="Segoe UI" w:hAnsi="Segoe UI" w:cs="Segoe UI"/>
+          <w:color w:val="FF0000"/>
+          <w:u w:val="single"/>
+          <w:bdr w:val="single" w:sz="2" w:space="0" w:color="F4F2EE" w:frame="1"/>
+        </w:rPr>
+        <w:t>:</w:t>
+      </w:r>
+    </w:p>
+    <w:p>
+      <w:pPr>
+        <w:spacing w:before="240" w:after="240"/>
+        <w:rPr>
+          <w:rFonts w:cstheme="minorHAnsi"/>
+          <w:color w:val="45423E"/>
+          <w:szCs w:val="22"/>
+          <w:bdr w:val="single" w:sz="2" w:space="0" w:color="F4F2EE" w:frame="1"/>
+        </w:rPr>
+      </w:pPr>
+      <w:r>
+        <w:rPr>
+          <w:rFonts w:cstheme="minorHAnsi"/>
+          <w:color w:val="45423E"/>
+          <w:szCs w:val="22"/>
+          <w:bdr w:val="single" w:sz="2" w:space="0" w:color="F4F2EE" w:frame="1"/>
+        </w:rPr>
+        <w:t xml:space="preserve">You can add tabs above the table, which can be used to filter the records based on some predefined conditions. Each tab can scope the </w:t>
+      </w:r>
+      <w:proofErr w:type="gramStart"/>
+      <w:r>
+        <w:rPr>
+          <w:rFonts w:cstheme="minorHAnsi"/>
+          <w:color w:val="45423E"/>
+          <w:szCs w:val="22"/>
+          <w:bdr w:val="single" w:sz="2" w:space="0" w:color="F4F2EE" w:frame="1"/>
+        </w:rPr>
+        <w:t>Eloquent</w:t>
+      </w:r>
+      <w:proofErr w:type="gramEnd"/>
+      <w:r>
+        <w:rPr>
+          <w:rFonts w:cstheme="minorHAnsi"/>
+          <w:color w:val="45423E"/>
+          <w:szCs w:val="22"/>
+          <w:bdr w:val="single" w:sz="2" w:space="0" w:color="F4F2EE" w:frame="1"/>
+        </w:rPr>
+        <w:t xml:space="preserve"> query of the table in a different way. To register tabs, add a </w:t>
+      </w:r>
+      <w:proofErr w:type="spellStart"/>
+      <w:proofErr w:type="gramStart"/>
+      <w:r>
+        <w:rPr>
+          <w:rStyle w:val="HTMLCode"/>
+          <w:rFonts w:asciiTheme="minorHAnsi" w:eastAsiaTheme="minorHAnsi" w:hAnsiTheme="minorHAnsi" w:cstheme="minorHAnsi"/>
+          <w:color w:val="45423E"/>
+          <w:sz w:val="22"/>
+          <w:szCs w:val="22"/>
+          <w:bdr w:val="single" w:sz="2" w:space="0" w:color="F4F2EE" w:frame="1"/>
+        </w:rPr>
+        <w:t>getTabs</w:t>
+      </w:r>
+      <w:proofErr w:type="spellEnd"/>
+      <w:r>
+        <w:rPr>
+          <w:rStyle w:val="HTMLCode"/>
+          <w:rFonts w:asciiTheme="minorHAnsi" w:eastAsiaTheme="minorHAnsi" w:hAnsiTheme="minorHAnsi" w:cstheme="minorHAnsi"/>
+          <w:color w:val="45423E"/>
+          <w:sz w:val="22"/>
+          <w:szCs w:val="22"/>
+          <w:bdr w:val="single" w:sz="2" w:space="0" w:color="F4F2EE" w:frame="1"/>
+        </w:rPr>
+        <w:t>(</w:t>
+      </w:r>
+      <w:proofErr w:type="gramEnd"/>
+      <w:r>
+        <w:rPr>
+          <w:rStyle w:val="HTMLCode"/>
+          <w:rFonts w:asciiTheme="minorHAnsi" w:eastAsiaTheme="minorHAnsi" w:hAnsiTheme="minorHAnsi" w:cstheme="minorHAnsi"/>
+          <w:color w:val="45423E"/>
+          <w:sz w:val="22"/>
+          <w:szCs w:val="22"/>
+          <w:bdr w:val="single" w:sz="2" w:space="0" w:color="F4F2EE" w:frame="1"/>
+        </w:rPr>
+        <w:t>)</w:t>
+      </w:r>
+      <w:r>
+        <w:rPr>
+          <w:rFonts w:cstheme="minorHAnsi"/>
+          <w:color w:val="45423E"/>
+          <w:szCs w:val="22"/>
+          <w:bdr w:val="single" w:sz="2" w:space="0" w:color="F4F2EE" w:frame="1"/>
+        </w:rPr>
+        <w:t> method to the List page class, and return an array of </w:t>
+      </w:r>
+      <w:r>
+        <w:rPr>
+          <w:rStyle w:val="HTMLCode"/>
+          <w:rFonts w:asciiTheme="minorHAnsi" w:eastAsiaTheme="minorHAnsi" w:hAnsiTheme="minorHAnsi" w:cstheme="minorHAnsi"/>
+          <w:color w:val="45423E"/>
+          <w:sz w:val="22"/>
+          <w:szCs w:val="22"/>
+          <w:bdr w:val="single" w:sz="2" w:space="0" w:color="F4F2EE" w:frame="1"/>
+        </w:rPr>
+        <w:t>Tab</w:t>
+      </w:r>
+      <w:r>
+        <w:rPr>
+          <w:rFonts w:cstheme="minorHAnsi"/>
+          <w:color w:val="45423E"/>
+          <w:szCs w:val="22"/>
+          <w:bdr w:val="single" w:sz="2" w:space="0" w:color="F4F2EE" w:frame="1"/>
+        </w:rPr>
+        <w:t> objects:</w:t>
+      </w:r>
+    </w:p>
+    <w:p>
+      <w:pPr>
+        <w:spacing w:before="240" w:after="240"/>
+        <w:rPr>
+          <w:rFonts w:cstheme="minorHAnsi"/>
+          <w:b/>
+          <w:bCs/>
+          <w:color w:val="548DD4" w:themeColor="text2" w:themeTint="99"/>
+          <w:szCs w:val="22"/>
+        </w:rPr>
+      </w:pPr>
+      <w:proofErr w:type="gramStart"/>
+      <w:r>
+        <w:rPr>
+          <w:rFonts w:cstheme="minorHAnsi"/>
+          <w:b/>
+          <w:bCs/>
+          <w:color w:val="548DD4" w:themeColor="text2" w:themeTint="99"/>
+          <w:szCs w:val="22"/>
+        </w:rPr>
+        <w:t>use</w:t>
+      </w:r>
+      <w:proofErr w:type="gramEnd"/>
+      <w:r>
+        <w:rPr>
+          <w:rFonts w:cstheme="minorHAnsi"/>
+          <w:b/>
+          <w:bCs/>
+          <w:color w:val="548DD4" w:themeColor="text2" w:themeTint="99"/>
+          <w:szCs w:val="22"/>
+        </w:rPr>
+        <w:t xml:space="preserve"> Filament\Schemas\Components\Tabs\Tab;</w:t>
+      </w:r>
+    </w:p>
+    <w:p>
+      <w:pPr>
+        <w:spacing w:before="240" w:after="240"/>
+        <w:rPr>
+          <w:rFonts w:cstheme="minorHAnsi"/>
+          <w:b/>
+          <w:bCs/>
+          <w:color w:val="548DD4" w:themeColor="text2" w:themeTint="99"/>
+          <w:szCs w:val="22"/>
+        </w:rPr>
+      </w:pPr>
+      <w:proofErr w:type="gramStart"/>
+      <w:r>
+        <w:rPr>
+          <w:rFonts w:cstheme="minorHAnsi"/>
+          <w:b/>
+          <w:bCs/>
+          <w:color w:val="548DD4" w:themeColor="text2" w:themeTint="99"/>
+          <w:szCs w:val="22"/>
+        </w:rPr>
+        <w:t>use</w:t>
+      </w:r>
+      <w:proofErr w:type="gramEnd"/>
+      <w:r>
+        <w:rPr>
+          <w:rFonts w:cstheme="minorHAnsi"/>
+          <w:b/>
+          <w:bCs/>
+          <w:color w:val="548DD4" w:themeColor="text2" w:themeTint="99"/>
+          <w:szCs w:val="22"/>
+        </w:rPr>
+        <w:t xml:space="preserve"> Illuminate\Database\Eloquent\Builder;</w:t>
+      </w:r>
+    </w:p>
+    <w:p>
+      <w:pPr>
+        <w:spacing w:before="240" w:after="240"/>
+        <w:rPr>
+          <w:rFonts w:cstheme="minorHAnsi"/>
+          <w:b/>
+          <w:bCs/>
+          <w:color w:val="548DD4" w:themeColor="text2" w:themeTint="99"/>
+          <w:szCs w:val="22"/>
+        </w:rPr>
+      </w:pPr>
+      <w:proofErr w:type="gramStart"/>
+      <w:r>
+        <w:rPr>
+          <w:rFonts w:cstheme="minorHAnsi"/>
+          <w:b/>
+          <w:bCs/>
+          <w:color w:val="548DD4" w:themeColor="text2" w:themeTint="99"/>
+          <w:szCs w:val="22"/>
+        </w:rPr>
+        <w:t>public</w:t>
+      </w:r>
+      <w:proofErr w:type="gramEnd"/>
+      <w:r>
+        <w:rPr>
+          <w:rFonts w:cstheme="minorHAnsi"/>
+          <w:b/>
+          <w:bCs/>
+          <w:color w:val="548DD4" w:themeColor="text2" w:themeTint="99"/>
+          <w:szCs w:val="22"/>
+        </w:rPr>
+        <w:t xml:space="preserve"> function </w:t>
+      </w:r>
+      <w:proofErr w:type="spellStart"/>
+      <w:r>
+        <w:rPr>
+          <w:rFonts w:cstheme="minorHAnsi"/>
+          <w:b/>
+          <w:bCs/>
+          <w:color w:val="548DD4" w:themeColor="text2" w:themeTint="99"/>
+          <w:szCs w:val="22"/>
+        </w:rPr>
+        <w:t>getTabs</w:t>
+      </w:r>
+      <w:proofErr w:type="spellEnd"/>
+      <w:r>
+        <w:rPr>
+          <w:rFonts w:cstheme="minorHAnsi"/>
+          <w:b/>
+          <w:bCs/>
+          <w:color w:val="548DD4" w:themeColor="text2" w:themeTint="99"/>
+          <w:szCs w:val="22"/>
+        </w:rPr>
+        <w:t>(): array</w:t>
+      </w:r>
+    </w:p>
+    <w:p>
+      <w:pPr>
+        <w:spacing w:before="240" w:after="240"/>
+        <w:rPr>
+          <w:rFonts w:cstheme="minorHAnsi"/>
+          <w:b/>
+          <w:bCs/>
+          <w:color w:val="548DD4" w:themeColor="text2" w:themeTint="99"/>
+          <w:szCs w:val="22"/>
+        </w:rPr>
+      </w:pPr>
+      <w:r>
+        <w:rPr>
+          <w:rFonts w:cstheme="minorHAnsi"/>
+          <w:b/>
+          <w:bCs/>
+          <w:color w:val="548DD4" w:themeColor="text2" w:themeTint="99"/>
+          <w:szCs w:val="22"/>
+        </w:rPr>
+        <w:t>{</w:t>
+      </w:r>
+    </w:p>
+    <w:p>
+      <w:pPr>
+        <w:spacing w:before="240" w:after="240"/>
+        <w:rPr>
+          <w:rFonts w:cstheme="minorHAnsi"/>
+          <w:b/>
+          <w:bCs/>
+          <w:color w:val="548DD4" w:themeColor="text2" w:themeTint="99"/>
+          <w:szCs w:val="22"/>
+        </w:rPr>
+      </w:pPr>
+      <w:r>
+        <w:rPr>
+          <w:rFonts w:cstheme="minorHAnsi"/>
+          <w:b/>
+          <w:bCs/>
+          <w:color w:val="548DD4" w:themeColor="text2" w:themeTint="99"/>
+          <w:szCs w:val="22"/>
+        </w:rPr>
+        <w:t xml:space="preserve">    </w:t>
+      </w:r>
+      <w:proofErr w:type="gramStart"/>
+      <w:r>
+        <w:rPr>
+          <w:rFonts w:cstheme="minorHAnsi"/>
+          <w:b/>
+          <w:bCs/>
+          <w:color w:val="548DD4" w:themeColor="text2" w:themeTint="99"/>
+          <w:szCs w:val="22"/>
+        </w:rPr>
+        <w:t>return</w:t>
+      </w:r>
+      <w:proofErr w:type="gramEnd"/>
+      <w:r>
+        <w:rPr>
+          <w:rFonts w:cstheme="minorHAnsi"/>
+          <w:b/>
+          <w:bCs/>
+          <w:color w:val="548DD4" w:themeColor="text2" w:themeTint="99"/>
+          <w:szCs w:val="22"/>
+        </w:rPr>
+        <w:t xml:space="preserve"> [</w:t>
+      </w:r>
+    </w:p>
+    <w:p>
+      <w:pPr>
+        <w:spacing w:before="240" w:after="240"/>
+        <w:rPr>
+          <w:rFonts w:cstheme="minorHAnsi"/>
+          <w:b/>
+          <w:bCs/>
+          <w:color w:val="548DD4" w:themeColor="text2" w:themeTint="99"/>
+          <w:szCs w:val="22"/>
+        </w:rPr>
+      </w:pPr>
+      <w:r>
+        <w:rPr>
+          <w:rFonts w:cstheme="minorHAnsi"/>
+          <w:b/>
+          <w:bCs/>
+          <w:color w:val="548DD4" w:themeColor="text2" w:themeTint="99"/>
+          <w:szCs w:val="22"/>
+        </w:rPr>
+        <w:t xml:space="preserve">        '</w:t>
+      </w:r>
+      <w:proofErr w:type="gramStart"/>
+      <w:r>
+        <w:rPr>
+          <w:rFonts w:cstheme="minorHAnsi"/>
+          <w:b/>
+          <w:bCs/>
+          <w:color w:val="548DD4" w:themeColor="text2" w:themeTint="99"/>
+          <w:szCs w:val="22"/>
+        </w:rPr>
+        <w:t>all</w:t>
+      </w:r>
+      <w:proofErr w:type="gramEnd"/>
+      <w:r>
+        <w:rPr>
+          <w:rFonts w:cstheme="minorHAnsi"/>
+          <w:b/>
+          <w:bCs/>
+          <w:color w:val="548DD4" w:themeColor="text2" w:themeTint="99"/>
+          <w:szCs w:val="22"/>
+        </w:rPr>
+        <w:t>' =&gt; Tab::make(),</w:t>
+      </w:r>
+    </w:p>
+    <w:p>
+      <w:pPr>
+        <w:spacing w:before="240" w:after="240"/>
+        <w:rPr>
+          <w:rFonts w:cstheme="minorHAnsi"/>
+          <w:b/>
+          <w:bCs/>
+          <w:color w:val="548DD4" w:themeColor="text2" w:themeTint="99"/>
+          <w:szCs w:val="22"/>
+        </w:rPr>
+      </w:pPr>
+      <w:r>
+        <w:rPr>
+          <w:rFonts w:cstheme="minorHAnsi"/>
+          <w:b/>
+          <w:bCs/>
+          <w:color w:val="548DD4" w:themeColor="text2" w:themeTint="99"/>
+          <w:szCs w:val="22"/>
+        </w:rPr>
+        <w:t xml:space="preserve">        '</w:t>
+      </w:r>
+      <w:proofErr w:type="gramStart"/>
+      <w:r>
+        <w:rPr>
+          <w:rFonts w:cstheme="minorHAnsi"/>
+          <w:b/>
+          <w:bCs/>
+          <w:color w:val="548DD4" w:themeColor="text2" w:themeTint="99"/>
+          <w:szCs w:val="22"/>
+        </w:rPr>
+        <w:t>active</w:t>
+      </w:r>
+      <w:proofErr w:type="gramEnd"/>
+      <w:r>
+        <w:rPr>
+          <w:rFonts w:cstheme="minorHAnsi"/>
+          <w:b/>
+          <w:bCs/>
+          <w:color w:val="548DD4" w:themeColor="text2" w:themeTint="99"/>
+          <w:szCs w:val="22"/>
+        </w:rPr>
+        <w:t>' =&gt; Tab::make()</w:t>
+      </w:r>
+    </w:p>
+    <w:p>
+      <w:pPr>
+        <w:spacing w:before="240" w:after="240"/>
+        <w:rPr>
+          <w:rFonts w:cstheme="minorHAnsi"/>
+          <w:b/>
+          <w:bCs/>
+          <w:color w:val="548DD4" w:themeColor="text2" w:themeTint="99"/>
+          <w:szCs w:val="22"/>
+        </w:rPr>
+      </w:pPr>
+      <w:r>
+        <w:rPr>
+          <w:rFonts w:cstheme="minorHAnsi"/>
+          <w:b/>
+          <w:bCs/>
+          <w:color w:val="548DD4" w:themeColor="text2" w:themeTint="99"/>
+          <w:szCs w:val="22"/>
+        </w:rPr>
+        <w:t xml:space="preserve">            -&gt;</w:t>
+      </w:r>
+      <w:proofErr w:type="spellStart"/>
+      <w:proofErr w:type="gramStart"/>
+      <w:r>
+        <w:rPr>
+          <w:rFonts w:cstheme="minorHAnsi"/>
+          <w:b/>
+          <w:bCs/>
+          <w:color w:val="548DD4" w:themeColor="text2" w:themeTint="99"/>
+          <w:szCs w:val="22"/>
+        </w:rPr>
+        <w:t>modifyQueryUsing</w:t>
+      </w:r>
+      <w:proofErr w:type="spellEnd"/>
+      <w:r>
+        <w:rPr>
+          <w:rFonts w:cstheme="minorHAnsi"/>
+          <w:b/>
+          <w:bCs/>
+          <w:color w:val="548DD4" w:themeColor="text2" w:themeTint="99"/>
+          <w:szCs w:val="22"/>
+        </w:rPr>
+        <w:t>(</w:t>
+      </w:r>
+      <w:proofErr w:type="spellStart"/>
+      <w:proofErr w:type="gramEnd"/>
+      <w:r>
+        <w:rPr>
+          <w:rFonts w:cstheme="minorHAnsi"/>
+          <w:b/>
+          <w:bCs/>
+          <w:color w:val="548DD4" w:themeColor="text2" w:themeTint="99"/>
+          <w:szCs w:val="22"/>
+        </w:rPr>
+        <w:t>fn</w:t>
+      </w:r>
+      <w:proofErr w:type="spellEnd"/>
+      <w:r>
+        <w:rPr>
+          <w:rFonts w:cstheme="minorHAnsi"/>
+          <w:b/>
+          <w:bCs/>
+          <w:color w:val="548DD4" w:themeColor="text2" w:themeTint="99"/>
+          <w:szCs w:val="22"/>
+        </w:rPr>
+        <w:t xml:space="preserve"> (Builder $query) =&gt; $query-&gt;where('active', true)),</w:t>
+      </w:r>
+    </w:p>
+    <w:p>
+      <w:pPr>
+        <w:spacing w:before="240" w:after="240"/>
+        <w:rPr>
+          <w:rFonts w:cstheme="minorHAnsi"/>
+          <w:b/>
+          <w:bCs/>
+          <w:color w:val="548DD4" w:themeColor="text2" w:themeTint="99"/>
+          <w:szCs w:val="22"/>
+        </w:rPr>
+      </w:pPr>
+      <w:r>
+        <w:rPr>
+          <w:rFonts w:cstheme="minorHAnsi"/>
+          <w:b/>
+          <w:bCs/>
+          <w:color w:val="548DD4" w:themeColor="text2" w:themeTint="99"/>
+          <w:szCs w:val="22"/>
+        </w:rPr>
+        <w:t xml:space="preserve">        '</w:t>
+      </w:r>
+      <w:proofErr w:type="gramStart"/>
+      <w:r>
+        <w:rPr>
+          <w:rFonts w:cstheme="minorHAnsi"/>
+          <w:b/>
+          <w:bCs/>
+          <w:color w:val="548DD4" w:themeColor="text2" w:themeTint="99"/>
+          <w:szCs w:val="22"/>
+        </w:rPr>
+        <w:t>inactive</w:t>
+      </w:r>
+      <w:proofErr w:type="gramEnd"/>
+      <w:r>
+        <w:rPr>
+          <w:rFonts w:cstheme="minorHAnsi"/>
+          <w:b/>
+          <w:bCs/>
+          <w:color w:val="548DD4" w:themeColor="text2" w:themeTint="99"/>
+          <w:szCs w:val="22"/>
+        </w:rPr>
+        <w:t>' =&gt; Tab::make()</w:t>
+      </w:r>
+    </w:p>
+    <w:p>
+      <w:pPr>
+        <w:spacing w:before="240" w:after="240"/>
+        <w:rPr>
+          <w:rFonts w:cstheme="minorHAnsi"/>
+          <w:b/>
+          <w:bCs/>
+          <w:color w:val="548DD4" w:themeColor="text2" w:themeTint="99"/>
+          <w:szCs w:val="22"/>
+        </w:rPr>
+      </w:pPr>
+      <w:r>
+        <w:rPr>
+          <w:rFonts w:cstheme="minorHAnsi"/>
+          <w:b/>
+          <w:bCs/>
+          <w:color w:val="548DD4" w:themeColor="text2" w:themeTint="99"/>
+          <w:szCs w:val="22"/>
+        </w:rPr>
+        <w:t xml:space="preserve">            -&gt;</w:t>
+      </w:r>
+      <w:proofErr w:type="spellStart"/>
+      <w:proofErr w:type="gramStart"/>
+      <w:r>
+        <w:rPr>
+          <w:rFonts w:cstheme="minorHAnsi"/>
+          <w:b/>
+          <w:bCs/>
+          <w:color w:val="548DD4" w:themeColor="text2" w:themeTint="99"/>
+          <w:szCs w:val="22"/>
+        </w:rPr>
+        <w:t>modifyQueryUsing</w:t>
+      </w:r>
+      <w:proofErr w:type="spellEnd"/>
+      <w:r>
+        <w:rPr>
+          <w:rFonts w:cstheme="minorHAnsi"/>
+          <w:b/>
+          <w:bCs/>
+          <w:color w:val="548DD4" w:themeColor="text2" w:themeTint="99"/>
+          <w:szCs w:val="22"/>
+        </w:rPr>
+        <w:t>(</w:t>
+      </w:r>
+      <w:proofErr w:type="spellStart"/>
+      <w:proofErr w:type="gramEnd"/>
+      <w:r>
+        <w:rPr>
+          <w:rFonts w:cstheme="minorHAnsi"/>
+          <w:b/>
+          <w:bCs/>
+          <w:color w:val="548DD4" w:themeColor="text2" w:themeTint="99"/>
+          <w:szCs w:val="22"/>
+        </w:rPr>
+        <w:t>fn</w:t>
+      </w:r>
+      <w:proofErr w:type="spellEnd"/>
+      <w:r>
+        <w:rPr>
+          <w:rFonts w:cstheme="minorHAnsi"/>
+          <w:b/>
+          <w:bCs/>
+          <w:color w:val="548DD4" w:themeColor="text2" w:themeTint="99"/>
+          <w:szCs w:val="22"/>
+        </w:rPr>
+        <w:t xml:space="preserve"> (Builder $query) =&gt; $query-&gt;where('active', false)),</w:t>
+      </w:r>
+    </w:p>
+    <w:p>
+      <w:pPr>
+        <w:spacing w:before="240" w:after="240"/>
+        <w:rPr>
+          <w:rFonts w:cstheme="minorHAnsi"/>
+          <w:b/>
+          <w:bCs/>
+          <w:color w:val="548DD4" w:themeColor="text2" w:themeTint="99"/>
+          <w:szCs w:val="22"/>
+        </w:rPr>
+      </w:pPr>
+      <w:r>
+        <w:rPr>
+          <w:rFonts w:cstheme="minorHAnsi"/>
+          <w:b/>
+          <w:bCs/>
+          <w:color w:val="548DD4" w:themeColor="text2" w:themeTint="99"/>
+          <w:szCs w:val="22"/>
+        </w:rPr>
+        <w:t xml:space="preserve">    ];</w:t>
+      </w:r>
+    </w:p>
+    <w:p>
+      <w:pPr>
+        <w:spacing w:before="240" w:after="240"/>
+        <w:rPr>
+          <w:rFonts w:cstheme="minorHAnsi"/>
+          <w:b/>
+          <w:bCs/>
+          <w:color w:val="548DD4" w:themeColor="text2" w:themeTint="99"/>
+          <w:szCs w:val="22"/>
+        </w:rPr>
+      </w:pPr>
+      <w:r>
+        <w:rPr>
+          <w:rFonts w:cstheme="minorHAnsi"/>
+          <w:b/>
+          <w:bCs/>
+          <w:color w:val="548DD4" w:themeColor="text2" w:themeTint="99"/>
+          <w:szCs w:val="22"/>
+        </w:rPr>
+        <w:t>}</w:t>
+      </w:r>
+    </w:p>
+    <w:p>
+      <w:pPr>
+        <w:spacing w:before="240" w:after="240"/>
+        <w:rPr>
+          <w:rFonts w:cstheme="minorHAnsi"/>
+          <w:szCs w:val="22"/>
+        </w:rPr>
+      </w:pPr>
+      <w:r>
+        <w:rPr>
+          <w:rFonts w:cstheme="minorHAnsi"/>
+          <w:szCs w:val="22"/>
+        </w:rPr>
+        <w:lastRenderedPageBreak/>
+        <w:drawing>
+          <wp:inline distT="0" distB="0" distL="0" distR="0" wp14:anchorId="1C2BEFB6" wp14:editId="49D24F63">
+            <wp:extent cx="5363633" cy="3099561"/>
+            <wp:effectExtent l="0" t="0" r="8890" b="5715"/>
+            <wp:docPr id="5" name="Picture 5"/>
+            <wp:cNvGraphicFramePr>
+              <a:graphicFrameLocks xmlns:a="http://schemas.openxmlformats.org/drawingml/2006/main" noChangeAspect="1"/>
+            </wp:cNvGraphicFramePr>
+            <a:graphic xmlns:a="http://schemas.openxmlformats.org/drawingml/2006/main">
+              <a:graphicData uri="http://schemas.openxmlformats.org/drawingml/2006/picture">
+                <pic:pic xmlns:pic="http://schemas.openxmlformats.org/drawingml/2006/picture">
+                  <pic:nvPicPr>
+                    <pic:cNvPr id="0" name=""/>
+                    <pic:cNvPicPr/>
+                  </pic:nvPicPr>
+                  <pic:blipFill>
+                    <a:blip r:embed="rId15"/>
+                    <a:stretch>
+                      <a:fillRect/>
+                    </a:stretch>
+                  </pic:blipFill>
+                  <pic:spPr>
+                    <a:xfrm>
+                      <a:off x="0" y="0"/>
+                      <a:ext cx="5366361" cy="3101138"/>
+                    </a:xfrm>
+                    <a:prstGeom prst="rect">
+                      <a:avLst/>
+                    </a:prstGeom>
+                  </pic:spPr>
+                </pic:pic>
+              </a:graphicData>
+            </a:graphic>
+          </wp:inline>
+        </w:drawing>
+      </w:r>
       <w:bookmarkStart w:id="0" w:name="_GoBack"/>
       <w:bookmarkEnd w:id="0"/>
     </w:p>
@@ -24237,6 +24950,24 @@
       <w:u w:val="single"/>
     </w:rPr>
   </w:style>
+  <w:style w:type="character" w:customStyle="1" w:styleId="cursor-pointer">
+    <w:name w:val="cursor-pointer"/>
+    <w:basedOn w:val="DefaultParagraphFont"/>
+    <w:rsid w:val="00F44F2A"/>
+  </w:style>
+  <w:style w:type="character" w:styleId="HTMLCode">
+    <w:name w:val="HTML Code"/>
+    <w:basedOn w:val="DefaultParagraphFont"/>
+    <w:uiPriority w:val="99"/>
+    <w:semiHidden/>
+    <w:unhideWhenUsed/>
+    <w:rsid w:val="00F44F2A"/>
+    <w:rPr>
+      <w:rFonts w:ascii="Courier New" w:eastAsia="Times New Roman" w:hAnsi="Courier New" w:cs="Courier New"/>
+      <w:sz w:val="20"/>
+      <w:szCs w:val="20"/>
+    </w:rPr>
+  </w:style>
 </w:styles>
 </file>
 
@@ -24668,6 +25399,24 @@
       <w:u w:val="single"/>
     </w:rPr>
   </w:style>
+  <w:style w:type="character" w:customStyle="1" w:styleId="cursor-pointer">
+    <w:name w:val="cursor-pointer"/>
+    <w:basedOn w:val="DefaultParagraphFont"/>
+    <w:rsid w:val="00F44F2A"/>
+  </w:style>
+  <w:style w:type="character" w:styleId="HTMLCode">
+    <w:name w:val="HTML Code"/>
+    <w:basedOn w:val="DefaultParagraphFont"/>
+    <w:uiPriority w:val="99"/>
+    <w:semiHidden/>
+    <w:unhideWhenUsed/>
+    <w:rsid w:val="00F44F2A"/>
+    <w:rPr>
+      <w:rFonts w:ascii="Courier New" w:eastAsia="Times New Roman" w:hAnsi="Courier New" w:cs="Courier New"/>
+      <w:sz w:val="20"/>
+      <w:szCs w:val="20"/>
+    </w:rPr>
+  </w:style>
 </w:styles>
 </file>
 

</xml_diff>

<commit_message>
Update Filament notes:Laravel Config Clear Commands
</commit_message>
<xml_diff>
--- a/Filament/filament notes.docx
+++ b/Filament/filament notes.docx
@@ -21291,7 +21291,9 @@
       <w:r>
         <w:rPr>
           <w:rFonts w:cstheme="minorHAnsi"/>
-          <w:szCs w:val="22"/>
+          <w:noProof/>
+          <w:szCs w:val="22"/>
+          <w:lang w:eastAsia="en-IN"/>
         </w:rPr>
         <w:lastRenderedPageBreak/>
         <w:drawing>
@@ -21330,37 +21332,1026 @@
           </wp:inline>
         </w:drawing>
       </w:r>
+    </w:p>
+    <w:p>
+      <w:pPr>
+        <w:spacing w:before="240" w:after="240"/>
+        <w:rPr>
+          <w:rFonts w:cstheme="minorHAnsi"/>
+          <w:szCs w:val="22"/>
+        </w:rPr>
+      </w:pPr>
+    </w:p>
+    <w:p>
+      <w:pPr>
+        <w:tabs>
+          <w:tab w:val="left" w:pos="2307"/>
+        </w:tabs>
+        <w:rPr>
+          <w:rFonts w:cstheme="minorHAnsi"/>
+          <w:color w:val="FF0000"/>
+          <w:sz w:val="32"/>
+          <w:szCs w:val="32"/>
+        </w:rPr>
+      </w:pPr>
+    </w:p>
+    <w:p>
+      <w:pPr>
+        <w:pStyle w:val="my-2"/>
+        <w:rPr>
+          <w:rFonts w:asciiTheme="minorHAnsi" w:hAnsiTheme="minorHAnsi" w:cstheme="minorHAnsi"/>
+          <w:b/>
+          <w:bCs/>
+          <w:i/>
+          <w:iCs/>
+          <w:color w:val="FF0000"/>
+          <w:sz w:val="32"/>
+          <w:szCs w:val="32"/>
+        </w:rPr>
+      </w:pPr>
+      <w:proofErr w:type="spellStart"/>
+      <w:proofErr w:type="gramStart"/>
+      <w:r>
+        <w:rPr>
+          <w:rStyle w:val="HTMLCode"/>
+          <w:rFonts w:asciiTheme="minorHAnsi" w:hAnsiTheme="minorHAnsi" w:cstheme="minorHAnsi"/>
+          <w:b/>
+          <w:bCs/>
+          <w:i/>
+          <w:iCs/>
+          <w:color w:val="FF0000"/>
+          <w:sz w:val="32"/>
+          <w:szCs w:val="32"/>
+        </w:rPr>
+        <w:t>php</w:t>
+      </w:r>
+      <w:proofErr w:type="spellEnd"/>
+      <w:proofErr w:type="gramEnd"/>
+      <w:r>
+        <w:rPr>
+          <w:rStyle w:val="HTMLCode"/>
+          <w:rFonts w:asciiTheme="minorHAnsi" w:hAnsiTheme="minorHAnsi" w:cstheme="minorHAnsi"/>
+          <w:b/>
+          <w:bCs/>
+          <w:i/>
+          <w:iCs/>
+          <w:color w:val="FF0000"/>
+          <w:sz w:val="32"/>
+          <w:szCs w:val="32"/>
+        </w:rPr>
+        <w:t xml:space="preserve"> artisan </w:t>
+      </w:r>
+      <w:proofErr w:type="spellStart"/>
+      <w:r>
+        <w:rPr>
+          <w:rStyle w:val="HTMLCode"/>
+          <w:rFonts w:asciiTheme="minorHAnsi" w:hAnsiTheme="minorHAnsi" w:cstheme="minorHAnsi"/>
+          <w:b/>
+          <w:bCs/>
+          <w:i/>
+          <w:iCs/>
+          <w:color w:val="FF0000"/>
+          <w:sz w:val="32"/>
+          <w:szCs w:val="32"/>
+        </w:rPr>
+        <w:t>config:clear</w:t>
+      </w:r>
+      <w:proofErr w:type="spellEnd"/>
+      <w:r>
+        <w:rPr>
+          <w:rFonts w:asciiTheme="minorHAnsi" w:hAnsiTheme="minorHAnsi" w:cstheme="minorHAnsi"/>
+          <w:b/>
+          <w:bCs/>
+          <w:i/>
+          <w:iCs/>
+          <w:color w:val="FF0000"/>
+          <w:sz w:val="32"/>
+          <w:szCs w:val="32"/>
+        </w:rPr>
+        <w:t xml:space="preserve"> </w:t>
+      </w:r>
       <w:bookmarkStart w:id="0" w:name="_GoBack"/>
       <w:bookmarkEnd w:id="0"/>
     </w:p>
     <w:p>
       <w:pPr>
-        <w:spacing w:before="240" w:after="240"/>
-        <w:rPr>
-          <w:rFonts w:cstheme="minorHAnsi"/>
-          <w:szCs w:val="22"/>
-        </w:rPr>
-      </w:pPr>
-    </w:p>
-    <w:p>
-      <w:pPr>
-        <w:rPr>
-          <w:rFonts w:cstheme="minorHAnsi"/>
-          <w:szCs w:val="22"/>
-        </w:rPr>
-      </w:pPr>
-    </w:p>
-    <w:p>
-      <w:pPr>
-        <w:spacing w:before="240" w:after="240"/>
-        <w:rPr>
-          <w:rFonts w:cstheme="minorHAnsi"/>
-          <w:szCs w:val="22"/>
-        </w:rPr>
-      </w:pPr>
-    </w:p>
-    <w:p>
-      <w:pPr>
+        <w:pStyle w:val="my-2"/>
+        <w:rPr>
+          <w:rFonts w:asciiTheme="minorHAnsi" w:hAnsiTheme="minorHAnsi" w:cstheme="minorHAnsi"/>
+          <w:sz w:val="22"/>
+          <w:szCs w:val="22"/>
+        </w:rPr>
+      </w:pPr>
+      <w:proofErr w:type="gramStart"/>
+      <w:r>
+        <w:rPr>
+          <w:rFonts w:asciiTheme="minorHAnsi" w:hAnsiTheme="minorHAnsi" w:cstheme="minorHAnsi"/>
+          <w:sz w:val="22"/>
+          <w:szCs w:val="22"/>
+        </w:rPr>
+        <w:t>removes</w:t>
+      </w:r>
+      <w:proofErr w:type="gramEnd"/>
+      <w:r>
+        <w:rPr>
+          <w:rFonts w:asciiTheme="minorHAnsi" w:hAnsiTheme="minorHAnsi" w:cstheme="minorHAnsi"/>
+          <w:sz w:val="22"/>
+          <w:szCs w:val="22"/>
+        </w:rPr>
+        <w:t xml:space="preserve"> </w:t>
+      </w:r>
+      <w:proofErr w:type="spellStart"/>
+      <w:r>
+        <w:rPr>
+          <w:rFonts w:asciiTheme="minorHAnsi" w:hAnsiTheme="minorHAnsi" w:cstheme="minorHAnsi"/>
+          <w:sz w:val="22"/>
+          <w:szCs w:val="22"/>
+        </w:rPr>
+        <w:t>Laravel’s</w:t>
+      </w:r>
+      <w:proofErr w:type="spellEnd"/>
+      <w:r>
+        <w:rPr>
+          <w:rFonts w:asciiTheme="minorHAnsi" w:hAnsiTheme="minorHAnsi" w:cstheme="minorHAnsi"/>
+          <w:sz w:val="22"/>
+          <w:szCs w:val="22"/>
+        </w:rPr>
+        <w:t xml:space="preserve"> cached </w:t>
+      </w:r>
+      <w:proofErr w:type="spellStart"/>
+      <w:r>
+        <w:rPr>
+          <w:rFonts w:asciiTheme="minorHAnsi" w:hAnsiTheme="minorHAnsi" w:cstheme="minorHAnsi"/>
+          <w:sz w:val="22"/>
+          <w:szCs w:val="22"/>
+        </w:rPr>
+        <w:t>config</w:t>
+      </w:r>
+      <w:proofErr w:type="spellEnd"/>
+      <w:r>
+        <w:rPr>
+          <w:rFonts w:asciiTheme="minorHAnsi" w:hAnsiTheme="minorHAnsi" w:cstheme="minorHAnsi"/>
+          <w:sz w:val="22"/>
+          <w:szCs w:val="22"/>
+        </w:rPr>
+        <w:t xml:space="preserve"> file, so your app reads fresh values from </w:t>
+      </w:r>
+      <w:r>
+        <w:rPr>
+          <w:rStyle w:val="HTMLCode"/>
+          <w:rFonts w:asciiTheme="minorHAnsi" w:hAnsiTheme="minorHAnsi" w:cstheme="minorHAnsi"/>
+          <w:sz w:val="22"/>
+          <w:szCs w:val="22"/>
+        </w:rPr>
+        <w:t>.</w:t>
+      </w:r>
+      <w:proofErr w:type="spellStart"/>
+      <w:r>
+        <w:rPr>
+          <w:rStyle w:val="HTMLCode"/>
+          <w:rFonts w:asciiTheme="minorHAnsi" w:hAnsiTheme="minorHAnsi" w:cstheme="minorHAnsi"/>
+          <w:sz w:val="22"/>
+          <w:szCs w:val="22"/>
+        </w:rPr>
+        <w:t>env</w:t>
+      </w:r>
+      <w:proofErr w:type="spellEnd"/>
+      <w:r>
+        <w:rPr>
+          <w:rFonts w:asciiTheme="minorHAnsi" w:hAnsiTheme="minorHAnsi" w:cstheme="minorHAnsi"/>
+          <w:sz w:val="22"/>
+          <w:szCs w:val="22"/>
+        </w:rPr>
+        <w:t xml:space="preserve"> again.</w:t>
+      </w:r>
+      <w:r>
+        <w:rPr>
+          <w:rStyle w:val="inline-block"/>
+          <w:rFonts w:asciiTheme="minorHAnsi" w:hAnsiTheme="minorHAnsi" w:cstheme="minorHAnsi"/>
+          <w:sz w:val="22"/>
+          <w:szCs w:val="22"/>
+        </w:rPr>
+        <w:t>laravel</w:t>
+      </w:r>
+      <w:r>
+        <w:rPr>
+          <w:rStyle w:val="opacity-50"/>
+          <w:rFonts w:asciiTheme="minorHAnsi" w:hAnsiTheme="minorHAnsi" w:cstheme="minorHAnsi"/>
+          <w:sz w:val="22"/>
+          <w:szCs w:val="22"/>
+        </w:rPr>
+        <w:t>+1</w:t>
+      </w:r>
+    </w:p>
+    <w:p>
+      <w:pPr>
+        <w:pStyle w:val="Heading2"/>
+        <w:rPr>
+          <w:rFonts w:asciiTheme="minorHAnsi" w:hAnsiTheme="minorHAnsi" w:cstheme="minorHAnsi"/>
+          <w:sz w:val="22"/>
+          <w:szCs w:val="22"/>
+        </w:rPr>
+      </w:pPr>
+      <w:r>
+        <w:rPr>
+          <w:rFonts w:asciiTheme="minorHAnsi" w:hAnsiTheme="minorHAnsi" w:cstheme="minorHAnsi"/>
+          <w:sz w:val="22"/>
+          <w:szCs w:val="22"/>
+        </w:rPr>
+        <w:t>When to use it</w:t>
+      </w:r>
+    </w:p>
+    <w:p>
+      <w:pPr>
+        <w:pStyle w:val="my-2"/>
+        <w:rPr>
+          <w:rFonts w:asciiTheme="minorHAnsi" w:hAnsiTheme="minorHAnsi" w:cstheme="minorHAnsi"/>
+          <w:sz w:val="22"/>
+          <w:szCs w:val="22"/>
+        </w:rPr>
+      </w:pPr>
+      <w:r>
+        <w:rPr>
+          <w:rFonts w:asciiTheme="minorHAnsi" w:hAnsiTheme="minorHAnsi" w:cstheme="minorHAnsi"/>
+          <w:sz w:val="22"/>
+          <w:szCs w:val="22"/>
+        </w:rPr>
+        <w:t>Run it after changing things like:</w:t>
+      </w:r>
+    </w:p>
+    <w:p>
+      <w:pPr>
+        <w:pStyle w:val="my-2"/>
+        <w:numPr>
+          <w:ilvl w:val="0"/>
+          <w:numId w:val="28"/>
+        </w:numPr>
+        <w:rPr>
+          <w:rFonts w:asciiTheme="minorHAnsi" w:hAnsiTheme="minorHAnsi" w:cstheme="minorHAnsi"/>
+          <w:sz w:val="22"/>
+          <w:szCs w:val="22"/>
+        </w:rPr>
+      </w:pPr>
+      <w:r>
+        <w:rPr>
+          <w:rStyle w:val="HTMLCode"/>
+          <w:rFonts w:asciiTheme="minorHAnsi" w:hAnsiTheme="minorHAnsi" w:cstheme="minorHAnsi"/>
+          <w:sz w:val="22"/>
+          <w:szCs w:val="22"/>
+        </w:rPr>
+        <w:t>DB_HOST</w:t>
+      </w:r>
+    </w:p>
+    <w:p>
+      <w:pPr>
+        <w:pStyle w:val="my-2"/>
+        <w:numPr>
+          <w:ilvl w:val="0"/>
+          <w:numId w:val="28"/>
+        </w:numPr>
+        <w:rPr>
+          <w:rFonts w:asciiTheme="minorHAnsi" w:hAnsiTheme="minorHAnsi" w:cstheme="minorHAnsi"/>
+          <w:sz w:val="22"/>
+          <w:szCs w:val="22"/>
+        </w:rPr>
+      </w:pPr>
+      <w:r>
+        <w:rPr>
+          <w:rStyle w:val="HTMLCode"/>
+          <w:rFonts w:asciiTheme="minorHAnsi" w:hAnsiTheme="minorHAnsi" w:cstheme="minorHAnsi"/>
+          <w:sz w:val="22"/>
+          <w:szCs w:val="22"/>
+        </w:rPr>
+        <w:t>DB_DATABASE</w:t>
+      </w:r>
+    </w:p>
+    <w:p>
+      <w:pPr>
+        <w:pStyle w:val="my-2"/>
+        <w:numPr>
+          <w:ilvl w:val="0"/>
+          <w:numId w:val="28"/>
+        </w:numPr>
+        <w:rPr>
+          <w:rFonts w:asciiTheme="minorHAnsi" w:hAnsiTheme="minorHAnsi" w:cstheme="minorHAnsi"/>
+          <w:sz w:val="22"/>
+          <w:szCs w:val="22"/>
+        </w:rPr>
+      </w:pPr>
+      <w:r>
+        <w:rPr>
+          <w:rStyle w:val="HTMLCode"/>
+          <w:rFonts w:asciiTheme="minorHAnsi" w:hAnsiTheme="minorHAnsi" w:cstheme="minorHAnsi"/>
+          <w:sz w:val="22"/>
+          <w:szCs w:val="22"/>
+        </w:rPr>
+        <w:t>DB_USERNAME</w:t>
+      </w:r>
+    </w:p>
+    <w:p>
+      <w:pPr>
+        <w:pStyle w:val="my-2"/>
+        <w:numPr>
+          <w:ilvl w:val="0"/>
+          <w:numId w:val="28"/>
+        </w:numPr>
+        <w:rPr>
+          <w:rFonts w:asciiTheme="minorHAnsi" w:hAnsiTheme="minorHAnsi" w:cstheme="minorHAnsi"/>
+          <w:sz w:val="22"/>
+          <w:szCs w:val="22"/>
+        </w:rPr>
+      </w:pPr>
+      <w:r>
+        <w:rPr>
+          <w:rStyle w:val="HTMLCode"/>
+          <w:rFonts w:asciiTheme="minorHAnsi" w:hAnsiTheme="minorHAnsi" w:cstheme="minorHAnsi"/>
+          <w:sz w:val="22"/>
+          <w:szCs w:val="22"/>
+        </w:rPr>
+        <w:t>DB_PASSWORD</w:t>
+      </w:r>
+    </w:p>
+    <w:p>
+      <w:pPr>
+        <w:pStyle w:val="my-2"/>
+        <w:numPr>
+          <w:ilvl w:val="0"/>
+          <w:numId w:val="28"/>
+        </w:numPr>
+        <w:rPr>
+          <w:rFonts w:asciiTheme="minorHAnsi" w:hAnsiTheme="minorHAnsi" w:cstheme="minorHAnsi"/>
+          <w:sz w:val="22"/>
+          <w:szCs w:val="22"/>
+        </w:rPr>
+      </w:pPr>
+      <w:r>
+        <w:rPr>
+          <w:rStyle w:val="HTMLCode"/>
+          <w:rFonts w:asciiTheme="minorHAnsi" w:hAnsiTheme="minorHAnsi" w:cstheme="minorHAnsi"/>
+          <w:sz w:val="22"/>
+          <w:szCs w:val="22"/>
+        </w:rPr>
+        <w:t>APP_KEY</w:t>
+      </w:r>
+    </w:p>
+    <w:p>
+      <w:pPr>
+        <w:pStyle w:val="my-2"/>
+        <w:numPr>
+          <w:ilvl w:val="0"/>
+          <w:numId w:val="28"/>
+        </w:numPr>
+        <w:rPr>
+          <w:rFonts w:asciiTheme="minorHAnsi" w:hAnsiTheme="minorHAnsi" w:cstheme="minorHAnsi"/>
+          <w:sz w:val="22"/>
+          <w:szCs w:val="22"/>
+        </w:rPr>
+      </w:pPr>
+      <w:r>
+        <w:rPr>
+          <w:rFonts w:asciiTheme="minorHAnsi" w:hAnsiTheme="minorHAnsi" w:cstheme="minorHAnsi"/>
+          <w:sz w:val="22"/>
+          <w:szCs w:val="22"/>
+        </w:rPr>
+        <w:t>mail or cache settings</w:t>
+      </w:r>
+      <w:r>
+        <w:rPr>
+          <w:rStyle w:val="inline-block"/>
+          <w:rFonts w:asciiTheme="minorHAnsi" w:hAnsiTheme="minorHAnsi" w:cstheme="minorHAnsi"/>
+          <w:sz w:val="22"/>
+          <w:szCs w:val="22"/>
+        </w:rPr>
+        <w:t>laravel</w:t>
+      </w:r>
+      <w:r>
+        <w:rPr>
+          <w:rStyle w:val="opacity-50"/>
+          <w:rFonts w:asciiTheme="minorHAnsi" w:hAnsiTheme="minorHAnsi" w:cstheme="minorHAnsi"/>
+          <w:sz w:val="22"/>
+          <w:szCs w:val="22"/>
+        </w:rPr>
+        <w:t>+1</w:t>
+      </w:r>
+    </w:p>
+    <w:p>
+      <w:pPr>
+        <w:pStyle w:val="Heading2"/>
+        <w:rPr>
+          <w:rFonts w:asciiTheme="minorHAnsi" w:hAnsiTheme="minorHAnsi" w:cstheme="minorHAnsi"/>
+          <w:sz w:val="22"/>
+          <w:szCs w:val="22"/>
+        </w:rPr>
+      </w:pPr>
+      <w:r>
+        <w:rPr>
+          <w:rFonts w:asciiTheme="minorHAnsi" w:hAnsiTheme="minorHAnsi" w:cstheme="minorHAnsi"/>
+          <w:sz w:val="22"/>
+          <w:szCs w:val="22"/>
+        </w:rPr>
+        <w:t>What it does</w:t>
+      </w:r>
+    </w:p>
+    <w:p>
+      <w:pPr>
+        <w:pStyle w:val="my-2"/>
+        <w:rPr>
+          <w:rFonts w:asciiTheme="minorHAnsi" w:hAnsiTheme="minorHAnsi" w:cstheme="minorHAnsi"/>
+          <w:sz w:val="22"/>
+          <w:szCs w:val="22"/>
+        </w:rPr>
+      </w:pPr>
+      <w:r>
+        <w:rPr>
+          <w:rFonts w:asciiTheme="minorHAnsi" w:hAnsiTheme="minorHAnsi" w:cstheme="minorHAnsi"/>
+          <w:sz w:val="22"/>
+          <w:szCs w:val="22"/>
+        </w:rPr>
+        <w:t xml:space="preserve">It clears the configuration cache only; it does </w:t>
+      </w:r>
+      <w:r>
+        <w:rPr>
+          <w:rStyle w:val="Strong"/>
+          <w:rFonts w:asciiTheme="minorHAnsi" w:hAnsiTheme="minorHAnsi" w:cstheme="minorHAnsi"/>
+          <w:sz w:val="22"/>
+          <w:szCs w:val="22"/>
+        </w:rPr>
+        <w:t>not</w:t>
+      </w:r>
+      <w:r>
+        <w:rPr>
+          <w:rFonts w:asciiTheme="minorHAnsi" w:hAnsiTheme="minorHAnsi" w:cstheme="minorHAnsi"/>
+          <w:sz w:val="22"/>
+          <w:szCs w:val="22"/>
+        </w:rPr>
+        <w:t xml:space="preserve"> change your code, database data, or </w:t>
+      </w:r>
+      <w:r>
+        <w:rPr>
+          <w:rStyle w:val="HTMLCode"/>
+          <w:rFonts w:asciiTheme="minorHAnsi" w:hAnsiTheme="minorHAnsi" w:cstheme="minorHAnsi"/>
+          <w:sz w:val="22"/>
+          <w:szCs w:val="22"/>
+        </w:rPr>
+        <w:t>.</w:t>
+      </w:r>
+      <w:proofErr w:type="spellStart"/>
+      <w:r>
+        <w:rPr>
+          <w:rStyle w:val="HTMLCode"/>
+          <w:rFonts w:asciiTheme="minorHAnsi" w:hAnsiTheme="minorHAnsi" w:cstheme="minorHAnsi"/>
+          <w:sz w:val="22"/>
+          <w:szCs w:val="22"/>
+        </w:rPr>
+        <w:t>env</w:t>
+      </w:r>
+      <w:proofErr w:type="spellEnd"/>
+      <w:r>
+        <w:rPr>
+          <w:rFonts w:asciiTheme="minorHAnsi" w:hAnsiTheme="minorHAnsi" w:cstheme="minorHAnsi"/>
+          <w:sz w:val="22"/>
+          <w:szCs w:val="22"/>
+        </w:rPr>
+        <w:t xml:space="preserve"> file itself.</w:t>
+      </w:r>
+    </w:p>
+    <w:p>
+      <w:pPr>
+        <w:pStyle w:val="Heading2"/>
+        <w:rPr>
+          <w:rFonts w:asciiTheme="minorHAnsi" w:hAnsiTheme="minorHAnsi" w:cstheme="minorHAnsi"/>
+          <w:sz w:val="22"/>
+          <w:szCs w:val="22"/>
+        </w:rPr>
+      </w:pPr>
+      <w:r>
+        <w:rPr>
+          <w:rFonts w:asciiTheme="minorHAnsi" w:hAnsiTheme="minorHAnsi" w:cstheme="minorHAnsi"/>
+          <w:sz w:val="22"/>
+          <w:szCs w:val="22"/>
+        </w:rPr>
+        <w:t>Common follow-up</w:t>
+      </w:r>
+    </w:p>
+    <w:p>
+      <w:pPr>
+        <w:pStyle w:val="my-2"/>
+        <w:rPr>
+          <w:rFonts w:asciiTheme="minorHAnsi" w:hAnsiTheme="minorHAnsi" w:cstheme="minorHAnsi"/>
+          <w:sz w:val="22"/>
+          <w:szCs w:val="22"/>
+        </w:rPr>
+      </w:pPr>
+      <w:r>
+        <w:rPr>
+          <w:rFonts w:asciiTheme="minorHAnsi" w:hAnsiTheme="minorHAnsi" w:cstheme="minorHAnsi"/>
+          <w:sz w:val="22"/>
+          <w:szCs w:val="22"/>
+        </w:rPr>
+        <w:t xml:space="preserve">After </w:t>
+      </w:r>
+      <w:proofErr w:type="spellStart"/>
+      <w:r>
+        <w:rPr>
+          <w:rStyle w:val="HTMLCode"/>
+          <w:rFonts w:asciiTheme="minorHAnsi" w:hAnsiTheme="minorHAnsi" w:cstheme="minorHAnsi"/>
+          <w:sz w:val="22"/>
+          <w:szCs w:val="22"/>
+        </w:rPr>
+        <w:t>config</w:t>
+      </w:r>
+      <w:proofErr w:type="gramStart"/>
+      <w:r>
+        <w:rPr>
+          <w:rStyle w:val="HTMLCode"/>
+          <w:rFonts w:asciiTheme="minorHAnsi" w:hAnsiTheme="minorHAnsi" w:cstheme="minorHAnsi"/>
+          <w:sz w:val="22"/>
+          <w:szCs w:val="22"/>
+        </w:rPr>
+        <w:t>:clear</w:t>
+      </w:r>
+      <w:proofErr w:type="spellEnd"/>
+      <w:proofErr w:type="gramEnd"/>
+      <w:r>
+        <w:rPr>
+          <w:rFonts w:asciiTheme="minorHAnsi" w:hAnsiTheme="minorHAnsi" w:cstheme="minorHAnsi"/>
+          <w:sz w:val="22"/>
+          <w:szCs w:val="22"/>
+        </w:rPr>
+        <w:t>, many developers also run:</w:t>
+      </w:r>
+    </w:p>
+    <w:p>
+      <w:pPr>
+        <w:pStyle w:val="HTMLPreformatted"/>
+        <w:rPr>
+          <w:rFonts w:asciiTheme="minorHAnsi" w:hAnsiTheme="minorHAnsi" w:cstheme="minorHAnsi"/>
+          <w:b/>
+          <w:bCs/>
+          <w:i/>
+          <w:iCs/>
+          <w:color w:val="548DD4" w:themeColor="text2" w:themeTint="99"/>
+          <w:sz w:val="22"/>
+          <w:szCs w:val="22"/>
+        </w:rPr>
+      </w:pPr>
+      <w:proofErr w:type="spellStart"/>
+      <w:proofErr w:type="gramStart"/>
+      <w:r>
+        <w:rPr>
+          <w:rStyle w:val="HTMLCode"/>
+          <w:rFonts w:asciiTheme="minorHAnsi" w:hAnsiTheme="minorHAnsi" w:cstheme="minorHAnsi"/>
+          <w:b/>
+          <w:bCs/>
+          <w:i/>
+          <w:iCs/>
+          <w:color w:val="548DD4" w:themeColor="text2" w:themeTint="99"/>
+          <w:sz w:val="22"/>
+          <w:szCs w:val="22"/>
+        </w:rPr>
+        <w:t>php</w:t>
+      </w:r>
+      <w:proofErr w:type="spellEnd"/>
+      <w:proofErr w:type="gramEnd"/>
+      <w:r>
+        <w:rPr>
+          <w:rStyle w:val="HTMLCode"/>
+          <w:rFonts w:asciiTheme="minorHAnsi" w:hAnsiTheme="minorHAnsi" w:cstheme="minorHAnsi"/>
+          <w:b/>
+          <w:bCs/>
+          <w:i/>
+          <w:iCs/>
+          <w:color w:val="548DD4" w:themeColor="text2" w:themeTint="99"/>
+          <w:sz w:val="22"/>
+          <w:szCs w:val="22"/>
+        </w:rPr>
+        <w:t xml:space="preserve"> artisan </w:t>
+      </w:r>
+      <w:proofErr w:type="spellStart"/>
+      <w:r>
+        <w:rPr>
+          <w:rStyle w:val="HTMLCode"/>
+          <w:rFonts w:asciiTheme="minorHAnsi" w:hAnsiTheme="minorHAnsi" w:cstheme="minorHAnsi"/>
+          <w:b/>
+          <w:bCs/>
+          <w:i/>
+          <w:iCs/>
+          <w:color w:val="548DD4" w:themeColor="text2" w:themeTint="99"/>
+          <w:sz w:val="22"/>
+          <w:szCs w:val="22"/>
+        </w:rPr>
+        <w:t>cache:clear</w:t>
+      </w:r>
+      <w:proofErr w:type="spellEnd"/>
+    </w:p>
+    <w:p>
+      <w:pPr>
+        <w:pStyle w:val="my-2"/>
+        <w:rPr>
+          <w:rFonts w:asciiTheme="minorHAnsi" w:hAnsiTheme="minorHAnsi" w:cstheme="minorHAnsi"/>
+          <w:sz w:val="22"/>
+          <w:szCs w:val="22"/>
+        </w:rPr>
+      </w:pPr>
+      <w:proofErr w:type="gramStart"/>
+      <w:r>
+        <w:rPr>
+          <w:rFonts w:asciiTheme="minorHAnsi" w:hAnsiTheme="minorHAnsi" w:cstheme="minorHAnsi"/>
+          <w:sz w:val="22"/>
+          <w:szCs w:val="22"/>
+        </w:rPr>
+        <w:t>and</w:t>
+      </w:r>
+      <w:proofErr w:type="gramEnd"/>
+      <w:r>
+        <w:rPr>
+          <w:rFonts w:asciiTheme="minorHAnsi" w:hAnsiTheme="minorHAnsi" w:cstheme="minorHAnsi"/>
+          <w:sz w:val="22"/>
+          <w:szCs w:val="22"/>
+        </w:rPr>
+        <w:t>, if needed:</w:t>
+      </w:r>
+    </w:p>
+    <w:p>
+      <w:pPr>
+        <w:pStyle w:val="HTMLPreformatted"/>
+        <w:rPr>
+          <w:rFonts w:asciiTheme="minorHAnsi" w:hAnsiTheme="minorHAnsi" w:cstheme="minorHAnsi"/>
+          <w:b/>
+          <w:bCs/>
+          <w:i/>
+          <w:iCs/>
+          <w:color w:val="548DD4" w:themeColor="text2" w:themeTint="99"/>
+          <w:sz w:val="22"/>
+          <w:szCs w:val="22"/>
+        </w:rPr>
+      </w:pPr>
+      <w:proofErr w:type="spellStart"/>
+      <w:proofErr w:type="gramStart"/>
+      <w:r>
+        <w:rPr>
+          <w:rStyle w:val="HTMLCode"/>
+          <w:rFonts w:asciiTheme="minorHAnsi" w:hAnsiTheme="minorHAnsi" w:cstheme="minorHAnsi"/>
+          <w:b/>
+          <w:bCs/>
+          <w:i/>
+          <w:iCs/>
+          <w:color w:val="548DD4" w:themeColor="text2" w:themeTint="99"/>
+          <w:sz w:val="22"/>
+          <w:szCs w:val="22"/>
+        </w:rPr>
+        <w:lastRenderedPageBreak/>
+        <w:t>php</w:t>
+      </w:r>
+      <w:proofErr w:type="spellEnd"/>
+      <w:proofErr w:type="gramEnd"/>
+      <w:r>
+        <w:rPr>
+          <w:rStyle w:val="HTMLCode"/>
+          <w:rFonts w:asciiTheme="minorHAnsi" w:hAnsiTheme="minorHAnsi" w:cstheme="minorHAnsi"/>
+          <w:b/>
+          <w:bCs/>
+          <w:i/>
+          <w:iCs/>
+          <w:color w:val="548DD4" w:themeColor="text2" w:themeTint="99"/>
+          <w:sz w:val="22"/>
+          <w:szCs w:val="22"/>
+        </w:rPr>
+        <w:t xml:space="preserve"> artisan </w:t>
+      </w:r>
+      <w:proofErr w:type="spellStart"/>
+      <w:r>
+        <w:rPr>
+          <w:rStyle w:val="HTMLCode"/>
+          <w:rFonts w:asciiTheme="minorHAnsi" w:hAnsiTheme="minorHAnsi" w:cstheme="minorHAnsi"/>
+          <w:b/>
+          <w:bCs/>
+          <w:i/>
+          <w:iCs/>
+          <w:color w:val="548DD4" w:themeColor="text2" w:themeTint="99"/>
+          <w:sz w:val="22"/>
+          <w:szCs w:val="22"/>
+        </w:rPr>
+        <w:t>optimize:clear</w:t>
+      </w:r>
+      <w:proofErr w:type="spellEnd"/>
+    </w:p>
+    <w:p>
+      <w:pPr>
+        <w:pStyle w:val="my-2"/>
+        <w:rPr>
+          <w:rFonts w:asciiTheme="minorHAnsi" w:hAnsiTheme="minorHAnsi" w:cstheme="minorHAnsi"/>
+          <w:sz w:val="22"/>
+          <w:szCs w:val="22"/>
+        </w:rPr>
+      </w:pPr>
+      <w:proofErr w:type="gramStart"/>
+      <w:r>
+        <w:rPr>
+          <w:rFonts w:asciiTheme="minorHAnsi" w:hAnsiTheme="minorHAnsi" w:cstheme="minorHAnsi"/>
+          <w:sz w:val="22"/>
+          <w:szCs w:val="22"/>
+        </w:rPr>
+        <w:t>because</w:t>
+      </w:r>
+      <w:proofErr w:type="gramEnd"/>
+      <w:r>
+        <w:rPr>
+          <w:rFonts w:asciiTheme="minorHAnsi" w:hAnsiTheme="minorHAnsi" w:cstheme="minorHAnsi"/>
+          <w:sz w:val="22"/>
+          <w:szCs w:val="22"/>
+        </w:rPr>
+        <w:t xml:space="preserve"> that clears </w:t>
+      </w:r>
+      <w:proofErr w:type="spellStart"/>
+      <w:r>
+        <w:rPr>
+          <w:rFonts w:asciiTheme="minorHAnsi" w:hAnsiTheme="minorHAnsi" w:cstheme="minorHAnsi"/>
+          <w:sz w:val="22"/>
+          <w:szCs w:val="22"/>
+        </w:rPr>
+        <w:t>config</w:t>
+      </w:r>
+      <w:proofErr w:type="spellEnd"/>
+      <w:r>
+        <w:rPr>
+          <w:rFonts w:asciiTheme="minorHAnsi" w:hAnsiTheme="minorHAnsi" w:cstheme="minorHAnsi"/>
+          <w:sz w:val="22"/>
+          <w:szCs w:val="22"/>
+        </w:rPr>
+        <w:t>, route, view, and application caches together during development.</w:t>
+      </w:r>
+    </w:p>
+    <w:p>
+      <w:pPr>
+        <w:pStyle w:val="Heading2"/>
+        <w:rPr>
+          <w:rFonts w:asciiTheme="minorHAnsi" w:hAnsiTheme="minorHAnsi" w:cstheme="minorHAnsi"/>
+          <w:sz w:val="22"/>
+          <w:szCs w:val="22"/>
+        </w:rPr>
+      </w:pPr>
+      <w:r>
+        <w:rPr>
+          <w:rFonts w:asciiTheme="minorHAnsi" w:hAnsiTheme="minorHAnsi" w:cstheme="minorHAnsi"/>
+          <w:sz w:val="22"/>
+          <w:szCs w:val="22"/>
+        </w:rPr>
+        <w:t xml:space="preserve">If you changed </w:t>
+      </w:r>
+      <w:r>
+        <w:rPr>
+          <w:rStyle w:val="HTMLCode"/>
+          <w:rFonts w:asciiTheme="minorHAnsi" w:eastAsiaTheme="majorEastAsia" w:hAnsiTheme="minorHAnsi" w:cstheme="minorHAnsi"/>
+          <w:sz w:val="22"/>
+          <w:szCs w:val="22"/>
+        </w:rPr>
+        <w:t>.</w:t>
+      </w:r>
+      <w:proofErr w:type="spellStart"/>
+      <w:r>
+        <w:rPr>
+          <w:rStyle w:val="HTMLCode"/>
+          <w:rFonts w:asciiTheme="minorHAnsi" w:eastAsiaTheme="majorEastAsia" w:hAnsiTheme="minorHAnsi" w:cstheme="minorHAnsi"/>
+          <w:sz w:val="22"/>
+          <w:szCs w:val="22"/>
+        </w:rPr>
+        <w:t>env</w:t>
+      </w:r>
+      <w:proofErr w:type="spellEnd"/>
+    </w:p>
+    <w:p>
+      <w:pPr>
+        <w:pStyle w:val="my-2"/>
+        <w:rPr>
+          <w:rFonts w:asciiTheme="minorHAnsi" w:hAnsiTheme="minorHAnsi" w:cstheme="minorHAnsi"/>
+          <w:sz w:val="22"/>
+          <w:szCs w:val="22"/>
+        </w:rPr>
+      </w:pPr>
+      <w:r>
+        <w:rPr>
+          <w:rFonts w:asciiTheme="minorHAnsi" w:hAnsiTheme="minorHAnsi" w:cstheme="minorHAnsi"/>
+          <w:sz w:val="22"/>
+          <w:szCs w:val="22"/>
+        </w:rPr>
+        <w:t>A common safe sequence is:</w:t>
+      </w:r>
+    </w:p>
+    <w:p>
+      <w:pPr>
+        <w:pStyle w:val="HTMLPreformatted"/>
+        <w:rPr>
+          <w:rStyle w:val="HTMLCode"/>
+          <w:rFonts w:asciiTheme="minorHAnsi" w:hAnsiTheme="minorHAnsi" w:cstheme="minorHAnsi"/>
+          <w:b/>
+          <w:bCs/>
+          <w:i/>
+          <w:iCs/>
+          <w:color w:val="548DD4" w:themeColor="text2" w:themeTint="99"/>
+          <w:sz w:val="22"/>
+          <w:szCs w:val="22"/>
+        </w:rPr>
+      </w:pPr>
+      <w:proofErr w:type="spellStart"/>
+      <w:proofErr w:type="gramStart"/>
+      <w:r>
+        <w:rPr>
+          <w:rStyle w:val="HTMLCode"/>
+          <w:rFonts w:asciiTheme="minorHAnsi" w:hAnsiTheme="minorHAnsi" w:cstheme="minorHAnsi"/>
+          <w:b/>
+          <w:bCs/>
+          <w:i/>
+          <w:iCs/>
+          <w:color w:val="548DD4" w:themeColor="text2" w:themeTint="99"/>
+          <w:sz w:val="22"/>
+          <w:szCs w:val="22"/>
+        </w:rPr>
+        <w:t>php</w:t>
+      </w:r>
+      <w:proofErr w:type="spellEnd"/>
+      <w:proofErr w:type="gramEnd"/>
+      <w:r>
+        <w:rPr>
+          <w:rStyle w:val="HTMLCode"/>
+          <w:rFonts w:asciiTheme="minorHAnsi" w:hAnsiTheme="minorHAnsi" w:cstheme="minorHAnsi"/>
+          <w:b/>
+          <w:bCs/>
+          <w:i/>
+          <w:iCs/>
+          <w:color w:val="548DD4" w:themeColor="text2" w:themeTint="99"/>
+          <w:sz w:val="22"/>
+          <w:szCs w:val="22"/>
+        </w:rPr>
+        <w:t xml:space="preserve"> artisan </w:t>
+      </w:r>
+      <w:proofErr w:type="spellStart"/>
+      <w:r>
+        <w:rPr>
+          <w:rStyle w:val="HTMLCode"/>
+          <w:rFonts w:asciiTheme="minorHAnsi" w:hAnsiTheme="minorHAnsi" w:cstheme="minorHAnsi"/>
+          <w:b/>
+          <w:bCs/>
+          <w:i/>
+          <w:iCs/>
+          <w:color w:val="548DD4" w:themeColor="text2" w:themeTint="99"/>
+          <w:sz w:val="22"/>
+          <w:szCs w:val="22"/>
+        </w:rPr>
+        <w:t>config:clear</w:t>
+      </w:r>
+      <w:proofErr w:type="spellEnd"/>
+    </w:p>
+    <w:p>
+      <w:pPr>
+        <w:pStyle w:val="HTMLPreformatted"/>
+        <w:rPr>
+          <w:rStyle w:val="HTMLCode"/>
+          <w:rFonts w:asciiTheme="minorHAnsi" w:hAnsiTheme="minorHAnsi" w:cstheme="minorHAnsi"/>
+          <w:b/>
+          <w:bCs/>
+          <w:i/>
+          <w:iCs/>
+          <w:color w:val="548DD4" w:themeColor="text2" w:themeTint="99"/>
+          <w:sz w:val="22"/>
+          <w:szCs w:val="22"/>
+        </w:rPr>
+      </w:pPr>
+      <w:proofErr w:type="spellStart"/>
+      <w:proofErr w:type="gramStart"/>
+      <w:r>
+        <w:rPr>
+          <w:rStyle w:val="HTMLCode"/>
+          <w:rFonts w:asciiTheme="minorHAnsi" w:hAnsiTheme="minorHAnsi" w:cstheme="minorHAnsi"/>
+          <w:b/>
+          <w:bCs/>
+          <w:i/>
+          <w:iCs/>
+          <w:color w:val="548DD4" w:themeColor="text2" w:themeTint="99"/>
+          <w:sz w:val="22"/>
+          <w:szCs w:val="22"/>
+        </w:rPr>
+        <w:t>php</w:t>
+      </w:r>
+      <w:proofErr w:type="spellEnd"/>
+      <w:proofErr w:type="gramEnd"/>
+      <w:r>
+        <w:rPr>
+          <w:rStyle w:val="HTMLCode"/>
+          <w:rFonts w:asciiTheme="minorHAnsi" w:hAnsiTheme="minorHAnsi" w:cstheme="minorHAnsi"/>
+          <w:b/>
+          <w:bCs/>
+          <w:i/>
+          <w:iCs/>
+          <w:color w:val="548DD4" w:themeColor="text2" w:themeTint="99"/>
+          <w:sz w:val="22"/>
+          <w:szCs w:val="22"/>
+        </w:rPr>
+        <w:t xml:space="preserve"> artisan </w:t>
+      </w:r>
+      <w:proofErr w:type="spellStart"/>
+      <w:r>
+        <w:rPr>
+          <w:rStyle w:val="HTMLCode"/>
+          <w:rFonts w:asciiTheme="minorHAnsi" w:hAnsiTheme="minorHAnsi" w:cstheme="minorHAnsi"/>
+          <w:b/>
+          <w:bCs/>
+          <w:i/>
+          <w:iCs/>
+          <w:color w:val="548DD4" w:themeColor="text2" w:themeTint="99"/>
+          <w:sz w:val="22"/>
+          <w:szCs w:val="22"/>
+        </w:rPr>
+        <w:t>cache:clear</w:t>
+      </w:r>
+      <w:proofErr w:type="spellEnd"/>
+    </w:p>
+    <w:p>
+      <w:pPr>
+        <w:pStyle w:val="HTMLPreformatted"/>
+        <w:rPr>
+          <w:rFonts w:asciiTheme="minorHAnsi" w:hAnsiTheme="minorHAnsi" w:cstheme="minorHAnsi"/>
+          <w:b/>
+          <w:bCs/>
+          <w:i/>
+          <w:iCs/>
+          <w:color w:val="548DD4" w:themeColor="text2" w:themeTint="99"/>
+          <w:sz w:val="22"/>
+          <w:szCs w:val="22"/>
+        </w:rPr>
+      </w:pPr>
+      <w:proofErr w:type="spellStart"/>
+      <w:proofErr w:type="gramStart"/>
+      <w:r>
+        <w:rPr>
+          <w:rStyle w:val="HTMLCode"/>
+          <w:rFonts w:asciiTheme="minorHAnsi" w:hAnsiTheme="minorHAnsi" w:cstheme="minorHAnsi"/>
+          <w:b/>
+          <w:bCs/>
+          <w:i/>
+          <w:iCs/>
+          <w:color w:val="548DD4" w:themeColor="text2" w:themeTint="99"/>
+          <w:sz w:val="22"/>
+          <w:szCs w:val="22"/>
+        </w:rPr>
+        <w:t>php</w:t>
+      </w:r>
+      <w:proofErr w:type="spellEnd"/>
+      <w:proofErr w:type="gramEnd"/>
+      <w:r>
+        <w:rPr>
+          <w:rStyle w:val="HTMLCode"/>
+          <w:rFonts w:asciiTheme="minorHAnsi" w:hAnsiTheme="minorHAnsi" w:cstheme="minorHAnsi"/>
+          <w:b/>
+          <w:bCs/>
+          <w:i/>
+          <w:iCs/>
+          <w:color w:val="548DD4" w:themeColor="text2" w:themeTint="99"/>
+          <w:sz w:val="22"/>
+          <w:szCs w:val="22"/>
+        </w:rPr>
+        <w:t xml:space="preserve"> artisan </w:t>
+      </w:r>
+      <w:proofErr w:type="spellStart"/>
+      <w:r>
+        <w:rPr>
+          <w:rStyle w:val="HTMLCode"/>
+          <w:rFonts w:asciiTheme="minorHAnsi" w:hAnsiTheme="minorHAnsi" w:cstheme="minorHAnsi"/>
+          <w:b/>
+          <w:bCs/>
+          <w:i/>
+          <w:iCs/>
+          <w:color w:val="548DD4" w:themeColor="text2" w:themeTint="99"/>
+          <w:sz w:val="22"/>
+          <w:szCs w:val="22"/>
+        </w:rPr>
+        <w:t>optimize:clear</w:t>
+      </w:r>
+      <w:proofErr w:type="spellEnd"/>
+    </w:p>
+    <w:p>
+      <w:pPr>
+        <w:pStyle w:val="my-2"/>
+        <w:rPr>
+          <w:rFonts w:asciiTheme="minorHAnsi" w:hAnsiTheme="minorHAnsi" w:cstheme="minorHAnsi"/>
+          <w:sz w:val="22"/>
+          <w:szCs w:val="22"/>
+        </w:rPr>
+      </w:pPr>
+      <w:r>
+        <w:rPr>
+          <w:rFonts w:asciiTheme="minorHAnsi" w:hAnsiTheme="minorHAnsi" w:cstheme="minorHAnsi"/>
+          <w:sz w:val="22"/>
+          <w:szCs w:val="22"/>
+        </w:rPr>
+        <w:t>Then test your app again or rerun migrations if you were fixing the database connection.</w:t>
+      </w:r>
+    </w:p>
+    <w:p>
+      <w:pPr>
+        <w:tabs>
+          <w:tab w:val="left" w:pos="2307"/>
+        </w:tabs>
         <w:rPr>
           <w:rFonts w:cstheme="minorHAnsi"/>
           <w:szCs w:val="22"/>
@@ -23083,6 +24074,155 @@
     </w:lvl>
   </w:abstractNum>
   <w:abstractNum w:abstractNumId="15">
+    <w:nsid w:val="53691DB1"/>
+    <w:multiLevelType w:val="multilevel"/>
+    <w:tmpl w:val="A596F572"/>
+    <w:lvl w:ilvl="0">
+      <w:start w:val="1"/>
+      <w:numFmt w:val="bullet"/>
+      <w:lvlText w:val=""/>
+      <w:lvlJc w:val="left"/>
+      <w:pPr>
+        <w:tabs>
+          <w:tab w:val="num" w:pos="720"/>
+        </w:tabs>
+        <w:ind w:left="720" w:hanging="360"/>
+      </w:pPr>
+      <w:rPr>
+        <w:rFonts w:ascii="Symbol" w:hAnsi="Symbol" w:hint="default"/>
+        <w:sz w:val="20"/>
+      </w:rPr>
+    </w:lvl>
+    <w:lvl w:ilvl="1" w:tentative="1">
+      <w:start w:val="1"/>
+      <w:numFmt w:val="bullet"/>
+      <w:lvlText w:val="o"/>
+      <w:lvlJc w:val="left"/>
+      <w:pPr>
+        <w:tabs>
+          <w:tab w:val="num" w:pos="1440"/>
+        </w:tabs>
+        <w:ind w:left="1440" w:hanging="360"/>
+      </w:pPr>
+      <w:rPr>
+        <w:rFonts w:ascii="Courier New" w:hAnsi="Courier New" w:hint="default"/>
+        <w:sz w:val="20"/>
+      </w:rPr>
+    </w:lvl>
+    <w:lvl w:ilvl="2" w:tentative="1">
+      <w:start w:val="1"/>
+      <w:numFmt w:val="bullet"/>
+      <w:lvlText w:val=""/>
+      <w:lvlJc w:val="left"/>
+      <w:pPr>
+        <w:tabs>
+          <w:tab w:val="num" w:pos="2160"/>
+        </w:tabs>
+        <w:ind w:left="2160" w:hanging="360"/>
+      </w:pPr>
+      <w:rPr>
+        <w:rFonts w:ascii="Wingdings" w:hAnsi="Wingdings" w:hint="default"/>
+        <w:sz w:val="20"/>
+      </w:rPr>
+    </w:lvl>
+    <w:lvl w:ilvl="3" w:tentative="1">
+      <w:start w:val="1"/>
+      <w:numFmt w:val="bullet"/>
+      <w:lvlText w:val=""/>
+      <w:lvlJc w:val="left"/>
+      <w:pPr>
+        <w:tabs>
+          <w:tab w:val="num" w:pos="2880"/>
+        </w:tabs>
+        <w:ind w:left="2880" w:hanging="360"/>
+      </w:pPr>
+      <w:rPr>
+        <w:rFonts w:ascii="Wingdings" w:hAnsi="Wingdings" w:hint="default"/>
+        <w:sz w:val="20"/>
+      </w:rPr>
+    </w:lvl>
+    <w:lvl w:ilvl="4" w:tentative="1">
+      <w:start w:val="1"/>
+      <w:numFmt w:val="bullet"/>
+      <w:lvlText w:val=""/>
+      <w:lvlJc w:val="left"/>
+      <w:pPr>
+        <w:tabs>
+          <w:tab w:val="num" w:pos="3600"/>
+        </w:tabs>
+        <w:ind w:left="3600" w:hanging="360"/>
+      </w:pPr>
+      <w:rPr>
+        <w:rFonts w:ascii="Wingdings" w:hAnsi="Wingdings" w:hint="default"/>
+        <w:sz w:val="20"/>
+      </w:rPr>
+    </w:lvl>
+    <w:lvl w:ilvl="5" w:tentative="1">
+      <w:start w:val="1"/>
+      <w:numFmt w:val="bullet"/>
+      <w:lvlText w:val=""/>
+      <w:lvlJc w:val="left"/>
+      <w:pPr>
+        <w:tabs>
+          <w:tab w:val="num" w:pos="4320"/>
+        </w:tabs>
+        <w:ind w:left="4320" w:hanging="360"/>
+      </w:pPr>
+      <w:rPr>
+        <w:rFonts w:ascii="Wingdings" w:hAnsi="Wingdings" w:hint="default"/>
+        <w:sz w:val="20"/>
+      </w:rPr>
+    </w:lvl>
+    <w:lvl w:ilvl="6" w:tentative="1">
+      <w:start w:val="1"/>
+      <w:numFmt w:val="bullet"/>
+      <w:lvlText w:val=""/>
+      <w:lvlJc w:val="left"/>
+      <w:pPr>
+        <w:tabs>
+          <w:tab w:val="num" w:pos="5040"/>
+        </w:tabs>
+        <w:ind w:left="5040" w:hanging="360"/>
+      </w:pPr>
+      <w:rPr>
+        <w:rFonts w:ascii="Wingdings" w:hAnsi="Wingdings" w:hint="default"/>
+        <w:sz w:val="20"/>
+      </w:rPr>
+    </w:lvl>
+    <w:lvl w:ilvl="7" w:tentative="1">
+      <w:start w:val="1"/>
+      <w:numFmt w:val="bullet"/>
+      <w:lvlText w:val=""/>
+      <w:lvlJc w:val="left"/>
+      <w:pPr>
+        <w:tabs>
+          <w:tab w:val="num" w:pos="5760"/>
+        </w:tabs>
+        <w:ind w:left="5760" w:hanging="360"/>
+      </w:pPr>
+      <w:rPr>
+        <w:rFonts w:ascii="Wingdings" w:hAnsi="Wingdings" w:hint="default"/>
+        <w:sz w:val="20"/>
+      </w:rPr>
+    </w:lvl>
+    <w:lvl w:ilvl="8" w:tentative="1">
+      <w:start w:val="1"/>
+      <w:numFmt w:val="bullet"/>
+      <w:lvlText w:val=""/>
+      <w:lvlJc w:val="left"/>
+      <w:pPr>
+        <w:tabs>
+          <w:tab w:val="num" w:pos="6480"/>
+        </w:tabs>
+        <w:ind w:left="6480" w:hanging="360"/>
+      </w:pPr>
+      <w:rPr>
+        <w:rFonts w:ascii="Wingdings" w:hAnsi="Wingdings" w:hint="default"/>
+        <w:sz w:val="20"/>
+      </w:rPr>
+    </w:lvl>
+  </w:abstractNum>
+  <w:abstractNum w:abstractNumId="16">
     <w:nsid w:val="55F73037"/>
     <w:multiLevelType w:val="hybridMultilevel"/>
     <w:tmpl w:val="C9B47740"/>
@@ -23195,7 +24335,7 @@
       </w:rPr>
     </w:lvl>
   </w:abstractNum>
-  <w:abstractNum w:abstractNumId="16">
+  <w:abstractNum w:abstractNumId="17">
     <w:nsid w:val="5F19EEA1"/>
     <w:multiLevelType w:val="hybridMultilevel"/>
     <w:tmpl w:val="4A064B52"/>
@@ -23308,7 +24448,7 @@
       </w:rPr>
     </w:lvl>
   </w:abstractNum>
-  <w:abstractNum w:abstractNumId="17">
+  <w:abstractNum w:abstractNumId="18">
     <w:nsid w:val="638D4CE5"/>
     <w:multiLevelType w:val="hybridMultilevel"/>
     <w:tmpl w:val="7158DEDA"/>
@@ -23421,7 +24561,7 @@
       </w:rPr>
     </w:lvl>
   </w:abstractNum>
-  <w:abstractNum w:abstractNumId="18">
+  <w:abstractNum w:abstractNumId="19">
     <w:nsid w:val="64C669D5"/>
     <w:multiLevelType w:val="hybridMultilevel"/>
     <w:tmpl w:val="B8564516"/>
@@ -23534,7 +24674,7 @@
       </w:rPr>
     </w:lvl>
   </w:abstractNum>
-  <w:abstractNum w:abstractNumId="19">
+  <w:abstractNum w:abstractNumId="20">
     <w:nsid w:val="6D14B790"/>
     <w:multiLevelType w:val="hybridMultilevel"/>
     <w:tmpl w:val="FEB4F556"/>
@@ -23647,7 +24787,7 @@
       </w:rPr>
     </w:lvl>
   </w:abstractNum>
-  <w:abstractNum w:abstractNumId="20">
+  <w:abstractNum w:abstractNumId="21">
     <w:nsid w:val="6F49F606"/>
     <w:multiLevelType w:val="hybridMultilevel"/>
     <w:tmpl w:val="B0B0C0C4"/>
@@ -23760,7 +24900,7 @@
       </w:rPr>
     </w:lvl>
   </w:abstractNum>
-  <w:abstractNum w:abstractNumId="21">
+  <w:abstractNum w:abstractNumId="22">
     <w:nsid w:val="70E94C29"/>
     <w:multiLevelType w:val="hybridMultilevel"/>
     <w:tmpl w:val="226E4AC6"/>
@@ -23873,7 +25013,7 @@
       </w:rPr>
     </w:lvl>
   </w:abstractNum>
-  <w:abstractNum w:abstractNumId="22">
+  <w:abstractNum w:abstractNumId="23">
     <w:nsid w:val="7553C419"/>
     <w:multiLevelType w:val="hybridMultilevel"/>
     <w:tmpl w:val="FB742A26"/>
@@ -23986,7 +25126,7 @@
       </w:rPr>
     </w:lvl>
   </w:abstractNum>
-  <w:abstractNum w:abstractNumId="23">
+  <w:abstractNum w:abstractNumId="24">
     <w:nsid w:val="75822CC5"/>
     <w:multiLevelType w:val="hybridMultilevel"/>
     <w:tmpl w:val="AFFE5774"/>
@@ -24099,7 +25239,7 @@
       </w:rPr>
     </w:lvl>
   </w:abstractNum>
-  <w:abstractNum w:abstractNumId="24">
+  <w:abstractNum w:abstractNumId="25">
     <w:nsid w:val="76B420E5"/>
     <w:multiLevelType w:val="hybridMultilevel"/>
     <w:tmpl w:val="386CE270"/>
@@ -24212,7 +25352,7 @@
       </w:rPr>
     </w:lvl>
   </w:abstractNum>
-  <w:abstractNum w:abstractNumId="25">
+  <w:abstractNum w:abstractNumId="26">
     <w:nsid w:val="7936C793"/>
     <w:multiLevelType w:val="hybridMultilevel"/>
     <w:tmpl w:val="DA88566E"/>
@@ -24325,7 +25465,7 @@
       </w:rPr>
     </w:lvl>
   </w:abstractNum>
-  <w:abstractNum w:abstractNumId="26">
+  <w:abstractNum w:abstractNumId="27">
     <w:nsid w:val="7D241509"/>
     <w:multiLevelType w:val="hybridMultilevel"/>
     <w:tmpl w:val="55FE704A"/>
@@ -24439,13 +25579,13 @@
     </w:lvl>
   </w:abstractNum>
   <w:num w:numId="1">
-    <w:abstractNumId w:val="26"/>
+    <w:abstractNumId w:val="27"/>
   </w:num>
   <w:num w:numId="2">
     <w:abstractNumId w:val="7"/>
   </w:num>
   <w:num w:numId="3">
-    <w:abstractNumId w:val="15"/>
+    <w:abstractNumId w:val="16"/>
   </w:num>
   <w:num w:numId="4">
     <w:abstractNumId w:val="10"/>
@@ -24460,19 +25600,19 @@
     <w:abstractNumId w:val="11"/>
   </w:num>
   <w:num w:numId="8">
-    <w:abstractNumId w:val="24"/>
+    <w:abstractNumId w:val="25"/>
   </w:num>
   <w:num w:numId="9">
-    <w:abstractNumId w:val="20"/>
+    <w:abstractNumId w:val="21"/>
   </w:num>
   <w:num w:numId="10">
-    <w:abstractNumId w:val="19"/>
+    <w:abstractNumId w:val="20"/>
   </w:num>
   <w:num w:numId="11">
     <w:abstractNumId w:val="1"/>
   </w:num>
   <w:num w:numId="12">
-    <w:abstractNumId w:val="22"/>
+    <w:abstractNumId w:val="23"/>
   </w:num>
   <w:num w:numId="13">
     <w:abstractNumId w:val="9"/>
@@ -24481,28 +25621,28 @@
     <w:abstractNumId w:val="14"/>
   </w:num>
   <w:num w:numId="15">
-    <w:abstractNumId w:val="16"/>
+    <w:abstractNumId w:val="17"/>
   </w:num>
   <w:num w:numId="16">
-    <w:abstractNumId w:val="23"/>
+    <w:abstractNumId w:val="24"/>
   </w:num>
   <w:num w:numId="17">
-    <w:abstractNumId w:val="18"/>
+    <w:abstractNumId w:val="19"/>
   </w:num>
   <w:num w:numId="18">
-    <w:abstractNumId w:val="21"/>
+    <w:abstractNumId w:val="22"/>
   </w:num>
   <w:num w:numId="19">
     <w:abstractNumId w:val="2"/>
   </w:num>
   <w:num w:numId="20">
-    <w:abstractNumId w:val="25"/>
+    <w:abstractNumId w:val="26"/>
   </w:num>
   <w:num w:numId="21">
     <w:abstractNumId w:val="12"/>
   </w:num>
   <w:num w:numId="22">
-    <w:abstractNumId w:val="17"/>
+    <w:abstractNumId w:val="18"/>
   </w:num>
   <w:num w:numId="23">
     <w:abstractNumId w:val="8"/>
@@ -24518,6 +25658,9 @@
   </w:num>
   <w:num w:numId="27">
     <w:abstractNumId w:val="0"/>
+  </w:num>
+  <w:num w:numId="28">
+    <w:abstractNumId w:val="15"/>
   </w:num>
 </w:numbering>
 </file>
@@ -24968,6 +26111,94 @@
       <w:szCs w:val="20"/>
     </w:rPr>
   </w:style>
+  <w:style w:type="paragraph" w:customStyle="1" w:styleId="my-2">
+    <w:name w:val="my-2"/>
+    <w:basedOn w:val="Normal"/>
+    <w:rsid w:val="00EC0ED3"/>
+    <w:pPr>
+      <w:spacing w:before="100" w:beforeAutospacing="1" w:after="100" w:afterAutospacing="1" w:line="240" w:lineRule="auto"/>
+    </w:pPr>
+    <w:rPr>
+      <w:rFonts w:ascii="Times New Roman" w:eastAsia="Times New Roman" w:hAnsi="Times New Roman" w:cs="Times New Roman"/>
+      <w:sz w:val="24"/>
+      <w:szCs w:val="24"/>
+      <w:lang w:eastAsia="en-IN"/>
+    </w:rPr>
+  </w:style>
+  <w:style w:type="character" w:customStyle="1" w:styleId="citation">
+    <w:name w:val="citation"/>
+    <w:basedOn w:val="DefaultParagraphFont"/>
+    <w:rsid w:val="00EC0ED3"/>
+  </w:style>
+  <w:style w:type="character" w:customStyle="1" w:styleId="inline-block">
+    <w:name w:val="inline-block"/>
+    <w:basedOn w:val="DefaultParagraphFont"/>
+    <w:rsid w:val="00EC0ED3"/>
+  </w:style>
+  <w:style w:type="character" w:customStyle="1" w:styleId="opacity-50">
+    <w:name w:val="opacity-50"/>
+    <w:basedOn w:val="DefaultParagraphFont"/>
+    <w:rsid w:val="00EC0ED3"/>
+  </w:style>
+  <w:style w:type="character" w:styleId="Strong">
+    <w:name w:val="Strong"/>
+    <w:basedOn w:val="DefaultParagraphFont"/>
+    <w:uiPriority w:val="22"/>
+    <w:qFormat/>
+    <w:rsid w:val="00EC0ED3"/>
+    <w:rPr>
+      <w:b/>
+      <w:bCs/>
+    </w:rPr>
+  </w:style>
+  <w:style w:type="paragraph" w:styleId="HTMLPreformatted">
+    <w:name w:val="HTML Preformatted"/>
+    <w:basedOn w:val="Normal"/>
+    <w:link w:val="HTMLPreformattedChar"/>
+    <w:uiPriority w:val="99"/>
+    <w:semiHidden/>
+    <w:unhideWhenUsed/>
+    <w:rsid w:val="00EC0ED3"/>
+    <w:pPr>
+      <w:tabs>
+        <w:tab w:val="left" w:pos="916"/>
+        <w:tab w:val="left" w:pos="1832"/>
+        <w:tab w:val="left" w:pos="2748"/>
+        <w:tab w:val="left" w:pos="3664"/>
+        <w:tab w:val="left" w:pos="4580"/>
+        <w:tab w:val="left" w:pos="5496"/>
+        <w:tab w:val="left" w:pos="6412"/>
+        <w:tab w:val="left" w:pos="7328"/>
+        <w:tab w:val="left" w:pos="8244"/>
+        <w:tab w:val="left" w:pos="9160"/>
+        <w:tab w:val="left" w:pos="10076"/>
+        <w:tab w:val="left" w:pos="10992"/>
+        <w:tab w:val="left" w:pos="11908"/>
+        <w:tab w:val="left" w:pos="12824"/>
+        <w:tab w:val="left" w:pos="13740"/>
+        <w:tab w:val="left" w:pos="14656"/>
+      </w:tabs>
+      <w:spacing w:after="0" w:line="240" w:lineRule="auto"/>
+    </w:pPr>
+    <w:rPr>
+      <w:rFonts w:ascii="Courier New" w:eastAsia="Times New Roman" w:hAnsi="Courier New" w:cs="Courier New"/>
+      <w:sz w:val="20"/>
+      <w:lang w:eastAsia="en-IN"/>
+    </w:rPr>
+  </w:style>
+  <w:style w:type="character" w:customStyle="1" w:styleId="HTMLPreformattedChar">
+    <w:name w:val="HTML Preformatted Char"/>
+    <w:basedOn w:val="DefaultParagraphFont"/>
+    <w:link w:val="HTMLPreformatted"/>
+    <w:uiPriority w:val="99"/>
+    <w:semiHidden/>
+    <w:rsid w:val="00EC0ED3"/>
+    <w:rPr>
+      <w:rFonts w:ascii="Courier New" w:eastAsia="Times New Roman" w:hAnsi="Courier New" w:cs="Courier New"/>
+      <w:sz w:val="20"/>
+      <w:lang w:eastAsia="en-IN"/>
+    </w:rPr>
+  </w:style>
 </w:styles>
 </file>
 
@@ -25417,6 +26648,94 @@
       <w:szCs w:val="20"/>
     </w:rPr>
   </w:style>
+  <w:style w:type="paragraph" w:customStyle="1" w:styleId="my-2">
+    <w:name w:val="my-2"/>
+    <w:basedOn w:val="Normal"/>
+    <w:rsid w:val="00EC0ED3"/>
+    <w:pPr>
+      <w:spacing w:before="100" w:beforeAutospacing="1" w:after="100" w:afterAutospacing="1" w:line="240" w:lineRule="auto"/>
+    </w:pPr>
+    <w:rPr>
+      <w:rFonts w:ascii="Times New Roman" w:eastAsia="Times New Roman" w:hAnsi="Times New Roman" w:cs="Times New Roman"/>
+      <w:sz w:val="24"/>
+      <w:szCs w:val="24"/>
+      <w:lang w:eastAsia="en-IN"/>
+    </w:rPr>
+  </w:style>
+  <w:style w:type="character" w:customStyle="1" w:styleId="citation">
+    <w:name w:val="citation"/>
+    <w:basedOn w:val="DefaultParagraphFont"/>
+    <w:rsid w:val="00EC0ED3"/>
+  </w:style>
+  <w:style w:type="character" w:customStyle="1" w:styleId="inline-block">
+    <w:name w:val="inline-block"/>
+    <w:basedOn w:val="DefaultParagraphFont"/>
+    <w:rsid w:val="00EC0ED3"/>
+  </w:style>
+  <w:style w:type="character" w:customStyle="1" w:styleId="opacity-50">
+    <w:name w:val="opacity-50"/>
+    <w:basedOn w:val="DefaultParagraphFont"/>
+    <w:rsid w:val="00EC0ED3"/>
+  </w:style>
+  <w:style w:type="character" w:styleId="Strong">
+    <w:name w:val="Strong"/>
+    <w:basedOn w:val="DefaultParagraphFont"/>
+    <w:uiPriority w:val="22"/>
+    <w:qFormat/>
+    <w:rsid w:val="00EC0ED3"/>
+    <w:rPr>
+      <w:b/>
+      <w:bCs/>
+    </w:rPr>
+  </w:style>
+  <w:style w:type="paragraph" w:styleId="HTMLPreformatted">
+    <w:name w:val="HTML Preformatted"/>
+    <w:basedOn w:val="Normal"/>
+    <w:link w:val="HTMLPreformattedChar"/>
+    <w:uiPriority w:val="99"/>
+    <w:semiHidden/>
+    <w:unhideWhenUsed/>
+    <w:rsid w:val="00EC0ED3"/>
+    <w:pPr>
+      <w:tabs>
+        <w:tab w:val="left" w:pos="916"/>
+        <w:tab w:val="left" w:pos="1832"/>
+        <w:tab w:val="left" w:pos="2748"/>
+        <w:tab w:val="left" w:pos="3664"/>
+        <w:tab w:val="left" w:pos="4580"/>
+        <w:tab w:val="left" w:pos="5496"/>
+        <w:tab w:val="left" w:pos="6412"/>
+        <w:tab w:val="left" w:pos="7328"/>
+        <w:tab w:val="left" w:pos="8244"/>
+        <w:tab w:val="left" w:pos="9160"/>
+        <w:tab w:val="left" w:pos="10076"/>
+        <w:tab w:val="left" w:pos="10992"/>
+        <w:tab w:val="left" w:pos="11908"/>
+        <w:tab w:val="left" w:pos="12824"/>
+        <w:tab w:val="left" w:pos="13740"/>
+        <w:tab w:val="left" w:pos="14656"/>
+      </w:tabs>
+      <w:spacing w:after="0" w:line="240" w:lineRule="auto"/>
+    </w:pPr>
+    <w:rPr>
+      <w:rFonts w:ascii="Courier New" w:eastAsia="Times New Roman" w:hAnsi="Courier New" w:cs="Courier New"/>
+      <w:sz w:val="20"/>
+      <w:lang w:eastAsia="en-IN"/>
+    </w:rPr>
+  </w:style>
+  <w:style w:type="character" w:customStyle="1" w:styleId="HTMLPreformattedChar">
+    <w:name w:val="HTML Preformatted Char"/>
+    <w:basedOn w:val="DefaultParagraphFont"/>
+    <w:link w:val="HTMLPreformatted"/>
+    <w:uiPriority w:val="99"/>
+    <w:semiHidden/>
+    <w:rsid w:val="00EC0ED3"/>
+    <w:rPr>
+      <w:rFonts w:ascii="Courier New" w:eastAsia="Times New Roman" w:hAnsi="Courier New" w:cs="Courier New"/>
+      <w:sz w:val="20"/>
+      <w:lang w:eastAsia="en-IN"/>
+    </w:rPr>
+  </w:style>
 </w:styles>
 </file>
 

</xml_diff>